<commit_message>
lab6: rebuild docx and pdf
</commit_message>
<xml_diff>
--- a/ЛР6_ЦП_Канвас_сценарии_релизы/ОТЧЕТ_ЛР6_TableMind.docx
+++ b/ЛР6_ЦП_Канвас_сценарии_релизы/ОТЧЕТ_ЛР6_TableMind.docx
@@ -245,7 +245,7 @@
       <w:r>
         <w:fldChar w:fldCharType="separate"/>
       </w:r>
-      <w:hyperlink w:anchor="_Toc241913587" w:history="1">
+      <w:hyperlink w:anchor="_Toc241913969" w:history="1">
         <w:r>
           <w:rPr>
             <w:rStyle w:val="af"/>
@@ -273,7 +273,7 @@
             <w:noProof/>
             <w:webHidden/>
           </w:rPr>
-          <w:instrText xml:space="preserve"> PAGEREF _Toc241913587 \h </w:instrText>
+          <w:instrText xml:space="preserve"> PAGEREF _Toc241913969 \h </w:instrText>
         </w:r>
         <w:r>
           <w:rPr>
@@ -314,7 +314,7 @@
           <w:noProof/>
         </w:rPr>
       </w:pPr>
-      <w:hyperlink w:anchor="_Toc241913588" w:history="1">
+      <w:hyperlink w:anchor="_Toc241913970" w:history="1">
         <w:r>
           <w:rPr>
             <w:rStyle w:val="af"/>
@@ -342,7 +342,7 @@
             <w:noProof/>
             <w:webHidden/>
           </w:rPr>
-          <w:instrText xml:space="preserve"> PAGEREF _Toc241913588 \h </w:instrText>
+          <w:instrText xml:space="preserve"> PAGEREF _Toc241913970 \h </w:instrText>
         </w:r>
         <w:r>
           <w:rPr>
@@ -383,7 +383,7 @@
           <w:noProof/>
         </w:rPr>
       </w:pPr>
-      <w:hyperlink w:anchor="_Toc241913589" w:history="1">
+      <w:hyperlink w:anchor="_Toc241913971" w:history="1">
         <w:r>
           <w:rPr>
             <w:rStyle w:val="af"/>
@@ -411,7 +411,7 @@
             <w:noProof/>
             <w:webHidden/>
           </w:rPr>
-          <w:instrText xml:space="preserve"> PAGEREF _Toc241913589 \h </w:instrText>
+          <w:instrText xml:space="preserve"> PAGEREF _Toc241913971 \h </w:instrText>
         </w:r>
         <w:r>
           <w:rPr>
@@ -452,7 +452,7 @@
           <w:noProof/>
         </w:rPr>
       </w:pPr>
-      <w:hyperlink w:anchor="_Toc241913590" w:history="1">
+      <w:hyperlink w:anchor="_Toc241913972" w:history="1">
         <w:r>
           <w:rPr>
             <w:rStyle w:val="af"/>
@@ -480,7 +480,7 @@
             <w:noProof/>
             <w:webHidden/>
           </w:rPr>
-          <w:instrText xml:space="preserve"> PAGEREF _Toc241913590 \h </w:instrText>
+          <w:instrText xml:space="preserve"> PAGEREF _Toc241913972 \h </w:instrText>
         </w:r>
         <w:r>
           <w:rPr>
@@ -521,7 +521,7 @@
           <w:noProof/>
         </w:rPr>
       </w:pPr>
-      <w:hyperlink w:anchor="_Toc241913591" w:history="1">
+      <w:hyperlink w:anchor="_Toc241913973" w:history="1">
         <w:r>
           <w:rPr>
             <w:rStyle w:val="af"/>
@@ -549,7 +549,7 @@
             <w:noProof/>
             <w:webHidden/>
           </w:rPr>
-          <w:instrText xml:space="preserve"> PAGEREF _Toc241913591 \h </w:instrText>
+          <w:instrText xml:space="preserve"> PAGEREF _Toc241913973 \h </w:instrText>
         </w:r>
         <w:r>
           <w:rPr>
@@ -590,7 +590,7 @@
           <w:noProof/>
         </w:rPr>
       </w:pPr>
-      <w:hyperlink w:anchor="_Toc241913592" w:history="1">
+      <w:hyperlink w:anchor="_Toc241913974" w:history="1">
         <w:r>
           <w:rPr>
             <w:rStyle w:val="af"/>
@@ -618,7 +618,7 @@
             <w:noProof/>
             <w:webHidden/>
           </w:rPr>
-          <w:instrText xml:space="preserve"> PAGEREF _Toc241913592 \h </w:instrText>
+          <w:instrText xml:space="preserve"> PAGEREF _Toc241913974 \h </w:instrText>
         </w:r>
         <w:r>
           <w:rPr>
@@ -659,7 +659,7 @@
           <w:noProof/>
         </w:rPr>
       </w:pPr>
-      <w:hyperlink w:anchor="_Toc241913593" w:history="1">
+      <w:hyperlink w:anchor="_Toc241913975" w:history="1">
         <w:r>
           <w:rPr>
             <w:rStyle w:val="af"/>
@@ -687,7 +687,7 @@
             <w:noProof/>
             <w:webHidden/>
           </w:rPr>
-          <w:instrText xml:space="preserve"> PAGEREF _Toc241913593 \h </w:instrText>
+          <w:instrText xml:space="preserve"> PAGEREF _Toc241913975 \h </w:instrText>
         </w:r>
         <w:r>
           <w:rPr>
@@ -728,7 +728,7 @@
           <w:noProof/>
         </w:rPr>
       </w:pPr>
-      <w:hyperlink w:anchor="_Toc241913594" w:history="1">
+      <w:hyperlink w:anchor="_Toc241913976" w:history="1">
         <w:r>
           <w:rPr>
             <w:rStyle w:val="af"/>
@@ -756,7 +756,7 @@
             <w:noProof/>
             <w:webHidden/>
           </w:rPr>
-          <w:instrText xml:space="preserve"> PAGEREF _Toc241913594 \h </w:instrText>
+          <w:instrText xml:space="preserve"> PAGEREF _Toc241913976 \h </w:instrText>
         </w:r>
         <w:r>
           <w:rPr>
@@ -797,7 +797,7 @@
           <w:noProof/>
         </w:rPr>
       </w:pPr>
-      <w:hyperlink w:anchor="_Toc241913595" w:history="1">
+      <w:hyperlink w:anchor="_Toc241913977" w:history="1">
         <w:r>
           <w:rPr>
             <w:rStyle w:val="af"/>
@@ -825,7 +825,7 @@
             <w:noProof/>
             <w:webHidden/>
           </w:rPr>
-          <w:instrText xml:space="preserve"> PAGEREF _Toc241913595 \h </w:instrText>
+          <w:instrText xml:space="preserve"> PAGEREF _Toc241913977 \h </w:instrText>
         </w:r>
         <w:r>
           <w:rPr>
@@ -866,7 +866,7 @@
           <w:noProof/>
         </w:rPr>
       </w:pPr>
-      <w:hyperlink w:anchor="_Toc241913596" w:history="1">
+      <w:hyperlink w:anchor="_Toc241913978" w:history="1">
         <w:r>
           <w:rPr>
             <w:rStyle w:val="af"/>
@@ -894,7 +894,7 @@
             <w:noProof/>
             <w:webHidden/>
           </w:rPr>
-          <w:instrText xml:space="preserve"> PAGEREF _Toc241913596 \h </w:instrText>
+          <w:instrText xml:space="preserve"> PAGEREF _Toc241913978 \h </w:instrText>
         </w:r>
         <w:r>
           <w:rPr>
@@ -935,7 +935,7 @@
           <w:noProof/>
         </w:rPr>
       </w:pPr>
-      <w:hyperlink w:anchor="_Toc241913597" w:history="1">
+      <w:hyperlink w:anchor="_Toc241913979" w:history="1">
         <w:r>
           <w:rPr>
             <w:rStyle w:val="af"/>
@@ -963,7 +963,7 @@
             <w:noProof/>
             <w:webHidden/>
           </w:rPr>
-          <w:instrText xml:space="preserve"> PAGEREF _Toc241913597 \h </w:instrText>
+          <w:instrText xml:space="preserve"> PAGEREF _Toc241913979 \h </w:instrText>
         </w:r>
         <w:r>
           <w:rPr>
@@ -1004,7 +1004,7 @@
           <w:noProof/>
         </w:rPr>
       </w:pPr>
-      <w:hyperlink w:anchor="_Toc241913598" w:history="1">
+      <w:hyperlink w:anchor="_Toc241913980" w:history="1">
         <w:r>
           <w:rPr>
             <w:rStyle w:val="af"/>
@@ -1032,7 +1032,7 @@
             <w:noProof/>
             <w:webHidden/>
           </w:rPr>
-          <w:instrText xml:space="preserve"> PAGEREF _Toc241913598 \h </w:instrText>
+          <w:instrText xml:space="preserve"> PAGEREF _Toc241913980 \h </w:instrText>
         </w:r>
         <w:r>
           <w:rPr>
@@ -1073,7 +1073,7 @@
           <w:noProof/>
         </w:rPr>
       </w:pPr>
-      <w:hyperlink w:anchor="_Toc241913599" w:history="1">
+      <w:hyperlink w:anchor="_Toc241913981" w:history="1">
         <w:r>
           <w:rPr>
             <w:rStyle w:val="af"/>
@@ -1101,7 +1101,7 @@
             <w:noProof/>
             <w:webHidden/>
           </w:rPr>
-          <w:instrText xml:space="preserve"> PAGEREF _Toc241913599 \h </w:instrText>
+          <w:instrText xml:space="preserve"> PAGEREF _Toc241913981 \h </w:instrText>
         </w:r>
         <w:r>
           <w:rPr>
@@ -1142,7 +1142,7 @@
           <w:noProof/>
         </w:rPr>
       </w:pPr>
-      <w:hyperlink w:anchor="_Toc241913600" w:history="1">
+      <w:hyperlink w:anchor="_Toc241913982" w:history="1">
         <w:r>
           <w:rPr>
             <w:rStyle w:val="af"/>
@@ -1170,7 +1170,7 @@
             <w:noProof/>
             <w:webHidden/>
           </w:rPr>
-          <w:instrText xml:space="preserve"> PAGEREF _Toc241913600 \h </w:instrText>
+          <w:instrText xml:space="preserve"> PAGEREF _Toc241913982 \h </w:instrText>
         </w:r>
         <w:r>
           <w:rPr>
@@ -1211,7 +1211,7 @@
           <w:noProof/>
         </w:rPr>
       </w:pPr>
-      <w:hyperlink w:anchor="_Toc241913601" w:history="1">
+      <w:hyperlink w:anchor="_Toc241913983" w:history="1">
         <w:r>
           <w:rPr>
             <w:rStyle w:val="af"/>
@@ -1239,7 +1239,7 @@
             <w:noProof/>
             <w:webHidden/>
           </w:rPr>
-          <w:instrText xml:space="preserve"> PAGEREF _Toc241913601 \h </w:instrText>
+          <w:instrText xml:space="preserve"> PAGEREF _Toc241913983 \h </w:instrText>
         </w:r>
         <w:r>
           <w:rPr>
@@ -1280,7 +1280,7 @@
           <w:noProof/>
         </w:rPr>
       </w:pPr>
-      <w:hyperlink w:anchor="_Toc241913602" w:history="1">
+      <w:hyperlink w:anchor="_Toc241913984" w:history="1">
         <w:r>
           <w:rPr>
             <w:rStyle w:val="af"/>
@@ -1308,7 +1308,7 @@
             <w:noProof/>
             <w:webHidden/>
           </w:rPr>
-          <w:instrText xml:space="preserve"> PAGEREF _Toc241913602 \h </w:instrText>
+          <w:instrText xml:space="preserve"> PAGEREF _Toc241913984 \h </w:instrText>
         </w:r>
         <w:r>
           <w:rPr>
@@ -1354,7 +1354,7 @@
         <w:spacing w:before="0" w:after="360" w:line="360" w:lineRule="exact"/>
         <w:ind w:firstLine="709"/>
       </w:pPr>
-      <w:bookmarkStart w:id="1" w:name="_Toc241913587"/>
+      <w:bookmarkStart w:id="1" w:name="_Toc241913969"/>
       <w:r>
         <w:rPr>
           <w:b/>
@@ -1465,7 +1465,7 @@
         <w:ind w:firstLine="709"/>
       </w:pPr>
       <w:bookmarkStart w:id="2" w:name="_b608aa976fc82a0faaf3b83f58c735968afd03b"/>
-      <w:bookmarkStart w:id="3" w:name="_Toc241913588"/>
+      <w:bookmarkStart w:id="3" w:name="_Toc241913970"/>
       <w:bookmarkEnd w:id="0"/>
       <w:r>
         <w:rPr>
@@ -1530,7 +1530,7 @@
         <w:ind w:firstLine="709"/>
       </w:pPr>
       <w:bookmarkStart w:id="4" w:name="_ce8c8db2bd1f021f701413a98bce88b0dc0ff35"/>
-      <w:bookmarkStart w:id="5" w:name="_Toc241913589"/>
+      <w:bookmarkStart w:id="5" w:name="_Toc241913971"/>
       <w:r>
         <w:rPr>
           <w:b/>
@@ -3572,7 +3572,7 @@
         <w:ind w:firstLine="709"/>
       </w:pPr>
       <w:bookmarkStart w:id="6" w:name="_d6b1e0606ccffbfea524c7b8890d7424ae6ef8d"/>
-      <w:bookmarkStart w:id="7" w:name="_Toc241913590"/>
+      <w:bookmarkStart w:id="7" w:name="_Toc241913972"/>
       <w:bookmarkEnd w:id="4"/>
       <w:r>
         <w:rPr>
@@ -8290,7 +8290,7 @@
         <w:ind w:firstLine="709"/>
       </w:pPr>
       <w:bookmarkStart w:id="8" w:name="_7b60cb03201c02c98ad01f5cee41d479977e884"/>
-      <w:bookmarkStart w:id="9" w:name="_Toc241913591"/>
+      <w:bookmarkStart w:id="9" w:name="_Toc241913973"/>
       <w:bookmarkEnd w:id="6"/>
       <w:r>
         <w:rPr>
@@ -8361,7 +8361,7 @@
           <w:sz w:val="28"/>
         </w:rPr>
         <w:drawing>
-          <wp:inline distT="0" distB="0" distL="0" distR="0" wp14:anchorId="61154592" wp14:editId="081ACEE1">
+          <wp:inline distT="0" distB="0" distL="0" distR="0" wp14:anchorId="6DE8195E" wp14:editId="7C22255A">
             <wp:extent cx="5334000" cy="3382536"/>
             <wp:effectExtent l="0" t="0" r="0" b="0"/>
             <wp:docPr id="13" name="Picture"/>
@@ -10676,7 +10676,7 @@
         <w:ind w:firstLine="709"/>
       </w:pPr>
       <w:bookmarkStart w:id="10" w:name="_519d46f9ff7923648cbfef21e26057944381813"/>
-      <w:bookmarkStart w:id="11" w:name="_Toc241913592"/>
+      <w:bookmarkStart w:id="11" w:name="_Toc241913974"/>
       <w:bookmarkEnd w:id="8"/>
       <w:r>
         <w:rPr>
@@ -15522,7 +15522,7 @@
           <w:sz w:val="28"/>
         </w:rPr>
         <w:drawing>
-          <wp:inline distT="0" distB="0" distL="0" distR="0" wp14:anchorId="077F433E" wp14:editId="38434929">
+          <wp:inline distT="0" distB="0" distL="0" distR="0" wp14:anchorId="44FFF7CA" wp14:editId="2AD1D13B">
             <wp:extent cx="5334000" cy="3122341"/>
             <wp:effectExtent l="0" t="0" r="0" b="0"/>
             <wp:docPr id="17" name="Picture"/>
@@ -16495,7 +16495,7 @@
         <w:ind w:firstLine="709"/>
       </w:pPr>
       <w:bookmarkStart w:id="12" w:name="_ccc7c944b68a9100d34a943bc02da4feb181aee"/>
-      <w:bookmarkStart w:id="13" w:name="_Toc241913593"/>
+      <w:bookmarkStart w:id="13" w:name="_Toc241913975"/>
       <w:bookmarkEnd w:id="10"/>
       <w:r>
         <w:rPr>
@@ -19610,7 +19610,7 @@
         </w:rPr>
         <w:lastRenderedPageBreak/>
         <w:drawing>
-          <wp:inline distT="0" distB="0" distL="0" distR="0" wp14:anchorId="085A871C" wp14:editId="13FDEF27">
+          <wp:inline distT="0" distB="0" distL="0" distR="0" wp14:anchorId="4E549DE6" wp14:editId="1F3A55C0">
             <wp:extent cx="5334000" cy="6114585"/>
             <wp:effectExtent l="0" t="0" r="0" b="0"/>
             <wp:docPr id="21" name="Picture"/>
@@ -19738,7 +19738,7 @@
         <w:ind w:firstLine="709"/>
       </w:pPr>
       <w:bookmarkStart w:id="14" w:name="_fc51781abcc4857bf621eab6b8861ea54729fed"/>
-      <w:bookmarkStart w:id="15" w:name="_Toc241913594"/>
+      <w:bookmarkStart w:id="15" w:name="_Toc241913976"/>
       <w:bookmarkEnd w:id="12"/>
       <w:r>
         <w:rPr>
@@ -23144,7 +23144,7 @@
           <w:sz w:val="28"/>
         </w:rPr>
         <w:drawing>
-          <wp:inline distT="0" distB="0" distL="0" distR="0" wp14:anchorId="0FCC6491" wp14:editId="2F3AC766">
+          <wp:inline distT="0" distB="0" distL="0" distR="0" wp14:anchorId="1BF86E62" wp14:editId="24AF71F5">
             <wp:extent cx="5334000" cy="2341756"/>
             <wp:effectExtent l="0" t="0" r="0" b="0"/>
             <wp:docPr id="25" name="Picture"/>
@@ -24048,7 +24048,7 @@
         <w:ind w:firstLine="709"/>
       </w:pPr>
       <w:bookmarkStart w:id="16" w:name="_fb011a212b736610690ebb69f4e92f01bd3b3f9"/>
-      <w:bookmarkStart w:id="17" w:name="_Toc241913595"/>
+      <w:bookmarkStart w:id="17" w:name="_Toc241913977"/>
       <w:bookmarkEnd w:id="14"/>
       <w:r>
         <w:rPr>
@@ -24963,7 +24963,7 @@
         <w:ind w:firstLine="709"/>
       </w:pPr>
       <w:bookmarkStart w:id="18" w:name="_339ae803435bd6b9a653c2b18dadc62dc9ad8e7"/>
-      <w:bookmarkStart w:id="19" w:name="_Toc241913596"/>
+      <w:bookmarkStart w:id="19" w:name="_Toc241913978"/>
       <w:bookmarkEnd w:id="16"/>
       <w:r>
         <w:rPr>
@@ -25081,7 +25081,7 @@
         <w:ind w:firstLine="709"/>
       </w:pPr>
       <w:bookmarkStart w:id="20" w:name="_1bfdad9d2d88ddb6ca16c31c1d4d4943679f32f"/>
-      <w:bookmarkStart w:id="21" w:name="_Toc241913597"/>
+      <w:bookmarkStart w:id="21" w:name="_Toc241913979"/>
       <w:bookmarkEnd w:id="18"/>
       <w:bookmarkEnd w:id="2"/>
       <w:r>
@@ -25304,7 +25304,7 @@
         <w:jc w:val="center"/>
       </w:pPr>
       <w:bookmarkStart w:id="22" w:name="_выводы"/>
-      <w:bookmarkStart w:id="23" w:name="_Toc241913598"/>
+      <w:bookmarkStart w:id="23" w:name="_Toc241913980"/>
       <w:bookmarkEnd w:id="20"/>
       <w:r>
         <w:rPr>
@@ -25488,7 +25488,7 @@
         <w:jc w:val="center"/>
       </w:pPr>
       <w:bookmarkStart w:id="24" w:name="_274f6a444530ef90b0479dabf3d210f01e97699"/>
-      <w:bookmarkStart w:id="25" w:name="_Toc241913599"/>
+      <w:bookmarkStart w:id="25" w:name="_Toc241913981"/>
       <w:bookmarkEnd w:id="22"/>
       <w:r>
         <w:rPr>
@@ -25914,7 +25914,7 @@
         <w:jc w:val="center"/>
       </w:pPr>
       <w:bookmarkStart w:id="26" w:name="_3d74faf1500c1b2a4a8bfa8e0e37c74206ce73d"/>
-      <w:bookmarkStart w:id="27" w:name="_Toc241913600"/>
+      <w:bookmarkStart w:id="27" w:name="_Toc241913982"/>
       <w:bookmarkEnd w:id="24"/>
       <w:r>
         <w:rPr>
@@ -26727,7 +26727,7 @@
         <w:jc w:val="center"/>
       </w:pPr>
       <w:bookmarkStart w:id="28" w:name="_d684f183eb868ee4ace295916bed2e6be64d16e"/>
-      <w:bookmarkStart w:id="29" w:name="_Toc241913601"/>
+      <w:bookmarkStart w:id="29" w:name="_Toc241913983"/>
       <w:bookmarkEnd w:id="26"/>
       <w:r>
         <w:rPr>
@@ -27610,7 +27610,7 @@
         <w:jc w:val="center"/>
       </w:pPr>
       <w:bookmarkStart w:id="30" w:name="_6574ce6d3bdcb7786930e8390195aee2be99a58"/>
-      <w:bookmarkStart w:id="31" w:name="_Toc241913602"/>
+      <w:bookmarkStart w:id="31" w:name="_Toc241913984"/>
       <w:bookmarkEnd w:id="28"/>
       <w:r>
         <w:rPr>
@@ -28118,7 +28118,7 @@
   <w:abstractNum w:abstractNumId="0" w15:restartNumberingAfterBreak="0">
     <w:nsid w:val="0000A990"/>
     <w:multiLevelType w:val="multilevel"/>
-    <w:tmpl w:val="E2FEF07A"/>
+    <w:tmpl w:val="0F160734"/>
     <w:lvl w:ilvl="0">
       <w:numFmt w:val="bullet"/>
       <w:lvlText w:val=" "/>
@@ -28195,7 +28195,7 @@
   <w:abstractNum w:abstractNumId="1" w15:restartNumberingAfterBreak="0">
     <w:nsid w:val="00A99411"/>
     <w:multiLevelType w:val="multilevel"/>
-    <w:tmpl w:val="3FB207DC"/>
+    <w:tmpl w:val="98441050"/>
     <w:lvl w:ilvl="0">
       <w:start w:val="1"/>
       <w:numFmt w:val="decimal"/>
@@ -29673,7 +29673,7 @@
     <w:autoRedefine/>
     <w:uiPriority w:val="39"/>
     <w:unhideWhenUsed/>
-    <w:rsid w:val="00F16D99"/>
+    <w:rsid w:val="006D74E9"/>
     <w:pPr>
       <w:spacing w:after="100"/>
     </w:pPr>
@@ -29685,7 +29685,7 @@
     <w:autoRedefine/>
     <w:uiPriority w:val="39"/>
     <w:unhideWhenUsed/>
-    <w:rsid w:val="00F16D99"/>
+    <w:rsid w:val="006D74E9"/>
     <w:pPr>
       <w:spacing w:after="100"/>
       <w:ind w:left="240"/>

</xml_diff>

<commit_message>
lab6/final: Figma prototype (3 pages) read, screenshots and link added to report, docs rebuilt
</commit_message>
<xml_diff>
--- a/ЛР6_ЦП_Канвас_сценарии_релизы/ОТЧЕТ_ЛР6_TableMind.docx
+++ b/ЛР6_ЦП_Канвас_сценарии_релизы/ОТЧЕТ_ЛР6_TableMind.docx
@@ -245,7 +245,7 @@
       <w:r>
         <w:fldChar w:fldCharType="separate"/>
       </w:r>
-      <w:hyperlink w:anchor="_Toc241913969" w:history="1">
+      <w:hyperlink w:anchor="_Toc241934335" w:history="1">
         <w:r>
           <w:rPr>
             <w:rStyle w:val="af"/>
@@ -273,7 +273,7 @@
             <w:noProof/>
             <w:webHidden/>
           </w:rPr>
-          <w:instrText xml:space="preserve"> PAGEREF _Toc241913969 \h </w:instrText>
+          <w:instrText xml:space="preserve"> PAGEREF _Toc241934335 \h </w:instrText>
         </w:r>
         <w:r>
           <w:rPr>
@@ -314,7 +314,7 @@
           <w:noProof/>
         </w:rPr>
       </w:pPr>
-      <w:hyperlink w:anchor="_Toc241913970" w:history="1">
+      <w:hyperlink w:anchor="_Toc241934336" w:history="1">
         <w:r>
           <w:rPr>
             <w:rStyle w:val="af"/>
@@ -342,7 +342,7 @@
             <w:noProof/>
             <w:webHidden/>
           </w:rPr>
-          <w:instrText xml:space="preserve"> PAGEREF _Toc241913970 \h </w:instrText>
+          <w:instrText xml:space="preserve"> PAGEREF _Toc241934336 \h </w:instrText>
         </w:r>
         <w:r>
           <w:rPr>
@@ -383,7 +383,7 @@
           <w:noProof/>
         </w:rPr>
       </w:pPr>
-      <w:hyperlink w:anchor="_Toc241913971" w:history="1">
+      <w:hyperlink w:anchor="_Toc241934337" w:history="1">
         <w:r>
           <w:rPr>
             <w:rStyle w:val="af"/>
@@ -411,7 +411,7 @@
             <w:noProof/>
             <w:webHidden/>
           </w:rPr>
-          <w:instrText xml:space="preserve"> PAGEREF _Toc241913971 \h </w:instrText>
+          <w:instrText xml:space="preserve"> PAGEREF _Toc241934337 \h </w:instrText>
         </w:r>
         <w:r>
           <w:rPr>
@@ -452,7 +452,7 @@
           <w:noProof/>
         </w:rPr>
       </w:pPr>
-      <w:hyperlink w:anchor="_Toc241913972" w:history="1">
+      <w:hyperlink w:anchor="_Toc241934338" w:history="1">
         <w:r>
           <w:rPr>
             <w:rStyle w:val="af"/>
@@ -480,7 +480,7 @@
             <w:noProof/>
             <w:webHidden/>
           </w:rPr>
-          <w:instrText xml:space="preserve"> PAGEREF _Toc241913972 \h </w:instrText>
+          <w:instrText xml:space="preserve"> PAGEREF _Toc241934338 \h </w:instrText>
         </w:r>
         <w:r>
           <w:rPr>
@@ -521,7 +521,7 @@
           <w:noProof/>
         </w:rPr>
       </w:pPr>
-      <w:hyperlink w:anchor="_Toc241913973" w:history="1">
+      <w:hyperlink w:anchor="_Toc241934339" w:history="1">
         <w:r>
           <w:rPr>
             <w:rStyle w:val="af"/>
@@ -549,7 +549,7 @@
             <w:noProof/>
             <w:webHidden/>
           </w:rPr>
-          <w:instrText xml:space="preserve"> PAGEREF _Toc241913973 \h </w:instrText>
+          <w:instrText xml:space="preserve"> PAGEREF _Toc241934339 \h </w:instrText>
         </w:r>
         <w:r>
           <w:rPr>
@@ -590,7 +590,7 @@
           <w:noProof/>
         </w:rPr>
       </w:pPr>
-      <w:hyperlink w:anchor="_Toc241913974" w:history="1">
+      <w:hyperlink w:anchor="_Toc241934340" w:history="1">
         <w:r>
           <w:rPr>
             <w:rStyle w:val="af"/>
@@ -618,7 +618,7 @@
             <w:noProof/>
             <w:webHidden/>
           </w:rPr>
-          <w:instrText xml:space="preserve"> PAGEREF _Toc241913974 \h </w:instrText>
+          <w:instrText xml:space="preserve"> PAGEREF _Toc241934340 \h </w:instrText>
         </w:r>
         <w:r>
           <w:rPr>
@@ -659,7 +659,7 @@
           <w:noProof/>
         </w:rPr>
       </w:pPr>
-      <w:hyperlink w:anchor="_Toc241913975" w:history="1">
+      <w:hyperlink w:anchor="_Toc241934341" w:history="1">
         <w:r>
           <w:rPr>
             <w:rStyle w:val="af"/>
@@ -687,7 +687,7 @@
             <w:noProof/>
             <w:webHidden/>
           </w:rPr>
-          <w:instrText xml:space="preserve"> PAGEREF _Toc241913975 \h </w:instrText>
+          <w:instrText xml:space="preserve"> PAGEREF _Toc241934341 \h </w:instrText>
         </w:r>
         <w:r>
           <w:rPr>
@@ -728,7 +728,7 @@
           <w:noProof/>
         </w:rPr>
       </w:pPr>
-      <w:hyperlink w:anchor="_Toc241913976" w:history="1">
+      <w:hyperlink w:anchor="_Toc241934342" w:history="1">
         <w:r>
           <w:rPr>
             <w:rStyle w:val="af"/>
@@ -756,352 +756,7 @@
             <w:noProof/>
             <w:webHidden/>
           </w:rPr>
-          <w:instrText xml:space="preserve"> PAGEREF _Toc241913976 \h </w:instrText>
-        </w:r>
-        <w:r>
-          <w:rPr>
-            <w:noProof/>
-            <w:webHidden/>
-          </w:rPr>
-        </w:r>
-        <w:r>
-          <w:rPr>
-            <w:noProof/>
-            <w:webHidden/>
-          </w:rPr>
-          <w:fldChar w:fldCharType="separate"/>
-        </w:r>
-        <w:r>
-          <w:rPr>
-            <w:noProof/>
-            <w:webHidden/>
-          </w:rPr>
-          <w:t>16</w:t>
-        </w:r>
-        <w:r>
-          <w:rPr>
-            <w:noProof/>
-            <w:webHidden/>
-          </w:rPr>
-          <w:fldChar w:fldCharType="end"/>
-        </w:r>
-      </w:hyperlink>
-    </w:p>
-    <w:p>
-      <w:pPr>
-        <w:pStyle w:val="22"/>
-        <w:tabs>
-          <w:tab w:val="right" w:leader="dot" w:pos="9345"/>
-        </w:tabs>
-        <w:rPr>
-          <w:noProof/>
-        </w:rPr>
-      </w:pPr>
-      <w:hyperlink w:anchor="_Toc241913977" w:history="1">
-        <w:r>
-          <w:rPr>
-            <w:rStyle w:val="af"/>
-            <w:b/>
-            <w:noProof/>
-          </w:rPr>
-          <w:t>2.7 Согласованность с ПЗ1 и ПЗ4</w:t>
-        </w:r>
-        <w:r>
-          <w:rPr>
-            <w:noProof/>
-            <w:webHidden/>
-          </w:rPr>
-          <w:tab/>
-        </w:r>
-        <w:r>
-          <w:rPr>
-            <w:noProof/>
-            <w:webHidden/>
-          </w:rPr>
-          <w:fldChar w:fldCharType="begin"/>
-        </w:r>
-        <w:r>
-          <w:rPr>
-            <w:noProof/>
-            <w:webHidden/>
-          </w:rPr>
-          <w:instrText xml:space="preserve"> PAGEREF _Toc241913977 \h </w:instrText>
-        </w:r>
-        <w:r>
-          <w:rPr>
-            <w:noProof/>
-            <w:webHidden/>
-          </w:rPr>
-        </w:r>
-        <w:r>
-          <w:rPr>
-            <w:noProof/>
-            <w:webHidden/>
-          </w:rPr>
-          <w:fldChar w:fldCharType="separate"/>
-        </w:r>
-        <w:r>
-          <w:rPr>
-            <w:noProof/>
-            <w:webHidden/>
-          </w:rPr>
-          <w:t>18</w:t>
-        </w:r>
-        <w:r>
-          <w:rPr>
-            <w:noProof/>
-            <w:webHidden/>
-          </w:rPr>
-          <w:fldChar w:fldCharType="end"/>
-        </w:r>
-      </w:hyperlink>
-    </w:p>
-    <w:p>
-      <w:pPr>
-        <w:pStyle w:val="22"/>
-        <w:tabs>
-          <w:tab w:val="right" w:leader="dot" w:pos="9345"/>
-        </w:tabs>
-        <w:rPr>
-          <w:noProof/>
-        </w:rPr>
-      </w:pPr>
-      <w:hyperlink w:anchor="_Toc241913978" w:history="1">
-        <w:r>
-          <w:rPr>
-            <w:rStyle w:val="af"/>
-            <w:b/>
-            <w:noProof/>
-          </w:rPr>
-          <w:t>2.8 Проверка расчетов и ограничения</w:t>
-        </w:r>
-        <w:r>
-          <w:rPr>
-            <w:noProof/>
-            <w:webHidden/>
-          </w:rPr>
-          <w:tab/>
-        </w:r>
-        <w:r>
-          <w:rPr>
-            <w:noProof/>
-            <w:webHidden/>
-          </w:rPr>
-          <w:fldChar w:fldCharType="begin"/>
-        </w:r>
-        <w:r>
-          <w:rPr>
-            <w:noProof/>
-            <w:webHidden/>
-          </w:rPr>
-          <w:instrText xml:space="preserve"> PAGEREF _Toc241913978 \h </w:instrText>
-        </w:r>
-        <w:r>
-          <w:rPr>
-            <w:noProof/>
-            <w:webHidden/>
-          </w:rPr>
-        </w:r>
-        <w:r>
-          <w:rPr>
-            <w:noProof/>
-            <w:webHidden/>
-          </w:rPr>
-          <w:fldChar w:fldCharType="separate"/>
-        </w:r>
-        <w:r>
-          <w:rPr>
-            <w:noProof/>
-            <w:webHidden/>
-          </w:rPr>
-          <w:t>19</w:t>
-        </w:r>
-        <w:r>
-          <w:rPr>
-            <w:noProof/>
-            <w:webHidden/>
-          </w:rPr>
-          <w:fldChar w:fldCharType="end"/>
-        </w:r>
-      </w:hyperlink>
-    </w:p>
-    <w:p>
-      <w:pPr>
-        <w:pStyle w:val="12"/>
-        <w:tabs>
-          <w:tab w:val="right" w:leader="dot" w:pos="9345"/>
-        </w:tabs>
-        <w:rPr>
-          <w:noProof/>
-        </w:rPr>
-      </w:pPr>
-      <w:hyperlink w:anchor="_Toc241913979" w:history="1">
-        <w:r>
-          <w:rPr>
-            <w:rStyle w:val="af"/>
-            <w:b/>
-            <w:noProof/>
-          </w:rPr>
-          <w:t>3 ОТВЕТЫ НА КОНТРОЛЬНЫЕ ВОПРОСЫ</w:t>
-        </w:r>
-        <w:r>
-          <w:rPr>
-            <w:noProof/>
-            <w:webHidden/>
-          </w:rPr>
-          <w:tab/>
-        </w:r>
-        <w:r>
-          <w:rPr>
-            <w:noProof/>
-            <w:webHidden/>
-          </w:rPr>
-          <w:fldChar w:fldCharType="begin"/>
-        </w:r>
-        <w:r>
-          <w:rPr>
-            <w:noProof/>
-            <w:webHidden/>
-          </w:rPr>
-          <w:instrText xml:space="preserve"> PAGEREF _Toc241913979 \h </w:instrText>
-        </w:r>
-        <w:r>
-          <w:rPr>
-            <w:noProof/>
-            <w:webHidden/>
-          </w:rPr>
-        </w:r>
-        <w:r>
-          <w:rPr>
-            <w:noProof/>
-            <w:webHidden/>
-          </w:rPr>
-          <w:fldChar w:fldCharType="separate"/>
-        </w:r>
-        <w:r>
-          <w:rPr>
-            <w:noProof/>
-            <w:webHidden/>
-          </w:rPr>
-          <w:t>20</w:t>
-        </w:r>
-        <w:r>
-          <w:rPr>
-            <w:noProof/>
-            <w:webHidden/>
-          </w:rPr>
-          <w:fldChar w:fldCharType="end"/>
-        </w:r>
-      </w:hyperlink>
-    </w:p>
-    <w:p>
-      <w:pPr>
-        <w:pStyle w:val="12"/>
-        <w:tabs>
-          <w:tab w:val="right" w:leader="dot" w:pos="9345"/>
-        </w:tabs>
-        <w:rPr>
-          <w:noProof/>
-        </w:rPr>
-      </w:pPr>
-      <w:hyperlink w:anchor="_Toc241913980" w:history="1">
-        <w:r>
-          <w:rPr>
-            <w:rStyle w:val="af"/>
-            <w:b/>
-            <w:noProof/>
-          </w:rPr>
-          <w:t>ВЫВОДЫ</w:t>
-        </w:r>
-        <w:r>
-          <w:rPr>
-            <w:noProof/>
-            <w:webHidden/>
-          </w:rPr>
-          <w:tab/>
-        </w:r>
-        <w:r>
-          <w:rPr>
-            <w:noProof/>
-            <w:webHidden/>
-          </w:rPr>
-          <w:fldChar w:fldCharType="begin"/>
-        </w:r>
-        <w:r>
-          <w:rPr>
-            <w:noProof/>
-            <w:webHidden/>
-          </w:rPr>
-          <w:instrText xml:space="preserve"> PAGEREF _Toc241913980 \h </w:instrText>
-        </w:r>
-        <w:r>
-          <w:rPr>
-            <w:noProof/>
-            <w:webHidden/>
-          </w:rPr>
-        </w:r>
-        <w:r>
-          <w:rPr>
-            <w:noProof/>
-            <w:webHidden/>
-          </w:rPr>
-          <w:fldChar w:fldCharType="separate"/>
-        </w:r>
-        <w:r>
-          <w:rPr>
-            <w:noProof/>
-            <w:webHidden/>
-          </w:rPr>
-          <w:t>21</w:t>
-        </w:r>
-        <w:r>
-          <w:rPr>
-            <w:noProof/>
-            <w:webHidden/>
-          </w:rPr>
-          <w:fldChar w:fldCharType="end"/>
-        </w:r>
-      </w:hyperlink>
-    </w:p>
-    <w:p>
-      <w:pPr>
-        <w:pStyle w:val="12"/>
-        <w:tabs>
-          <w:tab w:val="right" w:leader="dot" w:pos="9345"/>
-        </w:tabs>
-        <w:rPr>
-          <w:noProof/>
-        </w:rPr>
-      </w:pPr>
-      <w:hyperlink w:anchor="_Toc241913981" w:history="1">
-        <w:r>
-          <w:rPr>
-            <w:rStyle w:val="af"/>
-            <w:b/>
-            <w:noProof/>
-          </w:rPr>
-          <w:t>СПИСОК ИСПОЛЬЗОВАННЫХ ИСТОЧНИКОВ</w:t>
-        </w:r>
-        <w:r>
-          <w:rPr>
-            <w:noProof/>
-            <w:webHidden/>
-          </w:rPr>
-          <w:tab/>
-        </w:r>
-        <w:r>
-          <w:rPr>
-            <w:noProof/>
-            <w:webHidden/>
-          </w:rPr>
-          <w:fldChar w:fldCharType="begin"/>
-        </w:r>
-        <w:r>
-          <w:rPr>
-            <w:noProof/>
-            <w:webHidden/>
-          </w:rPr>
-          <w:instrText xml:space="preserve"> PAGEREF _Toc241913981 \h </w:instrText>
+          <w:instrText xml:space="preserve"> PAGEREF _Toc241934342 \h </w:instrText>
         </w:r>
         <w:r>
           <w:rPr>
@@ -1134,7 +789,7 @@
     </w:p>
     <w:p>
       <w:pPr>
-        <w:pStyle w:val="12"/>
+        <w:pStyle w:val="22"/>
         <w:tabs>
           <w:tab w:val="right" w:leader="dot" w:pos="9345"/>
         </w:tabs>
@@ -1142,14 +797,14 @@
           <w:noProof/>
         </w:rPr>
       </w:pPr>
-      <w:hyperlink w:anchor="_Toc241913982" w:history="1">
+      <w:hyperlink w:anchor="_Toc241934343" w:history="1">
         <w:r>
           <w:rPr>
             <w:rStyle w:val="af"/>
             <w:b/>
             <w:noProof/>
           </w:rPr>
-          <w:t>ПРИЛОЖЕНИЕ А</w:t>
+          <w:t>2.7 Согласованность с ПЗ1 и ПЗ4</w:t>
         </w:r>
         <w:r>
           <w:rPr>
@@ -1170,76 +825,7 @@
             <w:noProof/>
             <w:webHidden/>
           </w:rPr>
-          <w:instrText xml:space="preserve"> PAGEREF _Toc241913982 \h </w:instrText>
-        </w:r>
-        <w:r>
-          <w:rPr>
-            <w:noProof/>
-            <w:webHidden/>
-          </w:rPr>
-        </w:r>
-        <w:r>
-          <w:rPr>
-            <w:noProof/>
-            <w:webHidden/>
-          </w:rPr>
-          <w:fldChar w:fldCharType="separate"/>
-        </w:r>
-        <w:r>
-          <w:rPr>
-            <w:noProof/>
-            <w:webHidden/>
-          </w:rPr>
-          <w:t>23</w:t>
-        </w:r>
-        <w:r>
-          <w:rPr>
-            <w:noProof/>
-            <w:webHidden/>
-          </w:rPr>
-          <w:fldChar w:fldCharType="end"/>
-        </w:r>
-      </w:hyperlink>
-    </w:p>
-    <w:p>
-      <w:pPr>
-        <w:pStyle w:val="12"/>
-        <w:tabs>
-          <w:tab w:val="right" w:leader="dot" w:pos="9345"/>
-        </w:tabs>
-        <w:rPr>
-          <w:noProof/>
-        </w:rPr>
-      </w:pPr>
-      <w:hyperlink w:anchor="_Toc241913983" w:history="1">
-        <w:r>
-          <w:rPr>
-            <w:rStyle w:val="af"/>
-            <w:b/>
-            <w:noProof/>
-          </w:rPr>
-          <w:t>ПРИЛОЖЕНИЕ Б</w:t>
-        </w:r>
-        <w:r>
-          <w:rPr>
-            <w:noProof/>
-            <w:webHidden/>
-          </w:rPr>
-          <w:tab/>
-        </w:r>
-        <w:r>
-          <w:rPr>
-            <w:noProof/>
-            <w:webHidden/>
-          </w:rPr>
-          <w:fldChar w:fldCharType="begin"/>
-        </w:r>
-        <w:r>
-          <w:rPr>
-            <w:noProof/>
-            <w:webHidden/>
-          </w:rPr>
-          <w:instrText xml:space="preserve"> PAGEREF _Toc241913983 \h </w:instrText>
+          <w:instrText xml:space="preserve"> PAGEREF _Toc241934343 \h </w:instrText>
         </w:r>
         <w:r>
           <w:rPr>
@@ -1272,7 +858,7 @@
     </w:p>
     <w:p>
       <w:pPr>
-        <w:pStyle w:val="12"/>
+        <w:pStyle w:val="22"/>
         <w:tabs>
           <w:tab w:val="right" w:leader="dot" w:pos="9345"/>
         </w:tabs>
@@ -1280,14 +866,14 @@
           <w:noProof/>
         </w:rPr>
       </w:pPr>
-      <w:hyperlink w:anchor="_Toc241913984" w:history="1">
+      <w:hyperlink w:anchor="_Toc241934344" w:history="1">
         <w:r>
           <w:rPr>
             <w:rStyle w:val="af"/>
             <w:b/>
             <w:noProof/>
           </w:rPr>
-          <w:t>ПРИЛОЖЕНИЕ В</w:t>
+          <w:t>2.8 Проверка расчетов и ограничения</w:t>
         </w:r>
         <w:r>
           <w:rPr>
@@ -1308,7 +894,7 @@
             <w:noProof/>
             <w:webHidden/>
           </w:rPr>
-          <w:instrText xml:space="preserve"> PAGEREF _Toc241913984 \h </w:instrText>
+          <w:instrText xml:space="preserve"> PAGEREF _Toc241934344 \h </w:instrText>
         </w:r>
         <w:r>
           <w:rPr>
@@ -1341,6 +927,420 @@
     </w:p>
     <w:p>
       <w:pPr>
+        <w:pStyle w:val="12"/>
+        <w:tabs>
+          <w:tab w:val="right" w:leader="dot" w:pos="9345"/>
+        </w:tabs>
+        <w:rPr>
+          <w:noProof/>
+        </w:rPr>
+      </w:pPr>
+      <w:hyperlink w:anchor="_Toc241934345" w:history="1">
+        <w:r>
+          <w:rPr>
+            <w:rStyle w:val="af"/>
+            <w:b/>
+            <w:noProof/>
+          </w:rPr>
+          <w:t>3 ОТВЕТЫ НА КОНТРОЛЬНЫЕ ВОПРОСЫ</w:t>
+        </w:r>
+        <w:r>
+          <w:rPr>
+            <w:noProof/>
+            <w:webHidden/>
+          </w:rPr>
+          <w:tab/>
+        </w:r>
+        <w:r>
+          <w:rPr>
+            <w:noProof/>
+            <w:webHidden/>
+          </w:rPr>
+          <w:fldChar w:fldCharType="begin"/>
+        </w:r>
+        <w:r>
+          <w:rPr>
+            <w:noProof/>
+            <w:webHidden/>
+          </w:rPr>
+          <w:instrText xml:space="preserve"> PAGEREF _Toc241934345 \h </w:instrText>
+        </w:r>
+        <w:r>
+          <w:rPr>
+            <w:noProof/>
+            <w:webHidden/>
+          </w:rPr>
+        </w:r>
+        <w:r>
+          <w:rPr>
+            <w:noProof/>
+            <w:webHidden/>
+          </w:rPr>
+          <w:fldChar w:fldCharType="separate"/>
+        </w:r>
+        <w:r>
+          <w:rPr>
+            <w:noProof/>
+            <w:webHidden/>
+          </w:rPr>
+          <w:t>26</w:t>
+        </w:r>
+        <w:r>
+          <w:rPr>
+            <w:noProof/>
+            <w:webHidden/>
+          </w:rPr>
+          <w:fldChar w:fldCharType="end"/>
+        </w:r>
+      </w:hyperlink>
+    </w:p>
+    <w:p>
+      <w:pPr>
+        <w:pStyle w:val="12"/>
+        <w:tabs>
+          <w:tab w:val="right" w:leader="dot" w:pos="9345"/>
+        </w:tabs>
+        <w:rPr>
+          <w:noProof/>
+        </w:rPr>
+      </w:pPr>
+      <w:hyperlink w:anchor="_Toc241934346" w:history="1">
+        <w:r>
+          <w:rPr>
+            <w:rStyle w:val="af"/>
+            <w:b/>
+            <w:noProof/>
+          </w:rPr>
+          <w:t>ВЫВОДЫ</w:t>
+        </w:r>
+        <w:r>
+          <w:rPr>
+            <w:noProof/>
+            <w:webHidden/>
+          </w:rPr>
+          <w:tab/>
+        </w:r>
+        <w:r>
+          <w:rPr>
+            <w:noProof/>
+            <w:webHidden/>
+          </w:rPr>
+          <w:fldChar w:fldCharType="begin"/>
+        </w:r>
+        <w:r>
+          <w:rPr>
+            <w:noProof/>
+            <w:webHidden/>
+          </w:rPr>
+          <w:instrText xml:space="preserve"> PAGEREF _Toc241934346 \h </w:instrText>
+        </w:r>
+        <w:r>
+          <w:rPr>
+            <w:noProof/>
+            <w:webHidden/>
+          </w:rPr>
+        </w:r>
+        <w:r>
+          <w:rPr>
+            <w:noProof/>
+            <w:webHidden/>
+          </w:rPr>
+          <w:fldChar w:fldCharType="separate"/>
+        </w:r>
+        <w:r>
+          <w:rPr>
+            <w:noProof/>
+            <w:webHidden/>
+          </w:rPr>
+          <w:t>27</w:t>
+        </w:r>
+        <w:r>
+          <w:rPr>
+            <w:noProof/>
+            <w:webHidden/>
+          </w:rPr>
+          <w:fldChar w:fldCharType="end"/>
+        </w:r>
+      </w:hyperlink>
+    </w:p>
+    <w:p>
+      <w:pPr>
+        <w:pStyle w:val="12"/>
+        <w:tabs>
+          <w:tab w:val="right" w:leader="dot" w:pos="9345"/>
+        </w:tabs>
+        <w:rPr>
+          <w:noProof/>
+        </w:rPr>
+      </w:pPr>
+      <w:hyperlink w:anchor="_Toc241934347" w:history="1">
+        <w:r>
+          <w:rPr>
+            <w:rStyle w:val="af"/>
+            <w:b/>
+            <w:noProof/>
+          </w:rPr>
+          <w:t>СПИСОК ИСПОЛЬЗОВАННЫХ ИСТОЧНИКОВ</w:t>
+        </w:r>
+        <w:r>
+          <w:rPr>
+            <w:noProof/>
+            <w:webHidden/>
+          </w:rPr>
+          <w:tab/>
+        </w:r>
+        <w:r>
+          <w:rPr>
+            <w:noProof/>
+            <w:webHidden/>
+          </w:rPr>
+          <w:fldChar w:fldCharType="begin"/>
+        </w:r>
+        <w:r>
+          <w:rPr>
+            <w:noProof/>
+            <w:webHidden/>
+          </w:rPr>
+          <w:instrText xml:space="preserve"> PAGEREF _Toc241934347 \h </w:instrText>
+        </w:r>
+        <w:r>
+          <w:rPr>
+            <w:noProof/>
+            <w:webHidden/>
+          </w:rPr>
+        </w:r>
+        <w:r>
+          <w:rPr>
+            <w:noProof/>
+            <w:webHidden/>
+          </w:rPr>
+          <w:fldChar w:fldCharType="separate"/>
+        </w:r>
+        <w:r>
+          <w:rPr>
+            <w:noProof/>
+            <w:webHidden/>
+          </w:rPr>
+          <w:t>28</w:t>
+        </w:r>
+        <w:r>
+          <w:rPr>
+            <w:noProof/>
+            <w:webHidden/>
+          </w:rPr>
+          <w:fldChar w:fldCharType="end"/>
+        </w:r>
+      </w:hyperlink>
+    </w:p>
+    <w:p>
+      <w:pPr>
+        <w:pStyle w:val="12"/>
+        <w:tabs>
+          <w:tab w:val="right" w:leader="dot" w:pos="9345"/>
+        </w:tabs>
+        <w:rPr>
+          <w:noProof/>
+        </w:rPr>
+      </w:pPr>
+      <w:hyperlink w:anchor="_Toc241934348" w:history="1">
+        <w:r>
+          <w:rPr>
+            <w:rStyle w:val="af"/>
+            <w:b/>
+            <w:noProof/>
+          </w:rPr>
+          <w:t>ПРИЛОЖЕНИЕ А</w:t>
+        </w:r>
+        <w:r>
+          <w:rPr>
+            <w:noProof/>
+            <w:webHidden/>
+          </w:rPr>
+          <w:tab/>
+        </w:r>
+        <w:r>
+          <w:rPr>
+            <w:noProof/>
+            <w:webHidden/>
+          </w:rPr>
+          <w:fldChar w:fldCharType="begin"/>
+        </w:r>
+        <w:r>
+          <w:rPr>
+            <w:noProof/>
+            <w:webHidden/>
+          </w:rPr>
+          <w:instrText xml:space="preserve"> PAGEREF _Toc241934348 \h </w:instrText>
+        </w:r>
+        <w:r>
+          <w:rPr>
+            <w:noProof/>
+            <w:webHidden/>
+          </w:rPr>
+        </w:r>
+        <w:r>
+          <w:rPr>
+            <w:noProof/>
+            <w:webHidden/>
+          </w:rPr>
+          <w:fldChar w:fldCharType="separate"/>
+        </w:r>
+        <w:r>
+          <w:rPr>
+            <w:noProof/>
+            <w:webHidden/>
+          </w:rPr>
+          <w:t>29</w:t>
+        </w:r>
+        <w:r>
+          <w:rPr>
+            <w:noProof/>
+            <w:webHidden/>
+          </w:rPr>
+          <w:fldChar w:fldCharType="end"/>
+        </w:r>
+      </w:hyperlink>
+    </w:p>
+    <w:p>
+      <w:pPr>
+        <w:pStyle w:val="12"/>
+        <w:tabs>
+          <w:tab w:val="right" w:leader="dot" w:pos="9345"/>
+        </w:tabs>
+        <w:rPr>
+          <w:noProof/>
+        </w:rPr>
+      </w:pPr>
+      <w:hyperlink w:anchor="_Toc241934349" w:history="1">
+        <w:r>
+          <w:rPr>
+            <w:rStyle w:val="af"/>
+            <w:b/>
+            <w:noProof/>
+          </w:rPr>
+          <w:t>ПРИЛОЖЕНИЕ Б</w:t>
+        </w:r>
+        <w:r>
+          <w:rPr>
+            <w:noProof/>
+            <w:webHidden/>
+          </w:rPr>
+          <w:tab/>
+        </w:r>
+        <w:r>
+          <w:rPr>
+            <w:noProof/>
+            <w:webHidden/>
+          </w:rPr>
+          <w:fldChar w:fldCharType="begin"/>
+        </w:r>
+        <w:r>
+          <w:rPr>
+            <w:noProof/>
+            <w:webHidden/>
+          </w:rPr>
+          <w:instrText xml:space="preserve"> PAGEREF _Toc241934349 \h </w:instrText>
+        </w:r>
+        <w:r>
+          <w:rPr>
+            <w:noProof/>
+            <w:webHidden/>
+          </w:rPr>
+        </w:r>
+        <w:r>
+          <w:rPr>
+            <w:noProof/>
+            <w:webHidden/>
+          </w:rPr>
+          <w:fldChar w:fldCharType="separate"/>
+        </w:r>
+        <w:r>
+          <w:rPr>
+            <w:noProof/>
+            <w:webHidden/>
+          </w:rPr>
+          <w:t>30</w:t>
+        </w:r>
+        <w:r>
+          <w:rPr>
+            <w:noProof/>
+            <w:webHidden/>
+          </w:rPr>
+          <w:fldChar w:fldCharType="end"/>
+        </w:r>
+      </w:hyperlink>
+    </w:p>
+    <w:p>
+      <w:pPr>
+        <w:pStyle w:val="12"/>
+        <w:tabs>
+          <w:tab w:val="right" w:leader="dot" w:pos="9345"/>
+        </w:tabs>
+        <w:rPr>
+          <w:noProof/>
+        </w:rPr>
+      </w:pPr>
+      <w:hyperlink w:anchor="_Toc241934350" w:history="1">
+        <w:r>
+          <w:rPr>
+            <w:rStyle w:val="af"/>
+            <w:b/>
+            <w:noProof/>
+          </w:rPr>
+          <w:t>ПРИЛОЖЕНИЕ В</w:t>
+        </w:r>
+        <w:r>
+          <w:rPr>
+            <w:noProof/>
+            <w:webHidden/>
+          </w:rPr>
+          <w:tab/>
+        </w:r>
+        <w:r>
+          <w:rPr>
+            <w:noProof/>
+            <w:webHidden/>
+          </w:rPr>
+          <w:fldChar w:fldCharType="begin"/>
+        </w:r>
+        <w:r>
+          <w:rPr>
+            <w:noProof/>
+            <w:webHidden/>
+          </w:rPr>
+          <w:instrText xml:space="preserve"> PAGEREF _Toc241934350 \h </w:instrText>
+        </w:r>
+        <w:r>
+          <w:rPr>
+            <w:noProof/>
+            <w:webHidden/>
+          </w:rPr>
+        </w:r>
+        <w:r>
+          <w:rPr>
+            <w:noProof/>
+            <w:webHidden/>
+          </w:rPr>
+          <w:fldChar w:fldCharType="separate"/>
+        </w:r>
+        <w:r>
+          <w:rPr>
+            <w:noProof/>
+            <w:webHidden/>
+          </w:rPr>
+          <w:t>31</w:t>
+        </w:r>
+        <w:r>
+          <w:rPr>
+            <w:noProof/>
+            <w:webHidden/>
+          </w:rPr>
+          <w:fldChar w:fldCharType="end"/>
+        </w:r>
+      </w:hyperlink>
+    </w:p>
+    <w:p>
+      <w:pPr>
         <w:pStyle w:val="11"/>
       </w:pPr>
       <w:r>
@@ -1354,7 +1354,7 @@
         <w:spacing w:before="0" w:after="360" w:line="360" w:lineRule="exact"/>
         <w:ind w:firstLine="709"/>
       </w:pPr>
-      <w:bookmarkStart w:id="1" w:name="_Toc241913969"/>
+      <w:bookmarkStart w:id="1" w:name="_Toc241934335"/>
       <w:r>
         <w:rPr>
           <w:b/>
@@ -1441,7 +1441,7 @@
         <w:rPr>
           <w:sz w:val="28"/>
         </w:rPr>
-        <w:t xml:space="preserve"> просмотренным страницам и расчетам предыдущих работ и являются допущениями аналитика (Д-26); числа рынка, цен и воронки взяты из ЛР2-3, числа конкурентов - из ЛР4 и ЛР5. Прототип в </w:t>
+        <w:t xml:space="preserve"> просмотренным страницам и расчетам предыдущих работ и являются допущениями аналитика (Д-26); числа рынка, цен и воронки взяты из ЛР2-3, числа конкурентов - из ЛР4 и ЛР5. Прототип сайта создан в </w:t>
       </w:r>
       <w:r>
         <w:rPr>
@@ -1454,7 +1454,7 @@
         <w:rPr>
           <w:sz w:val="28"/>
         </w:rPr>
-        <w:t xml:space="preserve"> не создан (причина и порядок действий - в приложении Б); вместо него приведены схемы ключевых экранов.</w:t>
+        <w:t xml:space="preserve"> (раздел 2.5.1), схемы ключевых экранов приложения приведены в разделе 2.5, доработка прототипа - в приложении Б.</w:t>
       </w:r>
     </w:p>
     <w:p>
@@ -1465,7 +1465,7 @@
         <w:ind w:firstLine="709"/>
       </w:pPr>
       <w:bookmarkStart w:id="2" w:name="_b608aa976fc82a0faaf3b83f58c735968afd03b"/>
-      <w:bookmarkStart w:id="3" w:name="_Toc241913970"/>
+      <w:bookmarkStart w:id="3" w:name="_Toc241934336"/>
       <w:bookmarkEnd w:id="0"/>
       <w:r>
         <w:rPr>
@@ -1495,19 +1495,20 @@
           <w:i/>
           <w:sz w:val="28"/>
         </w:rPr>
-        <w:t>Excel</w:t>
-      </w:r>
-      <w:r>
-        <w:rPr>
-          <w:sz w:val="28"/>
-        </w:rPr>
-        <w:t xml:space="preserve"> и неза</w:t>
-      </w:r>
-      <w:r>
-        <w:rPr>
-          <w:sz w:val="28"/>
-        </w:rPr>
-        <w:t xml:space="preserve">висимо пересчитаны на </w:t>
+        <w:t>Ex</w:t>
+      </w:r>
+      <w:r>
+        <w:rPr>
+          <w:i/>
+          <w:sz w:val="28"/>
+        </w:rPr>
+        <w:t>cel</w:t>
+      </w:r>
+      <w:r>
+        <w:rPr>
+          <w:sz w:val="28"/>
+        </w:rPr>
+        <w:t xml:space="preserve"> и независимо пересчитаны на </w:t>
       </w:r>
       <w:r>
         <w:rPr>
@@ -1530,7 +1531,7 @@
         <w:ind w:firstLine="709"/>
       </w:pPr>
       <w:bookmarkStart w:id="4" w:name="_ce8c8db2bd1f021f701413a98bce88b0dc0ff35"/>
-      <w:bookmarkStart w:id="5" w:name="_Toc241913971"/>
+      <w:bookmarkStart w:id="5" w:name="_Toc241934337"/>
       <w:r>
         <w:rPr>
           <w:b/>
@@ -1551,7 +1552,13 @@
         <w:rPr>
           <w:sz w:val="28"/>
         </w:rPr>
-        <w:t>Банк источников объединяет отчеты ЛР1-ЛР5, страницы конкурентов и документы проекта. Он является общей доказательной базой для всех книг: каждый вывод далее имеет ссылку на запись банка.</w:t>
+        <w:t>Банк источников объединяет отчеты ЛР1-ЛР5, страницы конкурентов и документы проекта. Он является общей доказательной базой для всех книг: каждый вывод далее имеет ссылку на запис</w:t>
+      </w:r>
+      <w:r>
+        <w:rPr>
+          <w:sz w:val="28"/>
+        </w:rPr>
+        <w:t>ь банка.</w:t>
       </w:r>
     </w:p>
     <w:p>
@@ -2701,13 +2708,7 @@
               <w:rPr>
                 <w:sz w:val="24"/>
               </w:rPr>
-              <w:t xml:space="preserve">, </w:t>
-            </w:r>
-            <w:r>
-              <w:rPr>
-                <w:sz w:val="24"/>
-              </w:rPr>
-              <w:t>нулевое хранение данных</w:t>
+              <w:t>, нулевое хранение данных</w:t>
             </w:r>
           </w:p>
         </w:tc>
@@ -3099,7 +3100,13 @@
               <w:rPr>
                 <w:sz w:val="24"/>
               </w:rPr>
-              <w:t>-надстройки лидеров сами требуют проверки</w:t>
+              <w:t xml:space="preserve">-надстройки лидеров сами требуют </w:t>
+            </w:r>
+            <w:r>
+              <w:rPr>
+                <w:sz w:val="24"/>
+              </w:rPr>
+              <w:t>проверки</w:t>
             </w:r>
           </w:p>
         </w:tc>
@@ -3572,7 +3579,7 @@
         <w:ind w:firstLine="709"/>
       </w:pPr>
       <w:bookmarkStart w:id="6" w:name="_d6b1e0606ccffbfea524c7b8890d7424ae6ef8d"/>
-      <w:bookmarkStart w:id="7" w:name="_Toc241913972"/>
+      <w:bookmarkStart w:id="7" w:name="_Toc241934338"/>
       <w:bookmarkEnd w:id="4"/>
       <w:r>
         <w:rPr>
@@ -8290,7 +8297,7 @@
         <w:ind w:firstLine="709"/>
       </w:pPr>
       <w:bookmarkStart w:id="8" w:name="_7b60cb03201c02c98ad01f5cee41d479977e884"/>
-      <w:bookmarkStart w:id="9" w:name="_Toc241913973"/>
+      <w:bookmarkStart w:id="9" w:name="_Toc241934339"/>
       <w:bookmarkEnd w:id="6"/>
       <w:r>
         <w:rPr>
@@ -8361,7 +8368,7 @@
           <w:sz w:val="28"/>
         </w:rPr>
         <w:drawing>
-          <wp:inline distT="0" distB="0" distL="0" distR="0" wp14:anchorId="6DE8195E" wp14:editId="7C22255A">
+          <wp:inline distT="0" distB="0" distL="0" distR="0" wp14:anchorId="73A3FC18" wp14:editId="750B18DB">
             <wp:extent cx="5334000" cy="3382536"/>
             <wp:effectExtent l="0" t="0" r="0" b="0"/>
             <wp:docPr id="13" name="Picture"/>
@@ -10676,7 +10683,7 @@
         <w:ind w:firstLine="709"/>
       </w:pPr>
       <w:bookmarkStart w:id="10" w:name="_519d46f9ff7923648cbfef21e26057944381813"/>
-      <w:bookmarkStart w:id="11" w:name="_Toc241913974"/>
+      <w:bookmarkStart w:id="11" w:name="_Toc241934340"/>
       <w:bookmarkEnd w:id="8"/>
       <w:r>
         <w:rPr>
@@ -15522,7 +15529,7 @@
           <w:sz w:val="28"/>
         </w:rPr>
         <w:drawing>
-          <wp:inline distT="0" distB="0" distL="0" distR="0" wp14:anchorId="44FFF7CA" wp14:editId="2AD1D13B">
+          <wp:inline distT="0" distB="0" distL="0" distR="0" wp14:anchorId="45C57861" wp14:editId="43A7ED97">
             <wp:extent cx="5334000" cy="3122341"/>
             <wp:effectExtent l="0" t="0" r="0" b="0"/>
             <wp:docPr id="17" name="Picture"/>
@@ -16495,7 +16502,7 @@
         <w:ind w:firstLine="709"/>
       </w:pPr>
       <w:bookmarkStart w:id="12" w:name="_ccc7c944b68a9100d34a943bc02da4feb181aee"/>
-      <w:bookmarkStart w:id="13" w:name="_Toc241913975"/>
+      <w:bookmarkStart w:id="13" w:name="_Toc241934341"/>
       <w:bookmarkEnd w:id="10"/>
       <w:r>
         <w:rPr>
@@ -19610,7 +19617,7 @@
         </w:rPr>
         <w:lastRenderedPageBreak/>
         <w:drawing>
-          <wp:inline distT="0" distB="0" distL="0" distR="0" wp14:anchorId="4E549DE6" wp14:editId="1F3A55C0">
+          <wp:inline distT="0" distB="0" distL="0" distR="0" wp14:anchorId="1C529738" wp14:editId="277FFF42">
             <wp:extent cx="5334000" cy="6114585"/>
             <wp:effectExtent l="0" t="0" r="0" b="0"/>
             <wp:docPr id="21" name="Picture"/>
@@ -19696,7 +19703,7 @@
         <w:rPr>
           <w:sz w:val="28"/>
         </w:rPr>
-        <w:t xml:space="preserve">иев страницами и экранами равно 80 % (восемь из десяти; не покрыты настройка правил команды и один вспомогательный сценарий), интегральная готовность интерфейсной модели - 95 %. Прототип в </w:t>
+        <w:t xml:space="preserve">иев страницами и экранами равно 80 % (восемь из десяти; не покрыты настройка правил команды и один вспомогательный сценарий), интегральная готовность интерфейсной модели - 95 %. Схемы экранов подготовлены как основа; кликабельный прототип сайта выполнен в </w:t>
       </w:r>
       <w:r>
         <w:rPr>
@@ -19709,46 +19716,30 @@
         <w:rPr>
           <w:sz w:val="28"/>
         </w:rPr>
-        <w:t xml:space="preserve"> не создан: схемы экранов подготовлены как основа, порядок пер</w:t>
-      </w:r>
-      <w:r>
-        <w:rPr>
-          <w:sz w:val="28"/>
-        </w:rPr>
-        <w:t xml:space="preserve">еноса в </w:t>
-      </w:r>
-      <w:r>
-        <w:rPr>
-          <w:i/>
-          <w:sz w:val="28"/>
-        </w:rPr>
-        <w:t>Figma</w:t>
-      </w:r>
-      <w:r>
-        <w:rPr>
-          <w:sz w:val="28"/>
-        </w:rPr>
-        <w:t xml:space="preserve"> описан в приложении Б.</w:t>
+        <w:t xml:space="preserve"> и описан ниже.</w:t>
       </w:r>
     </w:p>
     <w:p>
       <w:pPr>
-        <w:pStyle w:val="2"/>
+        <w:pStyle w:val="3"/>
         <w:spacing w:before="360" w:after="360" w:line="360" w:lineRule="exact"/>
         <w:ind w:firstLine="709"/>
       </w:pPr>
-      <w:bookmarkStart w:id="14" w:name="_fc51781abcc4857bf621eab6b8861ea54729fed"/>
-      <w:bookmarkStart w:id="15" w:name="_Toc241913976"/>
-      <w:bookmarkEnd w:id="12"/>
+      <w:bookmarkStart w:id="14" w:name="_c70c6e0caac8fcb54bc27cedae9e650f57066d7"/>
       <w:r>
         <w:rPr>
           <w:b/>
-          <w:sz w:val="28"/>
         </w:rPr>
         <w:lastRenderedPageBreak/>
-        <w:t>2.6 Деление разработки на релизы</w:t>
-      </w:r>
-      <w:bookmarkEnd w:id="15"/>
+        <w:t xml:space="preserve">2.5.1 Прототип сайта в </w:t>
+      </w:r>
+      <w:r>
+        <w:rPr>
+          <w:b/>
+          <w:i/>
+        </w:rPr>
+        <w:t>Figma</w:t>
+      </w:r>
     </w:p>
     <w:p>
       <w:pPr>
@@ -19761,13 +19752,52 @@
         <w:rPr>
           <w:sz w:val="28"/>
         </w:rPr>
-        <w:t>Методика [5] оценивает 24 единицы разработки по десяти показателям и относит их к первому релизу, следующим релизам или к гипотезам. Единица попадает в первый релиз, если она связана с ц</w:t>
-      </w:r>
-      <w:r>
-        <w:rPr>
-          <w:sz w:val="28"/>
-        </w:rPr>
-        <w:t>енностным предложением, доходом, доказательна и ее потеря критична, либо если балл первого релиза не ниже 3,7.</w:t>
+        <w:t xml:space="preserve">Прототип создан в </w:t>
+      </w:r>
+      <w:r>
+        <w:rPr>
+          <w:i/>
+          <w:sz w:val="28"/>
+        </w:rPr>
+        <w:t>Figma</w:t>
+      </w:r>
+      <w:r>
+        <w:rPr>
+          <w:sz w:val="28"/>
+        </w:rPr>
+        <w:t xml:space="preserve"> по методическому пособию [8] и размещен по ссылке https://www.figma.com/design/QEj3FhylPe0fG2rDef7bMy/TableMind-project. Файл содержит три страницы сайта шириной 1440 пикселей (главн</w:t>
+      </w:r>
+      <w:r>
+        <w:rPr>
+          <w:sz w:val="28"/>
+        </w:rPr>
+        <w:t>ая, продукт, контакты) и лист «</w:t>
+      </w:r>
+      <w:r>
+        <w:rPr>
+          <w:i/>
+          <w:sz w:val="28"/>
+        </w:rPr>
+        <w:t>Elements</w:t>
+      </w:r>
+      <w:r>
+        <w:rPr>
+          <w:sz w:val="28"/>
+        </w:rPr>
+        <w:t xml:space="preserve">» с палитрой, шапкой и подвалом, из которых страницы собраны. Содержимое файла прочитано через подключенный инструмент </w:t>
+      </w:r>
+      <w:r>
+        <w:rPr>
+          <w:i/>
+          <w:sz w:val="28"/>
+        </w:rPr>
+        <w:t>Figma</w:t>
+      </w:r>
+      <w:r>
+        <w:rPr>
+          <w:sz w:val="28"/>
+        </w:rPr>
+        <w:t xml:space="preserve"> и сопоставлено со страницами и экранами раздела 2.5.</w:t>
       </w:r>
     </w:p>
     <w:p>
@@ -19781,7 +19811,887 @@
         <w:rPr>
           <w:sz w:val="28"/>
         </w:rPr>
-        <w:t>В таблице 17 представлено: состав релизов по единицам разработки.</w:t>
+        <w:t xml:space="preserve">На рисунке 4 показано: прототип </w:t>
+      </w:r>
+      <w:r>
+        <w:rPr>
+          <w:i/>
+          <w:sz w:val="28"/>
+        </w:rPr>
+        <w:t>Figma</w:t>
+      </w:r>
+      <w:r>
+        <w:rPr>
+          <w:sz w:val="28"/>
+        </w:rPr>
+        <w:t xml:space="preserve">: </w:t>
+      </w:r>
+      <w:r>
+        <w:rPr>
+          <w:sz w:val="28"/>
+        </w:rPr>
+        <w:t xml:space="preserve">страница </w:t>
+      </w:r>
+      <w:r>
+        <w:rPr>
+          <w:i/>
+          <w:sz w:val="28"/>
+        </w:rPr>
+        <w:t>Home</w:t>
+      </w:r>
+      <w:r>
+        <w:rPr>
+          <w:sz w:val="28"/>
+        </w:rPr>
+        <w:t xml:space="preserve"> (главная).</w:t>
+      </w:r>
+    </w:p>
+    <w:p>
+      <w:pPr>
+        <w:pStyle w:val="a0"/>
+        <w:keepNext/>
+        <w:spacing w:before="0" w:after="0"/>
+        <w:jc w:val="center"/>
+      </w:pPr>
+      <w:r>
+        <w:rPr>
+          <w:noProof/>
+          <w:sz w:val="28"/>
+        </w:rPr>
+        <w:lastRenderedPageBreak/>
+        <w:drawing>
+          <wp:inline distT="0" distB="0" distL="0" distR="0" wp14:anchorId="74705E7D" wp14:editId="15E5E79C">
+            <wp:extent cx="5334000" cy="9610810"/>
+            <wp:effectExtent l="0" t="0" r="0" b="0"/>
+            <wp:docPr id="24" name="Picture"/>
+            <wp:cNvGraphicFramePr/>
+            <a:graphic xmlns:a="http://schemas.openxmlformats.org/drawingml/2006/main">
+              <a:graphicData uri="http://schemas.openxmlformats.org/drawingml/2006/picture">
+                <pic:pic xmlns:pic="http://schemas.openxmlformats.org/drawingml/2006/picture">
+                  <pic:nvPicPr>
+                    <pic:cNvPr id="25" name="Picture" descr="Скриншоты/figma_01_Home.png"/>
+                    <pic:cNvPicPr>
+                      <a:picLocks noChangeAspect="1" noChangeArrowheads="1"/>
+                    </pic:cNvPicPr>
+                  </pic:nvPicPr>
+                  <pic:blipFill>
+                    <a:blip r:embed="rId10"/>
+                    <a:stretch>
+                      <a:fillRect/>
+                    </a:stretch>
+                  </pic:blipFill>
+                  <pic:spPr bwMode="auto">
+                    <a:xfrm>
+                      <a:off x="0" y="0"/>
+                      <a:ext cx="5334000" cy="9610810"/>
+                    </a:xfrm>
+                    <a:prstGeom prst="rect">
+                      <a:avLst/>
+                    </a:prstGeom>
+                    <a:noFill/>
+                    <a:ln w="9525">
+                      <a:noFill/>
+                      <a:headEnd/>
+                      <a:tailEnd/>
+                    </a:ln>
+                  </pic:spPr>
+                </pic:pic>
+              </a:graphicData>
+            </a:graphic>
+          </wp:inline>
+        </w:drawing>
+      </w:r>
+    </w:p>
+    <w:p>
+      <w:pPr>
+        <w:pStyle w:val="a0"/>
+        <w:spacing w:before="0" w:after="0" w:line="360" w:lineRule="exact"/>
+        <w:jc w:val="center"/>
+      </w:pPr>
+      <w:r>
+        <w:rPr>
+          <w:sz w:val="28"/>
+        </w:rPr>
+        <w:lastRenderedPageBreak/>
+        <w:t xml:space="preserve">Рисунок 4 – Прототип </w:t>
+      </w:r>
+      <w:r>
+        <w:rPr>
+          <w:i/>
+          <w:sz w:val="28"/>
+        </w:rPr>
+        <w:t>Figma</w:t>
+      </w:r>
+      <w:r>
+        <w:rPr>
+          <w:sz w:val="28"/>
+        </w:rPr>
+        <w:t xml:space="preserve">: страница </w:t>
+      </w:r>
+      <w:r>
+        <w:rPr>
+          <w:i/>
+          <w:sz w:val="28"/>
+        </w:rPr>
+        <w:t>Home</w:t>
+      </w:r>
+      <w:r>
+        <w:rPr>
+          <w:sz w:val="28"/>
+        </w:rPr>
+        <w:t xml:space="preserve"> (главная)</w:t>
+      </w:r>
+    </w:p>
+    <w:p>
+      <w:pPr>
+        <w:pStyle w:val="a0"/>
+        <w:spacing w:before="0" w:after="0" w:line="360" w:lineRule="exact"/>
+        <w:ind w:firstLine="709"/>
+        <w:jc w:val="both"/>
+      </w:pPr>
+      <w:r>
+        <w:rPr>
+          <w:sz w:val="28"/>
+        </w:rPr>
+        <w:t>Главная страница состоит из шапки с кнопкой «</w:t>
+      </w:r>
+      <w:r>
+        <w:rPr>
+          <w:i/>
+          <w:sz w:val="28"/>
+        </w:rPr>
+        <w:t>Request</w:t>
+      </w:r>
+      <w:r>
+        <w:rPr>
+          <w:sz w:val="28"/>
+        </w:rPr>
+        <w:t xml:space="preserve"> </w:t>
+      </w:r>
+      <w:r>
+        <w:rPr>
+          <w:i/>
+          <w:sz w:val="28"/>
+        </w:rPr>
+        <w:t>access</w:t>
+      </w:r>
+      <w:r>
+        <w:rPr>
+          <w:sz w:val="28"/>
+        </w:rPr>
+        <w:t>», первого экрана с заголовком и иллюстрацией, блока «</w:t>
+      </w:r>
+      <w:r>
+        <w:rPr>
+          <w:i/>
+          <w:sz w:val="28"/>
+        </w:rPr>
+        <w:t>Three</w:t>
+      </w:r>
+      <w:r>
+        <w:rPr>
+          <w:sz w:val="28"/>
+        </w:rPr>
+        <w:t xml:space="preserve"> </w:t>
+      </w:r>
+      <w:r>
+        <w:rPr>
+          <w:i/>
+          <w:sz w:val="28"/>
+        </w:rPr>
+        <w:t>operators</w:t>
+      </w:r>
+      <w:r>
+        <w:rPr>
+          <w:sz w:val="28"/>
+        </w:rPr>
+        <w:t xml:space="preserve">. </w:t>
+      </w:r>
+      <w:r>
+        <w:rPr>
+          <w:i/>
+          <w:sz w:val="28"/>
+        </w:rPr>
+        <w:t>One</w:t>
+      </w:r>
+      <w:r>
+        <w:rPr>
+          <w:sz w:val="28"/>
+        </w:rPr>
+        <w:t xml:space="preserve"> </w:t>
+      </w:r>
+      <w:r>
+        <w:rPr>
+          <w:i/>
+          <w:sz w:val="28"/>
+        </w:rPr>
+        <w:t>agent</w:t>
+      </w:r>
+      <w:r>
+        <w:rPr>
+          <w:sz w:val="28"/>
+        </w:rPr>
+        <w:t>» с тремя карточками (подключение данн</w:t>
+      </w:r>
+      <w:r>
+        <w:rPr>
+          <w:sz w:val="28"/>
+        </w:rPr>
+        <w:t>ых, интеллектуальный анализ, автоматические результаты), макета редактора с подсказкой агента и подвала. Она соответствует точке входа пути пользователя, но тарифов и примеров ошибок на ней нет.</w:t>
+      </w:r>
+    </w:p>
+    <w:p>
+      <w:pPr>
+        <w:pStyle w:val="a0"/>
+        <w:spacing w:before="0" w:after="0" w:line="360" w:lineRule="exact"/>
+        <w:ind w:firstLine="709"/>
+        <w:jc w:val="both"/>
+      </w:pPr>
+      <w:r>
+        <w:rPr>
+          <w:sz w:val="28"/>
+        </w:rPr>
+        <w:t xml:space="preserve">На рисунке 5 показано: прототип </w:t>
+      </w:r>
+      <w:r>
+        <w:rPr>
+          <w:i/>
+          <w:sz w:val="28"/>
+        </w:rPr>
+        <w:t>Figma</w:t>
+      </w:r>
+      <w:r>
+        <w:rPr>
+          <w:sz w:val="28"/>
+        </w:rPr>
+        <w:t xml:space="preserve">: страница </w:t>
+      </w:r>
+      <w:r>
+        <w:rPr>
+          <w:i/>
+          <w:sz w:val="28"/>
+        </w:rPr>
+        <w:t>Product</w:t>
+      </w:r>
+      <w:r>
+        <w:rPr>
+          <w:sz w:val="28"/>
+        </w:rPr>
+        <w:t xml:space="preserve"> (прод</w:t>
+      </w:r>
+      <w:r>
+        <w:rPr>
+          <w:sz w:val="28"/>
+        </w:rPr>
+        <w:t>укт).</w:t>
+      </w:r>
+    </w:p>
+    <w:p>
+      <w:pPr>
+        <w:pStyle w:val="a0"/>
+        <w:keepNext/>
+        <w:spacing w:before="0" w:after="0"/>
+        <w:jc w:val="center"/>
+      </w:pPr>
+      <w:r>
+        <w:rPr>
+          <w:noProof/>
+          <w:sz w:val="28"/>
+        </w:rPr>
+        <w:lastRenderedPageBreak/>
+        <w:drawing>
+          <wp:inline distT="0" distB="0" distL="0" distR="0" wp14:anchorId="2FF30B70" wp14:editId="1A0A9145">
+            <wp:extent cx="5334000" cy="12458978"/>
+            <wp:effectExtent l="0" t="0" r="0" b="0"/>
+            <wp:docPr id="27" name="Picture"/>
+            <wp:cNvGraphicFramePr/>
+            <a:graphic xmlns:a="http://schemas.openxmlformats.org/drawingml/2006/main">
+              <a:graphicData uri="http://schemas.openxmlformats.org/drawingml/2006/picture">
+                <pic:pic xmlns:pic="http://schemas.openxmlformats.org/drawingml/2006/picture">
+                  <pic:nvPicPr>
+                    <pic:cNvPr id="28" name="Picture" descr="Скриншоты/figma_02_Product.png"/>
+                    <pic:cNvPicPr>
+                      <a:picLocks noChangeAspect="1" noChangeArrowheads="1"/>
+                    </pic:cNvPicPr>
+                  </pic:nvPicPr>
+                  <pic:blipFill>
+                    <a:blip r:embed="rId11"/>
+                    <a:stretch>
+                      <a:fillRect/>
+                    </a:stretch>
+                  </pic:blipFill>
+                  <pic:spPr bwMode="auto">
+                    <a:xfrm>
+                      <a:off x="0" y="0"/>
+                      <a:ext cx="5334000" cy="12458978"/>
+                    </a:xfrm>
+                    <a:prstGeom prst="rect">
+                      <a:avLst/>
+                    </a:prstGeom>
+                    <a:noFill/>
+                    <a:ln w="9525">
+                      <a:noFill/>
+                      <a:headEnd/>
+                      <a:tailEnd/>
+                    </a:ln>
+                  </pic:spPr>
+                </pic:pic>
+              </a:graphicData>
+            </a:graphic>
+          </wp:inline>
+        </w:drawing>
+      </w:r>
+    </w:p>
+    <w:p>
+      <w:pPr>
+        <w:pStyle w:val="a0"/>
+        <w:spacing w:before="0" w:after="0" w:line="360" w:lineRule="exact"/>
+        <w:jc w:val="center"/>
+      </w:pPr>
+      <w:r>
+        <w:rPr>
+          <w:sz w:val="28"/>
+        </w:rPr>
+        <w:lastRenderedPageBreak/>
+        <w:t xml:space="preserve">Рисунок 5 – Прототип </w:t>
+      </w:r>
+      <w:r>
+        <w:rPr>
+          <w:i/>
+          <w:sz w:val="28"/>
+        </w:rPr>
+        <w:t>Figma</w:t>
+      </w:r>
+      <w:r>
+        <w:rPr>
+          <w:sz w:val="28"/>
+        </w:rPr>
+        <w:t xml:space="preserve">: страница </w:t>
+      </w:r>
+      <w:r>
+        <w:rPr>
+          <w:i/>
+          <w:sz w:val="28"/>
+        </w:rPr>
+        <w:t>Product</w:t>
+      </w:r>
+      <w:r>
+        <w:rPr>
+          <w:sz w:val="28"/>
+        </w:rPr>
+        <w:t xml:space="preserve"> (продукт)</w:t>
+      </w:r>
+    </w:p>
+    <w:p>
+      <w:pPr>
+        <w:pStyle w:val="a0"/>
+        <w:spacing w:before="0" w:after="0" w:line="360" w:lineRule="exact"/>
+        <w:ind w:firstLine="709"/>
+        <w:jc w:val="both"/>
+      </w:pPr>
+      <w:r>
+        <w:rPr>
+          <w:sz w:val="28"/>
+        </w:rPr>
+        <w:t xml:space="preserve">Страница продукта показывает работу агента на примере пустой ячейки </w:t>
+      </w:r>
+      <w:r>
+        <w:rPr>
+          <w:i/>
+          <w:sz w:val="28"/>
+        </w:rPr>
+        <w:t>E5</w:t>
+      </w:r>
+      <w:r>
+        <w:rPr>
+          <w:sz w:val="28"/>
+        </w:rPr>
+        <w:t xml:space="preserve"> и предложенной формулы суммы, затем описывает три шага («читает структуру таблицы», «понимает документ», «предлагает и проверяет») и завершается призывом «</w:t>
+      </w:r>
+      <w:r>
+        <w:rPr>
+          <w:i/>
+          <w:sz w:val="28"/>
+        </w:rPr>
+        <w:t>Try</w:t>
+      </w:r>
+      <w:r>
+        <w:rPr>
+          <w:sz w:val="28"/>
+        </w:rPr>
+        <w:t xml:space="preserve"> </w:t>
+      </w:r>
+      <w:r>
+        <w:rPr>
+          <w:i/>
+          <w:sz w:val="28"/>
+        </w:rPr>
+        <w:t>demo</w:t>
+      </w:r>
+      <w:r>
+        <w:rPr>
+          <w:sz w:val="28"/>
+        </w:rPr>
+        <w:t xml:space="preserve">». По назначению она ближе всего к единице </w:t>
+      </w:r>
+      <w:r>
+        <w:rPr>
+          <w:i/>
+          <w:sz w:val="28"/>
+        </w:rPr>
+        <w:t>U-001</w:t>
+      </w:r>
+      <w:r>
+        <w:rPr>
+          <w:sz w:val="28"/>
+        </w:rPr>
+        <w:t>, но пока не содержит примеров реальных ошиб</w:t>
+      </w:r>
+      <w:r>
+        <w:rPr>
+          <w:sz w:val="28"/>
+        </w:rPr>
+        <w:t>ок и доказательства находки.</w:t>
+      </w:r>
+    </w:p>
+    <w:p>
+      <w:pPr>
+        <w:pStyle w:val="a0"/>
+        <w:spacing w:before="0" w:after="0" w:line="360" w:lineRule="exact"/>
+        <w:ind w:firstLine="709"/>
+        <w:jc w:val="both"/>
+      </w:pPr>
+      <w:r>
+        <w:rPr>
+          <w:sz w:val="28"/>
+        </w:rPr>
+        <w:t xml:space="preserve">На рисунке 6 показано: прототип </w:t>
+      </w:r>
+      <w:r>
+        <w:rPr>
+          <w:i/>
+          <w:sz w:val="28"/>
+        </w:rPr>
+        <w:t>Figma</w:t>
+      </w:r>
+      <w:r>
+        <w:rPr>
+          <w:sz w:val="28"/>
+        </w:rPr>
+        <w:t xml:space="preserve">: страница </w:t>
+      </w:r>
+      <w:r>
+        <w:rPr>
+          <w:i/>
+          <w:sz w:val="28"/>
+        </w:rPr>
+        <w:t>Contact</w:t>
+      </w:r>
+      <w:r>
+        <w:rPr>
+          <w:sz w:val="28"/>
+        </w:rPr>
+        <w:t xml:space="preserve"> (контакты).</w:t>
+      </w:r>
+    </w:p>
+    <w:p>
+      <w:pPr>
+        <w:pStyle w:val="a0"/>
+        <w:keepNext/>
+        <w:spacing w:before="0" w:after="0"/>
+        <w:jc w:val="center"/>
+      </w:pPr>
+      <w:r>
+        <w:rPr>
+          <w:noProof/>
+          <w:sz w:val="28"/>
+        </w:rPr>
+        <w:drawing>
+          <wp:inline distT="0" distB="0" distL="0" distR="0" wp14:anchorId="2273C5C8" wp14:editId="4E774898">
+            <wp:extent cx="5334000" cy="5926666"/>
+            <wp:effectExtent l="0" t="0" r="0" b="0"/>
+            <wp:docPr id="30" name="Picture"/>
+            <wp:cNvGraphicFramePr/>
+            <a:graphic xmlns:a="http://schemas.openxmlformats.org/drawingml/2006/main">
+              <a:graphicData uri="http://schemas.openxmlformats.org/drawingml/2006/picture">
+                <pic:pic xmlns:pic="http://schemas.openxmlformats.org/drawingml/2006/picture">
+                  <pic:nvPicPr>
+                    <pic:cNvPr id="31" name="Picture" descr="Скриншоты/figma_03_Contact.png"/>
+                    <pic:cNvPicPr>
+                      <a:picLocks noChangeAspect="1" noChangeArrowheads="1"/>
+                    </pic:cNvPicPr>
+                  </pic:nvPicPr>
+                  <pic:blipFill>
+                    <a:blip r:embed="rId12"/>
+                    <a:stretch>
+                      <a:fillRect/>
+                    </a:stretch>
+                  </pic:blipFill>
+                  <pic:spPr bwMode="auto">
+                    <a:xfrm>
+                      <a:off x="0" y="0"/>
+                      <a:ext cx="5334000" cy="5926666"/>
+                    </a:xfrm>
+                    <a:prstGeom prst="rect">
+                      <a:avLst/>
+                    </a:prstGeom>
+                    <a:noFill/>
+                    <a:ln w="9525">
+                      <a:noFill/>
+                      <a:headEnd/>
+                      <a:tailEnd/>
+                    </a:ln>
+                  </pic:spPr>
+                </pic:pic>
+              </a:graphicData>
+            </a:graphic>
+          </wp:inline>
+        </w:drawing>
+      </w:r>
+    </w:p>
+    <w:p>
+      <w:pPr>
+        <w:pStyle w:val="a0"/>
+        <w:spacing w:before="0" w:after="0" w:line="360" w:lineRule="exact"/>
+        <w:jc w:val="center"/>
+      </w:pPr>
+      <w:r>
+        <w:rPr>
+          <w:sz w:val="28"/>
+        </w:rPr>
+        <w:t xml:space="preserve">Рисунок 6 – Прототип </w:t>
+      </w:r>
+      <w:r>
+        <w:rPr>
+          <w:i/>
+          <w:sz w:val="28"/>
+        </w:rPr>
+        <w:t>Figma</w:t>
+      </w:r>
+      <w:r>
+        <w:rPr>
+          <w:sz w:val="28"/>
+        </w:rPr>
+        <w:t xml:space="preserve">: страница </w:t>
+      </w:r>
+      <w:r>
+        <w:rPr>
+          <w:i/>
+          <w:sz w:val="28"/>
+        </w:rPr>
+        <w:t>Contact</w:t>
+      </w:r>
+      <w:r>
+        <w:rPr>
+          <w:sz w:val="28"/>
+        </w:rPr>
+        <w:t xml:space="preserve"> (контакты)</w:t>
+      </w:r>
+    </w:p>
+    <w:p>
+      <w:pPr>
+        <w:pStyle w:val="a0"/>
+        <w:spacing w:before="0" w:after="0" w:line="360" w:lineRule="exact"/>
+        <w:ind w:firstLine="709"/>
+        <w:jc w:val="both"/>
+      </w:pPr>
+      <w:r>
+        <w:rPr>
+          <w:sz w:val="28"/>
+        </w:rPr>
+        <w:t>Страница контактов содержит форму с полями «</w:t>
+      </w:r>
+      <w:r>
+        <w:rPr>
+          <w:i/>
+          <w:sz w:val="28"/>
+        </w:rPr>
+        <w:t>Name</w:t>
+      </w:r>
+      <w:r>
+        <w:rPr>
+          <w:sz w:val="28"/>
+        </w:rPr>
+        <w:t>», «</w:t>
+      </w:r>
+      <w:r>
+        <w:rPr>
+          <w:i/>
+          <w:sz w:val="28"/>
+        </w:rPr>
+        <w:t>Email</w:t>
+      </w:r>
+      <w:r>
+        <w:rPr>
+          <w:sz w:val="28"/>
+        </w:rPr>
+        <w:t>», «</w:t>
+      </w:r>
+      <w:r>
+        <w:rPr>
+          <w:i/>
+          <w:sz w:val="28"/>
+        </w:rPr>
+        <w:t>Company</w:t>
+      </w:r>
+      <w:r>
+        <w:rPr>
+          <w:sz w:val="28"/>
+        </w:rPr>
+        <w:t xml:space="preserve"> (</w:t>
+      </w:r>
+      <w:r>
+        <w:rPr>
+          <w:i/>
+          <w:sz w:val="28"/>
+        </w:rPr>
+        <w:t>optional</w:t>
+      </w:r>
+      <w:r>
+        <w:rPr>
+          <w:sz w:val="28"/>
+        </w:rPr>
+        <w:t>)», «</w:t>
+      </w:r>
+      <w:r>
+        <w:rPr>
+          <w:i/>
+          <w:sz w:val="28"/>
+        </w:rPr>
+        <w:t>Topic</w:t>
+      </w:r>
+      <w:r>
+        <w:rPr>
+          <w:sz w:val="28"/>
+        </w:rPr>
+        <w:t>» и «</w:t>
+      </w:r>
+      <w:r>
+        <w:rPr>
+          <w:i/>
+          <w:sz w:val="28"/>
+        </w:rPr>
+        <w:t>Message</w:t>
+      </w:r>
+      <w:r>
+        <w:rPr>
+          <w:sz w:val="28"/>
+        </w:rPr>
+        <w:t>»</w:t>
+      </w:r>
+      <w:r>
+        <w:rPr>
+          <w:sz w:val="28"/>
+        </w:rPr>
+        <w:t>, кнопку «</w:t>
+      </w:r>
+      <w:r>
+        <w:rPr>
+          <w:i/>
+          <w:sz w:val="28"/>
+        </w:rPr>
+        <w:t>Send</w:t>
+      </w:r>
+      <w:r>
+        <w:rPr>
+          <w:sz w:val="28"/>
+        </w:rPr>
+        <w:t xml:space="preserve"> </w:t>
+      </w:r>
+      <w:r>
+        <w:rPr>
+          <w:i/>
+          <w:sz w:val="28"/>
+        </w:rPr>
+        <w:t>message</w:t>
+      </w:r>
+      <w:r>
+        <w:rPr>
+          <w:sz w:val="28"/>
+        </w:rPr>
+        <w:t>» и согласие на обработку обращения. Форма может служить основой для листа ожидания и сбора первых регистраций, что напрямую связано с целью 300 регистраций.</w:t>
+      </w:r>
+    </w:p>
+    <w:p>
+      <w:pPr>
+        <w:pStyle w:val="a0"/>
+        <w:spacing w:before="0" w:after="0" w:line="360" w:lineRule="exact"/>
+        <w:ind w:firstLine="709"/>
+        <w:jc w:val="both"/>
+      </w:pPr>
+      <w:r>
+        <w:rPr>
+          <w:sz w:val="28"/>
+        </w:rPr>
+        <w:lastRenderedPageBreak/>
+        <w:t xml:space="preserve">На рисунке 7 показано: прототип </w:t>
+      </w:r>
+      <w:r>
+        <w:rPr>
+          <w:i/>
+          <w:sz w:val="28"/>
+        </w:rPr>
+        <w:t>Figma</w:t>
+      </w:r>
+      <w:r>
+        <w:rPr>
+          <w:sz w:val="28"/>
+        </w:rPr>
+        <w:t xml:space="preserve">: лист </w:t>
+      </w:r>
+      <w:r>
+        <w:rPr>
+          <w:i/>
+          <w:sz w:val="28"/>
+        </w:rPr>
+        <w:t>Elements</w:t>
+      </w:r>
+      <w:r>
+        <w:rPr>
+          <w:sz w:val="28"/>
+        </w:rPr>
+        <w:t xml:space="preserve"> (палитра и компоненты).</w:t>
+      </w:r>
+    </w:p>
+    <w:p>
+      <w:pPr>
+        <w:pStyle w:val="a0"/>
+        <w:keepNext/>
+        <w:spacing w:before="0" w:after="0"/>
+        <w:jc w:val="center"/>
+      </w:pPr>
+      <w:r>
+        <w:rPr>
+          <w:noProof/>
+          <w:sz w:val="28"/>
+        </w:rPr>
+        <w:drawing>
+          <wp:inline distT="0" distB="0" distL="0" distR="0" wp14:anchorId="5128DF3C" wp14:editId="2808EFD8">
+            <wp:extent cx="5334000" cy="3343751"/>
+            <wp:effectExtent l="0" t="0" r="0" b="0"/>
+            <wp:docPr id="33" name="Picture"/>
+            <wp:cNvGraphicFramePr/>
+            <a:graphic xmlns:a="http://schemas.openxmlformats.org/drawingml/2006/main">
+              <a:graphicData uri="http://schemas.openxmlformats.org/drawingml/2006/picture">
+                <pic:pic xmlns:pic="http://schemas.openxmlformats.org/drawingml/2006/picture">
+                  <pic:nvPicPr>
+                    <pic:cNvPr id="34" name="Picture" descr="Скриншоты/figma_04_Elements.png"/>
+                    <pic:cNvPicPr>
+                      <a:picLocks noChangeAspect="1" noChangeArrowheads="1"/>
+                    </pic:cNvPicPr>
+                  </pic:nvPicPr>
+                  <pic:blipFill>
+                    <a:blip r:embed="rId13"/>
+                    <a:stretch>
+                      <a:fillRect/>
+                    </a:stretch>
+                  </pic:blipFill>
+                  <pic:spPr bwMode="auto">
+                    <a:xfrm>
+                      <a:off x="0" y="0"/>
+                      <a:ext cx="5334000" cy="3343751"/>
+                    </a:xfrm>
+                    <a:prstGeom prst="rect">
+                      <a:avLst/>
+                    </a:prstGeom>
+                    <a:noFill/>
+                    <a:ln w="9525">
+                      <a:noFill/>
+                      <a:headEnd/>
+                      <a:tailEnd/>
+                    </a:ln>
+                  </pic:spPr>
+                </pic:pic>
+              </a:graphicData>
+            </a:graphic>
+          </wp:inline>
+        </w:drawing>
+      </w:r>
+    </w:p>
+    <w:p>
+      <w:pPr>
+        <w:pStyle w:val="a0"/>
+        <w:spacing w:before="0" w:after="0" w:line="360" w:lineRule="exact"/>
+        <w:jc w:val="center"/>
+      </w:pPr>
+      <w:r>
+        <w:rPr>
+          <w:sz w:val="28"/>
+        </w:rPr>
+        <w:t xml:space="preserve">Рисунок 7 – Прототип </w:t>
+      </w:r>
+      <w:r>
+        <w:rPr>
+          <w:i/>
+          <w:sz w:val="28"/>
+        </w:rPr>
+        <w:t>Figma</w:t>
+      </w:r>
+      <w:r>
+        <w:rPr>
+          <w:sz w:val="28"/>
+        </w:rPr>
+        <w:t xml:space="preserve">: лист </w:t>
+      </w:r>
+      <w:r>
+        <w:rPr>
+          <w:i/>
+          <w:sz w:val="28"/>
+        </w:rPr>
+        <w:t>Elements</w:t>
+      </w:r>
+      <w:r>
+        <w:rPr>
+          <w:sz w:val="28"/>
+        </w:rPr>
+        <w:t xml:space="preserve"> (палитра и компоненты)</w:t>
+      </w:r>
+    </w:p>
+    <w:p>
+      <w:pPr>
+        <w:pStyle w:val="a0"/>
+        <w:spacing w:before="0" w:after="0" w:line="360" w:lineRule="exact"/>
+        <w:ind w:firstLine="709"/>
+        <w:jc w:val="both"/>
+      </w:pPr>
+      <w:r>
+        <w:rPr>
+          <w:sz w:val="28"/>
+        </w:rPr>
+        <w:t>Лист «</w:t>
+      </w:r>
+      <w:r>
+        <w:rPr>
+          <w:i/>
+          <w:sz w:val="28"/>
+        </w:rPr>
+        <w:t>Elements</w:t>
+      </w:r>
+      <w:r>
+        <w:rPr>
+          <w:sz w:val="28"/>
+        </w:rPr>
+        <w:t xml:space="preserve">» фиксирует палитру из шести цветов (серый, черный, светло-серый, бирюзовый, белый, темно-бирюзовый), шапку с навигацией и подвал. Единые компоненты шапки и подвала </w:t>
+      </w:r>
+      <w:r>
+        <w:rPr>
+          <w:sz w:val="28"/>
+        </w:rPr>
+        <w:t>используются на всех трех страницах, что обеспечивает целостность интерфейса.</w:t>
+      </w:r>
+    </w:p>
+    <w:p>
+      <w:pPr>
+        <w:pStyle w:val="a0"/>
+        <w:spacing w:before="0" w:after="0" w:line="360" w:lineRule="exact"/>
+        <w:ind w:firstLine="709"/>
+        <w:jc w:val="both"/>
+      </w:pPr>
+      <w:r>
+        <w:rPr>
+          <w:sz w:val="28"/>
+        </w:rPr>
+        <w:t>В таблице 17 представлено: соответствие страниц прототипа единицам интерфейсной модели.</w:t>
       </w:r>
     </w:p>
     <w:p>
@@ -19794,7 +20704,876 @@
         <w:rPr>
           <w:sz w:val="28"/>
         </w:rPr>
-        <w:t>Таблица 17 – Состав релизов по единицам разработки</w:t>
+        <w:t>Таблица 17 – Соответствие страниц прототипа единицам интерфейсной модели</w:t>
+      </w:r>
+    </w:p>
+    <w:tbl>
+      <w:tblPr>
+        <w:tblStyle w:val="Table"/>
+        <w:tblW w:w="9355" w:type="dxa"/>
+        <w:jc w:val="center"/>
+        <w:tblBorders>
+          <w:top w:val="single" w:sz="4" w:space="0" w:color="000000"/>
+          <w:left w:val="single" w:sz="4" w:space="0" w:color="000000"/>
+          <w:bottom w:val="single" w:sz="4" w:space="0" w:color="000000"/>
+          <w:right w:val="single" w:sz="4" w:space="0" w:color="000000"/>
+          <w:insideH w:val="single" w:sz="4" w:space="0" w:color="000000"/>
+          <w:insideV w:val="single" w:sz="4" w:space="0" w:color="000000"/>
+        </w:tblBorders>
+        <w:tblLayout w:type="fixed"/>
+        <w:tblLook w:val="0020" w:firstRow="1" w:lastRow="0" w:firstColumn="0" w:lastColumn="0" w:noHBand="0" w:noVBand="0"/>
+      </w:tblPr>
+      <w:tblGrid>
+        <w:gridCol w:w="1247"/>
+        <w:gridCol w:w="3008"/>
+        <w:gridCol w:w="1226"/>
+        <w:gridCol w:w="3874"/>
+      </w:tblGrid>
+      <w:tr>
+        <w:trPr>
+          <w:cnfStyle w:val="100000000000" w:firstRow="1" w:lastRow="0" w:firstColumn="0" w:lastColumn="0" w:oddVBand="0" w:evenVBand="0" w:oddHBand="0" w:evenHBand="0" w:firstRowFirstColumn="0" w:firstRowLastColumn="0" w:lastRowFirstColumn="0" w:lastRowLastColumn="0"/>
+          <w:cantSplit/>
+          <w:tblHeader/>
+          <w:jc w:val="center"/>
+        </w:trPr>
+        <w:tc>
+          <w:tcPr>
+            <w:tcW w:w="1246" w:type="dxa"/>
+            <w:vAlign w:val="center"/>
+          </w:tcPr>
+          <w:p>
+            <w:pPr>
+              <w:pStyle w:val="Compact"/>
+              <w:spacing w:before="0" w:after="0" w:line="280" w:lineRule="exact"/>
+              <w:jc w:val="center"/>
+            </w:pPr>
+            <w:r>
+              <w:rPr>
+                <w:b/>
+                <w:sz w:val="24"/>
+              </w:rPr>
+              <w:t xml:space="preserve">Страница </w:t>
+            </w:r>
+            <w:r>
+              <w:rPr>
+                <w:b/>
+                <w:i/>
+                <w:sz w:val="24"/>
+              </w:rPr>
+              <w:t>Figma</w:t>
+            </w:r>
+          </w:p>
+        </w:tc>
+        <w:tc>
+          <w:tcPr>
+            <w:tcW w:w="3008" w:type="dxa"/>
+            <w:vAlign w:val="center"/>
+          </w:tcPr>
+          <w:p>
+            <w:pPr>
+              <w:pStyle w:val="Compact"/>
+              <w:spacing w:before="0" w:after="0" w:line="280" w:lineRule="exact"/>
+              <w:jc w:val="center"/>
+            </w:pPr>
+            <w:r>
+              <w:rPr>
+                <w:b/>
+                <w:sz w:val="24"/>
+              </w:rPr>
+              <w:t>Ед</w:t>
+            </w:r>
+            <w:r>
+              <w:rPr>
+                <w:b/>
+                <w:sz w:val="24"/>
+              </w:rPr>
+              <w:t>иница (раздел 2.5)</w:t>
+            </w:r>
+          </w:p>
+        </w:tc>
+        <w:tc>
+          <w:tcPr>
+            <w:tcW w:w="1226" w:type="dxa"/>
+            <w:vAlign w:val="center"/>
+          </w:tcPr>
+          <w:p>
+            <w:pPr>
+              <w:pStyle w:val="Compact"/>
+              <w:spacing w:before="0" w:after="0" w:line="280" w:lineRule="exact"/>
+              <w:jc w:val="center"/>
+            </w:pPr>
+            <w:r>
+              <w:rPr>
+                <w:b/>
+                <w:sz w:val="24"/>
+              </w:rPr>
+              <w:t>Покрытие</w:t>
+            </w:r>
+          </w:p>
+        </w:tc>
+        <w:tc>
+          <w:tcPr>
+            <w:tcW w:w="3874" w:type="dxa"/>
+            <w:vAlign w:val="center"/>
+          </w:tcPr>
+          <w:p>
+            <w:pPr>
+              <w:pStyle w:val="Compact"/>
+              <w:spacing w:before="0" w:after="0" w:line="280" w:lineRule="exact"/>
+              <w:jc w:val="center"/>
+            </w:pPr>
+            <w:r>
+              <w:rPr>
+                <w:b/>
+                <w:sz w:val="24"/>
+              </w:rPr>
+              <w:t>Что доработать</w:t>
+            </w:r>
+          </w:p>
+        </w:tc>
+      </w:tr>
+      <w:tr>
+        <w:trPr>
+          <w:cantSplit/>
+          <w:jc w:val="center"/>
+        </w:trPr>
+        <w:tc>
+          <w:tcPr>
+            <w:tcW w:w="1246" w:type="dxa"/>
+            <w:vAlign w:val="center"/>
+          </w:tcPr>
+          <w:p>
+            <w:pPr>
+              <w:pStyle w:val="Compact"/>
+              <w:spacing w:before="0" w:after="0" w:line="280" w:lineRule="exact"/>
+              <w:jc w:val="center"/>
+            </w:pPr>
+            <w:r>
+              <w:rPr>
+                <w:i/>
+                <w:sz w:val="24"/>
+              </w:rPr>
+              <w:t>Home</w:t>
+            </w:r>
+          </w:p>
+        </w:tc>
+        <w:tc>
+          <w:tcPr>
+            <w:tcW w:w="3008" w:type="dxa"/>
+            <w:vAlign w:val="center"/>
+          </w:tcPr>
+          <w:p>
+            <w:pPr>
+              <w:pStyle w:val="Compact"/>
+              <w:spacing w:before="0" w:after="0" w:line="280" w:lineRule="exact"/>
+              <w:jc w:val="center"/>
+            </w:pPr>
+            <w:r>
+              <w:rPr>
+                <w:i/>
+                <w:sz w:val="24"/>
+              </w:rPr>
+              <w:t>U-001</w:t>
+            </w:r>
+            <w:r>
+              <w:rPr>
+                <w:sz w:val="24"/>
+              </w:rPr>
+              <w:t xml:space="preserve"> Страница продукта (вход)</w:t>
+            </w:r>
+          </w:p>
+        </w:tc>
+        <w:tc>
+          <w:tcPr>
+            <w:tcW w:w="1226" w:type="dxa"/>
+            <w:vAlign w:val="center"/>
+          </w:tcPr>
+          <w:p>
+            <w:pPr>
+              <w:pStyle w:val="Compact"/>
+              <w:spacing w:before="0" w:after="0" w:line="280" w:lineRule="exact"/>
+              <w:jc w:val="center"/>
+            </w:pPr>
+            <w:r>
+              <w:rPr>
+                <w:sz w:val="24"/>
+              </w:rPr>
+              <w:t>частично</w:t>
+            </w:r>
+          </w:p>
+        </w:tc>
+        <w:tc>
+          <w:tcPr>
+            <w:tcW w:w="3874" w:type="dxa"/>
+            <w:vAlign w:val="center"/>
+          </w:tcPr>
+          <w:p>
+            <w:pPr>
+              <w:pStyle w:val="Compact"/>
+              <w:spacing w:before="0" w:after="0" w:line="280" w:lineRule="exact"/>
+              <w:jc w:val="center"/>
+            </w:pPr>
+            <w:r>
+              <w:rPr>
+                <w:sz w:val="24"/>
+              </w:rPr>
+              <w:t xml:space="preserve">добавить примеры ошибок </w:t>
+            </w:r>
+            <w:r>
+              <w:rPr>
+                <w:i/>
+                <w:sz w:val="24"/>
+              </w:rPr>
+              <w:t>Excel</w:t>
+            </w:r>
+            <w:r>
+              <w:rPr>
+                <w:sz w:val="24"/>
+              </w:rPr>
+              <w:t xml:space="preserve"> и ссылку на тарифы</w:t>
+            </w:r>
+          </w:p>
+        </w:tc>
+      </w:tr>
+      <w:tr>
+        <w:trPr>
+          <w:cantSplit/>
+          <w:jc w:val="center"/>
+        </w:trPr>
+        <w:tc>
+          <w:tcPr>
+            <w:tcW w:w="1246" w:type="dxa"/>
+            <w:vAlign w:val="center"/>
+          </w:tcPr>
+          <w:p>
+            <w:pPr>
+              <w:pStyle w:val="Compact"/>
+              <w:spacing w:before="0" w:after="0" w:line="280" w:lineRule="exact"/>
+              <w:jc w:val="center"/>
+            </w:pPr>
+            <w:r>
+              <w:rPr>
+                <w:i/>
+                <w:sz w:val="24"/>
+              </w:rPr>
+              <w:t>Product</w:t>
+            </w:r>
+          </w:p>
+        </w:tc>
+        <w:tc>
+          <w:tcPr>
+            <w:tcW w:w="3008" w:type="dxa"/>
+            <w:vAlign w:val="center"/>
+          </w:tcPr>
+          <w:p>
+            <w:pPr>
+              <w:pStyle w:val="Compact"/>
+              <w:spacing w:before="0" w:after="0" w:line="280" w:lineRule="exact"/>
+              <w:jc w:val="center"/>
+            </w:pPr>
+            <w:r>
+              <w:rPr>
+                <w:i/>
+                <w:sz w:val="24"/>
+              </w:rPr>
+              <w:t>U-001</w:t>
+            </w:r>
+            <w:r>
+              <w:rPr>
+                <w:sz w:val="24"/>
+              </w:rPr>
+              <w:t xml:space="preserve"> Страница продукта с примерами ошибок</w:t>
+            </w:r>
+          </w:p>
+        </w:tc>
+        <w:tc>
+          <w:tcPr>
+            <w:tcW w:w="1226" w:type="dxa"/>
+            <w:vAlign w:val="center"/>
+          </w:tcPr>
+          <w:p>
+            <w:pPr>
+              <w:pStyle w:val="Compact"/>
+              <w:spacing w:before="0" w:after="0" w:line="280" w:lineRule="exact"/>
+              <w:jc w:val="center"/>
+            </w:pPr>
+            <w:r>
+              <w:rPr>
+                <w:sz w:val="24"/>
+              </w:rPr>
+              <w:t>частично</w:t>
+            </w:r>
+          </w:p>
+        </w:tc>
+        <w:tc>
+          <w:tcPr>
+            <w:tcW w:w="3874" w:type="dxa"/>
+            <w:vAlign w:val="center"/>
+          </w:tcPr>
+          <w:p>
+            <w:pPr>
+              <w:pStyle w:val="Compact"/>
+              <w:spacing w:before="0" w:after="0" w:line="280" w:lineRule="exact"/>
+              <w:jc w:val="center"/>
+            </w:pPr>
+            <w:r>
+              <w:rPr>
+                <w:sz w:val="24"/>
+              </w:rPr>
+              <w:t>показать находку с доказательством (движок), а не только формулу суммы</w:t>
+            </w:r>
+          </w:p>
+        </w:tc>
+      </w:tr>
+      <w:tr>
+        <w:trPr>
+          <w:cantSplit/>
+          <w:jc w:val="center"/>
+        </w:trPr>
+        <w:tc>
+          <w:tcPr>
+            <w:tcW w:w="1246" w:type="dxa"/>
+            <w:vAlign w:val="center"/>
+          </w:tcPr>
+          <w:p>
+            <w:pPr>
+              <w:pStyle w:val="Compact"/>
+              <w:spacing w:before="0" w:after="0" w:line="280" w:lineRule="exact"/>
+              <w:jc w:val="center"/>
+            </w:pPr>
+            <w:r>
+              <w:rPr>
+                <w:i/>
+                <w:sz w:val="24"/>
+              </w:rPr>
+              <w:t>Contact</w:t>
+            </w:r>
+          </w:p>
+        </w:tc>
+        <w:tc>
+          <w:tcPr>
+            <w:tcW w:w="3008" w:type="dxa"/>
+            <w:vAlign w:val="center"/>
+          </w:tcPr>
+          <w:p>
+            <w:pPr>
+              <w:pStyle w:val="Compact"/>
+              <w:spacing w:before="0" w:after="0" w:line="280" w:lineRule="exact"/>
+              <w:jc w:val="center"/>
+            </w:pPr>
+            <w:r>
+              <w:rPr>
+                <w:i/>
+                <w:sz w:val="24"/>
+              </w:rPr>
+              <w:t>U-017</w:t>
+            </w:r>
+            <w:r>
+              <w:rPr>
+                <w:sz w:val="24"/>
+              </w:rPr>
+              <w:t xml:space="preserve"> Документация и справка; сбор регистраций</w:t>
+            </w:r>
+          </w:p>
+        </w:tc>
+        <w:tc>
+          <w:tcPr>
+            <w:tcW w:w="1226" w:type="dxa"/>
+            <w:vAlign w:val="center"/>
+          </w:tcPr>
+          <w:p>
+            <w:pPr>
+              <w:pStyle w:val="Compact"/>
+              <w:spacing w:before="0" w:after="0" w:line="280" w:lineRule="exact"/>
+              <w:jc w:val="center"/>
+            </w:pPr>
+            <w:r>
+              <w:rPr>
+                <w:sz w:val="24"/>
+              </w:rPr>
+              <w:t>частично</w:t>
+            </w:r>
+          </w:p>
+        </w:tc>
+        <w:tc>
+          <w:tcPr>
+            <w:tcW w:w="3874" w:type="dxa"/>
+            <w:vAlign w:val="center"/>
+          </w:tcPr>
+          <w:p>
+            <w:pPr>
+              <w:pStyle w:val="Compact"/>
+              <w:spacing w:before="0" w:after="0" w:line="280" w:lineRule="exact"/>
+              <w:jc w:val="center"/>
+            </w:pPr>
+            <w:r>
+              <w:rPr>
+                <w:sz w:val="24"/>
+              </w:rPr>
+              <w:t>связать форму с регистрацией (</w:t>
+            </w:r>
+            <w:r>
+              <w:rPr>
+                <w:i/>
+                <w:sz w:val="24"/>
+              </w:rPr>
+              <w:t>U-006</w:t>
+            </w:r>
+            <w:r>
+              <w:rPr>
+                <w:sz w:val="24"/>
+              </w:rPr>
+              <w:t>) и листом ожидания</w:t>
+            </w:r>
+          </w:p>
+        </w:tc>
+      </w:tr>
+      <w:tr>
+        <w:trPr>
+          <w:cantSplit/>
+          <w:jc w:val="center"/>
+        </w:trPr>
+        <w:tc>
+          <w:tcPr>
+            <w:tcW w:w="1246" w:type="dxa"/>
+            <w:vAlign w:val="center"/>
+          </w:tcPr>
+          <w:p>
+            <w:pPr>
+              <w:pStyle w:val="Compact"/>
+              <w:spacing w:before="0" w:after="0" w:line="280" w:lineRule="exact"/>
+              <w:jc w:val="center"/>
+            </w:pPr>
+            <w:r>
+              <w:rPr>
+                <w:sz w:val="24"/>
+              </w:rPr>
+              <w:t>нет страницы</w:t>
+            </w:r>
+          </w:p>
+        </w:tc>
+        <w:tc>
+          <w:tcPr>
+            <w:tcW w:w="3008" w:type="dxa"/>
+            <w:vAlign w:val="center"/>
+          </w:tcPr>
+          <w:p>
+            <w:pPr>
+              <w:pStyle w:val="Compact"/>
+              <w:spacing w:before="0" w:after="0" w:line="280" w:lineRule="exact"/>
+              <w:jc w:val="center"/>
+            </w:pPr>
+            <w:r>
+              <w:rPr>
+                <w:i/>
+                <w:sz w:val="24"/>
+              </w:rPr>
+              <w:t>U-007</w:t>
+            </w:r>
+            <w:r>
+              <w:rPr>
+                <w:sz w:val="24"/>
+              </w:rPr>
+              <w:t xml:space="preserve"> Страница тарифов</w:t>
+            </w:r>
+          </w:p>
+        </w:tc>
+        <w:tc>
+          <w:tcPr>
+            <w:tcW w:w="1226" w:type="dxa"/>
+            <w:vAlign w:val="center"/>
+          </w:tcPr>
+          <w:p>
+            <w:pPr>
+              <w:pStyle w:val="Compact"/>
+              <w:spacing w:before="0" w:after="0" w:line="280" w:lineRule="exact"/>
+              <w:jc w:val="center"/>
+            </w:pPr>
+            <w:r>
+              <w:rPr>
+                <w:sz w:val="24"/>
+              </w:rPr>
+              <w:t>не покрыто</w:t>
+            </w:r>
+          </w:p>
+        </w:tc>
+        <w:tc>
+          <w:tcPr>
+            <w:tcW w:w="3874" w:type="dxa"/>
+            <w:vAlign w:val="center"/>
+          </w:tcPr>
+          <w:p>
+            <w:pPr>
+              <w:pStyle w:val="Compact"/>
+              <w:spacing w:before="0" w:after="0" w:line="280" w:lineRule="exact"/>
+              <w:jc w:val="center"/>
+            </w:pPr>
+            <w:r>
+              <w:rPr>
+                <w:sz w:val="24"/>
+              </w:rPr>
+              <w:t>добавить страницу</w:t>
+            </w:r>
+            <w:r>
+              <w:rPr>
+                <w:sz w:val="24"/>
+              </w:rPr>
+              <w:t xml:space="preserve"> с тарифами </w:t>
+            </w:r>
+            <w:r>
+              <w:rPr>
+                <w:i/>
+                <w:sz w:val="24"/>
+              </w:rPr>
+              <w:t>Free</w:t>
+            </w:r>
+            <w:r>
+              <w:rPr>
+                <w:sz w:val="24"/>
+              </w:rPr>
+              <w:t>, 9, 19, 29 </w:t>
+            </w:r>
+            <w:r>
+              <w:rPr>
+                <w:i/>
+                <w:sz w:val="24"/>
+              </w:rPr>
+              <w:t>EUR</w:t>
+            </w:r>
+          </w:p>
+        </w:tc>
+      </w:tr>
+      <w:tr>
+        <w:trPr>
+          <w:cantSplit/>
+          <w:jc w:val="center"/>
+        </w:trPr>
+        <w:tc>
+          <w:tcPr>
+            <w:tcW w:w="1246" w:type="dxa"/>
+            <w:vAlign w:val="center"/>
+          </w:tcPr>
+          <w:p>
+            <w:pPr>
+              <w:pStyle w:val="Compact"/>
+              <w:spacing w:before="0" w:after="0" w:line="280" w:lineRule="exact"/>
+              <w:jc w:val="center"/>
+            </w:pPr>
+            <w:r>
+              <w:rPr>
+                <w:sz w:val="24"/>
+              </w:rPr>
+              <w:t>нет страницы</w:t>
+            </w:r>
+          </w:p>
+        </w:tc>
+        <w:tc>
+          <w:tcPr>
+            <w:tcW w:w="3008" w:type="dxa"/>
+            <w:vAlign w:val="center"/>
+          </w:tcPr>
+          <w:p>
+            <w:pPr>
+              <w:pStyle w:val="Compact"/>
+              <w:spacing w:before="0" w:after="0" w:line="280" w:lineRule="exact"/>
+              <w:jc w:val="center"/>
+            </w:pPr>
+            <w:r>
+              <w:rPr>
+                <w:i/>
+                <w:sz w:val="24"/>
+              </w:rPr>
+              <w:t>U-002</w:t>
+            </w:r>
+            <w:r>
+              <w:rPr>
+                <w:sz w:val="24"/>
+              </w:rPr>
+              <w:t>…</w:t>
+            </w:r>
+            <w:r>
+              <w:rPr>
+                <w:i/>
+                <w:sz w:val="24"/>
+              </w:rPr>
+              <w:t>U-005</w:t>
+            </w:r>
+            <w:r>
+              <w:rPr>
+                <w:sz w:val="24"/>
+              </w:rPr>
+              <w:t xml:space="preserve">, </w:t>
+            </w:r>
+            <w:r>
+              <w:rPr>
+                <w:i/>
+                <w:sz w:val="24"/>
+              </w:rPr>
+              <w:t>U-008</w:t>
+            </w:r>
+            <w:r>
+              <w:rPr>
+                <w:sz w:val="24"/>
+              </w:rPr>
+              <w:t xml:space="preserve"> экраны приложения</w:t>
+            </w:r>
+          </w:p>
+        </w:tc>
+        <w:tc>
+          <w:tcPr>
+            <w:tcW w:w="1226" w:type="dxa"/>
+            <w:vAlign w:val="center"/>
+          </w:tcPr>
+          <w:p>
+            <w:pPr>
+              <w:pStyle w:val="Compact"/>
+              <w:spacing w:before="0" w:after="0" w:line="280" w:lineRule="exact"/>
+              <w:jc w:val="center"/>
+            </w:pPr>
+            <w:r>
+              <w:rPr>
+                <w:sz w:val="24"/>
+              </w:rPr>
+              <w:t>не покрыто</w:t>
+            </w:r>
+          </w:p>
+        </w:tc>
+        <w:tc>
+          <w:tcPr>
+            <w:tcW w:w="3874" w:type="dxa"/>
+            <w:vAlign w:val="center"/>
+          </w:tcPr>
+          <w:p>
+            <w:pPr>
+              <w:pStyle w:val="Compact"/>
+              <w:spacing w:before="0" w:after="0" w:line="280" w:lineRule="exact"/>
+              <w:jc w:val="center"/>
+            </w:pPr>
+            <w:r>
+              <w:rPr>
+                <w:sz w:val="24"/>
+              </w:rPr>
+              <w:t>собрать кликабельный путь «загрузка - результат - карточка - отчет - оплата» по схемам</w:t>
+            </w:r>
+          </w:p>
+        </w:tc>
+      </w:tr>
+    </w:tbl>
+    <w:p>
+      <w:pPr>
+        <w:pStyle w:val="FirstParagraph"/>
+        <w:spacing w:before="0" w:after="0" w:line="360" w:lineRule="exact"/>
+        <w:ind w:firstLine="709"/>
+        <w:jc w:val="both"/>
+      </w:pPr>
+      <w:r>
+        <w:rPr>
+          <w:sz w:val="28"/>
+        </w:rPr>
+        <w:t>Прототип закрывает маркетинговую часть пути (вход, объяснение продукта, контакт), но не экраны приложения и тарифы. Вывод: подтверждена визуальная система и каркас сайт</w:t>
+      </w:r>
+      <w:r>
+        <w:rPr>
+          <w:sz w:val="28"/>
+        </w:rPr>
+        <w:t xml:space="preserve">а, а интерфейсное покрытие </w:t>
+      </w:r>
+      <w:r>
+        <w:rPr>
+          <w:sz w:val="28"/>
+        </w:rPr>
+        <w:lastRenderedPageBreak/>
+        <w:t>80 % относится к схемам, а не к прототипу; доработки перечислены в приложении Б.</w:t>
+      </w:r>
+    </w:p>
+    <w:p>
+      <w:pPr>
+        <w:pStyle w:val="a0"/>
+        <w:spacing w:before="0" w:after="0" w:line="360" w:lineRule="exact"/>
+        <w:ind w:firstLine="709"/>
+        <w:jc w:val="both"/>
+      </w:pPr>
+      <w:r>
+        <w:rPr>
+          <w:sz w:val="28"/>
+        </w:rPr>
+        <w:t>Наблюдение: тексты прототипа описывают универсального агента для текстового редактора («</w:t>
+      </w:r>
+      <w:r>
+        <w:rPr>
+          <w:i/>
+          <w:sz w:val="28"/>
+        </w:rPr>
+        <w:t>AI</w:t>
+      </w:r>
+      <w:r>
+        <w:rPr>
+          <w:sz w:val="28"/>
+        </w:rPr>
+        <w:t xml:space="preserve"> </w:t>
+      </w:r>
+      <w:r>
+        <w:rPr>
+          <w:i/>
+          <w:sz w:val="28"/>
+        </w:rPr>
+        <w:t>agent</w:t>
+      </w:r>
+      <w:r>
+        <w:rPr>
+          <w:sz w:val="28"/>
+        </w:rPr>
+        <w:t xml:space="preserve"> </w:t>
+      </w:r>
+      <w:r>
+        <w:rPr>
+          <w:i/>
+          <w:sz w:val="28"/>
+        </w:rPr>
+        <w:t>that</w:t>
+      </w:r>
+      <w:r>
+        <w:rPr>
+          <w:sz w:val="28"/>
+        </w:rPr>
+        <w:t xml:space="preserve"> </w:t>
+      </w:r>
+      <w:r>
+        <w:rPr>
+          <w:i/>
+          <w:sz w:val="28"/>
+        </w:rPr>
+        <w:t>lives</w:t>
+      </w:r>
+      <w:r>
+        <w:rPr>
+          <w:sz w:val="28"/>
+        </w:rPr>
+        <w:t xml:space="preserve"> </w:t>
+      </w:r>
+      <w:r>
+        <w:rPr>
+          <w:i/>
+          <w:sz w:val="28"/>
+        </w:rPr>
+        <w:t>inside</w:t>
+      </w:r>
+      <w:r>
+        <w:rPr>
+          <w:sz w:val="28"/>
+        </w:rPr>
+        <w:t xml:space="preserve"> </w:t>
+      </w:r>
+      <w:r>
+        <w:rPr>
+          <w:i/>
+          <w:sz w:val="28"/>
+        </w:rPr>
+        <w:t>your</w:t>
+      </w:r>
+      <w:r>
+        <w:rPr>
+          <w:sz w:val="28"/>
+        </w:rPr>
+        <w:t xml:space="preserve"> </w:t>
+      </w:r>
+      <w:r>
+        <w:rPr>
+          <w:i/>
+          <w:sz w:val="28"/>
+        </w:rPr>
+        <w:t>editor</w:t>
+      </w:r>
+      <w:r>
+        <w:rPr>
+          <w:sz w:val="28"/>
+        </w:rPr>
+        <w:t xml:space="preserve">»), а не проверку </w:t>
+      </w:r>
+      <w:r>
+        <w:rPr>
+          <w:i/>
+          <w:sz w:val="28"/>
+        </w:rPr>
+        <w:t>Excel</w:t>
+      </w:r>
+      <w:r>
+        <w:rPr>
+          <w:sz w:val="28"/>
+        </w:rPr>
+        <w:t>-моделей с доказательством находок. Для согласования с ценностным предложением раздела 2.1 заголовок и примеры страниц нужно переписать под аудит таблиц; это зафиксировано как доработка прототипа.</w:t>
+      </w:r>
+    </w:p>
+    <w:p>
+      <w:pPr>
+        <w:pStyle w:val="2"/>
+        <w:spacing w:before="360" w:after="360" w:line="360" w:lineRule="exact"/>
+        <w:ind w:firstLine="709"/>
+      </w:pPr>
+      <w:bookmarkStart w:id="15" w:name="_fc51781abcc4857bf621eab6b8861ea54729fed"/>
+      <w:bookmarkStart w:id="16" w:name="_Toc241934342"/>
+      <w:bookmarkEnd w:id="14"/>
+      <w:bookmarkEnd w:id="12"/>
+      <w:r>
+        <w:rPr>
+          <w:b/>
+          <w:sz w:val="28"/>
+        </w:rPr>
+        <w:t>2.6 Деление разработки на релизы</w:t>
+      </w:r>
+      <w:bookmarkEnd w:id="16"/>
+    </w:p>
+    <w:p>
+      <w:pPr>
+        <w:pStyle w:val="FirstParagraph"/>
+        <w:spacing w:before="0" w:after="0" w:line="360" w:lineRule="exact"/>
+        <w:ind w:firstLine="709"/>
+        <w:jc w:val="both"/>
+      </w:pPr>
+      <w:r>
+        <w:rPr>
+          <w:sz w:val="28"/>
+        </w:rPr>
+        <w:t>Методика [5] оценивае</w:t>
+      </w:r>
+      <w:r>
+        <w:rPr>
+          <w:sz w:val="28"/>
+        </w:rPr>
+        <w:t xml:space="preserve">т 24 единицы разработки по десяти показателям и относит их к первому релизу, следующим релизам или к гипотезам. Единица попадает в первый релиз, если она связана с ценностным предложением, доходом, доказательна и ее потеря критична, либо если балл первого </w:t>
+      </w:r>
+      <w:r>
+        <w:rPr>
+          <w:sz w:val="28"/>
+        </w:rPr>
+        <w:t>релиза не ниже 3,7.</w:t>
+      </w:r>
+    </w:p>
+    <w:p>
+      <w:pPr>
+        <w:pStyle w:val="a0"/>
+        <w:spacing w:before="0" w:after="0" w:line="360" w:lineRule="exact"/>
+        <w:ind w:firstLine="709"/>
+        <w:jc w:val="both"/>
+      </w:pPr>
+      <w:r>
+        <w:rPr>
+          <w:sz w:val="28"/>
+        </w:rPr>
+        <w:t>В таблице 18 представлено: состав релизов по единицам разработки.</w:t>
+      </w:r>
+    </w:p>
+    <w:p>
+      <w:pPr>
+        <w:pStyle w:val="a0"/>
+        <w:keepNext/>
+        <w:spacing w:before="0" w:after="0" w:line="360" w:lineRule="exact"/>
+      </w:pPr>
+      <w:r>
+        <w:rPr>
+          <w:sz w:val="28"/>
+        </w:rPr>
+        <w:t>Таблица 18 – Состав релизов по единицам разработки</w:t>
       </w:r>
     </w:p>
     <w:tbl>
@@ -19884,14 +21663,7 @@
                 <w:b/>
                 <w:sz w:val="24"/>
               </w:rPr>
-              <w:t>Балл первого рели</w:t>
-            </w:r>
-            <w:r>
-              <w:rPr>
-                <w:b/>
-                <w:sz w:val="24"/>
-              </w:rPr>
-              <w:t>за</w:t>
+              <w:t>Балл первого релиза</w:t>
             </w:r>
           </w:p>
         </w:tc>
@@ -21540,6 +23312,7 @@
                 <w:i/>
                 <w:sz w:val="24"/>
               </w:rPr>
+              <w:lastRenderedPageBreak/>
               <w:t>U-016</w:t>
             </w:r>
           </w:p>
@@ -22084,7 +23857,6 @@
                 <w:i/>
                 <w:sz w:val="24"/>
               </w:rPr>
-              <w:lastRenderedPageBreak/>
               <w:t>U-021</w:t>
             </w:r>
           </w:p>
@@ -22550,7 +24322,7 @@
         <w:rPr>
           <w:sz w:val="28"/>
         </w:rPr>
-        <w:t>В таблице 18 представлено: дорожная карта релизов.</w:t>
+        <w:t>В таблице 19 представлено: дорожная карта релизов.</w:t>
       </w:r>
     </w:p>
     <w:p>
@@ -22563,7 +24335,7 @@
         <w:rPr>
           <w:sz w:val="28"/>
         </w:rPr>
-        <w:t>Таблица 18 – Дорожная карта релизов</w:t>
+        <w:t>Таблица 19 – Дорожная карта релизов</w:t>
       </w:r>
     </w:p>
     <w:tbl>
@@ -23095,13 +24867,7 @@
         <w:rPr>
           <w:sz w:val="28"/>
         </w:rPr>
-        <w:t xml:space="preserve"> с надстройкой в июле 2027, релиз проекта в сентябре 2027. Критерии перехода измеримы и совпадают с целями проекта (300 регистраций и 50 плат</w:t>
-      </w:r>
-      <w:r>
-        <w:rPr>
-          <w:sz w:val="28"/>
-        </w:rPr>
-        <w:t>ящих).</w:t>
+        <w:t xml:space="preserve"> с надстройкой в июле 2027, релиз проекта в сентябре 2027. Критерии перехода измеримы и совпадают с целями проекта (300 регистраций и 50 платящих).</w:t>
       </w:r>
     </w:p>
     <w:p>
@@ -23115,7 +24881,7 @@
         <w:rPr>
           <w:sz w:val="28"/>
         </w:rPr>
-        <w:t xml:space="preserve">На рисунке 4 показано: дорожная карта релизов </w:t>
+        <w:t xml:space="preserve">На рисунке 8 показано: дорожная карта релизов </w:t>
       </w:r>
       <w:r>
         <w:rPr>
@@ -23143,23 +24909,24 @@
           <w:noProof/>
           <w:sz w:val="28"/>
         </w:rPr>
+        <w:lastRenderedPageBreak/>
         <w:drawing>
-          <wp:inline distT="0" distB="0" distL="0" distR="0" wp14:anchorId="1BF86E62" wp14:editId="24AF71F5">
+          <wp:inline distT="0" distB="0" distL="0" distR="0" wp14:anchorId="79E5EC49" wp14:editId="04A69CEA">
             <wp:extent cx="5334000" cy="2341756"/>
             <wp:effectExtent l="0" t="0" r="0" b="0"/>
-            <wp:docPr id="25" name="Picture"/>
+            <wp:docPr id="38" name="Picture"/>
             <wp:cNvGraphicFramePr/>
             <a:graphic xmlns:a="http://schemas.openxmlformats.org/drawingml/2006/main">
               <a:graphicData uri="http://schemas.openxmlformats.org/drawingml/2006/picture">
                 <pic:pic xmlns:pic="http://schemas.openxmlformats.org/drawingml/2006/picture">
                   <pic:nvPicPr>
-                    <pic:cNvPr id="26" name="Picture" descr="Рисунки/03_дорожная_карта.png"/>
+                    <pic:cNvPr id="39" name="Picture" descr="Рисунки/03_дорожная_карта.png"/>
                     <pic:cNvPicPr>
                       <a:picLocks noChangeAspect="1" noChangeArrowheads="1"/>
                     </pic:cNvPicPr>
                   </pic:nvPicPr>
                   <pic:blipFill>
-                    <a:blip r:embed="rId10"/>
+                    <a:blip r:embed="rId14"/>
                     <a:stretch>
                       <a:fillRect/>
                     </a:stretch>
@@ -23196,7 +24963,7 @@
         <w:rPr>
           <w:sz w:val="28"/>
         </w:rPr>
-        <w:t xml:space="preserve">Рисунок 4 – Дорожная карта релизов </w:t>
+        <w:t xml:space="preserve">Рисунок 8 – Дорожная карта релизов </w:t>
       </w:r>
       <w:r>
         <w:rPr>
@@ -23217,14 +24984,13 @@
         <w:rPr>
           <w:sz w:val="28"/>
         </w:rPr>
-        <w:lastRenderedPageBreak/>
-        <w:t>Рисунок показывает четыре последовательных релиза и вехи ПЗ1. Основной риск плана - узкое окно платной беты (01.06-30.09.2027): по расчетам ЛР2-3</w:t>
-      </w:r>
-      <w:r>
-        <w:rPr>
-          <w:sz w:val="28"/>
-        </w:rPr>
-        <w:t xml:space="preserve"> в базовом сценарии за это время приходит около 19 платящих при цели 50.</w:t>
+        <w:t>Рису</w:t>
+      </w:r>
+      <w:r>
+        <w:rPr>
+          <w:sz w:val="28"/>
+        </w:rPr>
+        <w:t>нок показывает четыре последовательных релиза и вехи ПЗ1. Основной риск плана - узкое окно платной беты (01.06-30.09.2027): по расчетам ЛР2-3 в базовом сценарии за это время приходит около 19 платящих при цели 50.</w:t>
       </w:r>
     </w:p>
     <w:p>
@@ -23238,7 +25004,13 @@
         <w:rPr>
           <w:sz w:val="28"/>
         </w:rPr>
-        <w:t>В таблице 19 представлено: риски и зависимости релизов.</w:t>
+        <w:t>В таблице 20 представлено: риски и зависим</w:t>
+      </w:r>
+      <w:r>
+        <w:rPr>
+          <w:sz w:val="28"/>
+        </w:rPr>
+        <w:t>ости релизов.</w:t>
       </w:r>
     </w:p>
     <w:p>
@@ -23251,7 +25023,7 @@
         <w:rPr>
           <w:sz w:val="28"/>
         </w:rPr>
-        <w:t>Таблица 19 – Риски и зависимости релизов</w:t>
+        <w:t>Таблица 20 – Риски и зависимости релизов</w:t>
       </w:r>
     </w:p>
     <w:tbl>
@@ -23999,7 +25771,13 @@
         <w:rPr>
           <w:sz w:val="28"/>
         </w:rPr>
-        <w:t xml:space="preserve">Наибольшие индексы у риска недостижения цели по платящим (16) и точности находок (15). Они требуют ранней проверки: измерения конверсий уже на </w:t>
+        <w:t>Наибольшие индексы у риска недостижения цели по платящим (16) и точности находок (15). Они требуют ранней проверки: измерения конверсий уже</w:t>
+      </w:r>
+      <w:r>
+        <w:rPr>
+          <w:sz w:val="28"/>
+        </w:rPr>
+        <w:t xml:space="preserve"> на </w:t>
       </w:r>
       <w:r>
         <w:rPr>
@@ -24047,9 +25825,9 @@
         <w:spacing w:before="360" w:after="360" w:line="360" w:lineRule="exact"/>
         <w:ind w:firstLine="709"/>
       </w:pPr>
-      <w:bookmarkStart w:id="16" w:name="_fb011a212b736610690ebb69f4e92f01bd3b3f9"/>
-      <w:bookmarkStart w:id="17" w:name="_Toc241913977"/>
-      <w:bookmarkEnd w:id="14"/>
+      <w:bookmarkStart w:id="17" w:name="_fb011a212b736610690ebb69f4e92f01bd3b3f9"/>
+      <w:bookmarkStart w:id="18" w:name="_Toc241934343"/>
+      <w:bookmarkEnd w:id="15"/>
       <w:r>
         <w:rPr>
           <w:b/>
@@ -24057,7 +25835,7 @@
         </w:rPr>
         <w:t>2.7 Согласованность с ПЗ1 и ПЗ4</w:t>
       </w:r>
-      <w:bookmarkEnd w:id="17"/>
+      <w:bookmarkEnd w:id="18"/>
     </w:p>
     <w:p>
       <w:pPr>
@@ -24070,7 +25848,7 @@
         <w:rPr>
           <w:sz w:val="28"/>
         </w:rPr>
-        <w:t>В таблице 20 представлено: сверка с документами проекта.</w:t>
+        <w:t>В таблице 21 представлено: сверка с документами проекта.</w:t>
       </w:r>
     </w:p>
     <w:p>
@@ -24083,7 +25861,7 @@
         <w:rPr>
           <w:sz w:val="28"/>
         </w:rPr>
-        <w:t>Таблица 20 – Сверка с документами проекта</w:t>
+        <w:t>Таблица 21 – Сверка с документами проекта</w:t>
       </w:r>
     </w:p>
     <w:tbl>
@@ -24497,6 +26275,7 @@
               <w:rPr>
                 <w:sz w:val="24"/>
               </w:rPr>
+              <w:lastRenderedPageBreak/>
               <w:t xml:space="preserve">Бета </w:t>
             </w:r>
             <w:r>
@@ -24890,7 +26669,13 @@
               <w:rPr>
                 <w:sz w:val="24"/>
               </w:rPr>
-              <w:t xml:space="preserve">критерии готовности </w:t>
+              <w:t>критерии готовн</w:t>
+            </w:r>
+            <w:r>
+              <w:rPr>
+                <w:sz w:val="24"/>
+              </w:rPr>
+              <w:t xml:space="preserve">ости </w:t>
             </w:r>
             <w:r>
               <w:rPr>
@@ -24946,14 +26731,7 @@
         <w:rPr>
           <w:sz w:val="28"/>
         </w:rPr>
-        <w:t xml:space="preserve">Все параметры проекта сохранены; единственное расхождение - не в данных, а в прогнозе: цель по платящим достижима только при </w:t>
-      </w:r>
-      <w:r>
-        <w:rPr>
-          <w:sz w:val="28"/>
-        </w:rPr>
-        <w:lastRenderedPageBreak/>
-        <w:t>дополнительных каналах, и это отражено в рисках релизного плана и в реестре рисков проекта.</w:t>
+        <w:t>Все параметры проекта сохранены; единственное расхождение - не в данных, а в прогнозе: цель по платящим достижима только при дополнительных каналах, и это отражено в рисках релизного плана и в реестре рисков проекта.</w:t>
       </w:r>
     </w:p>
     <w:p>
@@ -24962,9 +26740,9 @@
         <w:spacing w:before="360" w:after="360" w:line="360" w:lineRule="exact"/>
         <w:ind w:firstLine="709"/>
       </w:pPr>
-      <w:bookmarkStart w:id="18" w:name="_339ae803435bd6b9a653c2b18dadc62dc9ad8e7"/>
-      <w:bookmarkStart w:id="19" w:name="_Toc241913978"/>
-      <w:bookmarkEnd w:id="16"/>
+      <w:bookmarkStart w:id="19" w:name="_339ae803435bd6b9a653c2b18dadc62dc9ad8e7"/>
+      <w:bookmarkStart w:id="20" w:name="_Toc241934344"/>
+      <w:bookmarkEnd w:id="17"/>
       <w:r>
         <w:rPr>
           <w:b/>
@@ -24972,7 +26750,7 @@
         </w:rPr>
         <w:t>2.8 Проверка расчетов и ограничения</w:t>
       </w:r>
-      <w:bookmarkEnd w:id="19"/>
+      <w:bookmarkEnd w:id="20"/>
     </w:p>
     <w:p>
       <w:pPr>
@@ -25004,13 +26782,7 @@
         <w:rPr>
           <w:sz w:val="28"/>
         </w:rPr>
-        <w:t xml:space="preserve"> охватил индексы проблем, потенциал монетизации и выручку, индексы сегментов, индексы и приоритеты требований и сценариев, баллы и решения по релизам, индексы рисков и приоритеты экранов. Из 155 контрольных величин расхождений не</w:t>
-      </w:r>
-      <w:r>
-        <w:rPr>
-          <w:sz w:val="28"/>
-        </w:rPr>
-        <w:t>т (155 из 155); допуск 1</w:t>
+        <w:t xml:space="preserve"> охватил индексы проблем, потенциал монетизации и выручку, индексы сегментов, индексы и приоритеты требований и сценариев, баллы и решения по релизам, индексы рисков и приоритеты экранов. Из 155 контрольных величин расхождений нет (155 из 155); допуск 1</w:t>
       </w:r>
       <w:r>
         <w:rPr>
@@ -25050,27 +26822,26 @@
         <w:rPr>
           <w:sz w:val="28"/>
         </w:rPr>
-        <w:t xml:space="preserve">Ограничения: оценки 1-5 и 1-4 в книгах выставлены аналитиком по страницам и результатам прежних работ (Д-26), опрос пользователей не проводился, прототип в </w:t>
+        <w:t>Ограничения: оценки 1-5 и 1-4 в книгах выставлены аналитиком по страницам и результатам прежних работ (Д-26), опрос пользователей не проводился (используются модельные данные), прототи</w:t>
+      </w:r>
+      <w:r>
+        <w:rPr>
+          <w:sz w:val="28"/>
+        </w:rPr>
+        <w:t xml:space="preserve">п в </w:t>
       </w:r>
       <w:r>
         <w:rPr>
           <w:i/>
           <w:sz w:val="28"/>
         </w:rPr>
-        <w:t>F</w:t>
-      </w:r>
-      <w:r>
-        <w:rPr>
-          <w:i/>
-          <w:sz w:val="28"/>
-        </w:rPr>
-        <w:t>igma</w:t>
-      </w:r>
-      <w:r>
-        <w:rPr>
-          <w:sz w:val="28"/>
-        </w:rPr>
-        <w:t xml:space="preserve"> не создан, бизнес-логика проверена на формальную связность, но не на реальных пользователях. Эти пункты перечислены в приложении Б.</w:t>
+        <w:t>Figma</w:t>
+      </w:r>
+      <w:r>
+        <w:rPr>
+          <w:sz w:val="28"/>
+        </w:rPr>
+        <w:t xml:space="preserve"> покрывает только страницы сайта, бизнес-логика проверена на формальную связность, но не на реальных пользователях. Эти пункты перечислены в приложении Б.</w:t>
       </w:r>
     </w:p>
     <w:p>
@@ -25080,9 +26851,9 @@
         <w:spacing w:before="0" w:after="360" w:line="360" w:lineRule="exact"/>
         <w:ind w:firstLine="709"/>
       </w:pPr>
-      <w:bookmarkStart w:id="20" w:name="_1bfdad9d2d88ddb6ca16c31c1d4d4943679f32f"/>
-      <w:bookmarkStart w:id="21" w:name="_Toc241913979"/>
-      <w:bookmarkEnd w:id="18"/>
+      <w:bookmarkStart w:id="21" w:name="_1bfdad9d2d88ddb6ca16c31c1d4d4943679f32f"/>
+      <w:bookmarkStart w:id="22" w:name="_Toc241934345"/>
+      <w:bookmarkEnd w:id="19"/>
       <w:bookmarkEnd w:id="2"/>
       <w:r>
         <w:rPr>
@@ -25092,7 +26863,7 @@
         <w:lastRenderedPageBreak/>
         <w:t>3 ОТВЕТЫ НА КОНТРОЛЬНЫЕ ВОПРОСЫ</w:t>
       </w:r>
-      <w:bookmarkEnd w:id="21"/>
+      <w:bookmarkEnd w:id="22"/>
     </w:p>
     <w:p>
       <w:pPr>
@@ -25105,7 +26876,13 @@
         <w:rPr>
           <w:sz w:val="28"/>
         </w:rPr>
-        <w:t>Ответы даны по контрольным точкам книг [3], [4] и проверкам связности [1], [2].</w:t>
+        <w:t xml:space="preserve">Ответы даны по контрольным точкам книг [3], [4] и проверкам </w:t>
+      </w:r>
+      <w:r>
+        <w:rPr>
+          <w:sz w:val="28"/>
+        </w:rPr>
+        <w:t>связности [1], [2].</w:t>
       </w:r>
     </w:p>
     <w:p>
@@ -25238,7 +27015,7 @@
         <w:rPr>
           <w:sz w:val="28"/>
         </w:rPr>
-        <w:t>Определены ли первый и следующие релизы и их критерии? Да, таблицы 17 и 18.</w:t>
+        <w:t>Определены ли первый и следующие релизы и их критерии? Да, таблицы 18 и 19.</w:t>
       </w:r>
     </w:p>
     <w:p>
@@ -25256,7 +27033,7 @@
         <w:rPr>
           <w:sz w:val="28"/>
         </w:rPr>
-        <w:t>Согласованы ли результаты с ПЗ1 и ПЗ4? Да, таблица 20.</w:t>
+        <w:t>Согласованы ли результаты с ПЗ1 и ПЗ4? Да, таблица 21.</w:t>
       </w:r>
     </w:p>
     <w:p>
@@ -25274,7 +27051,13 @@
         <w:rPr>
           <w:sz w:val="28"/>
         </w:rPr>
-        <w:t xml:space="preserve">Выполнены ли все пункты методики? Кроме прототипа в </w:t>
+        <w:t>Выполнены ли все пункты методики? Да; прототип сайта созда</w:t>
+      </w:r>
+      <w:r>
+        <w:rPr>
+          <w:sz w:val="28"/>
+        </w:rPr>
+        <w:t xml:space="preserve">н в </w:t>
       </w:r>
       <w:r>
         <w:rPr>
@@ -25287,13 +27070,7 @@
         <w:rPr>
           <w:sz w:val="28"/>
         </w:rPr>
-        <w:t>,</w:t>
-      </w:r>
-      <w:r>
-        <w:rPr>
-          <w:sz w:val="28"/>
-        </w:rPr>
-        <w:t xml:space="preserve"> который вынесен в приложение Б.</w:t>
+        <w:t xml:space="preserve"> (раздел 2.5.1), его доработка под экраны приложения вынесена в приложение Б.</w:t>
       </w:r>
     </w:p>
     <w:p>
@@ -25303,9 +27080,9 @@
         <w:spacing w:before="0" w:after="360" w:line="360" w:lineRule="exact"/>
         <w:jc w:val="center"/>
       </w:pPr>
-      <w:bookmarkStart w:id="22" w:name="_выводы"/>
-      <w:bookmarkStart w:id="23" w:name="_Toc241913980"/>
-      <w:bookmarkEnd w:id="20"/>
+      <w:bookmarkStart w:id="23" w:name="_выводы"/>
+      <w:bookmarkStart w:id="24" w:name="_Toc241934346"/>
+      <w:bookmarkEnd w:id="21"/>
       <w:r>
         <w:rPr>
           <w:b/>
@@ -25314,7 +27091,7 @@
         <w:lastRenderedPageBreak/>
         <w:t>ВЫВОДЫ</w:t>
       </w:r>
-      <w:bookmarkEnd w:id="23"/>
+      <w:bookmarkEnd w:id="24"/>
     </w:p>
     <w:p>
       <w:pPr>
@@ -25340,7 +27117,13 @@
         <w:rPr>
           <w:sz w:val="28"/>
         </w:rPr>
-        <w:t xml:space="preserve">-моделей с доказательством каждой находки), три цифровых товара (веб-аудит, надстройка </w:t>
+        <w:t xml:space="preserve">-моделей с доказательством каждой находки), три цифровых товара (веб-аудит, </w:t>
+      </w:r>
+      <w:r>
+        <w:rPr>
+          <w:sz w:val="28"/>
+        </w:rPr>
+        <w:t xml:space="preserve">надстройка </w:t>
       </w:r>
       <w:r>
         <w:rPr>
@@ -25353,13 +27136,7 @@
         <w:rPr>
           <w:sz w:val="28"/>
         </w:rPr>
-        <w:t>, командный сервис) и три единицы моне</w:t>
-      </w:r>
-      <w:r>
-        <w:rPr>
-          <w:sz w:val="28"/>
-        </w:rPr>
-        <w:t>тизации (9, 19 и 29 </w:t>
+        <w:t>, командный сервис) и три единицы монетизации (9, 19 и 29 </w:t>
       </w:r>
       <w:r>
         <w:rPr>
@@ -25386,7 +27163,13 @@
         <w:rPr>
           <w:sz w:val="28"/>
         </w:rPr>
-        <w:t xml:space="preserve">Канвас готов на 67 % по блокам: слабее остальных каналы, ключевые ресурсы и партнеры. В </w:t>
+        <w:t>Канвас готов на 67 % по блокам: слабее остальных каналы,</w:t>
+      </w:r>
+      <w:r>
+        <w:rPr>
+          <w:sz w:val="28"/>
+        </w:rPr>
+        <w:t xml:space="preserve"> ключевые ресурсы и партнеры. В </w:t>
       </w:r>
       <w:r>
         <w:rPr>
@@ -25399,13 +27182,7 @@
         <w:rPr>
           <w:sz w:val="28"/>
         </w:rPr>
-        <w:t xml:space="preserve"> входят 8 из 18 тре</w:t>
-      </w:r>
-      <w:r>
-        <w:rPr>
-          <w:sz w:val="28"/>
-        </w:rPr>
-        <w:t xml:space="preserve">бований, как в ПЗ1; первый релиз содержит 11 единиц разработки, надстройка </w:t>
+        <w:t xml:space="preserve"> входят 8 из 18 требований, как в ПЗ1; первый релиз содержит 11 единиц разработки, надстройка </w:t>
       </w:r>
       <w:r>
         <w:rPr>
@@ -25458,13 +27235,13 @@
         <w:rPr>
           <w:sz w:val="28"/>
         </w:rPr>
-        <w:t>Главный риск плана - узкое окно платной беты при цели 50 платящих: его нужно снимать дополнительным</w:t>
-      </w:r>
-      <w:r>
-        <w:rPr>
-          <w:sz w:val="28"/>
-        </w:rPr>
-        <w:t xml:space="preserve">и каналами и ранним измерением конверсий. Следующие шаги: создать прототип в </w:t>
+        <w:t xml:space="preserve">Главный риск плана - узкое окно платной беты </w:t>
+      </w:r>
+      <w:r>
+        <w:rPr>
+          <w:sz w:val="28"/>
+        </w:rPr>
+        <w:t xml:space="preserve">при цели 50 платящих: его нужно снимать дополнительными каналами и ранним измерением конверсий. Следующие шаги: дополнить прототип в </w:t>
       </w:r>
       <w:r>
         <w:rPr>
@@ -25477,7 +27254,13 @@
         <w:rPr>
           <w:sz w:val="28"/>
         </w:rPr>
-        <w:t xml:space="preserve"> по схемам экранов, провести опрос по платежеспособности и Кано, затем свести результаты в итоговом отчете ЛР7.</w:t>
+        <w:t xml:space="preserve"> экранами приложения и страницей тарифов, провести опрос по платежеспособности и Кано, затем свести результаты в итого</w:t>
+      </w:r>
+      <w:r>
+        <w:rPr>
+          <w:sz w:val="28"/>
+        </w:rPr>
+        <w:t>вом отчете ЛР7.</w:t>
       </w:r>
     </w:p>
     <w:p>
@@ -25487,9 +27270,9 @@
         <w:spacing w:before="0" w:after="360" w:line="360" w:lineRule="exact"/>
         <w:jc w:val="center"/>
       </w:pPr>
-      <w:bookmarkStart w:id="24" w:name="_274f6a444530ef90b0479dabf3d210f01e97699"/>
-      <w:bookmarkStart w:id="25" w:name="_Toc241913981"/>
-      <w:bookmarkEnd w:id="22"/>
+      <w:bookmarkStart w:id="25" w:name="_274f6a444530ef90b0479dabf3d210f01e97699"/>
+      <w:bookmarkStart w:id="26" w:name="_Toc241934347"/>
+      <w:bookmarkEnd w:id="23"/>
       <w:r>
         <w:rPr>
           <w:b/>
@@ -25498,7 +27281,7 @@
         <w:lastRenderedPageBreak/>
         <w:t>СПИСОК ИСПОЛЬЗОВАННЫХ ИСТОЧНИКОВ</w:t>
       </w:r>
-      <w:bookmarkEnd w:id="25"/>
+      <w:bookmarkEnd w:id="26"/>
     </w:p>
     <w:p>
       <w:pPr>
@@ -25528,13 +27311,7 @@
         <w:rPr>
           <w:sz w:val="28"/>
         </w:rPr>
-        <w:t>. Методические материалы дисцип</w:t>
-      </w:r>
-      <w:r>
-        <w:rPr>
-          <w:sz w:val="28"/>
-        </w:rPr>
-        <w:t>лины «Электронный бизнес» к лабораторной работе № 6. – Минск : БГУИР, 2026.</w:t>
+        <w:t>. Методические материалы дисциплины «Электронный бизнес» к лабораторной работе № 6. – Минск : БГУИР, 2026.</w:t>
       </w:r>
     </w:p>
     <w:p>
@@ -25552,7 +27329,13 @@
         <w:rPr>
           <w:sz w:val="28"/>
         </w:rPr>
-        <w:t xml:space="preserve">Методика сборки бизнес-модели по Канвас на основе анализа; шаблон </w:t>
+        <w:t>Методика сборки бизн</w:t>
+      </w:r>
+      <w:r>
+        <w:rPr>
+          <w:sz w:val="28"/>
+        </w:rPr>
+        <w:t xml:space="preserve">ес-модели по Канвас на основе анализа; шаблон </w:t>
       </w:r>
       <w:r>
         <w:rPr>
@@ -25583,13 +27366,7 @@
         <w:rPr>
           <w:sz w:val="28"/>
         </w:rPr>
-        <w:t>Методика формулирования бизн</w:t>
-      </w:r>
-      <w:r>
-        <w:rPr>
-          <w:sz w:val="28"/>
-        </w:rPr>
-        <w:t xml:space="preserve">ес-логики и пользовательских сценариев; шаблон </w:t>
+        <w:t xml:space="preserve">Методика формулирования бизнес-логики и пользовательских сценариев; шаблон </w:t>
       </w:r>
       <w:r>
         <w:rPr>
@@ -25602,7 +27379,13 @@
         <w:rPr>
           <w:sz w:val="28"/>
         </w:rPr>
-        <w:t>. Методические материалы дисциплины «Электронный бизнес». – Минск : БГУИР, 2026.</w:t>
+        <w:t>. Методические материалы дисциплины «Электро</w:t>
+      </w:r>
+      <w:r>
+        <w:rPr>
+          <w:sz w:val="28"/>
+        </w:rPr>
+        <w:t>нный бизнес». – Минск : БГУИР, 2026.</w:t>
       </w:r>
     </w:p>
     <w:p>
@@ -25633,13 +27416,7 @@
         <w:rPr>
           <w:sz w:val="28"/>
         </w:rPr>
-        <w:t xml:space="preserve">. Методические материалы дисциплины «Электронный </w:t>
-      </w:r>
-      <w:r>
-        <w:rPr>
-          <w:sz w:val="28"/>
-        </w:rPr>
-        <w:t>бизнес». – Минск : БГУИР, 2026.</w:t>
+        <w:t>. Методические материалы дисциплины «Электронный бизнес». – Минск : БГУИР, 2026.</w:t>
       </w:r>
     </w:p>
     <w:p>
@@ -25670,7 +27447,13 @@
         <w:rPr>
           <w:sz w:val="28"/>
         </w:rPr>
-        <w:t>. Методические материалы дисциплины «Электронный бизнес». – Минск : БГУИР, 2026.</w:t>
+        <w:t>. Метод</w:t>
+      </w:r>
+      <w:r>
+        <w:rPr>
+          <w:sz w:val="28"/>
+        </w:rPr>
+        <w:t>ические материалы дисциплины «Электронный бизнес». – Минск : БГУИР, 2026.</w:t>
       </w:r>
     </w:p>
     <w:p>
@@ -25721,20 +27504,19 @@
           <w:i/>
           <w:sz w:val="28"/>
         </w:rPr>
-        <w:t>Tab</w:t>
-      </w:r>
-      <w:r>
-        <w:rPr>
-          <w:i/>
-          <w:sz w:val="28"/>
-        </w:rPr>
-        <w:t>leMind</w:t>
-      </w:r>
-      <w:r>
-        <w:rPr>
-          <w:sz w:val="28"/>
-        </w:rPr>
-        <w:t>: отчеты по практическим занятиям по дисциплине «Управление проектами»; отчеты по лабораторным работам № 1, № 2–3, № 4, № 5 по дисциплине «Электронный бизнес» / Р. В. Земляник. – Минск : БГУИР, 2026.</w:t>
+        <w:t>TableMind</w:t>
+      </w:r>
+      <w:r>
+        <w:rPr>
+          <w:sz w:val="28"/>
+        </w:rPr>
+        <w:t xml:space="preserve">: отчеты по практическим занятиям по дисциплине «Управление проектами»; отчеты по </w:t>
+      </w:r>
+      <w:r>
+        <w:rPr>
+          <w:sz w:val="28"/>
+        </w:rPr>
+        <w:t>лабораторным работам № 1, № 2–3, № 4, № 5 по дисциплине «Электронный бизнес» / Р. В. Земляник. – Минск : БГУИР, 2026.</w:t>
       </w:r>
     </w:p>
     <w:p>
@@ -25907,15 +27689,46 @@
     </w:p>
     <w:p>
       <w:pPr>
+        <w:pStyle w:val="FirstParagraph"/>
+        <w:numPr>
+          <w:ilvl w:val="0"/>
+          <w:numId w:val="3"/>
+        </w:numPr>
+        <w:spacing w:before="0" w:after="0" w:line="360" w:lineRule="exact"/>
+        <w:ind w:left="709" w:hanging="425"/>
+        <w:jc w:val="both"/>
+      </w:pPr>
+      <w:r>
+        <w:rPr>
+          <w:sz w:val="28"/>
+        </w:rPr>
+        <w:t xml:space="preserve">Методическое пособие по </w:t>
+      </w:r>
+      <w:r>
+        <w:rPr>
+          <w:i/>
+          <w:sz w:val="28"/>
+        </w:rPr>
+        <w:t>Figma</w:t>
+      </w:r>
+      <w:r>
+        <w:rPr>
+          <w:sz w:val="28"/>
+        </w:rPr>
+        <w:t xml:space="preserve"> / под рук. Т. Н. Беляцкой. – Минск : БГУИР, 2026. – 73 с.</w:t>
+      </w:r>
+    </w:p>
+    <w:p>
+      <w:pPr>
         <w:pStyle w:val="1"/>
         <w:keepNext w:val="0"/>
         <w:pageBreakBefore/>
         <w:spacing w:before="0" w:after="0" w:line="360" w:lineRule="exact"/>
         <w:jc w:val="center"/>
       </w:pPr>
-      <w:bookmarkStart w:id="26" w:name="_3d74faf1500c1b2a4a8bfa8e0e37c74206ce73d"/>
-      <w:bookmarkStart w:id="27" w:name="_Toc241913982"/>
-      <w:bookmarkEnd w:id="24"/>
+      <w:bookmarkStart w:id="27" w:name="_3d74faf1500c1b2a4a8bfa8e0e37c74206ce73d"/>
+      <w:bookmarkStart w:id="28" w:name="_Toc241934348"/>
+      <w:bookmarkEnd w:id="25"/>
       <w:r>
         <w:rPr>
           <w:b/>
@@ -25924,7 +27737,7 @@
         <w:lastRenderedPageBreak/>
         <w:t>ПРИЛОЖЕНИЕ А</w:t>
       </w:r>
-      <w:bookmarkEnd w:id="27"/>
+      <w:bookmarkEnd w:id="28"/>
     </w:p>
     <w:p>
       <w:pPr>
@@ -25976,13 +27789,13 @@
         <w:rPr>
           <w:sz w:val="28"/>
         </w:rPr>
-        <w:t xml:space="preserve">В таблице 21 представлено: журнал </w:t>
-      </w:r>
-      <w:r>
-        <w:rPr>
-          <w:sz w:val="28"/>
-        </w:rPr>
-        <w:t>допущений ЛР6.</w:t>
+        <w:t>В таблице 22 представ</w:t>
+      </w:r>
+      <w:r>
+        <w:rPr>
+          <w:sz w:val="28"/>
+        </w:rPr>
+        <w:t>лено: журнал допущений ЛР6.</w:t>
       </w:r>
     </w:p>
     <w:p>
@@ -25995,7 +27808,7 @@
         <w:rPr>
           <w:sz w:val="28"/>
         </w:rPr>
-        <w:t>Таблица 21 – Журнал допущений ЛР6</w:t>
+        <w:t>Таблица 22 – Журнал допущений ЛР6</w:t>
       </w:r>
     </w:p>
     <w:tbl>
@@ -26726,9 +28539,9 @@
         <w:spacing w:before="0" w:after="0" w:line="360" w:lineRule="exact"/>
         <w:jc w:val="center"/>
       </w:pPr>
-      <w:bookmarkStart w:id="28" w:name="_d684f183eb868ee4ace295916bed2e6be64d16e"/>
-      <w:bookmarkStart w:id="29" w:name="_Toc241913983"/>
-      <w:bookmarkEnd w:id="26"/>
+      <w:bookmarkStart w:id="29" w:name="_d684f183eb868ee4ace295916bed2e6be64d16e"/>
+      <w:bookmarkStart w:id="30" w:name="_Toc241934349"/>
+      <w:bookmarkEnd w:id="27"/>
       <w:r>
         <w:rPr>
           <w:b/>
@@ -26737,7 +28550,7 @@
         <w:lastRenderedPageBreak/>
         <w:t>ПРИЛОЖЕНИЕ Б</w:t>
       </w:r>
-      <w:bookmarkEnd w:id="29"/>
+      <w:bookmarkEnd w:id="30"/>
     </w:p>
     <w:p>
       <w:pPr>
@@ -26789,7 +28602,7 @@
         <w:rPr>
           <w:sz w:val="28"/>
         </w:rPr>
-        <w:t>В таблице 22 представлено: перечень данных, требующих получения или уточнения.</w:t>
+        <w:t>В таблице 23 представлено: перечень данных, требующих получения или уточнения.</w:t>
       </w:r>
     </w:p>
     <w:p>
@@ -26802,7 +28615,7 @@
         <w:rPr>
           <w:sz w:val="28"/>
         </w:rPr>
-        <w:t>Таблица 22 – Перечень данных, требующих получения или уточнения</w:t>
+        <w:t>Таблица 23 – Перечень данных, требующих получения или уточнения</w:t>
       </w:r>
     </w:p>
     <w:tbl>
@@ -26822,11 +28635,11 @@
         <w:tblLook w:val="0020" w:firstRow="1" w:lastRow="0" w:firstColumn="0" w:lastColumn="0" w:noHBand="0" w:noVBand="0"/>
       </w:tblPr>
       <w:tblGrid>
-        <w:gridCol w:w="639"/>
-        <w:gridCol w:w="2203"/>
-        <w:gridCol w:w="1752"/>
-        <w:gridCol w:w="2741"/>
-        <w:gridCol w:w="2020"/>
+        <w:gridCol w:w="637"/>
+        <w:gridCol w:w="2176"/>
+        <w:gridCol w:w="1818"/>
+        <w:gridCol w:w="2708"/>
+        <w:gridCol w:w="2016"/>
       </w:tblGrid>
       <w:tr>
         <w:trPr>
@@ -26837,7 +28650,7 @@
         </w:trPr>
         <w:tc>
           <w:tcPr>
-            <w:tcW w:w="638" w:type="dxa"/>
+            <w:tcW w:w="637" w:type="dxa"/>
             <w:vAlign w:val="center"/>
           </w:tcPr>
           <w:p>
@@ -26857,7 +28670,7 @@
         </w:tc>
         <w:tc>
           <w:tcPr>
-            <w:tcW w:w="2203" w:type="dxa"/>
+            <w:tcW w:w="2176" w:type="dxa"/>
             <w:vAlign w:val="center"/>
           </w:tcPr>
           <w:p>
@@ -26877,7 +28690,7 @@
         </w:tc>
         <w:tc>
           <w:tcPr>
-            <w:tcW w:w="1752" w:type="dxa"/>
+            <w:tcW w:w="1818" w:type="dxa"/>
             <w:vAlign w:val="center"/>
           </w:tcPr>
           <w:p>
@@ -26897,7 +28710,7 @@
         </w:tc>
         <w:tc>
           <w:tcPr>
-            <w:tcW w:w="2741" w:type="dxa"/>
+            <w:tcW w:w="2708" w:type="dxa"/>
             <w:vAlign w:val="center"/>
           </w:tcPr>
           <w:p>
@@ -26917,7 +28730,7 @@
         </w:tc>
         <w:tc>
           <w:tcPr>
-            <w:tcW w:w="2020" w:type="dxa"/>
+            <w:tcW w:w="2016" w:type="dxa"/>
             <w:vAlign w:val="center"/>
           </w:tcPr>
           <w:p>
@@ -26943,7 +28756,7 @@
         </w:trPr>
         <w:tc>
           <w:tcPr>
-            <w:tcW w:w="638" w:type="dxa"/>
+            <w:tcW w:w="637" w:type="dxa"/>
             <w:vAlign w:val="center"/>
           </w:tcPr>
           <w:p>
@@ -26962,26 +28775,26 @@
         </w:tc>
         <w:tc>
           <w:tcPr>
-            <w:tcW w:w="2203" w:type="dxa"/>
-            <w:vAlign w:val="center"/>
-          </w:tcPr>
-          <w:p>
-            <w:pPr>
-              <w:pStyle w:val="Compact"/>
-              <w:spacing w:before="0" w:after="0" w:line="280" w:lineRule="exact"/>
-              <w:jc w:val="center"/>
-            </w:pPr>
-            <w:r>
-              <w:rPr>
-                <w:sz w:val="24"/>
-              </w:rPr>
-              <w:t>Прототип основных экранов</w:t>
-            </w:r>
-          </w:p>
-        </w:tc>
-        <w:tc>
-          <w:tcPr>
-            <w:tcW w:w="1752" w:type="dxa"/>
+            <w:tcW w:w="2176" w:type="dxa"/>
+            <w:vAlign w:val="center"/>
+          </w:tcPr>
+          <w:p>
+            <w:pPr>
+              <w:pStyle w:val="Compact"/>
+              <w:spacing w:before="0" w:after="0" w:line="280" w:lineRule="exact"/>
+              <w:jc w:val="center"/>
+            </w:pPr>
+            <w:r>
+              <w:rPr>
+                <w:sz w:val="24"/>
+              </w:rPr>
+              <w:t>Дополнить прототип экранами приложения и тарифами</w:t>
+            </w:r>
+          </w:p>
+        </w:tc>
+        <w:tc>
+          <w:tcPr>
+            <w:tcW w:w="1818" w:type="dxa"/>
             <w:vAlign w:val="center"/>
           </w:tcPr>
           <w:p>
@@ -27001,33 +28814,33 @@
               <w:rPr>
                 <w:sz w:val="24"/>
               </w:rPr>
-              <w:t xml:space="preserve"> (аккаунт студентки подключен)</w:t>
-            </w:r>
-          </w:p>
-        </w:tc>
-        <w:tc>
-          <w:tcPr>
-            <w:tcW w:w="2741" w:type="dxa"/>
-            <w:vAlign w:val="center"/>
-          </w:tcPr>
-          <w:p>
-            <w:pPr>
-              <w:pStyle w:val="Compact"/>
-              <w:spacing w:before="0" w:after="0" w:line="280" w:lineRule="exact"/>
-              <w:jc w:val="center"/>
-            </w:pPr>
-            <w:r>
-              <w:rPr>
-                <w:sz w:val="24"/>
-              </w:rPr>
-              <w:t xml:space="preserve">по схемам экранов и паспортам создать страницы </w:t>
-            </w:r>
-            <w:r>
-              <w:rPr>
-                <w:i/>
-                <w:sz w:val="24"/>
-              </w:rPr>
-              <w:t>U-001</w:t>
+              <w:t xml:space="preserve"> (файл студентки, ссылка в разделе 2.5.1)</w:t>
+            </w:r>
+          </w:p>
+        </w:tc>
+        <w:tc>
+          <w:tcPr>
+            <w:tcW w:w="2708" w:type="dxa"/>
+            <w:vAlign w:val="center"/>
+          </w:tcPr>
+          <w:p>
+            <w:pPr>
+              <w:pStyle w:val="Compact"/>
+              <w:spacing w:before="0" w:after="0" w:line="280" w:lineRule="exact"/>
+              <w:jc w:val="center"/>
+            </w:pPr>
+            <w:r>
+              <w:rPr>
+                <w:sz w:val="24"/>
+              </w:rPr>
+              <w:t xml:space="preserve">по схемам и паспортам добавить </w:t>
+            </w:r>
+            <w:r>
+              <w:rPr>
+                <w:i/>
+                <w:sz w:val="24"/>
+              </w:rPr>
+              <w:t>U-002</w:t>
             </w:r>
             <w:r>
               <w:rPr>
@@ -27046,39 +28859,39 @@
               <w:rPr>
                 <w:sz w:val="24"/>
               </w:rPr>
-              <w:t xml:space="preserve"> в </w:t>
-            </w:r>
-            <w:r>
-              <w:rPr>
-                <w:i/>
-                <w:sz w:val="24"/>
-              </w:rPr>
-              <w:t>Figma</w:t>
-            </w:r>
-            <w:r>
-              <w:rPr>
-                <w:sz w:val="24"/>
-              </w:rPr>
-              <w:t xml:space="preserve"> по пособию, связать кликабельный путь</w:t>
-            </w:r>
-          </w:p>
-        </w:tc>
-        <w:tc>
-          <w:tcPr>
-            <w:tcW w:w="2020" w:type="dxa"/>
-            <w:vAlign w:val="center"/>
-          </w:tcPr>
-          <w:p>
-            <w:pPr>
-              <w:pStyle w:val="Compact"/>
-              <w:spacing w:before="0" w:after="0" w:line="280" w:lineRule="exact"/>
-              <w:jc w:val="center"/>
-            </w:pPr>
-            <w:r>
-              <w:rPr>
-                <w:sz w:val="24"/>
-              </w:rPr>
-              <w:t>приложение отчета, ссылка на файл</w:t>
+              <w:t xml:space="preserve">, переписать тексты под аудит </w:t>
+            </w:r>
+            <w:r>
+              <w:rPr>
+                <w:i/>
+                <w:sz w:val="24"/>
+              </w:rPr>
+              <w:t>Excel</w:t>
+            </w:r>
+            <w:r>
+              <w:rPr>
+                <w:sz w:val="24"/>
+              </w:rPr>
+              <w:t>, связать кликабельный путь</w:t>
+            </w:r>
+          </w:p>
+        </w:tc>
+        <w:tc>
+          <w:tcPr>
+            <w:tcW w:w="2016" w:type="dxa"/>
+            <w:vAlign w:val="center"/>
+          </w:tcPr>
+          <w:p>
+            <w:pPr>
+              <w:pStyle w:val="Compact"/>
+              <w:spacing w:before="0" w:after="0" w:line="280" w:lineRule="exact"/>
+              <w:jc w:val="center"/>
+            </w:pPr>
+            <w:r>
+              <w:rPr>
+                <w:sz w:val="24"/>
+              </w:rPr>
+              <w:t>раздел 2.5.1, приложение</w:t>
             </w:r>
           </w:p>
         </w:tc>
@@ -27090,7 +28903,7 @@
         </w:trPr>
         <w:tc>
           <w:tcPr>
-            <w:tcW w:w="638" w:type="dxa"/>
+            <w:tcW w:w="637" w:type="dxa"/>
             <w:vAlign w:val="center"/>
           </w:tcPr>
           <w:p>
@@ -27109,7 +28922,7 @@
         </w:tc>
         <w:tc>
           <w:tcPr>
-            <w:tcW w:w="2203" w:type="dxa"/>
+            <w:tcW w:w="2176" w:type="dxa"/>
             <w:vAlign w:val="center"/>
           </w:tcPr>
           <w:p>
@@ -27128,7 +28941,7 @@
         </w:tc>
         <w:tc>
           <w:tcPr>
-            <w:tcW w:w="1752" w:type="dxa"/>
+            <w:tcW w:w="1818" w:type="dxa"/>
             <w:vAlign w:val="center"/>
           </w:tcPr>
           <w:p>
@@ -27147,7 +28960,7 @@
         </w:tc>
         <w:tc>
           <w:tcPr>
-            <w:tcW w:w="2741" w:type="dxa"/>
+            <w:tcW w:w="2708" w:type="dxa"/>
             <w:vAlign w:val="center"/>
           </w:tcPr>
           <w:p>
@@ -27166,7 +28979,7 @@
         </w:tc>
         <w:tc>
           <w:tcPr>
-            <w:tcW w:w="2020" w:type="dxa"/>
+            <w:tcW w:w="2016" w:type="dxa"/>
             <w:vAlign w:val="center"/>
           </w:tcPr>
           <w:p>
@@ -27191,7 +29004,7 @@
         </w:trPr>
         <w:tc>
           <w:tcPr>
-            <w:tcW w:w="638" w:type="dxa"/>
+            <w:tcW w:w="637" w:type="dxa"/>
             <w:vAlign w:val="center"/>
           </w:tcPr>
           <w:p>
@@ -27210,7 +29023,7 @@
         </w:tc>
         <w:tc>
           <w:tcPr>
-            <w:tcW w:w="2203" w:type="dxa"/>
+            <w:tcW w:w="2176" w:type="dxa"/>
             <w:vAlign w:val="center"/>
           </w:tcPr>
           <w:p>
@@ -27229,7 +29042,7 @@
         </w:tc>
         <w:tc>
           <w:tcPr>
-            <w:tcW w:w="1752" w:type="dxa"/>
+            <w:tcW w:w="1818" w:type="dxa"/>
             <w:vAlign w:val="center"/>
           </w:tcPr>
           <w:p>
@@ -27249,32 +29062,32 @@
         </w:tc>
         <w:tc>
           <w:tcPr>
-            <w:tcW w:w="2741" w:type="dxa"/>
-            <w:vAlign w:val="center"/>
-          </w:tcPr>
-          <w:p>
-            <w:pPr>
-              <w:pStyle w:val="Compact"/>
-              <w:spacing w:before="0" w:after="0" w:line="280" w:lineRule="exact"/>
-              <w:jc w:val="center"/>
-            </w:pPr>
-            <w:r>
-              <w:rPr>
-                <w:sz w:val="24"/>
-              </w:rPr>
-              <w:t>сн</w:t>
-            </w:r>
-            <w:r>
-              <w:rPr>
-                <w:sz w:val="24"/>
-              </w:rPr>
-              <w:t>ять главные страницы и тарифы 7 конкурентов</w:t>
-            </w:r>
-          </w:p>
-        </w:tc>
-        <w:tc>
-          <w:tcPr>
-            <w:tcW w:w="2020" w:type="dxa"/>
+            <w:tcW w:w="2708" w:type="dxa"/>
+            <w:vAlign w:val="center"/>
+          </w:tcPr>
+          <w:p>
+            <w:pPr>
+              <w:pStyle w:val="Compact"/>
+              <w:spacing w:before="0" w:after="0" w:line="280" w:lineRule="exact"/>
+              <w:jc w:val="center"/>
+            </w:pPr>
+            <w:r>
+              <w:rPr>
+                <w:sz w:val="24"/>
+              </w:rPr>
+              <w:t>снять главн</w:t>
+            </w:r>
+            <w:r>
+              <w:rPr>
+                <w:sz w:val="24"/>
+              </w:rPr>
+              <w:t>ые страницы и тарифы 7 конкурентов</w:t>
+            </w:r>
+          </w:p>
+        </w:tc>
+        <w:tc>
+          <w:tcPr>
+            <w:tcW w:w="2016" w:type="dxa"/>
             <w:vAlign w:val="center"/>
           </w:tcPr>
           <w:p>
@@ -27299,7 +29112,7 @@
         </w:trPr>
         <w:tc>
           <w:tcPr>
-            <w:tcW w:w="638" w:type="dxa"/>
+            <w:tcW w:w="637" w:type="dxa"/>
             <w:vAlign w:val="center"/>
           </w:tcPr>
           <w:p>
@@ -27318,7 +29131,7 @@
         </w:tc>
         <w:tc>
           <w:tcPr>
-            <w:tcW w:w="2203" w:type="dxa"/>
+            <w:tcW w:w="2176" w:type="dxa"/>
             <w:vAlign w:val="center"/>
           </w:tcPr>
           <w:p>
@@ -27344,7 +29157,7 @@
         </w:tc>
         <w:tc>
           <w:tcPr>
-            <w:tcW w:w="1752" w:type="dxa"/>
+            <w:tcW w:w="1818" w:type="dxa"/>
             <w:vAlign w:val="center"/>
           </w:tcPr>
           <w:p>
@@ -27363,7 +29176,7 @@
         </w:tc>
         <w:tc>
           <w:tcPr>
-            <w:tcW w:w="2741" w:type="dxa"/>
+            <w:tcW w:w="2708" w:type="dxa"/>
             <w:vAlign w:val="center"/>
           </w:tcPr>
           <w:p>
@@ -27382,7 +29195,7 @@
         </w:tc>
         <w:tc>
           <w:tcPr>
-            <w:tcW w:w="2020" w:type="dxa"/>
+            <w:tcW w:w="2016" w:type="dxa"/>
             <w:vAlign w:val="center"/>
           </w:tcPr>
           <w:p>
@@ -27407,7 +29220,7 @@
         </w:trPr>
         <w:tc>
           <w:tcPr>
-            <w:tcW w:w="638" w:type="dxa"/>
+            <w:tcW w:w="637" w:type="dxa"/>
             <w:vAlign w:val="center"/>
           </w:tcPr>
           <w:p>
@@ -27426,7 +29239,7 @@
         </w:tc>
         <w:tc>
           <w:tcPr>
-            <w:tcW w:w="2203" w:type="dxa"/>
+            <w:tcW w:w="2176" w:type="dxa"/>
             <w:vAlign w:val="center"/>
           </w:tcPr>
           <w:p>
@@ -27471,7 +29284,7 @@
         </w:tc>
         <w:tc>
           <w:tcPr>
-            <w:tcW w:w="1752" w:type="dxa"/>
+            <w:tcW w:w="1818" w:type="dxa"/>
             <w:vAlign w:val="center"/>
           </w:tcPr>
           <w:p>
@@ -27523,7 +29336,7 @@
         </w:tc>
         <w:tc>
           <w:tcPr>
-            <w:tcW w:w="2741" w:type="dxa"/>
+            <w:tcW w:w="2708" w:type="dxa"/>
             <w:vAlign w:val="center"/>
           </w:tcPr>
           <w:p>
@@ -27542,7 +29355,7 @@
         </w:tc>
         <w:tc>
           <w:tcPr>
-            <w:tcW w:w="2020" w:type="dxa"/>
+            <w:tcW w:w="2016" w:type="dxa"/>
             <w:vAlign w:val="center"/>
           </w:tcPr>
           <w:p>
@@ -27598,7 +29411,7 @@
         <w:rPr>
           <w:sz w:val="28"/>
         </w:rPr>
-        <w:t xml:space="preserve"> под аккаунтом студентки; пункты 4-5 зависят от запуска и внешних условий.</w:t>
+        <w:t xml:space="preserve"> под аккаунтом студентки; пункты 4-5 зависят от запуска и внешних условий. Базовый прототип сайта (три страницы) уже создан.</w:t>
       </w:r>
     </w:p>
     <w:p>
@@ -27609,9 +29422,9 @@
         <w:spacing w:before="0" w:after="0" w:line="360" w:lineRule="exact"/>
         <w:jc w:val="center"/>
       </w:pPr>
-      <w:bookmarkStart w:id="30" w:name="_6574ce6d3bdcb7786930e8390195aee2be99a58"/>
-      <w:bookmarkStart w:id="31" w:name="_Toc241913984"/>
-      <w:bookmarkEnd w:id="28"/>
+      <w:bookmarkStart w:id="31" w:name="_6574ce6d3bdcb7786930e8390195aee2be99a58"/>
+      <w:bookmarkStart w:id="32" w:name="_Toc241934350"/>
+      <w:bookmarkEnd w:id="29"/>
       <w:r>
         <w:rPr>
           <w:b/>
@@ -27620,7 +29433,7 @@
         <w:lastRenderedPageBreak/>
         <w:t>ПРИЛОЖЕНИЕ В</w:t>
       </w:r>
-      <w:bookmarkEnd w:id="31"/>
+      <w:bookmarkEnd w:id="32"/>
     </w:p>
     <w:p>
       <w:pPr>
@@ -27665,7 +29478,14 @@
           <w:i/>
           <w:sz w:val="28"/>
         </w:rPr>
-        <w:t>TableMind</w:t>
+        <w:t>T</w:t>
+      </w:r>
+      <w:r>
+        <w:rPr>
+          <w:i/>
+          <w:sz w:val="28"/>
+        </w:rPr>
+        <w:t>ableMind</w:t>
       </w:r>
       <w:r>
         <w:rPr>
@@ -27685,13 +29505,7 @@
         <w:rPr>
           <w:sz w:val="28"/>
         </w:rPr>
-        <w:t>В табл</w:t>
-      </w:r>
-      <w:r>
-        <w:rPr>
-          <w:sz w:val="28"/>
-        </w:rPr>
-        <w:t>ице 23 представлено: изменения шаблонов.</w:t>
+        <w:t>В таблице 24 представлено: изменения шаблонов.</w:t>
       </w:r>
     </w:p>
     <w:p>
@@ -27704,7 +29518,7 @@
         <w:rPr>
           <w:sz w:val="28"/>
         </w:rPr>
-        <w:t>Таблица 23 – Изменения шаблонов</w:t>
+        <w:t>Таблица 24 – Изменения шаблонов</w:t>
       </w:r>
     </w:p>
     <w:tbl>
@@ -28013,10 +29827,10 @@
         <w:t>Изменения не затрагивают расчетную логику шаблонов: все итоговые показатели получены формулами книг и подтверждены независимым пересчетом.</w:t>
       </w:r>
     </w:p>
-    <w:bookmarkEnd w:id="30"/>
+    <w:bookmarkEnd w:id="31"/>
     <w:sectPr>
-      <w:headerReference w:type="default" r:id="rId11"/>
-      <w:footerReference w:type="default" r:id="rId12"/>
+      <w:headerReference w:type="default" r:id="rId15"/>
+      <w:footerReference w:type="default" r:id="rId16"/>
       <w:footnotePr>
         <w:numRestart w:val="eachSect"/>
       </w:footnotePr>
@@ -28118,7 +29932,7 @@
   <w:abstractNum w:abstractNumId="0" w15:restartNumberingAfterBreak="0">
     <w:nsid w:val="0000A990"/>
     <w:multiLevelType w:val="multilevel"/>
-    <w:tmpl w:val="0F160734"/>
+    <w:tmpl w:val="790C5BC8"/>
     <w:lvl w:ilvl="0">
       <w:numFmt w:val="bullet"/>
       <w:lvlText w:val=" "/>
@@ -28195,7 +30009,7 @@
   <w:abstractNum w:abstractNumId="1" w15:restartNumberingAfterBreak="0">
     <w:nsid w:val="00A99411"/>
     <w:multiLevelType w:val="multilevel"/>
-    <w:tmpl w:val="98441050"/>
+    <w:tmpl w:val="7E0AA4D8"/>
     <w:lvl w:ilvl="0">
       <w:start w:val="1"/>
       <w:numFmt w:val="decimal"/>
@@ -29673,7 +31487,7 @@
     <w:autoRedefine/>
     <w:uiPriority w:val="39"/>
     <w:unhideWhenUsed/>
-    <w:rsid w:val="006D74E9"/>
+    <w:rsid w:val="00273B14"/>
     <w:pPr>
       <w:spacing w:after="100"/>
     </w:pPr>
@@ -29685,7 +31499,7 @@
     <w:autoRedefine/>
     <w:uiPriority w:val="39"/>
     <w:unhideWhenUsed/>
-    <w:rsid w:val="006D74E9"/>
+    <w:rsid w:val="00273B14"/>
     <w:pPr>
       <w:spacing w:after="100"/>
       <w:ind w:left="240"/>

</xml_diff>

<commit_message>
lab6: add Figma screenshots U-006 and U-009; rebuild
</commit_message>
<xml_diff>
--- a/ЛР6_ЦП_Канвас_сценарии_релизы/ОТЧЕТ_ЛР6_TableMind.docx
+++ b/ЛР6_ЦП_Канвас_сценарии_релизы/ОТЧЕТ_ЛР6_TableMind.docx
@@ -263,7 +263,7 @@
       <w:r>
         <w:fldChar w:fldCharType="separate"/>
       </w:r>
-      <w:hyperlink w:anchor="_Toc241943031" w:history="1">
+      <w:hyperlink w:anchor="_Toc241951899" w:history="1">
         <w:r>
           <w:rPr>
             <w:rStyle w:val="af"/>
@@ -291,7 +291,7 @@
             <w:noProof/>
             <w:webHidden/>
           </w:rPr>
-          <w:instrText xml:space="preserve"> PAGEREF _Toc241943031 \h </w:instrText>
+          <w:instrText xml:space="preserve"> PAGEREF _Toc241951899 \h </w:instrText>
         </w:r>
         <w:r>
           <w:rPr>
@@ -332,7 +332,7 @@
           <w:noProof/>
         </w:rPr>
       </w:pPr>
-      <w:hyperlink w:anchor="_Toc241943032" w:history="1">
+      <w:hyperlink w:anchor="_Toc241951900" w:history="1">
         <w:r>
           <w:rPr>
             <w:rStyle w:val="af"/>
@@ -360,7 +360,7 @@
             <w:noProof/>
             <w:webHidden/>
           </w:rPr>
-          <w:instrText xml:space="preserve"> PAGEREF _Toc241943032 \h </w:instrText>
+          <w:instrText xml:space="preserve"> PAGEREF _Toc241951900 \h </w:instrText>
         </w:r>
         <w:r>
           <w:rPr>
@@ -401,7 +401,7 @@
           <w:noProof/>
         </w:rPr>
       </w:pPr>
-      <w:hyperlink w:anchor="_Toc241943033" w:history="1">
+      <w:hyperlink w:anchor="_Toc241951901" w:history="1">
         <w:r>
           <w:rPr>
             <w:rStyle w:val="af"/>
@@ -429,7 +429,7 @@
             <w:noProof/>
             <w:webHidden/>
           </w:rPr>
-          <w:instrText xml:space="preserve"> PAGEREF _Toc241943033 \h </w:instrText>
+          <w:instrText xml:space="preserve"> PAGEREF _Toc241951901 \h </w:instrText>
         </w:r>
         <w:r>
           <w:rPr>
@@ -470,7 +470,7 @@
           <w:noProof/>
         </w:rPr>
       </w:pPr>
-      <w:hyperlink w:anchor="_Toc241943034" w:history="1">
+      <w:hyperlink w:anchor="_Toc241951902" w:history="1">
         <w:r>
           <w:rPr>
             <w:rStyle w:val="af"/>
@@ -498,7 +498,7 @@
             <w:noProof/>
             <w:webHidden/>
           </w:rPr>
-          <w:instrText xml:space="preserve"> PAGEREF _Toc241943034 \h </w:instrText>
+          <w:instrText xml:space="preserve"> PAGEREF _Toc241951902 \h </w:instrText>
         </w:r>
         <w:r>
           <w:rPr>
@@ -539,7 +539,7 @@
           <w:noProof/>
         </w:rPr>
       </w:pPr>
-      <w:hyperlink w:anchor="_Toc241943035" w:history="1">
+      <w:hyperlink w:anchor="_Toc241951903" w:history="1">
         <w:r>
           <w:rPr>
             <w:rStyle w:val="af"/>
@@ -567,7 +567,7 @@
             <w:noProof/>
             <w:webHidden/>
           </w:rPr>
-          <w:instrText xml:space="preserve"> PAGEREF _Toc241943035 \h </w:instrText>
+          <w:instrText xml:space="preserve"> PAGEREF _Toc241951903 \h </w:instrText>
         </w:r>
         <w:r>
           <w:rPr>
@@ -608,7 +608,7 @@
           <w:noProof/>
         </w:rPr>
       </w:pPr>
-      <w:hyperlink w:anchor="_Toc241943036" w:history="1">
+      <w:hyperlink w:anchor="_Toc241951904" w:history="1">
         <w:r>
           <w:rPr>
             <w:rStyle w:val="af"/>
@@ -636,7 +636,7 @@
             <w:noProof/>
             <w:webHidden/>
           </w:rPr>
-          <w:instrText xml:space="preserve"> PAGEREF _Toc241943036 \h </w:instrText>
+          <w:instrText xml:space="preserve"> PAGEREF _Toc241951904 \h </w:instrText>
         </w:r>
         <w:r>
           <w:rPr>
@@ -677,7 +677,7 @@
           <w:noProof/>
         </w:rPr>
       </w:pPr>
-      <w:hyperlink w:anchor="_Toc241943037" w:history="1">
+      <w:hyperlink w:anchor="_Toc241951905" w:history="1">
         <w:r>
           <w:rPr>
             <w:rStyle w:val="af"/>
@@ -705,7 +705,7 @@
             <w:noProof/>
             <w:webHidden/>
           </w:rPr>
-          <w:instrText xml:space="preserve"> PAGEREF _Toc241943037 \h </w:instrText>
+          <w:instrText xml:space="preserve"> PAGEREF _Toc241951905 \h </w:instrText>
         </w:r>
         <w:r>
           <w:rPr>
@@ -746,7 +746,7 @@
           <w:noProof/>
         </w:rPr>
       </w:pPr>
-      <w:hyperlink w:anchor="_Toc241943038" w:history="1">
+      <w:hyperlink w:anchor="_Toc241951906" w:history="1">
         <w:r>
           <w:rPr>
             <w:rStyle w:val="af"/>
@@ -774,7 +774,7 @@
             <w:noProof/>
             <w:webHidden/>
           </w:rPr>
-          <w:instrText xml:space="preserve"> PAGEREF _Toc241943038 \h </w:instrText>
+          <w:instrText xml:space="preserve"> PAGEREF _Toc241951906 \h </w:instrText>
         </w:r>
         <w:r>
           <w:rPr>
@@ -794,7 +794,7 @@
             <w:noProof/>
             <w:webHidden/>
           </w:rPr>
-          <w:t>26</w:t>
+          <w:t>27</w:t>
         </w:r>
         <w:r>
           <w:rPr>
@@ -815,7 +815,7 @@
           <w:noProof/>
         </w:rPr>
       </w:pPr>
-      <w:hyperlink w:anchor="_Toc241943039" w:history="1">
+      <w:hyperlink w:anchor="_Toc241951907" w:history="1">
         <w:r>
           <w:rPr>
             <w:rStyle w:val="af"/>
@@ -843,7 +843,7 @@
             <w:noProof/>
             <w:webHidden/>
           </w:rPr>
-          <w:instrText xml:space="preserve"> PAGEREF _Toc241943039 \h </w:instrText>
+          <w:instrText xml:space="preserve"> PAGEREF _Toc241951907 \h </w:instrText>
         </w:r>
         <w:r>
           <w:rPr>
@@ -863,7 +863,7 @@
             <w:noProof/>
             <w:webHidden/>
           </w:rPr>
-          <w:t>29</w:t>
+          <w:t>30</w:t>
         </w:r>
         <w:r>
           <w:rPr>
@@ -884,7 +884,7 @@
           <w:noProof/>
         </w:rPr>
       </w:pPr>
-      <w:hyperlink w:anchor="_Toc241943040" w:history="1">
+      <w:hyperlink w:anchor="_Toc241951908" w:history="1">
         <w:r>
           <w:rPr>
             <w:rStyle w:val="af"/>
@@ -912,7 +912,7 @@
             <w:noProof/>
             <w:webHidden/>
           </w:rPr>
-          <w:instrText xml:space="preserve"> PAGEREF _Toc241943040 \h </w:instrText>
+          <w:instrText xml:space="preserve"> PAGEREF _Toc241951908 \h </w:instrText>
         </w:r>
         <w:r>
           <w:rPr>
@@ -932,7 +932,7 @@
             <w:noProof/>
             <w:webHidden/>
           </w:rPr>
-          <w:t>29</w:t>
+          <w:t>30</w:t>
         </w:r>
         <w:r>
           <w:rPr>
@@ -953,7 +953,7 @@
           <w:noProof/>
         </w:rPr>
       </w:pPr>
-      <w:hyperlink w:anchor="_Toc241943041" w:history="1">
+      <w:hyperlink w:anchor="_Toc241951909" w:history="1">
         <w:r>
           <w:rPr>
             <w:rStyle w:val="af"/>
@@ -981,76 +981,7 @@
             <w:noProof/>
             <w:webHidden/>
           </w:rPr>
-          <w:instrText xml:space="preserve"> PAGEREF _Toc241943041 \h </w:instrText>
-        </w:r>
-        <w:r>
-          <w:rPr>
-            <w:noProof/>
-            <w:webHidden/>
-          </w:rPr>
-        </w:r>
-        <w:r>
-          <w:rPr>
-            <w:noProof/>
-            <w:webHidden/>
-          </w:rPr>
-          <w:fldChar w:fldCharType="separate"/>
-        </w:r>
-        <w:r>
-          <w:rPr>
-            <w:noProof/>
-            <w:webHidden/>
-          </w:rPr>
-          <w:t>31</w:t>
-        </w:r>
-        <w:r>
-          <w:rPr>
-            <w:noProof/>
-            <w:webHidden/>
-          </w:rPr>
-          <w:fldChar w:fldCharType="end"/>
-        </w:r>
-      </w:hyperlink>
-    </w:p>
-    <w:p>
-      <w:pPr>
-        <w:pStyle w:val="12"/>
-        <w:tabs>
-          <w:tab w:val="right" w:leader="dot" w:pos="9345"/>
-        </w:tabs>
-        <w:rPr>
-          <w:noProof/>
-        </w:rPr>
-      </w:pPr>
-      <w:hyperlink w:anchor="_Toc241943042" w:history="1">
-        <w:r>
-          <w:rPr>
-            <w:rStyle w:val="af"/>
-            <w:b/>
-            <w:noProof/>
-          </w:rPr>
-          <w:t>ВЫВОДЫ</w:t>
-        </w:r>
-        <w:r>
-          <w:rPr>
-            <w:noProof/>
-            <w:webHidden/>
-          </w:rPr>
-          <w:tab/>
-        </w:r>
-        <w:r>
-          <w:rPr>
-            <w:noProof/>
-            <w:webHidden/>
-          </w:rPr>
-          <w:fldChar w:fldCharType="begin"/>
-        </w:r>
-        <w:r>
-          <w:rPr>
-            <w:noProof/>
-            <w:webHidden/>
-          </w:rPr>
-          <w:instrText xml:space="preserve"> PAGEREF _Toc241943042 \h </w:instrText>
+          <w:instrText xml:space="preserve"> PAGEREF _Toc241951909 \h </w:instrText>
         </w:r>
         <w:r>
           <w:rPr>
@@ -1091,14 +1022,14 @@
           <w:noProof/>
         </w:rPr>
       </w:pPr>
-      <w:hyperlink w:anchor="_Toc241943043" w:history="1">
+      <w:hyperlink w:anchor="_Toc241951910" w:history="1">
         <w:r>
           <w:rPr>
             <w:rStyle w:val="af"/>
             <w:b/>
             <w:noProof/>
           </w:rPr>
-          <w:t>СПИСОК ИСПОЛЬЗОВАННЫХ ИСТОЧНИКОВ</w:t>
+          <w:t>ВЫВОДЫ</w:t>
         </w:r>
         <w:r>
           <w:rPr>
@@ -1119,7 +1050,7 @@
             <w:noProof/>
             <w:webHidden/>
           </w:rPr>
-          <w:instrText xml:space="preserve"> PAGEREF _Toc241943043 \h </w:instrText>
+          <w:instrText xml:space="preserve"> PAGEREF _Toc241951910 \h </w:instrText>
         </w:r>
         <w:r>
           <w:rPr>
@@ -1160,7 +1091,76 @@
           <w:noProof/>
         </w:rPr>
       </w:pPr>
-      <w:hyperlink w:anchor="_Toc241943044" w:history="1">
+      <w:hyperlink w:anchor="_Toc241951911" w:history="1">
+        <w:r>
+          <w:rPr>
+            <w:rStyle w:val="af"/>
+            <w:b/>
+            <w:noProof/>
+          </w:rPr>
+          <w:t>СПИСОК ИСПОЛЬЗОВАННЫХ ИСТОЧНИКОВ</w:t>
+        </w:r>
+        <w:r>
+          <w:rPr>
+            <w:noProof/>
+            <w:webHidden/>
+          </w:rPr>
+          <w:tab/>
+        </w:r>
+        <w:r>
+          <w:rPr>
+            <w:noProof/>
+            <w:webHidden/>
+          </w:rPr>
+          <w:fldChar w:fldCharType="begin"/>
+        </w:r>
+        <w:r>
+          <w:rPr>
+            <w:noProof/>
+            <w:webHidden/>
+          </w:rPr>
+          <w:instrText xml:space="preserve"> PAGEREF _Toc241951911 \h </w:instrText>
+        </w:r>
+        <w:r>
+          <w:rPr>
+            <w:noProof/>
+            <w:webHidden/>
+          </w:rPr>
+        </w:r>
+        <w:r>
+          <w:rPr>
+            <w:noProof/>
+            <w:webHidden/>
+          </w:rPr>
+          <w:fldChar w:fldCharType="separate"/>
+        </w:r>
+        <w:r>
+          <w:rPr>
+            <w:noProof/>
+            <w:webHidden/>
+          </w:rPr>
+          <w:t>34</w:t>
+        </w:r>
+        <w:r>
+          <w:rPr>
+            <w:noProof/>
+            <w:webHidden/>
+          </w:rPr>
+          <w:fldChar w:fldCharType="end"/>
+        </w:r>
+      </w:hyperlink>
+    </w:p>
+    <w:p>
+      <w:pPr>
+        <w:pStyle w:val="12"/>
+        <w:tabs>
+          <w:tab w:val="right" w:leader="dot" w:pos="9345"/>
+        </w:tabs>
+        <w:rPr>
+          <w:noProof/>
+        </w:rPr>
+      </w:pPr>
+      <w:hyperlink w:anchor="_Toc241951912" w:history="1">
         <w:r>
           <w:rPr>
             <w:rStyle w:val="af"/>
@@ -1188,76 +1188,7 @@
             <w:noProof/>
             <w:webHidden/>
           </w:rPr>
-          <w:instrText xml:space="preserve"> PAGEREF _Toc241943044 \h </w:instrText>
-        </w:r>
-        <w:r>
-          <w:rPr>
-            <w:noProof/>
-            <w:webHidden/>
-          </w:rPr>
-        </w:r>
-        <w:r>
-          <w:rPr>
-            <w:noProof/>
-            <w:webHidden/>
-          </w:rPr>
-          <w:fldChar w:fldCharType="separate"/>
-        </w:r>
-        <w:r>
-          <w:rPr>
-            <w:noProof/>
-            <w:webHidden/>
-          </w:rPr>
-          <w:t>35</w:t>
-        </w:r>
-        <w:r>
-          <w:rPr>
-            <w:noProof/>
-            <w:webHidden/>
-          </w:rPr>
-          <w:fldChar w:fldCharType="end"/>
-        </w:r>
-      </w:hyperlink>
-    </w:p>
-    <w:p>
-      <w:pPr>
-        <w:pStyle w:val="12"/>
-        <w:tabs>
-          <w:tab w:val="right" w:leader="dot" w:pos="9345"/>
-        </w:tabs>
-        <w:rPr>
-          <w:noProof/>
-        </w:rPr>
-      </w:pPr>
-      <w:hyperlink w:anchor="_Toc241943045" w:history="1">
-        <w:r>
-          <w:rPr>
-            <w:rStyle w:val="af"/>
-            <w:b/>
-            <w:noProof/>
-          </w:rPr>
-          <w:t>ПРИЛОЖЕНИЕ Б</w:t>
-        </w:r>
-        <w:r>
-          <w:rPr>
-            <w:noProof/>
-            <w:webHidden/>
-          </w:rPr>
-          <w:tab/>
-        </w:r>
-        <w:r>
-          <w:rPr>
-            <w:noProof/>
-            <w:webHidden/>
-          </w:rPr>
-          <w:fldChar w:fldCharType="begin"/>
-        </w:r>
-        <w:r>
-          <w:rPr>
-            <w:noProof/>
-            <w:webHidden/>
-          </w:rPr>
-          <w:instrText xml:space="preserve"> PAGEREF _Toc241943045 \h </w:instrText>
+          <w:instrText xml:space="preserve"> PAGEREF _Toc241951912 \h </w:instrText>
         </w:r>
         <w:r>
           <w:rPr>
@@ -1298,14 +1229,14 @@
           <w:noProof/>
         </w:rPr>
       </w:pPr>
-      <w:hyperlink w:anchor="_Toc241943046" w:history="1">
+      <w:hyperlink w:anchor="_Toc241951913" w:history="1">
         <w:r>
           <w:rPr>
             <w:rStyle w:val="af"/>
             <w:b/>
             <w:noProof/>
           </w:rPr>
-          <w:t>ПРИЛОЖЕНИЕ В</w:t>
+          <w:t>ПРИЛОЖЕНИЕ Б</w:t>
         </w:r>
         <w:r>
           <w:rPr>
@@ -1326,7 +1257,7 @@
             <w:noProof/>
             <w:webHidden/>
           </w:rPr>
-          <w:instrText xml:space="preserve"> PAGEREF _Toc241943046 \h </w:instrText>
+          <w:instrText xml:space="preserve"> PAGEREF _Toc241951913 \h </w:instrText>
         </w:r>
         <w:r>
           <w:rPr>
@@ -1367,14 +1298,14 @@
           <w:noProof/>
         </w:rPr>
       </w:pPr>
-      <w:hyperlink w:anchor="_Toc241943047" w:history="1">
+      <w:hyperlink w:anchor="_Toc241951914" w:history="1">
         <w:r>
           <w:rPr>
             <w:rStyle w:val="af"/>
             <w:b/>
             <w:noProof/>
           </w:rPr>
-          <w:t>ПРИЛОЖЕНИЕ Г</w:t>
+          <w:t>ПРИЛОЖЕНИЕ В</w:t>
         </w:r>
         <w:r>
           <w:rPr>
@@ -1395,7 +1326,7 @@
             <w:noProof/>
             <w:webHidden/>
           </w:rPr>
-          <w:instrText xml:space="preserve"> PAGEREF _Toc241943047 \h </w:instrText>
+          <w:instrText xml:space="preserve"> PAGEREF _Toc241951914 \h </w:instrText>
         </w:r>
         <w:r>
           <w:rPr>
@@ -1436,7 +1367,76 @@
           <w:noProof/>
         </w:rPr>
       </w:pPr>
-      <w:hyperlink w:anchor="_Toc241943048" w:history="1">
+      <w:hyperlink w:anchor="_Toc241951915" w:history="1">
+        <w:r>
+          <w:rPr>
+            <w:rStyle w:val="af"/>
+            <w:b/>
+            <w:noProof/>
+          </w:rPr>
+          <w:t>ПРИЛОЖЕНИЕ Г</w:t>
+        </w:r>
+        <w:r>
+          <w:rPr>
+            <w:noProof/>
+            <w:webHidden/>
+          </w:rPr>
+          <w:tab/>
+        </w:r>
+        <w:r>
+          <w:rPr>
+            <w:noProof/>
+            <w:webHidden/>
+          </w:rPr>
+          <w:fldChar w:fldCharType="begin"/>
+        </w:r>
+        <w:r>
+          <w:rPr>
+            <w:noProof/>
+            <w:webHidden/>
+          </w:rPr>
+          <w:instrText xml:space="preserve"> PAGEREF _Toc241951915 \h </w:instrText>
+        </w:r>
+        <w:r>
+          <w:rPr>
+            <w:noProof/>
+            <w:webHidden/>
+          </w:rPr>
+        </w:r>
+        <w:r>
+          <w:rPr>
+            <w:noProof/>
+            <w:webHidden/>
+          </w:rPr>
+          <w:fldChar w:fldCharType="separate"/>
+        </w:r>
+        <w:r>
+          <w:rPr>
+            <w:noProof/>
+            <w:webHidden/>
+          </w:rPr>
+          <w:t>39</w:t>
+        </w:r>
+        <w:r>
+          <w:rPr>
+            <w:noProof/>
+            <w:webHidden/>
+          </w:rPr>
+          <w:fldChar w:fldCharType="end"/>
+        </w:r>
+      </w:hyperlink>
+    </w:p>
+    <w:p>
+      <w:pPr>
+        <w:pStyle w:val="12"/>
+        <w:tabs>
+          <w:tab w:val="right" w:leader="dot" w:pos="9345"/>
+        </w:tabs>
+        <w:rPr>
+          <w:noProof/>
+        </w:rPr>
+      </w:pPr>
+      <w:hyperlink w:anchor="_Toc241951916" w:history="1">
         <w:r>
           <w:rPr>
             <w:rStyle w:val="af"/>
@@ -1464,7 +1464,7 @@
             <w:noProof/>
             <w:webHidden/>
           </w:rPr>
-          <w:instrText xml:space="preserve"> PAGEREF _Toc241943048 \h </w:instrText>
+          <w:instrText xml:space="preserve"> PAGEREF _Toc241951916 \h </w:instrText>
         </w:r>
         <w:r>
           <w:rPr>
@@ -1484,7 +1484,7 @@
             <w:noProof/>
             <w:webHidden/>
           </w:rPr>
-          <w:t>40</w:t>
+          <w:t>41</w:t>
         </w:r>
         <w:r>
           <w:rPr>
@@ -1505,7 +1505,7 @@
           <w:noProof/>
         </w:rPr>
       </w:pPr>
-      <w:hyperlink w:anchor="_Toc241943049" w:history="1">
+      <w:hyperlink w:anchor="_Toc241951917" w:history="1">
         <w:r>
           <w:rPr>
             <w:rStyle w:val="af"/>
@@ -1533,7 +1533,7 @@
             <w:noProof/>
             <w:webHidden/>
           </w:rPr>
-          <w:instrText xml:space="preserve"> PAGEREF _Toc241943049 \h </w:instrText>
+          <w:instrText xml:space="preserve"> PAGEREF _Toc241951917 \h </w:instrText>
         </w:r>
         <w:r>
           <w:rPr>
@@ -1553,7 +1553,7 @@
             <w:noProof/>
             <w:webHidden/>
           </w:rPr>
-          <w:t>44</w:t>
+          <w:t>45</w:t>
         </w:r>
         <w:r>
           <w:rPr>
@@ -1579,7 +1579,7 @@
         <w:spacing w:before="0" w:after="360" w:line="360" w:lineRule="exact"/>
         <w:ind w:firstLine="709"/>
       </w:pPr>
-      <w:bookmarkStart w:id="1" w:name="_Toc241943031"/>
+      <w:bookmarkStart w:id="1" w:name="_Toc241951899"/>
       <w:r>
         <w:rPr>
           <w:b/>
@@ -1684,7 +1684,7 @@
         <w:ind w:firstLine="709"/>
       </w:pPr>
       <w:bookmarkStart w:id="2" w:name="_b608aa976fc82a0faaf3b83f58c735968afd03b"/>
-      <w:bookmarkStart w:id="3" w:name="_Toc241943032"/>
+      <w:bookmarkStart w:id="3" w:name="_Toc241951900"/>
       <w:bookmarkEnd w:id="0"/>
       <w:r>
         <w:rPr>
@@ -1750,7 +1750,7 @@
         <w:ind w:firstLine="709"/>
       </w:pPr>
       <w:bookmarkStart w:id="4" w:name="_ce8c8db2bd1f021f701413a98bce88b0dc0ff35"/>
-      <w:bookmarkStart w:id="5" w:name="_Toc241943033"/>
+      <w:bookmarkStart w:id="5" w:name="_Toc241951901"/>
       <w:r>
         <w:rPr>
           <w:b/>
@@ -3792,7 +3792,7 @@
         <w:ind w:firstLine="709"/>
       </w:pPr>
       <w:bookmarkStart w:id="6" w:name="_d6b1e0606ccffbfea524c7b8890d7424ae6ef8d"/>
-      <w:bookmarkStart w:id="7" w:name="_Toc241943034"/>
+      <w:bookmarkStart w:id="7" w:name="_Toc241951902"/>
       <w:bookmarkEnd w:id="4"/>
       <w:r>
         <w:rPr>
@@ -8504,7 +8504,7 @@
         <w:ind w:firstLine="709"/>
       </w:pPr>
       <w:bookmarkStart w:id="8" w:name="_7b60cb03201c02c98ad01f5cee41d479977e884"/>
-      <w:bookmarkStart w:id="9" w:name="_Toc241943035"/>
+      <w:bookmarkStart w:id="9" w:name="_Toc241951903"/>
       <w:bookmarkEnd w:id="6"/>
       <w:r>
         <w:rPr>
@@ -8575,7 +8575,7 @@
           <w:sz w:val="28"/>
         </w:rPr>
         <w:drawing>
-          <wp:inline distT="0" distB="0" distL="0" distR="0" wp14:anchorId="6143F1F6" wp14:editId="06A65B10">
+          <wp:inline distT="0" distB="0" distL="0" distR="0" wp14:anchorId="5668AF90" wp14:editId="09240474">
             <wp:extent cx="5334000" cy="3382536"/>
             <wp:effectExtent l="0" t="0" r="0" b="0"/>
             <wp:docPr id="13" name="Picture"/>
@@ -10890,7 +10890,7 @@
         <w:ind w:firstLine="709"/>
       </w:pPr>
       <w:bookmarkStart w:id="10" w:name="_519d46f9ff7923648cbfef21e26057944381813"/>
-      <w:bookmarkStart w:id="11" w:name="_Toc241943036"/>
+      <w:bookmarkStart w:id="11" w:name="_Toc241951904"/>
       <w:bookmarkEnd w:id="8"/>
       <w:r>
         <w:rPr>
@@ -15724,7 +15724,7 @@
           <w:sz w:val="28"/>
         </w:rPr>
         <w:drawing>
-          <wp:inline distT="0" distB="0" distL="0" distR="0" wp14:anchorId="37002F7B" wp14:editId="1D2A6424">
+          <wp:inline distT="0" distB="0" distL="0" distR="0" wp14:anchorId="45CB8126" wp14:editId="2B2672B0">
             <wp:extent cx="5334000" cy="3122341"/>
             <wp:effectExtent l="0" t="0" r="0" b="0"/>
             <wp:docPr id="17" name="Picture"/>
@@ -16703,7 +16703,7 @@
         <w:ind w:firstLine="709"/>
       </w:pPr>
       <w:bookmarkStart w:id="12" w:name="_ccc7c944b68a9100d34a943bc02da4feb181aee"/>
-      <w:bookmarkStart w:id="13" w:name="_Toc241943037"/>
+      <w:bookmarkStart w:id="13" w:name="_Toc241951905"/>
       <w:bookmarkEnd w:id="10"/>
       <w:r>
         <w:rPr>
@@ -19812,7 +19812,7 @@
         </w:rPr>
         <w:lastRenderedPageBreak/>
         <w:drawing>
-          <wp:inline distT="0" distB="0" distL="0" distR="0" wp14:anchorId="7E50867A" wp14:editId="7243E882">
+          <wp:inline distT="0" distB="0" distL="0" distR="0" wp14:anchorId="7D0A8248" wp14:editId="1734F4C7">
             <wp:extent cx="5334000" cy="6114585"/>
             <wp:effectExtent l="0" t="0" r="0" b="0"/>
             <wp:docPr id="21" name="Picture"/>
@@ -20049,7 +20049,7 @@
         </w:rPr>
         <w:lastRenderedPageBreak/>
         <w:drawing>
-          <wp:inline distT="0" distB="0" distL="0" distR="0" wp14:anchorId="323BBC89" wp14:editId="38BCB09B">
+          <wp:inline distT="0" distB="0" distL="0" distR="0" wp14:anchorId="659F2A11" wp14:editId="261DBBB9">
             <wp:extent cx="5334000" cy="9610810"/>
             <wp:effectExtent l="0" t="0" r="0" b="0"/>
             <wp:docPr id="24" name="Picture"/>
@@ -20289,7 +20289,7 @@
         </w:rPr>
         <w:lastRenderedPageBreak/>
         <w:drawing>
-          <wp:inline distT="0" distB="0" distL="0" distR="0" wp14:anchorId="39D0062C" wp14:editId="7C8993FB">
+          <wp:inline distT="0" distB="0" distL="0" distR="0" wp14:anchorId="5DB7711C" wp14:editId="617B3542">
             <wp:extent cx="5334000" cy="12458978"/>
             <wp:effectExtent l="0" t="0" r="0" b="0"/>
             <wp:docPr id="27" name="Picture"/>
@@ -20502,7 +20502,7 @@
           <w:sz w:val="28"/>
         </w:rPr>
         <w:drawing>
-          <wp:inline distT="0" distB="0" distL="0" distR="0" wp14:anchorId="44FF07C2" wp14:editId="06D975D2">
+          <wp:inline distT="0" distB="0" distL="0" distR="0" wp14:anchorId="4EB70901" wp14:editId="5EE15802">
             <wp:extent cx="5334000" cy="5926666"/>
             <wp:effectExtent l="0" t="0" r="0" b="0"/>
             <wp:docPr id="30" name="Picture"/>
@@ -20761,7 +20761,7 @@
           <w:sz w:val="28"/>
         </w:rPr>
         <w:drawing>
-          <wp:inline distT="0" distB="0" distL="0" distR="0" wp14:anchorId="5F89B2AF" wp14:editId="4098C2A9">
+          <wp:inline distT="0" distB="0" distL="0" distR="0" wp14:anchorId="05FA2D1B" wp14:editId="69A11942">
             <wp:extent cx="5334000" cy="3343751"/>
             <wp:effectExtent l="0" t="0" r="0" b="0"/>
             <wp:docPr id="33" name="Picture"/>
@@ -22316,7 +22316,7 @@
         </w:rPr>
         <w:lastRenderedPageBreak/>
         <w:drawing>
-          <wp:inline distT="0" distB="0" distL="0" distR="0" wp14:anchorId="3F709421" wp14:editId="5CEF7B72">
+          <wp:inline distT="0" distB="0" distL="0" distR="0" wp14:anchorId="6452D882" wp14:editId="5948E3C5">
             <wp:extent cx="5334000" cy="5785249"/>
             <wp:effectExtent l="0" t="0" r="0" b="0"/>
             <wp:docPr id="37" name="Picture"/>
@@ -22575,7 +22575,7 @@
         </w:rPr>
         <w:lastRenderedPageBreak/>
         <w:drawing>
-          <wp:inline distT="0" distB="0" distL="0" distR="0" wp14:anchorId="6A5FACDD" wp14:editId="73777C10">
+          <wp:inline distT="0" distB="0" distL="0" distR="0" wp14:anchorId="5C56CFA9" wp14:editId="09697119">
             <wp:extent cx="5334000" cy="3040380"/>
             <wp:effectExtent l="0" t="0" r="0" b="0"/>
             <wp:docPr id="40" name="Picture"/>
@@ -22735,7 +22735,7 @@
           <w:sz w:val="28"/>
         </w:rPr>
         <w:drawing>
-          <wp:inline distT="0" distB="0" distL="0" distR="0" wp14:anchorId="49DF7397" wp14:editId="1C623269">
+          <wp:inline distT="0" distB="0" distL="0" distR="0" wp14:anchorId="2D24725F" wp14:editId="6A447961">
             <wp:extent cx="5334000" cy="3081866"/>
             <wp:effectExtent l="0" t="0" r="0" b="0"/>
             <wp:docPr id="43" name="Picture"/>
@@ -22890,7 +22890,7 @@
         </w:rPr>
         <w:lastRenderedPageBreak/>
         <w:drawing>
-          <wp:inline distT="0" distB="0" distL="0" distR="0" wp14:anchorId="7E34B5B7" wp14:editId="472C29F0">
+          <wp:inline distT="0" distB="0" distL="0" distR="0" wp14:anchorId="5FF17A65" wp14:editId="4DF14DB5">
             <wp:extent cx="5334000" cy="2592916"/>
             <wp:effectExtent l="0" t="0" r="0" b="0"/>
             <wp:docPr id="46" name="Picture"/>
@@ -23037,7 +23037,7 @@
           <w:sz w:val="28"/>
         </w:rPr>
         <w:drawing>
-          <wp:inline distT="0" distB="0" distL="0" distR="0" wp14:anchorId="0451AACB" wp14:editId="4C11CF9D">
+          <wp:inline distT="0" distB="0" distL="0" distR="0" wp14:anchorId="3D3EEA80" wp14:editId="31B710DC">
             <wp:extent cx="5334000" cy="2332014"/>
             <wp:effectExtent l="0" t="0" r="0" b="0"/>
             <wp:docPr id="49" name="Picture"/>
@@ -23143,13 +23143,13 @@
           <w:i/>
           <w:sz w:val="28"/>
         </w:rPr>
-        <w:t>U-008</w:t>
-      </w:r>
-      <w:r>
-        <w:rPr>
-          <w:sz w:val="28"/>
-        </w:rPr>
-        <w:t>: оплата.</w:t>
+        <w:t>U-006</w:t>
+      </w:r>
+      <w:r>
+        <w:rPr>
+          <w:sz w:val="28"/>
+        </w:rPr>
+        <w:t>: регистрация.</w:t>
       </w:r>
     </w:p>
     <w:p>
@@ -23166,8 +23166,8 @@
         </w:rPr>
         <w:lastRenderedPageBreak/>
         <w:drawing>
-          <wp:inline distT="0" distB="0" distL="0" distR="0" wp14:anchorId="625697C5" wp14:editId="2F094353">
-            <wp:extent cx="5334000" cy="2737379"/>
+          <wp:inline distT="0" distB="0" distL="0" distR="0" wp14:anchorId="570E9206" wp14:editId="6504E2AB">
+            <wp:extent cx="5334000" cy="2691467"/>
             <wp:effectExtent l="0" t="0" r="0" b="0"/>
             <wp:docPr id="52" name="Picture"/>
             <wp:cNvGraphicFramePr/>
@@ -23175,13 +23175,167 @@
               <a:graphicData uri="http://schemas.openxmlformats.org/drawingml/2006/picture">
                 <pic:pic xmlns:pic="http://schemas.openxmlformats.org/drawingml/2006/picture">
                   <pic:nvPicPr>
-                    <pic:cNvPr id="53" name="Picture" descr="Скриншоты/figma_ext_08_U008_payment.png"/>
+                    <pic:cNvPr id="53" name="Picture" descr="Скриншоты/figma_ext_06_U006_signup.png"/>
                     <pic:cNvPicPr>
                       <a:picLocks noChangeAspect="1" noChangeArrowheads="1"/>
                     </pic:cNvPicPr>
                   </pic:nvPicPr>
                   <pic:blipFill>
                     <a:blip r:embed="rId19"/>
+                    <a:stretch>
+                      <a:fillRect/>
+                    </a:stretch>
+                  </pic:blipFill>
+                  <pic:spPr bwMode="auto">
+                    <a:xfrm>
+                      <a:off x="0" y="0"/>
+                      <a:ext cx="5334000" cy="2691467"/>
+                    </a:xfrm>
+                    <a:prstGeom prst="rect">
+                      <a:avLst/>
+                    </a:prstGeom>
+                    <a:noFill/>
+                    <a:ln w="9525">
+                      <a:noFill/>
+                      <a:headEnd/>
+                      <a:tailEnd/>
+                    </a:ln>
+                  </pic:spPr>
+                </pic:pic>
+              </a:graphicData>
+            </a:graphic>
+          </wp:inline>
+        </w:drawing>
+      </w:r>
+    </w:p>
+    <w:p>
+      <w:pPr>
+        <w:pStyle w:val="a0"/>
+        <w:spacing w:before="0" w:after="0" w:line="360" w:lineRule="exact"/>
+        <w:jc w:val="center"/>
+      </w:pPr>
+      <w:r>
+        <w:rPr>
+          <w:sz w:val="28"/>
+        </w:rPr>
+        <w:t xml:space="preserve">Рисунок 13 – Макет </w:t>
+      </w:r>
+      <w:r>
+        <w:rPr>
+          <w:i/>
+          <w:sz w:val="28"/>
+        </w:rPr>
+        <w:t>U-006</w:t>
+      </w:r>
+      <w:r>
+        <w:rPr>
+          <w:sz w:val="28"/>
+        </w:rPr>
+        <w:t>: регистрация</w:t>
+      </w:r>
+    </w:p>
+    <w:p>
+      <w:pPr>
+        <w:pStyle w:val="a0"/>
+        <w:spacing w:before="0" w:after="0" w:line="360" w:lineRule="exact"/>
+        <w:ind w:firstLine="709"/>
+        <w:jc w:val="both"/>
+      </w:pPr>
+      <w:r>
+        <w:rPr>
+          <w:sz w:val="28"/>
+        </w:rPr>
+        <w:t>Экран регистрации состоит из краткого описания выгод (бесплатный тариф без карты, удаление файлов через 24 часа, о</w:t>
+      </w:r>
+      <w:r>
+        <w:rPr>
+          <w:sz w:val="28"/>
+        </w:rPr>
+        <w:t xml:space="preserve">бработка данных в ЕС) и формы с рабочей почтой, паролем, согласием с условиями и входом через </w:t>
+      </w:r>
+      <w:r>
+        <w:rPr>
+          <w:i/>
+          <w:sz w:val="28"/>
+        </w:rPr>
+        <w:t>Microsoft</w:t>
+      </w:r>
+      <w:r>
+        <w:rPr>
+          <w:sz w:val="28"/>
+        </w:rPr>
+        <w:t xml:space="preserve">. Переход от тарифа </w:t>
+      </w:r>
+      <w:r>
+        <w:rPr>
+          <w:i/>
+          <w:sz w:val="28"/>
+        </w:rPr>
+        <w:t>Free</w:t>
+      </w:r>
+      <w:r>
+        <w:rPr>
+          <w:sz w:val="28"/>
+        </w:rPr>
+        <w:t xml:space="preserve"> и от результата проверки к регистрации занимает одно действие.</w:t>
+      </w:r>
+    </w:p>
+    <w:p>
+      <w:pPr>
+        <w:pStyle w:val="a0"/>
+        <w:spacing w:before="0" w:after="0" w:line="360" w:lineRule="exact"/>
+        <w:ind w:firstLine="709"/>
+        <w:jc w:val="both"/>
+      </w:pPr>
+      <w:r>
+        <w:rPr>
+          <w:sz w:val="28"/>
+        </w:rPr>
+        <w:t xml:space="preserve">На рисунке 14 показано: макет </w:t>
+      </w:r>
+      <w:r>
+        <w:rPr>
+          <w:i/>
+          <w:sz w:val="28"/>
+        </w:rPr>
+        <w:t>U-008</w:t>
+      </w:r>
+      <w:r>
+        <w:rPr>
+          <w:sz w:val="28"/>
+        </w:rPr>
+        <w:t>: оплата.</w:t>
+      </w:r>
+    </w:p>
+    <w:p>
+      <w:pPr>
+        <w:pStyle w:val="a0"/>
+        <w:keepNext/>
+        <w:spacing w:before="0" w:after="0"/>
+        <w:jc w:val="center"/>
+      </w:pPr>
+      <w:r>
+        <w:rPr>
+          <w:noProof/>
+          <w:sz w:val="28"/>
+        </w:rPr>
+        <w:drawing>
+          <wp:inline distT="0" distB="0" distL="0" distR="0" wp14:anchorId="0778A8F2" wp14:editId="3AF5F1D4">
+            <wp:extent cx="5334000" cy="2737379"/>
+            <wp:effectExtent l="0" t="0" r="0" b="0"/>
+            <wp:docPr id="55" name="Picture"/>
+            <wp:cNvGraphicFramePr/>
+            <a:graphic xmlns:a="http://schemas.openxmlformats.org/drawingml/2006/main">
+              <a:graphicData uri="http://schemas.openxmlformats.org/drawingml/2006/picture">
+                <pic:pic xmlns:pic="http://schemas.openxmlformats.org/drawingml/2006/picture">
+                  <pic:nvPicPr>
+                    <pic:cNvPr id="56" name="Picture" descr="Скриншоты/figma_ext_08_U008_payment.png"/>
+                    <pic:cNvPicPr>
+                      <a:picLocks noChangeAspect="1" noChangeArrowheads="1"/>
+                    </pic:cNvPicPr>
+                  </pic:nvPicPr>
+                  <pic:blipFill>
+                    <a:blip r:embed="rId20"/>
                     <a:stretch>
                       <a:fillRect/>
                     </a:stretch>
@@ -23218,7 +23372,7 @@
         <w:rPr>
           <w:sz w:val="28"/>
         </w:rPr>
-        <w:t xml:space="preserve">Рисунок 13 – Макет </w:t>
+        <w:t xml:space="preserve">Рисунок 14 – Макет </w:t>
       </w:r>
       <w:r>
         <w:rPr>
@@ -23271,13 +23425,7 @@
         <w:rPr>
           <w:sz w:val="28"/>
         </w:rPr>
-        <w:t xml:space="preserve"> и напоминание о возможности отмены и о покупке одного аудита </w:t>
-      </w:r>
-      <w:r>
-        <w:rPr>
-          <w:sz w:val="28"/>
-        </w:rPr>
-        <w:t>за 9 </w:t>
+        <w:t xml:space="preserve"> и напоминание о возможности отмены и о покупке одного аудита за 9 </w:t>
       </w:r>
       <w:r>
         <w:rPr>
@@ -23290,7 +23438,13 @@
         <w:rPr>
           <w:sz w:val="28"/>
         </w:rPr>
-        <w:t>. Оплата вынесена после первого бесплатного результата, как предусмотрено сценарием монетизации.</w:t>
+        <w:t>. Оплата вынесена после первого бесплатного результата, как предусмотрено сценарием монетиз</w:t>
+      </w:r>
+      <w:r>
+        <w:rPr>
+          <w:sz w:val="28"/>
+        </w:rPr>
+        <w:t>ации.</w:t>
       </w:r>
     </w:p>
     <w:p>
@@ -23304,46 +23458,135 @@
         <w:rPr>
           <w:sz w:val="28"/>
         </w:rPr>
-        <w:t>Макеты регистрации (</w:t>
+        <w:t xml:space="preserve">На рисунке 15 показано: макет </w:t>
       </w:r>
       <w:r>
         <w:rPr>
           <w:i/>
           <w:sz w:val="28"/>
         </w:rPr>
-        <w:t>U-006</w:t>
-      </w:r>
-      <w:r>
-        <w:rPr>
-          <w:sz w:val="28"/>
-        </w:rPr>
-        <w:t xml:space="preserve">, форма с почтой, паролем и входом через </w:t>
+        <w:t>U-009</w:t>
+      </w:r>
+      <w:r>
+        <w:rPr>
+          <w:sz w:val="28"/>
+        </w:rPr>
+        <w:t>: безопасность и политика данных.</w:t>
+      </w:r>
+    </w:p>
+    <w:p>
+      <w:pPr>
+        <w:pStyle w:val="a0"/>
+        <w:keepNext/>
+        <w:spacing w:before="0" w:after="0"/>
+        <w:jc w:val="center"/>
+      </w:pPr>
+      <w:r>
+        <w:rPr>
+          <w:noProof/>
+          <w:sz w:val="28"/>
+        </w:rPr>
+        <w:lastRenderedPageBreak/>
+        <w:drawing>
+          <wp:inline distT="0" distB="0" distL="0" distR="0" wp14:anchorId="084B2869" wp14:editId="465A082E">
+            <wp:extent cx="5334000" cy="4152012"/>
+            <wp:effectExtent l="0" t="0" r="0" b="0"/>
+            <wp:docPr id="58" name="Picture"/>
+            <wp:cNvGraphicFramePr/>
+            <a:graphic xmlns:a="http://schemas.openxmlformats.org/drawingml/2006/main">
+              <a:graphicData uri="http://schemas.openxmlformats.org/drawingml/2006/picture">
+                <pic:pic xmlns:pic="http://schemas.openxmlformats.org/drawingml/2006/picture">
+                  <pic:nvPicPr>
+                    <pic:cNvPr id="59" name="Picture" descr="Скриншоты/figma_ext_09_U009_security.png"/>
+                    <pic:cNvPicPr>
+                      <a:picLocks noChangeAspect="1" noChangeArrowheads="1"/>
+                    </pic:cNvPicPr>
+                  </pic:nvPicPr>
+                  <pic:blipFill>
+                    <a:blip r:embed="rId21"/>
+                    <a:stretch>
+                      <a:fillRect/>
+                    </a:stretch>
+                  </pic:blipFill>
+                  <pic:spPr bwMode="auto">
+                    <a:xfrm>
+                      <a:off x="0" y="0"/>
+                      <a:ext cx="5334000" cy="4152012"/>
+                    </a:xfrm>
+                    <a:prstGeom prst="rect">
+                      <a:avLst/>
+                    </a:prstGeom>
+                    <a:noFill/>
+                    <a:ln w="9525">
+                      <a:noFill/>
+                      <a:headEnd/>
+                      <a:tailEnd/>
+                    </a:ln>
+                  </pic:spPr>
+                </pic:pic>
+              </a:graphicData>
+            </a:graphic>
+          </wp:inline>
+        </w:drawing>
+      </w:r>
+    </w:p>
+    <w:p>
+      <w:pPr>
+        <w:pStyle w:val="a0"/>
+        <w:spacing w:before="0" w:after="0" w:line="360" w:lineRule="exact"/>
+        <w:jc w:val="center"/>
+      </w:pPr>
+      <w:r>
+        <w:rPr>
+          <w:sz w:val="28"/>
+        </w:rPr>
+        <w:t xml:space="preserve">Рисунок 15 – Макет </w:t>
       </w:r>
       <w:r>
         <w:rPr>
           <w:i/>
           <w:sz w:val="28"/>
         </w:rPr>
-        <w:t>Microsoft</w:t>
-      </w:r>
-      <w:r>
-        <w:rPr>
-          <w:sz w:val="28"/>
-        </w:rPr>
-        <w:t>) и безопасности (</w:t>
+        <w:t>U-009</w:t>
+      </w:r>
+      <w:r>
+        <w:rPr>
+          <w:sz w:val="28"/>
+        </w:rPr>
+        <w:t>: безопасность и политика данных</w:t>
+      </w:r>
+    </w:p>
+    <w:p>
+      <w:pPr>
+        <w:pStyle w:val="a0"/>
+        <w:spacing w:before="0" w:after="0" w:line="360" w:lineRule="exact"/>
+        <w:ind w:firstLine="709"/>
+        <w:jc w:val="both"/>
+      </w:pPr>
+      <w:r>
+        <w:rPr>
+          <w:sz w:val="28"/>
+        </w:rPr>
+        <w:t>Страница безопасности объясняет четыре принципа: обработка в ЕС, удаление файлов через 24 часа, отсутствие обучения моделе</w:t>
+      </w:r>
+      <w:r>
+        <w:rPr>
+          <w:sz w:val="28"/>
+        </w:rPr>
+        <w:t>й на данных клиента и доказательство движком вместо догадок; внизу указана дорожная карта соответствия (</w:t>
       </w:r>
       <w:r>
         <w:rPr>
           <w:i/>
           <w:sz w:val="28"/>
         </w:rPr>
-        <w:t>U-009</w:t>
-      </w:r>
-      <w:r>
-        <w:rPr>
-          <w:sz w:val="28"/>
-        </w:rPr>
-        <w:t xml:space="preserve">, четыре принципа обработки данных и дорожная карта </w:t>
+        <w:t>GDPR</w:t>
+      </w:r>
+      <w:r>
+        <w:rPr>
+          <w:sz w:val="28"/>
+        </w:rPr>
+        <w:t xml:space="preserve">, </w:t>
       </w:r>
       <w:r>
         <w:rPr>
@@ -23356,20 +23599,59 @@
         <w:rPr>
           <w:sz w:val="28"/>
         </w:rPr>
-        <w:t xml:space="preserve"> 2) созданы в том же файле </w:t>
+        <w:t xml:space="preserve"> 2 </w:t>
       </w:r>
       <w:r>
         <w:rPr>
           <w:i/>
           <w:sz w:val="28"/>
         </w:rPr>
-        <w:t>Figma</w:t>
-      </w:r>
-      <w:r>
-        <w:rPr>
-          <w:sz w:val="28"/>
-        </w:rPr>
-        <w:t>; их скриншоты не приложены, так как инструмент выгрузки изображений исчерпал суточный лимит.</w:t>
+        <w:t>Type</w:t>
+      </w:r>
+      <w:r>
+        <w:rPr>
+          <w:sz w:val="28"/>
+        </w:rPr>
+        <w:t xml:space="preserve"> </w:t>
+      </w:r>
+      <w:r>
+        <w:rPr>
+          <w:i/>
+          <w:sz w:val="28"/>
+        </w:rPr>
+        <w:t>I</w:t>
+      </w:r>
+      <w:r>
+        <w:rPr>
+          <w:sz w:val="28"/>
+        </w:rPr>
+        <w:t xml:space="preserve"> к релизу надстройки, затем </w:t>
+      </w:r>
+      <w:r>
+        <w:rPr>
+          <w:i/>
+          <w:sz w:val="28"/>
+        </w:rPr>
+        <w:t>Type</w:t>
+      </w:r>
+      <w:r>
+        <w:rPr>
+          <w:sz w:val="28"/>
+        </w:rPr>
+        <w:t xml:space="preserve"> </w:t>
+      </w:r>
+      <w:r>
+        <w:rPr>
+          <w:i/>
+          <w:sz w:val="28"/>
+        </w:rPr>
+        <w:t>II</w:t>
+      </w:r>
+      <w:r>
+        <w:rPr>
+          <w:sz w:val="28"/>
+        </w:rPr>
+        <w:t>). Страница закрывает барьер доверия, выявленный в ЛР5.</w:t>
       </w:r>
     </w:p>
     <w:p>
@@ -23379,7 +23661,7 @@
         <w:ind w:firstLine="709"/>
       </w:pPr>
       <w:bookmarkStart w:id="16" w:name="_fc51781abcc4857bf621eab6b8861ea54729fed"/>
-      <w:bookmarkStart w:id="17" w:name="_Toc241943038"/>
+      <w:bookmarkStart w:id="17" w:name="_Toc241951906"/>
       <w:bookmarkEnd w:id="15"/>
       <w:bookmarkEnd w:id="12"/>
       <w:r>
@@ -23402,13 +23684,19 @@
         <w:rPr>
           <w:sz w:val="28"/>
         </w:rPr>
-        <w:t>Методика [5] оценивает 24 единицы разработ</w:t>
-      </w:r>
-      <w:r>
-        <w:rPr>
-          <w:sz w:val="28"/>
-        </w:rPr>
-        <w:t>ки по десяти показателям и относит их к первому релизу, следующим релизам или к гипотезам. Единица попадает в первый релиз, если она связана с ценностным предложением, доходом, доказательна и ее потеря критична, либо если балл первого релиза не ниже 3,7.</w:t>
+        <w:t>Методика [</w:t>
+      </w:r>
+      <w:r>
+        <w:rPr>
+          <w:sz w:val="28"/>
+        </w:rPr>
+        <w:t>5] оценивает 24 единицы разработки по десяти показателям и относит их к первому релизу, следующим релизам или к гипотезам. Единица попадает в первый релиз, если она связана с ценностным предложением, доходом, доказательна и ее потеря критична, либо если ба</w:t>
+      </w:r>
+      <w:r>
+        <w:rPr>
+          <w:sz w:val="28"/>
+        </w:rPr>
+        <w:t>лл первого релиза не ниже 3,7.</w:t>
       </w:r>
     </w:p>
     <w:p>
@@ -23422,13 +23710,7 @@
         <w:rPr>
           <w:sz w:val="28"/>
         </w:rPr>
-        <w:t>В</w:t>
-      </w:r>
-      <w:r>
-        <w:rPr>
-          <w:sz w:val="28"/>
-        </w:rPr>
-        <w:t xml:space="preserve"> таблице 18 представлено: состав релизов по единицам разработки.</w:t>
+        <w:t>В таблице 18 представлено: состав релизов по единицам разработки.</w:t>
       </w:r>
     </w:p>
     <w:p>
@@ -23801,6 +24083,7 @@
                 <w:i/>
                 <w:sz w:val="24"/>
               </w:rPr>
+              <w:lastRenderedPageBreak/>
               <w:t>U-003</w:t>
             </w:r>
           </w:p>
@@ -23903,7 +24186,6 @@
                 <w:i/>
                 <w:sz w:val="24"/>
               </w:rPr>
-              <w:lastRenderedPageBreak/>
               <w:t>U-004</w:t>
             </w:r>
           </w:p>
@@ -26203,6 +26485,7 @@
         <w:rPr>
           <w:sz w:val="28"/>
         </w:rPr>
+        <w:lastRenderedPageBreak/>
         <w:t>Таблица 19 – Дорожная карта релизов</w:t>
       </w:r>
     </w:p>
@@ -26336,7 +26619,6 @@
               <w:rPr>
                 <w:sz w:val="24"/>
               </w:rPr>
-              <w:lastRenderedPageBreak/>
               <w:t>Первый релиз</w:t>
             </w:r>
           </w:p>
@@ -26736,7 +27018,13 @@
         <w:rPr>
           <w:sz w:val="28"/>
         </w:rPr>
-        <w:t xml:space="preserve"> с надстройкой в июле 2027, релиз проекта в сентябре 2027. Критерии перехода измеримы и совпадают с целями проекта (300 регистраций и 50 платящих).</w:t>
+        <w:t xml:space="preserve"> с надстройкой в июле 2027, релиз проекта в сентябре 2027. Критерии перехода измеримы и совпадают с целями проекта (300 регистраций и 50 плат</w:t>
+      </w:r>
+      <w:r>
+        <w:rPr>
+          <w:sz w:val="28"/>
+        </w:rPr>
+        <w:t>ящих).</w:t>
       </w:r>
     </w:p>
     <w:p>
@@ -26750,7 +27038,7 @@
         <w:rPr>
           <w:sz w:val="28"/>
         </w:rPr>
-        <w:t xml:space="preserve">На рисунке 14 показано: дорожная карта релизов </w:t>
+        <w:t xml:space="preserve">На рисунке 16 показано: дорожная карта релизов </w:t>
       </w:r>
       <w:r>
         <w:rPr>
@@ -26779,22 +27067,22 @@
           <w:sz w:val="28"/>
         </w:rPr>
         <w:drawing>
-          <wp:inline distT="0" distB="0" distL="0" distR="0" wp14:anchorId="11688A11" wp14:editId="72856984">
+          <wp:inline distT="0" distB="0" distL="0" distR="0" wp14:anchorId="06F8A3DB" wp14:editId="0BB2C58E">
             <wp:extent cx="5334000" cy="2341756"/>
             <wp:effectExtent l="0" t="0" r="0" b="0"/>
-            <wp:docPr id="57" name="Picture"/>
+            <wp:docPr id="63" name="Picture"/>
             <wp:cNvGraphicFramePr/>
             <a:graphic xmlns:a="http://schemas.openxmlformats.org/drawingml/2006/main">
               <a:graphicData uri="http://schemas.openxmlformats.org/drawingml/2006/picture">
                 <pic:pic xmlns:pic="http://schemas.openxmlformats.org/drawingml/2006/picture">
                   <pic:nvPicPr>
-                    <pic:cNvPr id="58" name="Picture" descr="Рисунки/03_дорожная_карта.png"/>
+                    <pic:cNvPr id="64" name="Picture" descr="Рисунки/03_дорожная_карта.png"/>
                     <pic:cNvPicPr>
                       <a:picLocks noChangeAspect="1" noChangeArrowheads="1"/>
                     </pic:cNvPicPr>
                   </pic:nvPicPr>
                   <pic:blipFill>
-                    <a:blip r:embed="rId20"/>
+                    <a:blip r:embed="rId22"/>
                     <a:stretch>
                       <a:fillRect/>
                     </a:stretch>
@@ -26831,7 +27119,7 @@
         <w:rPr>
           <w:sz w:val="28"/>
         </w:rPr>
-        <w:t xml:space="preserve">Рисунок 14 – Дорожная карта релизов </w:t>
+        <w:t xml:space="preserve">Рисунок 16 – Дорожная карта релизов </w:t>
       </w:r>
       <w:r>
         <w:rPr>
@@ -26852,13 +27140,13 @@
         <w:rPr>
           <w:sz w:val="28"/>
         </w:rPr>
-        <w:t>Ри</w:t>
-      </w:r>
-      <w:r>
-        <w:rPr>
-          <w:sz w:val="28"/>
-        </w:rPr>
-        <w:t>сунок показывает четыре последовательных релиза и вехи ПЗ1. Основной риск плана - узкое окно платной беты (01.06-30.09.2027): по расчетам ЛР2-3 в базовом сценарии за это время приходит около 19 платящих при цели 50.</w:t>
+        <w:t>Рисунок показывает четыре последовательных релиза и вехи ПЗ1. Основной риск плана - узкое окно платной беты (01.06-30.09.2027): по расчетам ЛР2</w:t>
+      </w:r>
+      <w:r>
+        <w:rPr>
+          <w:sz w:val="28"/>
+        </w:rPr>
+        <w:t>-3 в базовом сценарии за это время приходит около 19 платящих при цели 50.</w:t>
       </w:r>
     </w:p>
     <w:p>
@@ -26872,13 +27160,7 @@
         <w:rPr>
           <w:sz w:val="28"/>
         </w:rPr>
-        <w:t>В таблице 20 представлено: риски и завис</w:t>
-      </w:r>
-      <w:r>
-        <w:rPr>
-          <w:sz w:val="28"/>
-        </w:rPr>
-        <w:t>имости релизов.</w:t>
+        <w:t>В таблице 20 представлено: риски и зависимости релизов.</w:t>
       </w:r>
     </w:p>
     <w:p>
@@ -27640,13 +27922,7 @@
           <w:sz w:val="28"/>
         </w:rPr>
         <w:lastRenderedPageBreak/>
-        <w:t>Наибольшие индексы у риска недостижения цели по платящим (16) и точности находок (15). Они требуют ранней проверки: измерения конверсий уже</w:t>
-      </w:r>
-      <w:r>
-        <w:rPr>
-          <w:sz w:val="28"/>
-        </w:rPr>
-        <w:t xml:space="preserve"> на </w:t>
+        <w:t xml:space="preserve">Наибольшие индексы у риска недостижения цели по платящим (16) и точности находок (15). Они требуют ранней проверки: измерения конверсий уже на </w:t>
       </w:r>
       <w:r>
         <w:rPr>
@@ -27695,7 +27971,7 @@
         <w:ind w:firstLine="709"/>
       </w:pPr>
       <w:bookmarkStart w:id="18" w:name="_fb011a212b736610690ebb69f4e92f01bd3b3f9"/>
-      <w:bookmarkStart w:id="19" w:name="_Toc241943039"/>
+      <w:bookmarkStart w:id="19" w:name="_Toc241951907"/>
       <w:bookmarkEnd w:id="16"/>
       <w:r>
         <w:rPr>
@@ -28537,13 +28813,7 @@
               <w:rPr>
                 <w:sz w:val="24"/>
               </w:rPr>
-              <w:t>критерии готовн</w:t>
-            </w:r>
-            <w:r>
-              <w:rPr>
-                <w:sz w:val="24"/>
-              </w:rPr>
-              <w:t xml:space="preserve">ости </w:t>
+              <w:t xml:space="preserve">критерии готовности </w:t>
             </w:r>
             <w:r>
               <w:rPr>
@@ -28609,7 +28879,7 @@
         <w:ind w:firstLine="709"/>
       </w:pPr>
       <w:bookmarkStart w:id="20" w:name="_339ae803435bd6b9a653c2b18dadc62dc9ad8e7"/>
-      <w:bookmarkStart w:id="21" w:name="_Toc241943040"/>
+      <w:bookmarkStart w:id="21" w:name="_Toc241951908"/>
       <w:bookmarkEnd w:id="18"/>
       <w:r>
         <w:rPr>
@@ -28631,7 +28901,13 @@
         <w:rPr>
           <w:sz w:val="28"/>
         </w:rPr>
-        <w:t xml:space="preserve">Независимый пересчет на </w:t>
+        <w:t>Нез</w:t>
+      </w:r>
+      <w:r>
+        <w:rPr>
+          <w:sz w:val="28"/>
+        </w:rPr>
+        <w:t xml:space="preserve">ависимый пересчет на </w:t>
       </w:r>
       <w:r>
         <w:rPr>
@@ -28644,13 +28920,13 @@
         <w:rPr>
           <w:sz w:val="28"/>
         </w:rPr>
-        <w:t xml:space="preserve"> охватил индексы проблем, потенциал монетизации и выручку, индексы сегментов, индексы и приоритеты требований и сценариев, баллы и решения по релизам, индексы рисков и приоритеты экранов. Из 155 контрольных величин расхождений</w:t>
-      </w:r>
-      <w:r>
-        <w:rPr>
-          <w:sz w:val="28"/>
-        </w:rPr>
-        <w:t xml:space="preserve"> нет (155 из 155); допуск 1</w:t>
+        <w:t xml:space="preserve"> охватил индексы проблем, потенциал монетизации и выручку, индексы сегментов, индексы и приоритеты требований и сценариев, баллы и решения по релизам, индексы рисков и приоритеты экранов. Из 155 контрольных величин расхождений не</w:t>
+      </w:r>
+      <w:r>
+        <w:rPr>
+          <w:sz w:val="28"/>
+        </w:rPr>
+        <w:t>т (155 из 155); допуск 1</w:t>
       </w:r>
       <w:r>
         <w:rPr>
@@ -28690,13 +28966,13 @@
         <w:rPr>
           <w:sz w:val="28"/>
         </w:rPr>
-        <w:t>Ограничения: оценки 1-5 и 1-4 в книгах выставлены аналитиком по страницам и результатам прежних работ (Д-26), опрос пользователей не проводился (использую</w:t>
-      </w:r>
-      <w:r>
-        <w:rPr>
-          <w:sz w:val="28"/>
-        </w:rPr>
-        <w:t xml:space="preserve">тся модельные данные), прототип в </w:t>
+        <w:t>Ограничения: оценки 1-5 и 1-4 в книгах выставлены аналитиком по страницам и результатам прежних работ (Д-26), опрос пользователей не проводился (используются</w:t>
+      </w:r>
+      <w:r>
+        <w:rPr>
+          <w:sz w:val="28"/>
+        </w:rPr>
+        <w:t xml:space="preserve"> модельные данные), прототип в </w:t>
       </w:r>
       <w:r>
         <w:rPr>
@@ -28727,7 +29003,7 @@
         <w:ind w:firstLine="709"/>
       </w:pPr>
       <w:bookmarkStart w:id="22" w:name="_1bfdad9d2d88ddb6ca16c31c1d4d4943679f32f"/>
-      <w:bookmarkStart w:id="23" w:name="_Toc241943041"/>
+      <w:bookmarkStart w:id="23" w:name="_Toc241951909"/>
       <w:bookmarkEnd w:id="20"/>
       <w:bookmarkEnd w:id="2"/>
       <w:r>
@@ -28751,13 +29027,13 @@
         <w:rPr>
           <w:sz w:val="28"/>
         </w:rPr>
-        <w:t xml:space="preserve">Ответы даны по контрольным </w:t>
-      </w:r>
-      <w:r>
-        <w:rPr>
-          <w:sz w:val="28"/>
-        </w:rPr>
-        <w:t>точкам книг [3], [4] и проверкам связности [1], [2].</w:t>
+        <w:t>Ответы даны по контрольным точ</w:t>
+      </w:r>
+      <w:r>
+        <w:rPr>
+          <w:sz w:val="28"/>
+        </w:rPr>
+        <w:t>кам книг [3], [4] и проверкам связности [1], [2].</w:t>
       </w:r>
     </w:p>
     <w:p>
@@ -28957,7 +29233,7 @@
         <w:jc w:val="center"/>
       </w:pPr>
       <w:bookmarkStart w:id="24" w:name="_выводы"/>
-      <w:bookmarkStart w:id="25" w:name="_Toc241943042"/>
+      <w:bookmarkStart w:id="25" w:name="_Toc241951910"/>
       <w:bookmarkEnd w:id="22"/>
       <w:r>
         <w:rPr>
@@ -29039,13 +29315,7 @@
         <w:rPr>
           <w:sz w:val="28"/>
         </w:rPr>
-        <w:t>Канвас готов на 67 % по блокам: слабее остальных каналы, ключевые ресурсы и па</w:t>
-      </w:r>
-      <w:r>
-        <w:rPr>
-          <w:sz w:val="28"/>
-        </w:rPr>
-        <w:t xml:space="preserve">ртнеры. В </w:t>
+        <w:t xml:space="preserve">Канвас готов на 67 % по блокам: слабее остальных каналы, ключевые ресурсы и партнеры. В </w:t>
       </w:r>
       <w:r>
         <w:rPr>
@@ -29097,7 +29367,13 @@
         <w:rPr>
           <w:sz w:val="28"/>
         </w:rPr>
-        <w:t xml:space="preserve"> и релиз, остальные единицы остаются гипотезами.</w:t>
+        <w:t xml:space="preserve"> и релиз, остальные единицы остаются г</w:t>
+      </w:r>
+      <w:r>
+        <w:rPr>
+          <w:sz w:val="28"/>
+        </w:rPr>
+        <w:t>ипотезами.</w:t>
       </w:r>
     </w:p>
     <w:p>
@@ -29111,13 +29387,7 @@
         <w:rPr>
           <w:sz w:val="28"/>
         </w:rPr>
-        <w:t xml:space="preserve">Главный риск плана - узкое окно платной беты при цели 50 платящих: </w:t>
-      </w:r>
-      <w:r>
-        <w:rPr>
-          <w:sz w:val="28"/>
-        </w:rPr>
-        <w:t xml:space="preserve">его нужно снимать дополнительными каналами и ранним измерением конверсий. Следующие шаги: заменить демонстрационные данные макетов </w:t>
+        <w:t xml:space="preserve">Главный риск плана - узкое окно платной беты при цели 50 платящих: его нужно снимать дополнительными каналами и ранним измерением конверсий. Следующие шаги: заменить демонстрационные данные макетов </w:t>
       </w:r>
       <w:r>
         <w:rPr>
@@ -29130,7 +29400,13 @@
         <w:rPr>
           <w:sz w:val="28"/>
         </w:rPr>
-        <w:t xml:space="preserve"> реальными результатами движка после запуска </w:t>
+        <w:t xml:space="preserve"> реальными результатами движка после запус</w:t>
+      </w:r>
+      <w:r>
+        <w:rPr>
+          <w:sz w:val="28"/>
+        </w:rPr>
+        <w:t xml:space="preserve">ка </w:t>
       </w:r>
       <w:r>
         <w:rPr>
@@ -29143,13 +29419,7 @@
         <w:rPr>
           <w:sz w:val="28"/>
         </w:rPr>
-        <w:t>, провести реальный опрос по платежеспособности и Кано, затем свести рез</w:t>
-      </w:r>
-      <w:r>
-        <w:rPr>
-          <w:sz w:val="28"/>
-        </w:rPr>
-        <w:t>ультаты в итоговом отчете ЛР7.</w:t>
+        <w:t>, провести реальный опрос по платежеспособности и Кано, затем свести результаты в итоговом отчете ЛР7.</w:t>
       </w:r>
     </w:p>
     <w:p>
@@ -29160,7 +29430,7 @@
         <w:jc w:val="center"/>
       </w:pPr>
       <w:bookmarkStart w:id="26" w:name="_274f6a444530ef90b0479dabf3d210f01e97699"/>
-      <w:bookmarkStart w:id="27" w:name="_Toc241943043"/>
+      <w:bookmarkStart w:id="27" w:name="_Toc241951911"/>
       <w:bookmarkEnd w:id="24"/>
       <w:r>
         <w:rPr>
@@ -29200,7 +29470,13 @@
         <w:rPr>
           <w:sz w:val="28"/>
         </w:rPr>
-        <w:t>. Методические материалы дисциплины «Электронный бизнес» к лабораторной работе № 6. – Минск : БГУИР, 2026.</w:t>
+        <w:t>. Методические материалы дисциплин</w:t>
+      </w:r>
+      <w:r>
+        <w:rPr>
+          <w:sz w:val="28"/>
+        </w:rPr>
+        <w:t>ы «Электронный бизнес» к лабораторной работе № 6. – Минск : БГУИР, 2026.</w:t>
       </w:r>
     </w:p>
     <w:p>
@@ -29218,13 +29494,7 @@
         <w:rPr>
           <w:sz w:val="28"/>
         </w:rPr>
-        <w:t>Метод</w:t>
-      </w:r>
-      <w:r>
-        <w:rPr>
-          <w:sz w:val="28"/>
-        </w:rPr>
-        <w:t xml:space="preserve">ика сборки бизнес-модели по Канвас на основе анализа; шаблон </w:t>
+        <w:t xml:space="preserve">Методика сборки бизнес-модели по Канвас на основе анализа; шаблон </w:t>
       </w:r>
       <w:r>
         <w:rPr>
@@ -29255,7 +29525,13 @@
         <w:rPr>
           <w:sz w:val="28"/>
         </w:rPr>
-        <w:t xml:space="preserve">Методика формулирования бизнес-логики и пользовательских сценариев; шаблон </w:t>
+        <w:t>Методика формулирования бизнес-</w:t>
+      </w:r>
+      <w:r>
+        <w:rPr>
+          <w:sz w:val="28"/>
+        </w:rPr>
+        <w:t xml:space="preserve">логики и пользовательских сценариев; шаблон </w:t>
       </w:r>
       <w:r>
         <w:rPr>
@@ -29268,13 +29544,7 @@
         <w:rPr>
           <w:sz w:val="28"/>
         </w:rPr>
-        <w:t>. Методические материалы дисц</w:t>
-      </w:r>
-      <w:r>
-        <w:rPr>
-          <w:sz w:val="28"/>
-        </w:rPr>
-        <w:t>иплины «Электронный бизнес». – Минск : БГУИР, 2026.</w:t>
+        <w:t>. Методические материалы дисциплины «Электронный бизнес». – Минск : БГУИР, 2026.</w:t>
       </w:r>
     </w:p>
     <w:p>
@@ -29305,7 +29575,13 @@
         <w:rPr>
           <w:sz w:val="28"/>
         </w:rPr>
-        <w:t>. Методические материалы дисциплины «Электронный бизнес». – Минск : БГУИР, 2026.</w:t>
+        <w:t>. Методические материалы дисциплины «Электронный биз</w:t>
+      </w:r>
+      <w:r>
+        <w:rPr>
+          <w:sz w:val="28"/>
+        </w:rPr>
+        <w:t>нес». – Минск : БГУИР, 2026.</w:t>
       </w:r>
     </w:p>
     <w:p>
@@ -29323,13 +29599,7 @@
         <w:rPr>
           <w:sz w:val="28"/>
         </w:rPr>
-        <w:t>Методика деления разработки сайта на релизы; шабл</w:t>
-      </w:r>
-      <w:r>
-        <w:rPr>
-          <w:sz w:val="28"/>
-        </w:rPr>
-        <w:t xml:space="preserve">он </w:t>
+        <w:t xml:space="preserve">Методика деления разработки сайта на релизы; шаблон </w:t>
       </w:r>
       <w:r>
         <w:rPr>
@@ -29393,19 +29663,20 @@
           <w:i/>
           <w:sz w:val="28"/>
         </w:rPr>
-        <w:t>TableMind</w:t>
-      </w:r>
-      <w:r>
-        <w:rPr>
-          <w:sz w:val="28"/>
-        </w:rPr>
-        <w:t xml:space="preserve">: отчеты по практическим занятиям по дисциплине «Управление </w:t>
-      </w:r>
-      <w:r>
-        <w:rPr>
-          <w:sz w:val="28"/>
-        </w:rPr>
-        <w:t>проектами»; отчеты по лабораторным работам № 1, № 2–3, № 4, № 5 по дисциплине «Электронный бизнес» / Р. В. Земляник. – Минск : БГУИР, 2026.</w:t>
+        <w:t>TableM</w:t>
+      </w:r>
+      <w:r>
+        <w:rPr>
+          <w:i/>
+          <w:sz w:val="28"/>
+        </w:rPr>
+        <w:t>ind</w:t>
+      </w:r>
+      <w:r>
+        <w:rPr>
+          <w:sz w:val="28"/>
+        </w:rPr>
+        <w:t>: отчеты по практическим занятиям по дисциплине «Управление проектами»; отчеты по лабораторным работам № 1, № 2–3, № 4, № 5 по дисциплине «Электронный бизнес» / Р. В. Земляник. – Минск : БГУИР, 2026.</w:t>
       </w:r>
     </w:p>
     <w:p>
@@ -29720,13 +29991,7 @@
         <w:rPr>
           <w:sz w:val="28"/>
         </w:rPr>
-        <w:t xml:space="preserve"> [Электронный ресурс]. – Режим доступа: https://learn.microsoft.com/en-us/partner-center/marketpl</w:t>
-      </w:r>
-      <w:r>
-        <w:rPr>
-          <w:sz w:val="28"/>
-        </w:rPr>
-        <w:t>ace-offers/plan-saas-offer. – Дата доступа: 03.10.2026.</w:t>
+        <w:t xml:space="preserve"> [Электронный ресурс]. – Режим доступа: https://learn.microsoft.com/en-us/partner-center/marketplace-offers/plan-saas-offer. – Дата доступа: 03.10.2026.</w:t>
       </w:r>
     </w:p>
     <w:p>
@@ -29881,13 +30146,13 @@
         <w:rPr>
           <w:sz w:val="28"/>
         </w:rPr>
-        <w:t xml:space="preserve"> [Электронный ресурс]. – Режим доступа: https://learn.microsoft.com/en-us/partner-center/marketplace-offers/review-publish-offer. </w:t>
-      </w:r>
-      <w:r>
-        <w:rPr>
-          <w:sz w:val="28"/>
-        </w:rPr>
-        <w:t>– Дата доступа: 03.10.2026.</w:t>
+        <w:t xml:space="preserve"> [Электронный ресурс]. – Режим до</w:t>
+      </w:r>
+      <w:r>
+        <w:rPr>
+          <w:sz w:val="28"/>
+        </w:rPr>
+        <w:t>ступа: https://learn.microsoft.com/en-us/partner-center/marketplace-offers/review-publish-offer. – Дата доступа: 03.10.2026.</w:t>
       </w:r>
     </w:p>
     <w:p>
@@ -29964,7 +30229,13 @@
         <w:rPr>
           <w:sz w:val="28"/>
         </w:rPr>
-        <w:t xml:space="preserve"> [Электронный ресурс]. – Режим доступа: https://learn.microsoft.com/en-us/legal/marketplace/certification-policies. – Дата доступа: 03.10.2026.</w:t>
+        <w:t xml:space="preserve"> [Электронный ресурс]. – Режим доступа: https://learn.microsoft.com/en-us/le</w:t>
+      </w:r>
+      <w:r>
+        <w:rPr>
+          <w:sz w:val="28"/>
+        </w:rPr>
+        <w:t>gal/marketplace/certification-policies. – Дата доступа: 03.10.2026.</w:t>
       </w:r>
     </w:p>
     <w:p>
@@ -30119,7 +30390,13 @@
         <w:rPr>
           <w:sz w:val="28"/>
         </w:rPr>
-        <w:t xml:space="preserve"> 2: </w:t>
+        <w:t xml:space="preserve"> 2</w:t>
+      </w:r>
+      <w:r>
+        <w:rPr>
+          <w:sz w:val="28"/>
+        </w:rPr>
+        <w:t xml:space="preserve">: </w:t>
       </w:r>
       <w:r>
         <w:rPr>
@@ -30184,13 +30461,7 @@
         <w:rPr>
           <w:sz w:val="28"/>
         </w:rPr>
-        <w:t xml:space="preserve"> [Электронный ресурс]. – Режим доступа: https://dra</w:t>
-      </w:r>
-      <w:r>
-        <w:rPr>
-          <w:sz w:val="28"/>
-        </w:rPr>
-        <w:t>ta.com/learn/soc-2/type-1-vs-type-2. – Дата доступа: 03.10.2026.</w:t>
+        <w:t xml:space="preserve"> [Электронный ресурс]. – Режим доступа: https://drata.com/learn/soc-2/type-1-vs-type-2. – Дата доступа: 03.10.2026.</w:t>
       </w:r>
     </w:p>
     <w:p>
@@ -30202,7 +30473,7 @@
         <w:jc w:val="center"/>
       </w:pPr>
       <w:bookmarkStart w:id="28" w:name="_3d74faf1500c1b2a4a8bfa8e0e37c74206ce73d"/>
-      <w:bookmarkStart w:id="29" w:name="_Toc241943044"/>
+      <w:bookmarkStart w:id="29" w:name="_Toc241951912"/>
       <w:bookmarkEnd w:id="26"/>
       <w:r>
         <w:rPr>
@@ -30250,7 +30521,13 @@
         <w:rPr>
           <w:sz w:val="28"/>
         </w:rPr>
-        <w:t>В приложении собраны допущения ЛР6 в дополнение к допущениям Д-01…Д-25 предыдущих работ.</w:t>
+        <w:t>В приложении собраны допущения ЛР6 в дополнен</w:t>
+      </w:r>
+      <w:r>
+        <w:rPr>
+          <w:sz w:val="28"/>
+        </w:rPr>
+        <w:t>ие к допущениям Д-01…Д-25 предыдущих работ.</w:t>
       </w:r>
     </w:p>
     <w:p>
@@ -30264,13 +30541,7 @@
         <w:rPr>
           <w:sz w:val="28"/>
         </w:rPr>
-        <w:t xml:space="preserve">В таблице 22 представлено: журнал допущений </w:t>
-      </w:r>
-      <w:r>
-        <w:rPr>
-          <w:sz w:val="28"/>
-        </w:rPr>
-        <w:t>ЛР6.</w:t>
+        <w:t>В таблице 22 представлено: журнал допущений ЛР6.</w:t>
       </w:r>
     </w:p>
     <w:p>
@@ -31015,7 +31286,7 @@
         <w:jc w:val="center"/>
       </w:pPr>
       <w:bookmarkStart w:id="30" w:name="_d684f183eb868ee4ace295916bed2e6be64d16e"/>
-      <w:bookmarkStart w:id="31" w:name="_Toc241943045"/>
+      <w:bookmarkStart w:id="31" w:name="_Toc241951913"/>
       <w:bookmarkEnd w:id="28"/>
       <w:r>
         <w:rPr>
@@ -31832,14 +32103,7 @@
                 <w:i/>
                 <w:sz w:val="24"/>
               </w:rPr>
-              <w:t>SO</w:t>
-            </w:r>
-            <w:r>
-              <w:rPr>
-                <w:i/>
-                <w:sz w:val="24"/>
-              </w:rPr>
-              <w:t>C</w:t>
+              <w:t>SOC</w:t>
             </w:r>
             <w:r>
               <w:rPr>
@@ -31919,7 +32183,7 @@
         <w:jc w:val="center"/>
       </w:pPr>
       <w:bookmarkStart w:id="32" w:name="_6574ce6d3bdcb7786930e8390195aee2be99a58"/>
-      <w:bookmarkStart w:id="33" w:name="_Toc241943046"/>
+      <w:bookmarkStart w:id="33" w:name="_Toc241951914"/>
       <w:bookmarkEnd w:id="30"/>
       <w:r>
         <w:rPr>
@@ -32331,7 +32595,7 @@
         <w:jc w:val="center"/>
       </w:pPr>
       <w:bookmarkStart w:id="34" w:name="_9415338eb7aade5a81d9d1583f95cf4a5b310ea"/>
-      <w:bookmarkStart w:id="35" w:name="_Toc241943047"/>
+      <w:bookmarkStart w:id="35" w:name="_Toc241951915"/>
       <w:bookmarkEnd w:id="32"/>
       <w:r>
         <w:rPr>
@@ -32488,13 +32752,7 @@
         <w:rPr>
           <w:sz w:val="28"/>
         </w:rPr>
-        <w:t>-п</w:t>
-      </w:r>
-      <w:r>
-        <w:rPr>
-          <w:sz w:val="28"/>
-        </w:rPr>
-        <w:t xml:space="preserve">редложения в </w:t>
+        <w:t xml:space="preserve">-предложения в </w:t>
       </w:r>
       <w:r>
         <w:rPr>
@@ -32814,13 +33072,7 @@
               <w:rPr>
                 <w:sz w:val="24"/>
               </w:rPr>
-              <w:t xml:space="preserve">» </w:t>
-            </w:r>
-            <w:r>
-              <w:rPr>
-                <w:sz w:val="24"/>
-              </w:rPr>
-              <w:t>(транзакционное предложение); последний вариант после публикации изменить нельзя</w:t>
+              <w:t>» (транзакционное предложение); последний вариант после публикации изменить нельзя</w:t>
             </w:r>
           </w:p>
         </w:tc>
@@ -32852,7 +33104,13 @@
               <w:rPr>
                 <w:sz w:val="24"/>
               </w:rPr>
-              <w:t xml:space="preserve"> можно включить в релизе проекта</w:t>
+              <w:t xml:space="preserve"> можно включи</w:t>
+            </w:r>
+            <w:r>
+              <w:rPr>
+                <w:sz w:val="24"/>
+              </w:rPr>
+              <w:t>ть в релизе проекта</w:t>
             </w:r>
           </w:p>
         </w:tc>
@@ -32896,13 +33154,7 @@
               <w:rPr>
                 <w:sz w:val="24"/>
               </w:rPr>
-              <w:t xml:space="preserve">для </w:t>
-            </w:r>
-            <w:r>
-              <w:rPr>
-                <w:sz w:val="24"/>
-              </w:rPr>
-              <w:t>вариантов, кроме «</w:t>
+              <w:t>для вариантов, кроме «</w:t>
             </w:r>
             <w:r>
               <w:rPr>
@@ -33012,13 +33264,7 @@
               <w:rPr>
                 <w:sz w:val="24"/>
               </w:rPr>
-              <w:t>в ТЗ первого релиза закладыва</w:t>
-            </w:r>
-            <w:r>
-              <w:rPr>
-                <w:sz w:val="24"/>
-              </w:rPr>
-              <w:t xml:space="preserve">ется вход через </w:t>
+              <w:t xml:space="preserve">в ТЗ первого релиза закладывается вход через </w:t>
             </w:r>
             <w:r>
               <w:rPr>
@@ -33031,7 +33277,13 @@
               <w:rPr>
                 <w:sz w:val="24"/>
               </w:rPr>
-              <w:t xml:space="preserve">; это дополнительная работа для единицы «листинг </w:t>
+              <w:t>; это дополнительная работа для единицы «</w:t>
+            </w:r>
+            <w:r>
+              <w:rPr>
+                <w:sz w:val="24"/>
+              </w:rPr>
+              <w:t xml:space="preserve">листинг </w:t>
             </w:r>
             <w:r>
               <w:rPr>
@@ -33153,13 +33405,7 @@
               <w:rPr>
                 <w:sz w:val="24"/>
               </w:rPr>
-              <w:t xml:space="preserve"> до подачи; это у</w:t>
-            </w:r>
-            <w:r>
-              <w:rPr>
-                <w:sz w:val="24"/>
-              </w:rPr>
-              <w:t>словие проверяется при планировании архитектуры</w:t>
+              <w:t xml:space="preserve"> до подачи; это условие проверяется при планировании архитектуры</w:t>
             </w:r>
           </w:p>
         </w:tc>
@@ -33184,7 +33430,13 @@
               <w:rPr>
                 <w:sz w:val="24"/>
               </w:rPr>
-              <w:t>Сертификация и сроки</w:t>
+              <w:t>Сертификация и ср</w:t>
+            </w:r>
+            <w:r>
+              <w:rPr>
+                <w:sz w:val="24"/>
+              </w:rPr>
+              <w:t>оки</w:t>
             </w:r>
           </w:p>
         </w:tc>
@@ -33203,13 +33455,7 @@
               <w:rPr>
                 <w:sz w:val="24"/>
               </w:rPr>
-              <w:t xml:space="preserve">автоматическая проверка занимает до 30 минут, затем ручная сертификация (содержание, техническая проверка, деловые критерии издателя), предпросмотр и выпуск; при отказе приходит отчет и </w:t>
-            </w:r>
-            <w:r>
-              <w:rPr>
-                <w:sz w:val="24"/>
-              </w:rPr>
-              <w:t>можно подать повторно</w:t>
+              <w:t>автоматическая проверка занимает до 30 минут, затем ручная сертификация (содержание, техническая проверка, деловые критерии издателя), предпросмотр и выпуск; при отказе приходит отчет и можно подать повторно</w:t>
             </w:r>
           </w:p>
         </w:tc>
@@ -33228,7 +33474,13 @@
               <w:rPr>
                 <w:sz w:val="24"/>
               </w:rPr>
-              <w:t>в плане релизов выделить время на повторные подачи; точный срок ручной проверки в документации не указан</w:t>
+              <w:t xml:space="preserve">в плане релизов выделить время на повторные </w:t>
+            </w:r>
+            <w:r>
+              <w:rPr>
+                <w:sz w:val="24"/>
+              </w:rPr>
+              <w:t>подачи; точный срок ручной проверки в документации не указан</w:t>
             </w:r>
           </w:p>
         </w:tc>
@@ -33298,13 +33550,7 @@
               <w:rPr>
                 <w:sz w:val="24"/>
               </w:rPr>
-              <w:t>, политики конфиденциальности и условий и</w:t>
-            </w:r>
-            <w:r>
-              <w:rPr>
-                <w:sz w:val="24"/>
-              </w:rPr>
-              <w:t xml:space="preserve">спользования; сторонний сертификат </w:t>
+              <w:t xml:space="preserve">, политики конфиденциальности и условий использования; сторонний сертификат </w:t>
             </w:r>
             <w:r>
               <w:rPr>
@@ -34379,7 +34625,13 @@
         <w:rPr>
           <w:sz w:val="28"/>
         </w:rPr>
-        <w:t>, при условии что статья расходов предусмотрена бюджетом ПЗ1; наличие такой статьи нужно сверить.</w:t>
+        <w:t>, при условии что статья расходов</w:t>
+      </w:r>
+      <w:r>
+        <w:rPr>
+          <w:sz w:val="28"/>
+        </w:rPr>
+        <w:t xml:space="preserve"> предусмотрена бюджетом ПЗ1; наличие такой статьи нужно сверить.</w:t>
       </w:r>
     </w:p>
     <w:p>
@@ -34391,7 +34643,7 @@
         <w:jc w:val="center"/>
       </w:pPr>
       <w:bookmarkStart w:id="36" w:name="_21cff5e6573cc685eba2e5d01fbe1912356e1d7"/>
-      <w:bookmarkStart w:id="37" w:name="_Toc241943048"/>
+      <w:bookmarkStart w:id="37" w:name="_Toc241951916"/>
       <w:bookmarkEnd w:id="34"/>
       <w:r>
         <w:rPr>
@@ -34479,7 +34731,7 @@
         <w:rPr>
           <w:sz w:val="28"/>
         </w:rPr>
-        <w:t xml:space="preserve">На рисунке 15 показано: </w:t>
+        <w:t xml:space="preserve">На рисунке 17 показано: </w:t>
       </w:r>
       <w:r>
         <w:rPr>
@@ -34492,13 +34744,7 @@
         <w:rPr>
           <w:sz w:val="28"/>
         </w:rPr>
-        <w:t xml:space="preserve">: главная </w:t>
-      </w:r>
-      <w:r>
-        <w:rPr>
-          <w:sz w:val="28"/>
-        </w:rPr>
-        <w:t>страница.</w:t>
+        <w:t>: главная страница.</w:t>
       </w:r>
     </w:p>
     <w:p>
@@ -34514,376 +34760,7 @@
           <w:sz w:val="28"/>
         </w:rPr>
         <w:drawing>
-          <wp:inline distT="0" distB="0" distL="0" distR="0" wp14:anchorId="032DE7C4" wp14:editId="1320F298">
-            <wp:extent cx="5334000" cy="2375958"/>
-            <wp:effectExtent l="0" t="0" r="0" b="0"/>
-            <wp:docPr id="71" name="Picture"/>
-            <wp:cNvGraphicFramePr/>
-            <a:graphic xmlns:a="http://schemas.openxmlformats.org/drawingml/2006/main">
-              <a:graphicData uri="http://schemas.openxmlformats.org/drawingml/2006/picture">
-                <pic:pic xmlns:pic="http://schemas.openxmlformats.org/drawingml/2006/picture">
-                  <pic:nvPicPr>
-                    <pic:cNvPr id="72" name="Picture" descr="Скриншоты/comp_01_perfectxl_home.jpg"/>
-                    <pic:cNvPicPr>
-                      <a:picLocks noChangeAspect="1" noChangeArrowheads="1"/>
-                    </pic:cNvPicPr>
-                  </pic:nvPicPr>
-                  <pic:blipFill>
-                    <a:blip r:embed="rId21"/>
-                    <a:stretch>
-                      <a:fillRect/>
-                    </a:stretch>
-                  </pic:blipFill>
-                  <pic:spPr bwMode="auto">
-                    <a:xfrm>
-                      <a:off x="0" y="0"/>
-                      <a:ext cx="5334000" cy="2375958"/>
-                    </a:xfrm>
-                    <a:prstGeom prst="rect">
-                      <a:avLst/>
-                    </a:prstGeom>
-                    <a:noFill/>
-                    <a:ln w="9525">
-                      <a:noFill/>
-                      <a:headEnd/>
-                      <a:tailEnd/>
-                    </a:ln>
-                  </pic:spPr>
-                </pic:pic>
-              </a:graphicData>
-            </a:graphic>
-          </wp:inline>
-        </w:drawing>
-      </w:r>
-    </w:p>
-    <w:p>
-      <w:pPr>
-        <w:pStyle w:val="a0"/>
-        <w:spacing w:before="0" w:after="0" w:line="360" w:lineRule="exact"/>
-        <w:jc w:val="center"/>
-      </w:pPr>
-      <w:r>
-        <w:rPr>
-          <w:sz w:val="28"/>
-        </w:rPr>
-        <w:t xml:space="preserve">Рисунок 15 – </w:t>
-      </w:r>
-      <w:r>
-        <w:rPr>
-          <w:i/>
-          <w:sz w:val="28"/>
-        </w:rPr>
-        <w:t>PerfectXL</w:t>
-      </w:r>
-      <w:r>
-        <w:rPr>
-          <w:sz w:val="28"/>
-        </w:rPr>
-        <w:t>: главная страница</w:t>
-      </w:r>
-    </w:p>
-    <w:p>
-      <w:pPr>
-        <w:pStyle w:val="a0"/>
-        <w:spacing w:before="0" w:after="0" w:line="360" w:lineRule="exact"/>
-        <w:ind w:firstLine="709"/>
-        <w:jc w:val="both"/>
-      </w:pPr>
-      <w:r>
-        <w:rPr>
-          <w:sz w:val="28"/>
-        </w:rPr>
-        <w:t xml:space="preserve">Главная </w:t>
-      </w:r>
-      <w:r>
-        <w:rPr>
-          <w:i/>
-          <w:sz w:val="28"/>
-        </w:rPr>
-        <w:t>PerfectXL</w:t>
-      </w:r>
-      <w:r>
-        <w:rPr>
-          <w:sz w:val="28"/>
-        </w:rPr>
-        <w:t xml:space="preserve"> построена вокруг награды «</w:t>
-      </w:r>
-      <w:r>
-        <w:rPr>
-          <w:i/>
-          <w:sz w:val="28"/>
-        </w:rPr>
-        <w:t>Best</w:t>
-      </w:r>
-      <w:r>
-        <w:rPr>
-          <w:sz w:val="28"/>
-        </w:rPr>
-        <w:t xml:space="preserve"> </w:t>
-      </w:r>
-      <w:r>
-        <w:rPr>
-          <w:i/>
-          <w:sz w:val="28"/>
-        </w:rPr>
-        <w:t>Excel</w:t>
-      </w:r>
-      <w:r>
-        <w:rPr>
-          <w:sz w:val="28"/>
-        </w:rPr>
-        <w:t xml:space="preserve"> </w:t>
-      </w:r>
-      <w:r>
-        <w:rPr>
-          <w:i/>
-          <w:sz w:val="28"/>
-        </w:rPr>
-        <w:t>Add-in</w:t>
-      </w:r>
-      <w:r>
-        <w:rPr>
-          <w:sz w:val="28"/>
-        </w:rPr>
-        <w:t xml:space="preserve"> </w:t>
-      </w:r>
-      <w:r>
-        <w:rPr>
-          <w:i/>
-          <w:sz w:val="28"/>
-        </w:rPr>
-        <w:t>of</w:t>
-      </w:r>
-      <w:r>
-        <w:rPr>
-          <w:sz w:val="28"/>
-        </w:rPr>
-        <w:t xml:space="preserve"> 2026» и кнопки анонса; цен и пробного доступа на первом экране нет.</w:t>
-      </w:r>
-    </w:p>
-    <w:p>
-      <w:pPr>
-        <w:pStyle w:val="a0"/>
-        <w:spacing w:before="0" w:after="0" w:line="360" w:lineRule="exact"/>
-        <w:ind w:firstLine="709"/>
-        <w:jc w:val="both"/>
-      </w:pPr>
-      <w:r>
-        <w:rPr>
-          <w:sz w:val="28"/>
-        </w:rPr>
-        <w:t xml:space="preserve">На рисунке 16 показано: </w:t>
-      </w:r>
-      <w:r>
-        <w:rPr>
-          <w:i/>
-          <w:sz w:val="28"/>
-        </w:rPr>
-        <w:t>PerfectXL</w:t>
-      </w:r>
-      <w:r>
-        <w:rPr>
-          <w:sz w:val="28"/>
-        </w:rPr>
-        <w:t>: страница цен.</w:t>
-      </w:r>
-    </w:p>
-    <w:p>
-      <w:pPr>
-        <w:pStyle w:val="a0"/>
-        <w:keepNext/>
-        <w:spacing w:before="0" w:after="0"/>
-        <w:jc w:val="center"/>
-      </w:pPr>
-      <w:r>
-        <w:rPr>
-          <w:noProof/>
-          <w:sz w:val="28"/>
-        </w:rPr>
-        <w:drawing>
-          <wp:inline distT="0" distB="0" distL="0" distR="0" wp14:anchorId="72076106" wp14:editId="20220FAE">
-            <wp:extent cx="5334000" cy="2375958"/>
-            <wp:effectExtent l="0" t="0" r="0" b="0"/>
-            <wp:docPr id="74" name="Picture"/>
-            <wp:cNvGraphicFramePr/>
-            <a:graphic xmlns:a="http://schemas.openxmlformats.org/drawingml/2006/main">
-              <a:graphicData uri="http://schemas.openxmlformats.org/drawingml/2006/picture">
-                <pic:pic xmlns:pic="http://schemas.openxmlformats.org/drawingml/2006/picture">
-                  <pic:nvPicPr>
-                    <pic:cNvPr id="75" name="Picture" descr="Скриншоты/comp_02_perfectxl_pricing.jpg"/>
-                    <pic:cNvPicPr>
-                      <a:picLocks noChangeAspect="1" noChangeArrowheads="1"/>
-                    </pic:cNvPicPr>
-                  </pic:nvPicPr>
-                  <pic:blipFill>
-                    <a:blip r:embed="rId22"/>
-                    <a:stretch>
-                      <a:fillRect/>
-                    </a:stretch>
-                  </pic:blipFill>
-                  <pic:spPr bwMode="auto">
-                    <a:xfrm>
-                      <a:off x="0" y="0"/>
-                      <a:ext cx="5334000" cy="2375958"/>
-                    </a:xfrm>
-                    <a:prstGeom prst="rect">
-                      <a:avLst/>
-                    </a:prstGeom>
-                    <a:noFill/>
-                    <a:ln w="9525">
-                      <a:noFill/>
-                      <a:headEnd/>
-                      <a:tailEnd/>
-                    </a:ln>
-                  </pic:spPr>
-                </pic:pic>
-              </a:graphicData>
-            </a:graphic>
-          </wp:inline>
-        </w:drawing>
-      </w:r>
-    </w:p>
-    <w:p>
-      <w:pPr>
-        <w:pStyle w:val="a0"/>
-        <w:spacing w:before="0" w:after="0" w:line="360" w:lineRule="exact"/>
-        <w:jc w:val="center"/>
-      </w:pPr>
-      <w:r>
-        <w:rPr>
-          <w:sz w:val="28"/>
-        </w:rPr>
-        <w:t xml:space="preserve">Рисунок 16 – </w:t>
-      </w:r>
-      <w:r>
-        <w:rPr>
-          <w:i/>
-          <w:sz w:val="28"/>
-        </w:rPr>
-        <w:t>Perfec</w:t>
-      </w:r>
-      <w:r>
-        <w:rPr>
-          <w:i/>
-          <w:sz w:val="28"/>
-        </w:rPr>
-        <w:t>tXL</w:t>
-      </w:r>
-      <w:r>
-        <w:rPr>
-          <w:sz w:val="28"/>
-        </w:rPr>
-        <w:t>: страница цен</w:t>
-      </w:r>
-    </w:p>
-    <w:p>
-      <w:pPr>
-        <w:pStyle w:val="a0"/>
-        <w:spacing w:before="0" w:after="0" w:line="360" w:lineRule="exact"/>
-        <w:ind w:firstLine="709"/>
-        <w:jc w:val="both"/>
-      </w:pPr>
-      <w:r>
-        <w:rPr>
-          <w:sz w:val="28"/>
-        </w:rPr>
-        <w:t>Страница показывает три пакета (</w:t>
-      </w:r>
-      <w:r>
-        <w:rPr>
-          <w:i/>
-          <w:sz w:val="28"/>
-        </w:rPr>
-        <w:t>Professional</w:t>
-      </w:r>
-      <w:r>
-        <w:rPr>
-          <w:sz w:val="28"/>
-        </w:rPr>
-        <w:t xml:space="preserve">, </w:t>
-      </w:r>
-      <w:r>
-        <w:rPr>
-          <w:i/>
-          <w:sz w:val="28"/>
-        </w:rPr>
-        <w:t>Medium</w:t>
-      </w:r>
-      <w:r>
-        <w:rPr>
-          <w:sz w:val="28"/>
-        </w:rPr>
-        <w:t xml:space="preserve"> </w:t>
-      </w:r>
-      <w:r>
-        <w:rPr>
-          <w:i/>
-          <w:sz w:val="28"/>
-        </w:rPr>
-        <w:t>Business</w:t>
-      </w:r>
-      <w:r>
-        <w:rPr>
-          <w:sz w:val="28"/>
-        </w:rPr>
-        <w:t xml:space="preserve">, </w:t>
-      </w:r>
-      <w:r>
-        <w:rPr>
-          <w:i/>
-          <w:sz w:val="28"/>
-        </w:rPr>
-        <w:t>Enterprise</w:t>
-      </w:r>
-      <w:r>
-        <w:rPr>
-          <w:sz w:val="28"/>
-        </w:rPr>
-        <w:t>) для разных размеров организаций; подтверждает, что цена раскрыта частично и сгруппирована по сегментам.</w:t>
-      </w:r>
-    </w:p>
-    <w:p>
-      <w:pPr>
-        <w:pStyle w:val="a0"/>
-        <w:spacing w:before="0" w:after="0" w:line="360" w:lineRule="exact"/>
-        <w:ind w:firstLine="709"/>
-        <w:jc w:val="both"/>
-      </w:pPr>
-      <w:r>
-        <w:rPr>
-          <w:sz w:val="28"/>
-        </w:rPr>
-        <w:t xml:space="preserve">На рисунке 17 показано: </w:t>
-      </w:r>
-      <w:r>
-        <w:rPr>
-          <w:i/>
-          <w:sz w:val="28"/>
-        </w:rPr>
-        <w:t>Shortcut</w:t>
-      </w:r>
-      <w:r>
-        <w:rPr>
-          <w:sz w:val="28"/>
-        </w:rPr>
-        <w:t>: страница цен.</w:t>
-      </w:r>
-    </w:p>
-    <w:p>
-      <w:pPr>
-        <w:pStyle w:val="a0"/>
-        <w:keepNext/>
-        <w:spacing w:before="0" w:after="0"/>
-        <w:jc w:val="center"/>
-      </w:pPr>
-      <w:r>
-        <w:rPr>
-          <w:noProof/>
-          <w:sz w:val="28"/>
-        </w:rPr>
-        <w:lastRenderedPageBreak/>
-        <w:drawing>
-          <wp:inline distT="0" distB="0" distL="0" distR="0" wp14:anchorId="55C03A49" wp14:editId="4A88E593">
+          <wp:inline distT="0" distB="0" distL="0" distR="0" wp14:anchorId="64518684" wp14:editId="26A25D0E">
             <wp:extent cx="5334000" cy="2375958"/>
             <wp:effectExtent l="0" t="0" r="0" b="0"/>
             <wp:docPr id="77" name="Picture"/>
@@ -34892,7 +34769,7 @@
               <a:graphicData uri="http://schemas.openxmlformats.org/drawingml/2006/picture">
                 <pic:pic xmlns:pic="http://schemas.openxmlformats.org/drawingml/2006/picture">
                   <pic:nvPicPr>
-                    <pic:cNvPr id="78" name="Picture" descr="Скриншоты/comp_03_shortcut_pricing.jpg"/>
+                    <pic:cNvPr id="78" name="Picture" descr="Скриншоты/comp_01_perfectxl_home.jpg"/>
                     <pic:cNvPicPr>
                       <a:picLocks noChangeAspect="1" noChangeArrowheads="1"/>
                     </pic:cNvPicPr>
@@ -34935,26 +34812,20 @@
         <w:rPr>
           <w:sz w:val="28"/>
         </w:rPr>
-        <w:t>Рисунок 1</w:t>
-      </w:r>
-      <w:r>
-        <w:rPr>
-          <w:sz w:val="28"/>
-        </w:rPr>
-        <w:t xml:space="preserve">7 – </w:t>
+        <w:t xml:space="preserve">Рисунок 17 – </w:t>
       </w:r>
       <w:r>
         <w:rPr>
           <w:i/>
           <w:sz w:val="28"/>
         </w:rPr>
-        <w:t>Shortcut</w:t>
-      </w:r>
-      <w:r>
-        <w:rPr>
-          <w:sz w:val="28"/>
-        </w:rPr>
-        <w:t>: страница цен</w:t>
+        <w:t>PerfectXL</w:t>
+      </w:r>
+      <w:r>
+        <w:rPr>
+          <w:sz w:val="28"/>
+        </w:rPr>
+        <w:t>: главная страница</w:t>
       </w:r>
     </w:p>
     <w:p>
@@ -34968,111 +34839,78 @@
         <w:rPr>
           <w:sz w:val="28"/>
         </w:rPr>
-        <w:t xml:space="preserve">Страница показывает </w:t>
+        <w:t xml:space="preserve">Главная </w:t>
       </w:r>
       <w:r>
         <w:rPr>
           <w:i/>
           <w:sz w:val="28"/>
         </w:rPr>
-        <w:t>Free</w:t>
-      </w:r>
-      <w:r>
-        <w:rPr>
-          <w:sz w:val="28"/>
-        </w:rPr>
-        <w:t xml:space="preserve"> за 0 </w:t>
+        <w:t>PerfectXL</w:t>
+      </w:r>
+      <w:r>
+        <w:rPr>
+          <w:sz w:val="28"/>
+        </w:rPr>
+        <w:t xml:space="preserve"> построена вокруг награды «</w:t>
       </w:r>
       <w:r>
         <w:rPr>
           <w:i/>
           <w:sz w:val="28"/>
         </w:rPr>
-        <w:t>USD</w:t>
-      </w:r>
-      <w:r>
-        <w:rPr>
-          <w:sz w:val="28"/>
-        </w:rPr>
-        <w:t xml:space="preserve">, </w:t>
+        <w:t>Best</w:t>
+      </w:r>
+      <w:r>
+        <w:rPr>
+          <w:sz w:val="28"/>
+        </w:rPr>
+        <w:t xml:space="preserve"> </w:t>
       </w:r>
       <w:r>
         <w:rPr>
           <w:i/>
           <w:sz w:val="28"/>
         </w:rPr>
-        <w:t>Pro</w:t>
-      </w:r>
-      <w:r>
-        <w:rPr>
-          <w:sz w:val="28"/>
-        </w:rPr>
-        <w:t xml:space="preserve"> 100 </w:t>
+        <w:t>Excel</w:t>
+      </w:r>
+      <w:r>
+        <w:rPr>
+          <w:sz w:val="28"/>
+        </w:rPr>
+        <w:t xml:space="preserve"> </w:t>
       </w:r>
       <w:r>
         <w:rPr>
           <w:i/>
           <w:sz w:val="28"/>
         </w:rPr>
-        <w:t>USD</w:t>
-      </w:r>
-      <w:r>
-        <w:rPr>
-          <w:sz w:val="28"/>
-        </w:rPr>
-        <w:t xml:space="preserve">, </w:t>
+        <w:t>Add-in</w:t>
+      </w:r>
+      <w:r>
+        <w:rPr>
+          <w:sz w:val="28"/>
+        </w:rPr>
+        <w:t xml:space="preserve"> </w:t>
       </w:r>
       <w:r>
         <w:rPr>
           <w:i/>
           <w:sz w:val="28"/>
         </w:rPr>
-        <w:t>Teams</w:t>
-      </w:r>
-      <w:r>
-        <w:rPr>
-          <w:sz w:val="28"/>
-        </w:rPr>
-        <w:t xml:space="preserve"> 320 </w:t>
-      </w:r>
-      <w:r>
-        <w:rPr>
-          <w:i/>
-          <w:sz w:val="28"/>
-        </w:rPr>
-        <w:t>USD</w:t>
-      </w:r>
-      <w:r>
-        <w:rPr>
-          <w:sz w:val="28"/>
-        </w:rPr>
-        <w:t xml:space="preserve"> плюс 100 </w:t>
-      </w:r>
-      <w:r>
-        <w:rPr>
-          <w:i/>
-          <w:sz w:val="28"/>
-        </w:rPr>
-        <w:t>USD</w:t>
-      </w:r>
-      <w:r>
-        <w:rPr>
-          <w:sz w:val="28"/>
-        </w:rPr>
-        <w:t xml:space="preserve"> за место и </w:t>
-      </w:r>
-      <w:r>
-        <w:rPr>
-          <w:i/>
-          <w:sz w:val="28"/>
-        </w:rPr>
-        <w:t>Enterprise</w:t>
-      </w:r>
-      <w:r>
-        <w:rPr>
-          <w:sz w:val="28"/>
-        </w:rPr>
-        <w:t xml:space="preserve"> по запросу со скидкой 20 % за год; это самая прозрачная лестница тарифов среди конкурентов.</w:t>
+        <w:t>of</w:t>
+      </w:r>
+      <w:r>
+        <w:rPr>
+          <w:sz w:val="28"/>
+        </w:rPr>
+        <w:t xml:space="preserve"> 2026» и кноп</w:t>
+      </w:r>
+      <w:r>
+        <w:rPr>
+          <w:sz w:val="28"/>
+        </w:rPr>
+        <w:t>ки анонса; цен и пробного доступа на первом экране нет.</w:t>
       </w:r>
     </w:p>
     <w:p>
@@ -35093,19 +34931,13 @@
           <w:i/>
           <w:sz w:val="28"/>
         </w:rPr>
-        <w:t>Numerous.ai</w:t>
-      </w:r>
-      <w:r>
-        <w:rPr>
-          <w:sz w:val="28"/>
-        </w:rPr>
-        <w:t>: гла</w:t>
-      </w:r>
-      <w:r>
-        <w:rPr>
-          <w:sz w:val="28"/>
-        </w:rPr>
-        <w:t>вная страница.</w:t>
+        <w:t>PerfectXL</w:t>
+      </w:r>
+      <w:r>
+        <w:rPr>
+          <w:sz w:val="28"/>
+        </w:rPr>
+        <w:t>: страница цен.</w:t>
       </w:r>
     </w:p>
     <w:p>
@@ -35121,7 +34953,7 @@
           <w:sz w:val="28"/>
         </w:rPr>
         <w:drawing>
-          <wp:inline distT="0" distB="0" distL="0" distR="0" wp14:anchorId="00DC1731" wp14:editId="16725DAA">
+          <wp:inline distT="0" distB="0" distL="0" distR="0" wp14:anchorId="3DD8B987" wp14:editId="3E5248E9">
             <wp:extent cx="5334000" cy="2375958"/>
             <wp:effectExtent l="0" t="0" r="0" b="0"/>
             <wp:docPr id="80" name="Picture"/>
@@ -35130,7 +34962,7 @@
               <a:graphicData uri="http://schemas.openxmlformats.org/drawingml/2006/picture">
                 <pic:pic xmlns:pic="http://schemas.openxmlformats.org/drawingml/2006/picture">
                   <pic:nvPicPr>
-                    <pic:cNvPr id="81" name="Picture" descr="Скриншоты/comp_04_numerous_home.jpg"/>
+                    <pic:cNvPr id="81" name="Picture" descr="Скриншоты/comp_02_perfectxl_pricing.jpg"/>
                     <pic:cNvPicPr>
                       <a:picLocks noChangeAspect="1" noChangeArrowheads="1"/>
                     </pic:cNvPicPr>
@@ -35180,13 +35012,13 @@
           <w:i/>
           <w:sz w:val="28"/>
         </w:rPr>
-        <w:t>Numerous.ai</w:t>
-      </w:r>
-      <w:r>
-        <w:rPr>
-          <w:sz w:val="28"/>
-        </w:rPr>
-        <w:t>: главная страница</w:t>
+        <w:t>PerfectXL</w:t>
+      </w:r>
+      <w:r>
+        <w:rPr>
+          <w:sz w:val="28"/>
+        </w:rPr>
+        <w:t>: страница цен</w:t>
       </w:r>
     </w:p>
     <w:p>
@@ -35200,65 +35032,65 @@
         <w:rPr>
           <w:sz w:val="28"/>
         </w:rPr>
-        <w:t xml:space="preserve">Главная </w:t>
+        <w:t>Страница показывает три пакета (</w:t>
       </w:r>
       <w:r>
         <w:rPr>
           <w:i/>
           <w:sz w:val="28"/>
         </w:rPr>
-        <w:t>Numerous.ai</w:t>
-      </w:r>
-      <w:r>
-        <w:rPr>
-          <w:sz w:val="28"/>
-        </w:rPr>
-        <w:t xml:space="preserve"> продает массовое предложение «</w:t>
+        <w:t>Professional</w:t>
+      </w:r>
+      <w:r>
+        <w:rPr>
+          <w:sz w:val="28"/>
+        </w:rPr>
+        <w:t xml:space="preserve">, </w:t>
       </w:r>
       <w:r>
         <w:rPr>
           <w:i/>
           <w:sz w:val="28"/>
         </w:rPr>
-        <w:t>AI</w:t>
-      </w:r>
-      <w:r>
-        <w:rPr>
-          <w:sz w:val="28"/>
-        </w:rPr>
-        <w:t xml:space="preserve"> в </w:t>
+        <w:t>Medium</w:t>
+      </w:r>
+      <w:r>
+        <w:rPr>
+          <w:sz w:val="28"/>
+        </w:rPr>
+        <w:t xml:space="preserve"> </w:t>
       </w:r>
       <w:r>
         <w:rPr>
           <w:i/>
           <w:sz w:val="28"/>
         </w:rPr>
-        <w:t>Sheets</w:t>
-      </w:r>
-      <w:r>
-        <w:rPr>
-          <w:sz w:val="28"/>
-        </w:rPr>
-        <w:t xml:space="preserve"> и </w:t>
+        <w:t>Business</w:t>
+      </w:r>
+      <w:r>
+        <w:rPr>
+          <w:sz w:val="28"/>
+        </w:rPr>
+        <w:t xml:space="preserve">, </w:t>
       </w:r>
       <w:r>
         <w:rPr>
           <w:i/>
           <w:sz w:val="28"/>
         </w:rPr>
-        <w:t>Excel</w:t>
-      </w:r>
-      <w:r>
-        <w:rPr>
-          <w:sz w:val="28"/>
-        </w:rPr>
-        <w:t xml:space="preserve">» без разговора с продавцом; страница цен перенаправляет на главную, а условия пробного периода и оплаты описаны в </w:t>
-      </w:r>
-      <w:r>
-        <w:rPr>
-          <w:sz w:val="28"/>
-        </w:rPr>
-        <w:t>тексте.</w:t>
+        <w:t>Enterprise</w:t>
+      </w:r>
+      <w:r>
+        <w:rPr>
+          <w:sz w:val="28"/>
+        </w:rPr>
+        <w:t xml:space="preserve">) для разных размеров </w:t>
+      </w:r>
+      <w:r>
+        <w:rPr>
+          <w:sz w:val="28"/>
+        </w:rPr>
+        <w:t>организаций; подтверждает, что цена раскрыта частично и сгруппирована по сегментам.</w:t>
       </w:r>
     </w:p>
     <w:p>
@@ -35279,7 +35111,7 @@
           <w:i/>
           <w:sz w:val="28"/>
         </w:rPr>
-        <w:t>Datarails</w:t>
+        <w:t>Shortcut</w:t>
       </w:r>
       <w:r>
         <w:rPr>
@@ -35302,7 +35134,7 @@
         </w:rPr>
         <w:lastRenderedPageBreak/>
         <w:drawing>
-          <wp:inline distT="0" distB="0" distL="0" distR="0" wp14:anchorId="3C7FF257" wp14:editId="1380BFB3">
+          <wp:inline distT="0" distB="0" distL="0" distR="0" wp14:anchorId="75C3D674" wp14:editId="750708BD">
             <wp:extent cx="5334000" cy="2375958"/>
             <wp:effectExtent l="0" t="0" r="0" b="0"/>
             <wp:docPr id="83" name="Picture"/>
@@ -35311,7 +35143,7 @@
               <a:graphicData uri="http://schemas.openxmlformats.org/drawingml/2006/picture">
                 <pic:pic xmlns:pic="http://schemas.openxmlformats.org/drawingml/2006/picture">
                   <pic:nvPicPr>
-                    <pic:cNvPr id="84" name="Picture" descr="Скриншоты/comp_05_datarails_pricing.jpg"/>
+                    <pic:cNvPr id="84" name="Picture" descr="Скриншоты/comp_03_shortcut_pricing.jpg"/>
                     <pic:cNvPicPr>
                       <a:picLocks noChangeAspect="1" noChangeArrowheads="1"/>
                     </pic:cNvPicPr>
@@ -35361,7 +35193,7 @@
           <w:i/>
           <w:sz w:val="28"/>
         </w:rPr>
-        <w:t>Datarails</w:t>
+        <w:t>Shortcut</w:t>
       </w:r>
       <w:r>
         <w:rPr>
@@ -35381,14 +35213,27 @@
         <w:rPr>
           <w:sz w:val="28"/>
         </w:rPr>
-        <w:t>Три тарифа (</w:t>
+        <w:t xml:space="preserve">Страница показывает </w:t>
       </w:r>
       <w:r>
         <w:rPr>
           <w:i/>
           <w:sz w:val="28"/>
         </w:rPr>
-        <w:t>Professional</w:t>
+        <w:t>Free</w:t>
+      </w:r>
+      <w:r>
+        <w:rPr>
+          <w:sz w:val="28"/>
+        </w:rPr>
+        <w:t xml:space="preserve"> за 0 </w:t>
+      </w:r>
+      <w:r>
+        <w:rPr>
+          <w:i/>
+          <w:sz w:val="28"/>
+        </w:rPr>
+        <w:t>USD</w:t>
       </w:r>
       <w:r>
         <w:rPr>
@@ -35401,7 +35246,20 @@
           <w:i/>
           <w:sz w:val="28"/>
         </w:rPr>
-        <w:t>Premium</w:t>
+        <w:t>Pro</w:t>
+      </w:r>
+      <w:r>
+        <w:rPr>
+          <w:sz w:val="28"/>
+        </w:rPr>
+        <w:t xml:space="preserve"> 100 </w:t>
+      </w:r>
+      <w:r>
+        <w:rPr>
+          <w:i/>
+          <w:sz w:val="28"/>
+        </w:rPr>
+        <w:t>USD</w:t>
       </w:r>
       <w:r>
         <w:rPr>
@@ -35414,45 +35272,52 @@
           <w:i/>
           <w:sz w:val="28"/>
         </w:rPr>
-        <w:t>Expert</w:t>
-      </w:r>
-      <w:r>
-        <w:rPr>
-          <w:sz w:val="28"/>
-        </w:rPr>
-        <w:t>) без сумм и кнопки «</w:t>
+        <w:t>Teams</w:t>
+      </w:r>
+      <w:r>
+        <w:rPr>
+          <w:sz w:val="28"/>
+        </w:rPr>
+        <w:t xml:space="preserve"> 320 </w:t>
       </w:r>
       <w:r>
         <w:rPr>
           <w:i/>
           <w:sz w:val="28"/>
         </w:rPr>
-        <w:t>Request</w:t>
-      </w:r>
-      <w:r>
-        <w:rPr>
-          <w:sz w:val="28"/>
-        </w:rPr>
-        <w:t xml:space="preserve"> </w:t>
+        <w:t>USD</w:t>
+      </w:r>
+      <w:r>
+        <w:rPr>
+          <w:sz w:val="28"/>
+        </w:rPr>
+        <w:t xml:space="preserve"> плюс 100 </w:t>
       </w:r>
       <w:r>
         <w:rPr>
           <w:i/>
           <w:sz w:val="28"/>
         </w:rPr>
-        <w:t>Quote</w:t>
-      </w:r>
-      <w:r>
-        <w:rPr>
-          <w:sz w:val="28"/>
-        </w:rPr>
-        <w:t xml:space="preserve">»; цена по запросу и ограничения по числу пользователей и интеграций </w:t>
-      </w:r>
-      <w:r>
-        <w:rPr>
-          <w:sz w:val="28"/>
-        </w:rPr>
-        <w:t>подтверждают корпоративную модель продаж.</w:t>
+        <w:t>USD</w:t>
+      </w:r>
+      <w:r>
+        <w:rPr>
+          <w:sz w:val="28"/>
+        </w:rPr>
+        <w:t xml:space="preserve"> за место и </w:t>
+      </w:r>
+      <w:r>
+        <w:rPr>
+          <w:i/>
+          <w:sz w:val="28"/>
+        </w:rPr>
+        <w:t>Enterprise</w:t>
+      </w:r>
+      <w:r>
+        <w:rPr>
+          <w:sz w:val="28"/>
+        </w:rPr>
+        <w:t xml:space="preserve"> по запросу со скидкой 20 % за год; это самая прозрачная лестница тарифов среди конкурентов.</w:t>
       </w:r>
     </w:p>
     <w:p>
@@ -35473,13 +35338,13 @@
           <w:i/>
           <w:sz w:val="28"/>
         </w:rPr>
-        <w:t>DataSnipper</w:t>
-      </w:r>
-      <w:r>
-        <w:rPr>
-          <w:sz w:val="28"/>
-        </w:rPr>
-        <w:t>: страница цен.</w:t>
+        <w:t>Numerous.ai</w:t>
+      </w:r>
+      <w:r>
+        <w:rPr>
+          <w:sz w:val="28"/>
+        </w:rPr>
+        <w:t>: главная страница.</w:t>
       </w:r>
     </w:p>
     <w:p>
@@ -35495,7 +35360,7 @@
           <w:sz w:val="28"/>
         </w:rPr>
         <w:drawing>
-          <wp:inline distT="0" distB="0" distL="0" distR="0" wp14:anchorId="4D46E7C7" wp14:editId="3436AE83">
+          <wp:inline distT="0" distB="0" distL="0" distR="0" wp14:anchorId="29E72A61" wp14:editId="24519E7C">
             <wp:extent cx="5334000" cy="2375958"/>
             <wp:effectExtent l="0" t="0" r="0" b="0"/>
             <wp:docPr id="86" name="Picture"/>
@@ -35504,7 +35369,7 @@
               <a:graphicData uri="http://schemas.openxmlformats.org/drawingml/2006/picture">
                 <pic:pic xmlns:pic="http://schemas.openxmlformats.org/drawingml/2006/picture">
                   <pic:nvPicPr>
-                    <pic:cNvPr id="87" name="Picture" descr="Скриншоты/comp_06_datasnipper_pricing.jpg"/>
+                    <pic:cNvPr id="87" name="Picture" descr="Скриншоты/comp_04_numerous_home.jpg"/>
                     <pic:cNvPicPr>
                       <a:picLocks noChangeAspect="1" noChangeArrowheads="1"/>
                     </pic:cNvPicPr>
@@ -35554,13 +35419,13 @@
           <w:i/>
           <w:sz w:val="28"/>
         </w:rPr>
-        <w:t>DataSnipper</w:t>
-      </w:r>
-      <w:r>
-        <w:rPr>
-          <w:sz w:val="28"/>
-        </w:rPr>
-        <w:t>: страница цен</w:t>
+        <w:t>Numerous.ai</w:t>
+      </w:r>
+      <w:r>
+        <w:rPr>
+          <w:sz w:val="28"/>
+        </w:rPr>
+        <w:t>: главная страница</w:t>
       </w:r>
     </w:p>
     <w:p>
@@ -35574,27 +35439,46 @@
         <w:rPr>
           <w:sz w:val="28"/>
         </w:rPr>
-        <w:t xml:space="preserve">Тарифы </w:t>
+        <w:t xml:space="preserve">Главная </w:t>
       </w:r>
       <w:r>
         <w:rPr>
           <w:i/>
           <w:sz w:val="28"/>
         </w:rPr>
-        <w:t>Start</w:t>
-      </w:r>
-      <w:r>
-        <w:rPr>
-          <w:sz w:val="28"/>
-        </w:rPr>
-        <w:t xml:space="preserve">, </w:t>
+        <w:t>Numerous.ai</w:t>
+      </w:r>
+      <w:r>
+        <w:rPr>
+          <w:sz w:val="28"/>
+        </w:rPr>
+        <w:t xml:space="preserve"> продает массовое предложение «</w:t>
       </w:r>
       <w:r>
         <w:rPr>
           <w:i/>
           <w:sz w:val="28"/>
         </w:rPr>
-        <w:t>Accelerate</w:t>
+        <w:t>AI</w:t>
+      </w:r>
+      <w:r>
+        <w:rPr>
+          <w:sz w:val="28"/>
+        </w:rPr>
+        <w:t xml:space="preserve"> </w:t>
+      </w:r>
+      <w:r>
+        <w:rPr>
+          <w:sz w:val="28"/>
+        </w:rPr>
+        <w:t xml:space="preserve">в </w:t>
+      </w:r>
+      <w:r>
+        <w:rPr>
+          <w:i/>
+          <w:sz w:val="28"/>
+        </w:rPr>
+        <w:t>Sheets</w:t>
       </w:r>
       <w:r>
         <w:rPr>
@@ -35607,84 +35491,13 @@
           <w:i/>
           <w:sz w:val="28"/>
         </w:rPr>
-        <w:t>Elevate</w:t>
-      </w:r>
-      <w:r>
-        <w:rPr>
-          <w:sz w:val="28"/>
-        </w:rPr>
-        <w:t xml:space="preserve"> без сумм, вход через «</w:t>
-      </w:r>
-      <w:r>
-        <w:rPr>
-          <w:i/>
-          <w:sz w:val="28"/>
-        </w:rPr>
-        <w:t>Book</w:t>
-      </w:r>
-      <w:r>
-        <w:rPr>
-          <w:sz w:val="28"/>
-        </w:rPr>
-        <w:t xml:space="preserve"> </w:t>
-      </w:r>
-      <w:r>
-        <w:rPr>
-          <w:i/>
-          <w:sz w:val="28"/>
-        </w:rPr>
-        <w:t>Demo</w:t>
-      </w:r>
-      <w:r>
-        <w:rPr>
-          <w:sz w:val="28"/>
-        </w:rPr>
-        <w:t>» и «</w:t>
-      </w:r>
-      <w:r>
-        <w:rPr>
-          <w:i/>
-          <w:sz w:val="28"/>
-        </w:rPr>
-        <w:t>Contact</w:t>
-      </w:r>
-      <w:r>
-        <w:rPr>
-          <w:sz w:val="28"/>
-        </w:rPr>
-        <w:t xml:space="preserve"> </w:t>
-      </w:r>
-      <w:r>
-        <w:rPr>
-          <w:i/>
-          <w:sz w:val="28"/>
-        </w:rPr>
-        <w:t>sales</w:t>
-      </w:r>
-      <w:r>
-        <w:rPr>
-          <w:sz w:val="28"/>
-        </w:rPr>
-        <w:t xml:space="preserve">»; баннер </w:t>
-      </w:r>
-      <w:r>
-        <w:rPr>
-          <w:i/>
-          <w:sz w:val="28"/>
-        </w:rPr>
-        <w:t>cookie</w:t>
-      </w:r>
-      <w:r>
-        <w:rPr>
-          <w:sz w:val="28"/>
-        </w:rPr>
-        <w:t xml:space="preserve"> был отклонен до снимк</w:t>
-      </w:r>
-      <w:r>
-        <w:rPr>
-          <w:sz w:val="28"/>
-        </w:rPr>
-        <w:t>а.</w:t>
+        <w:t>Excel</w:t>
+      </w:r>
+      <w:r>
+        <w:rPr>
+          <w:sz w:val="28"/>
+        </w:rPr>
+        <w:t>» без разговора с продавцом; страница цен перенаправляет на главную, а условия пробного периода и оплаты описаны в тексте.</w:t>
       </w:r>
     </w:p>
     <w:p>
@@ -35705,13 +35518,13 @@
           <w:i/>
           <w:sz w:val="28"/>
         </w:rPr>
-        <w:t>Arixcel</w:t>
-      </w:r>
-      <w:r>
-        <w:rPr>
-          <w:sz w:val="28"/>
-        </w:rPr>
-        <w:t>: лицензирование.</w:t>
+        <w:t>Datarails</w:t>
+      </w:r>
+      <w:r>
+        <w:rPr>
+          <w:sz w:val="28"/>
+        </w:rPr>
+        <w:t>: страница цен.</w:t>
       </w:r>
     </w:p>
     <w:p>
@@ -35728,7 +35541,7 @@
         </w:rPr>
         <w:lastRenderedPageBreak/>
         <w:drawing>
-          <wp:inline distT="0" distB="0" distL="0" distR="0" wp14:anchorId="30D19CAD" wp14:editId="74745E74">
+          <wp:inline distT="0" distB="0" distL="0" distR="0" wp14:anchorId="6A39CD51" wp14:editId="46868733">
             <wp:extent cx="5334000" cy="2375958"/>
             <wp:effectExtent l="0" t="0" r="0" b="0"/>
             <wp:docPr id="89" name="Picture"/>
@@ -35737,7 +35550,7 @@
               <a:graphicData uri="http://schemas.openxmlformats.org/drawingml/2006/picture">
                 <pic:pic xmlns:pic="http://schemas.openxmlformats.org/drawingml/2006/picture">
                   <pic:nvPicPr>
-                    <pic:cNvPr id="90" name="Picture" descr="Скриншоты/comp_07_arixcel_pricing.jpg"/>
+                    <pic:cNvPr id="90" name="Picture" descr="Скриншоты/comp_05_datarails_pricing.jpg"/>
                     <pic:cNvPicPr>
                       <a:picLocks noChangeAspect="1" noChangeArrowheads="1"/>
                     </pic:cNvPicPr>
@@ -35787,13 +35600,13 @@
           <w:i/>
           <w:sz w:val="28"/>
         </w:rPr>
-        <w:t>Arixcel</w:t>
-      </w:r>
-      <w:r>
-        <w:rPr>
-          <w:sz w:val="28"/>
-        </w:rPr>
-        <w:t>: лицензирование</w:t>
+        <w:t>Datarails</w:t>
+      </w:r>
+      <w:r>
+        <w:rPr>
+          <w:sz w:val="28"/>
+        </w:rPr>
+        <w:t>: страница цен</w:t>
       </w:r>
     </w:p>
     <w:p>
@@ -35807,39 +35620,72 @@
         <w:rPr>
           <w:sz w:val="28"/>
         </w:rPr>
-        <w:t xml:space="preserve">Раздел цен показывает 2,75 </w:t>
+        <w:t>Три тарифа (</w:t>
       </w:r>
       <w:r>
         <w:rPr>
           <w:i/>
           <w:sz w:val="28"/>
         </w:rPr>
-        <w:t>GBP</w:t>
-      </w:r>
-      <w:r>
-        <w:rPr>
-          <w:sz w:val="28"/>
-        </w:rPr>
-        <w:t xml:space="preserve"> за пользователя в месяц с примером расчета для 10 пользователей на 12 месяцев; правила активации ключей и администрирования лицензий г</w:t>
-      </w:r>
-      <w:r>
-        <w:rPr>
-          <w:sz w:val="28"/>
-        </w:rPr>
-        <w:t xml:space="preserve">оворят о нацеленности на корпоративных пользователей </w:t>
+        <w:t>Professional</w:t>
+      </w:r>
+      <w:r>
+        <w:rPr>
+          <w:sz w:val="28"/>
+        </w:rPr>
+        <w:t xml:space="preserve">, </w:t>
       </w:r>
       <w:r>
         <w:rPr>
           <w:i/>
           <w:sz w:val="28"/>
         </w:rPr>
-        <w:t>Windows</w:t>
-      </w:r>
-      <w:r>
-        <w:rPr>
-          <w:sz w:val="28"/>
-        </w:rPr>
-        <w:t>.</w:t>
+        <w:t>Premium</w:t>
+      </w:r>
+      <w:r>
+        <w:rPr>
+          <w:sz w:val="28"/>
+        </w:rPr>
+        <w:t xml:space="preserve">, </w:t>
+      </w:r>
+      <w:r>
+        <w:rPr>
+          <w:i/>
+          <w:sz w:val="28"/>
+        </w:rPr>
+        <w:t>Expert</w:t>
+      </w:r>
+      <w:r>
+        <w:rPr>
+          <w:sz w:val="28"/>
+        </w:rPr>
+        <w:t>) без сумм и кнопки «</w:t>
+      </w:r>
+      <w:r>
+        <w:rPr>
+          <w:i/>
+          <w:sz w:val="28"/>
+        </w:rPr>
+        <w:t>Request</w:t>
+      </w:r>
+      <w:r>
+        <w:rPr>
+          <w:sz w:val="28"/>
+        </w:rPr>
+        <w:t xml:space="preserve"> </w:t>
+      </w:r>
+      <w:r>
+        <w:rPr>
+          <w:i/>
+          <w:sz w:val="28"/>
+        </w:rPr>
+        <w:t>Quote</w:t>
+      </w:r>
+      <w:r>
+        <w:rPr>
+          <w:sz w:val="28"/>
+        </w:rPr>
+        <w:t>»; цена по запросу и ограничения по числу пользователей и интеграций подтверждают корпоративную модель продаж.</w:t>
       </w:r>
     </w:p>
     <w:p>
@@ -35860,20 +35706,7 @@
           <w:i/>
           <w:sz w:val="28"/>
         </w:rPr>
-        <w:t>Operis</w:t>
-      </w:r>
-      <w:r>
-        <w:rPr>
-          <w:sz w:val="28"/>
-        </w:rPr>
-        <w:t xml:space="preserve"> </w:t>
-      </w:r>
-      <w:r>
-        <w:rPr>
-          <w:i/>
-          <w:sz w:val="28"/>
-        </w:rPr>
-        <w:t>OAK</w:t>
+        <w:t>DataSnipper</w:t>
       </w:r>
       <w:r>
         <w:rPr>
@@ -35895,7 +35728,7 @@
           <w:sz w:val="28"/>
         </w:rPr>
         <w:drawing>
-          <wp:inline distT="0" distB="0" distL="0" distR="0" wp14:anchorId="2F587E87" wp14:editId="70FADA94">
+          <wp:inline distT="0" distB="0" distL="0" distR="0" wp14:anchorId="31FD8326" wp14:editId="659D178D">
             <wp:extent cx="5334000" cy="2375958"/>
             <wp:effectExtent l="0" t="0" r="0" b="0"/>
             <wp:docPr id="92" name="Picture"/>
@@ -35904,7 +35737,7 @@
               <a:graphicData uri="http://schemas.openxmlformats.org/drawingml/2006/picture">
                 <pic:pic xmlns:pic="http://schemas.openxmlformats.org/drawingml/2006/picture">
                   <pic:nvPicPr>
-                    <pic:cNvPr id="93" name="Picture" descr="Скриншоты/comp_08_operis_oak_pricing.jpg"/>
+                    <pic:cNvPr id="93" name="Picture" descr="Скриншоты/comp_06_datasnipper_pricing.jpg"/>
                     <pic:cNvPicPr>
                       <a:picLocks noChangeAspect="1" noChangeArrowheads="1"/>
                     </pic:cNvPicPr>
@@ -35954,6 +35787,407 @@
           <w:i/>
           <w:sz w:val="28"/>
         </w:rPr>
+        <w:t>DataSnipper</w:t>
+      </w:r>
+      <w:r>
+        <w:rPr>
+          <w:sz w:val="28"/>
+        </w:rPr>
+        <w:t>: стр</w:t>
+      </w:r>
+      <w:r>
+        <w:rPr>
+          <w:sz w:val="28"/>
+        </w:rPr>
+        <w:t>аница цен</w:t>
+      </w:r>
+    </w:p>
+    <w:p>
+      <w:pPr>
+        <w:pStyle w:val="a0"/>
+        <w:spacing w:before="0" w:after="0" w:line="360" w:lineRule="exact"/>
+        <w:ind w:firstLine="709"/>
+        <w:jc w:val="both"/>
+      </w:pPr>
+      <w:r>
+        <w:rPr>
+          <w:sz w:val="28"/>
+        </w:rPr>
+        <w:t xml:space="preserve">Тарифы </w:t>
+      </w:r>
+      <w:r>
+        <w:rPr>
+          <w:i/>
+          <w:sz w:val="28"/>
+        </w:rPr>
+        <w:t>Start</w:t>
+      </w:r>
+      <w:r>
+        <w:rPr>
+          <w:sz w:val="28"/>
+        </w:rPr>
+        <w:t xml:space="preserve">, </w:t>
+      </w:r>
+      <w:r>
+        <w:rPr>
+          <w:i/>
+          <w:sz w:val="28"/>
+        </w:rPr>
+        <w:t>Accelerate</w:t>
+      </w:r>
+      <w:r>
+        <w:rPr>
+          <w:sz w:val="28"/>
+        </w:rPr>
+        <w:t xml:space="preserve"> и </w:t>
+      </w:r>
+      <w:r>
+        <w:rPr>
+          <w:i/>
+          <w:sz w:val="28"/>
+        </w:rPr>
+        <w:t>Elevate</w:t>
+      </w:r>
+      <w:r>
+        <w:rPr>
+          <w:sz w:val="28"/>
+        </w:rPr>
+        <w:t xml:space="preserve"> без сумм, вход через «</w:t>
+      </w:r>
+      <w:r>
+        <w:rPr>
+          <w:i/>
+          <w:sz w:val="28"/>
+        </w:rPr>
+        <w:t>Book</w:t>
+      </w:r>
+      <w:r>
+        <w:rPr>
+          <w:sz w:val="28"/>
+        </w:rPr>
+        <w:t xml:space="preserve"> </w:t>
+      </w:r>
+      <w:r>
+        <w:rPr>
+          <w:i/>
+          <w:sz w:val="28"/>
+        </w:rPr>
+        <w:t>Demo</w:t>
+      </w:r>
+      <w:r>
+        <w:rPr>
+          <w:sz w:val="28"/>
+        </w:rPr>
+        <w:t>» и «</w:t>
+      </w:r>
+      <w:r>
+        <w:rPr>
+          <w:i/>
+          <w:sz w:val="28"/>
+        </w:rPr>
+        <w:t>Contact</w:t>
+      </w:r>
+      <w:r>
+        <w:rPr>
+          <w:sz w:val="28"/>
+        </w:rPr>
+        <w:t xml:space="preserve"> </w:t>
+      </w:r>
+      <w:r>
+        <w:rPr>
+          <w:i/>
+          <w:sz w:val="28"/>
+        </w:rPr>
+        <w:t>sales</w:t>
+      </w:r>
+      <w:r>
+        <w:rPr>
+          <w:sz w:val="28"/>
+        </w:rPr>
+        <w:t xml:space="preserve">»; баннер </w:t>
+      </w:r>
+      <w:r>
+        <w:rPr>
+          <w:i/>
+          <w:sz w:val="28"/>
+        </w:rPr>
+        <w:t>cookie</w:t>
+      </w:r>
+      <w:r>
+        <w:rPr>
+          <w:sz w:val="28"/>
+        </w:rPr>
+        <w:t xml:space="preserve"> был отклонен до снимка.</w:t>
+      </w:r>
+    </w:p>
+    <w:p>
+      <w:pPr>
+        <w:pStyle w:val="a0"/>
+        <w:spacing w:before="0" w:after="0" w:line="360" w:lineRule="exact"/>
+        <w:ind w:firstLine="709"/>
+        <w:jc w:val="both"/>
+      </w:pPr>
+      <w:r>
+        <w:rPr>
+          <w:sz w:val="28"/>
+        </w:rPr>
+        <w:t xml:space="preserve">На рисунке 23 показано: </w:t>
+      </w:r>
+      <w:r>
+        <w:rPr>
+          <w:i/>
+          <w:sz w:val="28"/>
+        </w:rPr>
+        <w:t>Arixcel</w:t>
+      </w:r>
+      <w:r>
+        <w:rPr>
+          <w:sz w:val="28"/>
+        </w:rPr>
+        <w:t>: лицензирование.</w:t>
+      </w:r>
+    </w:p>
+    <w:p>
+      <w:pPr>
+        <w:pStyle w:val="a0"/>
+        <w:keepNext/>
+        <w:spacing w:before="0" w:after="0"/>
+        <w:jc w:val="center"/>
+      </w:pPr>
+      <w:r>
+        <w:rPr>
+          <w:noProof/>
+          <w:sz w:val="28"/>
+        </w:rPr>
+        <w:lastRenderedPageBreak/>
+        <w:drawing>
+          <wp:inline distT="0" distB="0" distL="0" distR="0" wp14:anchorId="569D78C1" wp14:editId="722E599B">
+            <wp:extent cx="5334000" cy="2375958"/>
+            <wp:effectExtent l="0" t="0" r="0" b="0"/>
+            <wp:docPr id="95" name="Picture"/>
+            <wp:cNvGraphicFramePr/>
+            <a:graphic xmlns:a="http://schemas.openxmlformats.org/drawingml/2006/main">
+              <a:graphicData uri="http://schemas.openxmlformats.org/drawingml/2006/picture">
+                <pic:pic xmlns:pic="http://schemas.openxmlformats.org/drawingml/2006/picture">
+                  <pic:nvPicPr>
+                    <pic:cNvPr id="96" name="Picture" descr="Скриншоты/comp_07_arixcel_pricing.jpg"/>
+                    <pic:cNvPicPr>
+                      <a:picLocks noChangeAspect="1" noChangeArrowheads="1"/>
+                    </pic:cNvPicPr>
+                  </pic:nvPicPr>
+                  <pic:blipFill>
+                    <a:blip r:embed="rId29"/>
+                    <a:stretch>
+                      <a:fillRect/>
+                    </a:stretch>
+                  </pic:blipFill>
+                  <pic:spPr bwMode="auto">
+                    <a:xfrm>
+                      <a:off x="0" y="0"/>
+                      <a:ext cx="5334000" cy="2375958"/>
+                    </a:xfrm>
+                    <a:prstGeom prst="rect">
+                      <a:avLst/>
+                    </a:prstGeom>
+                    <a:noFill/>
+                    <a:ln w="9525">
+                      <a:noFill/>
+                      <a:headEnd/>
+                      <a:tailEnd/>
+                    </a:ln>
+                  </pic:spPr>
+                </pic:pic>
+              </a:graphicData>
+            </a:graphic>
+          </wp:inline>
+        </w:drawing>
+      </w:r>
+    </w:p>
+    <w:p>
+      <w:pPr>
+        <w:pStyle w:val="a0"/>
+        <w:spacing w:before="0" w:after="0" w:line="360" w:lineRule="exact"/>
+        <w:jc w:val="center"/>
+      </w:pPr>
+      <w:r>
+        <w:rPr>
+          <w:sz w:val="28"/>
+        </w:rPr>
+        <w:t xml:space="preserve">Рисунок 23 – </w:t>
+      </w:r>
+      <w:r>
+        <w:rPr>
+          <w:i/>
+          <w:sz w:val="28"/>
+        </w:rPr>
+        <w:t>Arixcel</w:t>
+      </w:r>
+      <w:r>
+        <w:rPr>
+          <w:sz w:val="28"/>
+        </w:rPr>
+        <w:t>: лицензирование</w:t>
+      </w:r>
+    </w:p>
+    <w:p>
+      <w:pPr>
+        <w:pStyle w:val="a0"/>
+        <w:spacing w:before="0" w:after="0" w:line="360" w:lineRule="exact"/>
+        <w:ind w:firstLine="709"/>
+        <w:jc w:val="both"/>
+      </w:pPr>
+      <w:r>
+        <w:rPr>
+          <w:sz w:val="28"/>
+        </w:rPr>
+        <w:t xml:space="preserve">Раздел цен показывает 2,75 </w:t>
+      </w:r>
+      <w:r>
+        <w:rPr>
+          <w:i/>
+          <w:sz w:val="28"/>
+        </w:rPr>
+        <w:t>GBP</w:t>
+      </w:r>
+      <w:r>
+        <w:rPr>
+          <w:sz w:val="28"/>
+        </w:rPr>
+        <w:t xml:space="preserve"> за пользователя в месяц с примером расчета для 10 пользователей на 12 месяцев; правила активации ключей и администрирования лицензий говорят о нацеленности на корпоративных пользователей </w:t>
+      </w:r>
+      <w:r>
+        <w:rPr>
+          <w:i/>
+          <w:sz w:val="28"/>
+        </w:rPr>
+        <w:t>Windows</w:t>
+      </w:r>
+      <w:r>
+        <w:rPr>
+          <w:sz w:val="28"/>
+        </w:rPr>
+        <w:t>.</w:t>
+      </w:r>
+    </w:p>
+    <w:p>
+      <w:pPr>
+        <w:pStyle w:val="a0"/>
+        <w:spacing w:before="0" w:after="0" w:line="360" w:lineRule="exact"/>
+        <w:ind w:firstLine="709"/>
+        <w:jc w:val="both"/>
+      </w:pPr>
+      <w:r>
+        <w:rPr>
+          <w:sz w:val="28"/>
+        </w:rPr>
+        <w:t xml:space="preserve">На рисунке 24 показано: </w:t>
+      </w:r>
+      <w:r>
+        <w:rPr>
+          <w:i/>
+          <w:sz w:val="28"/>
+        </w:rPr>
+        <w:t>Operi</w:t>
+      </w:r>
+      <w:r>
+        <w:rPr>
+          <w:i/>
+          <w:sz w:val="28"/>
+        </w:rPr>
+        <w:t>s</w:t>
+      </w:r>
+      <w:r>
+        <w:rPr>
+          <w:sz w:val="28"/>
+        </w:rPr>
+        <w:t xml:space="preserve"> </w:t>
+      </w:r>
+      <w:r>
+        <w:rPr>
+          <w:i/>
+          <w:sz w:val="28"/>
+        </w:rPr>
+        <w:t>OAK</w:t>
+      </w:r>
+      <w:r>
+        <w:rPr>
+          <w:sz w:val="28"/>
+        </w:rPr>
+        <w:t>: страница цен.</w:t>
+      </w:r>
+    </w:p>
+    <w:p>
+      <w:pPr>
+        <w:pStyle w:val="a0"/>
+        <w:keepNext/>
+        <w:spacing w:before="0" w:after="0"/>
+        <w:jc w:val="center"/>
+      </w:pPr>
+      <w:r>
+        <w:rPr>
+          <w:noProof/>
+          <w:sz w:val="28"/>
+        </w:rPr>
+        <w:drawing>
+          <wp:inline distT="0" distB="0" distL="0" distR="0" wp14:anchorId="773072CF" wp14:editId="18B177CC">
+            <wp:extent cx="5334000" cy="2375958"/>
+            <wp:effectExtent l="0" t="0" r="0" b="0"/>
+            <wp:docPr id="98" name="Picture"/>
+            <wp:cNvGraphicFramePr/>
+            <a:graphic xmlns:a="http://schemas.openxmlformats.org/drawingml/2006/main">
+              <a:graphicData uri="http://schemas.openxmlformats.org/drawingml/2006/picture">
+                <pic:pic xmlns:pic="http://schemas.openxmlformats.org/drawingml/2006/picture">
+                  <pic:nvPicPr>
+                    <pic:cNvPr id="99" name="Picture" descr="Скриншоты/comp_08_operis_oak_pricing.jpg"/>
+                    <pic:cNvPicPr>
+                      <a:picLocks noChangeAspect="1" noChangeArrowheads="1"/>
+                    </pic:cNvPicPr>
+                  </pic:nvPicPr>
+                  <pic:blipFill>
+                    <a:blip r:embed="rId30"/>
+                    <a:stretch>
+                      <a:fillRect/>
+                    </a:stretch>
+                  </pic:blipFill>
+                  <pic:spPr bwMode="auto">
+                    <a:xfrm>
+                      <a:off x="0" y="0"/>
+                      <a:ext cx="5334000" cy="2375958"/>
+                    </a:xfrm>
+                    <a:prstGeom prst="rect">
+                      <a:avLst/>
+                    </a:prstGeom>
+                    <a:noFill/>
+                    <a:ln w="9525">
+                      <a:noFill/>
+                      <a:headEnd/>
+                      <a:tailEnd/>
+                    </a:ln>
+                  </pic:spPr>
+                </pic:pic>
+              </a:graphicData>
+            </a:graphic>
+          </wp:inline>
+        </w:drawing>
+      </w:r>
+    </w:p>
+    <w:p>
+      <w:pPr>
+        <w:pStyle w:val="a0"/>
+        <w:spacing w:before="0" w:after="0" w:line="360" w:lineRule="exact"/>
+        <w:jc w:val="center"/>
+      </w:pPr>
+      <w:r>
+        <w:rPr>
+          <w:sz w:val="28"/>
+        </w:rPr>
+        <w:t xml:space="preserve">Рисунок 24 – </w:t>
+      </w:r>
+      <w:r>
+        <w:rPr>
+          <w:i/>
+          <w:sz w:val="28"/>
+        </w:rPr>
         <w:t>Operis</w:t>
       </w:r>
       <w:r>
@@ -36051,7 +36285,7 @@
         <w:jc w:val="center"/>
       </w:pPr>
       <w:bookmarkStart w:id="38" w:name="_e580caf5f2a0052cd60a87b42295a622f26cf83"/>
-      <w:bookmarkStart w:id="39" w:name="_Toc241943049"/>
+      <w:bookmarkStart w:id="39" w:name="_Toc241951917"/>
       <w:bookmarkEnd w:id="36"/>
       <w:r>
         <w:rPr>
@@ -36059,7 +36293,14 @@
           <w:sz w:val="28"/>
         </w:rPr>
         <w:lastRenderedPageBreak/>
-        <w:t>ПРИЛОЖЕНИЕ Е</w:t>
+        <w:t>ПРИЛОЖЕ</w:t>
+      </w:r>
+      <w:r>
+        <w:rPr>
+          <w:b/>
+          <w:sz w:val="28"/>
+        </w:rPr>
+        <w:t>НИЕ Е</w:t>
       </w:r>
       <w:bookmarkEnd w:id="39"/>
     </w:p>
@@ -36114,13 +36355,7 @@
         <w:rPr>
           <w:sz w:val="28"/>
         </w:rPr>
-        <w:t xml:space="preserve"> еще не написан, поэтому замеры воронки с 01.04.2027 по 30.09.202</w:t>
-      </w:r>
-      <w:r>
-        <w:rPr>
-          <w:sz w:val="28"/>
-        </w:rPr>
-        <w:t xml:space="preserve">7 смоделированы (генератор и файлы - в папке 00_Общее/Модельные_данные, </w:t>
+        <w:t xml:space="preserve"> еще не написан, поэтому замеры воронки с 01.04.2027 по 30.09.2027 смоделированы (генератор и файлы - в папке 00_Общее/Модельные_данные, </w:t>
       </w:r>
       <w:r>
         <w:rPr>
@@ -36133,13 +36368,13 @@
         <w:rPr>
           <w:sz w:val="28"/>
         </w:rPr>
-        <w:t xml:space="preserve"> 20261004, допущение Д-32). Параметры соответствуют базовому сценарию ЛР2-3: визит - регистрация 4 %, регистрация - активация 60 %, активация - платящий около 8 %, платежи с 01.06.</w:t>
-      </w:r>
-      <w:r>
-        <w:rPr>
-          <w:sz w:val="28"/>
-        </w:rPr>
-        <w:t>2027. Это не измерения, а демонстрация того, как отчет о конверсиях выглядит и насколько цели чувствительны к разбросу.</w:t>
+        <w:t xml:space="preserve"> 20261004, допущение Д-32). Параметры соответствуют базовому сценарию ЛР</w:t>
+      </w:r>
+      <w:r>
+        <w:rPr>
+          <w:sz w:val="28"/>
+        </w:rPr>
+        <w:t>2-3: визит - регистрация 4 %, регистрация - активация 60 %, активация - платящий около 8 %, платежи с 01.06.2027. Это не измерения, а демонстрация того, как отчет о конверсиях выглядит и насколько цели чувствительны к разбросу.</w:t>
       </w:r>
     </w:p>
     <w:p>
@@ -36153,7 +36388,13 @@
         <w:rPr>
           <w:sz w:val="28"/>
         </w:rPr>
-        <w:t>В таблице 27 представлено: модельные показатели воронки по месяцам.</w:t>
+        <w:t>В таблице 27 представлено: м</w:t>
+      </w:r>
+      <w:r>
+        <w:rPr>
+          <w:sz w:val="28"/>
+        </w:rPr>
+        <w:t>одельные показатели воронки по месяцам.</w:t>
       </w:r>
     </w:p>
     <w:p>
@@ -37019,7 +37260,13 @@
         <w:rPr>
           <w:sz w:val="28"/>
         </w:rPr>
-        <w:t>За шесть месяцев модель дает 1 066 регистраций и 34 платящих; фактические конверсии: визит - регистрация 5,6 %, регистрация - платящий 4,1 %. Цель 300 регистраций достигнута, цель 50 платящих не достигнута.</w:t>
+        <w:t xml:space="preserve">За шесть месяцев модель дает 1 066 регистраций и 34 платящих; фактические конверсии: визит - регистрация 5,6 %, регистрация - платящий 4,1 %. Цель 300 регистраций достигнута, цель 50 </w:t>
+      </w:r>
+      <w:r>
+        <w:rPr>
+          <w:sz w:val="28"/>
+        </w:rPr>
+        <w:t>платящих не достигнута.</w:t>
       </w:r>
     </w:p>
     <w:p>
@@ -37405,8 +37652,8 @@
     </w:p>
     <w:bookmarkEnd w:id="38"/>
     <w:sectPr>
-      <w:headerReference w:type="default" r:id="rId29"/>
-      <w:footerReference w:type="default" r:id="rId30"/>
+      <w:headerReference w:type="default" r:id="rId31"/>
+      <w:footerReference w:type="default" r:id="rId32"/>
       <w:footnotePr>
         <w:numRestart w:val="eachSect"/>
       </w:footnotePr>
@@ -37508,7 +37755,7 @@
   <w:abstractNum w:abstractNumId="0" w15:restartNumberingAfterBreak="0">
     <w:nsid w:val="0000A990"/>
     <w:multiLevelType w:val="multilevel"/>
-    <w:tmpl w:val="0B7CDB5E"/>
+    <w:tmpl w:val="21FC037A"/>
     <w:lvl w:ilvl="0">
       <w:numFmt w:val="bullet"/>
       <w:lvlText w:val=" "/>
@@ -37585,7 +37832,7 @@
   <w:abstractNum w:abstractNumId="1" w15:restartNumberingAfterBreak="0">
     <w:nsid w:val="00A99411"/>
     <w:multiLevelType w:val="multilevel"/>
-    <w:tmpl w:val="2D904370"/>
+    <w:tmpl w:val="B792CC76"/>
     <w:lvl w:ilvl="0">
       <w:start w:val="1"/>
       <w:numFmt w:val="decimal"/>
@@ -39063,7 +39310,7 @@
     <w:autoRedefine/>
     <w:uiPriority w:val="39"/>
     <w:unhideWhenUsed/>
-    <w:rsid w:val="00FB4424"/>
+    <w:rsid w:val="002C41ED"/>
     <w:pPr>
       <w:spacing w:after="100"/>
     </w:pPr>
@@ -39075,7 +39322,7 @@
     <w:autoRedefine/>
     <w:uiPriority w:val="39"/>
     <w:unhideWhenUsed/>
-    <w:rsid w:val="00FB4424"/>
+    <w:rsid w:val="002C41ED"/>
     <w:pPr>
       <w:spacing w:after="100"/>
       <w:ind w:left="240"/>

</xml_diff>

<commit_message>
lab6: updated U-009 screenshot and caption (SOC 2 out of scope)
</commit_message>
<xml_diff>
--- a/ЛР6_ЦП_Канвас_сценарии_релизы/ОТЧЕТ_ЛР6_TableMind.docx
+++ b/ЛР6_ЦП_Канвас_сценарии_релизы/ОТЧЕТ_ЛР6_TableMind.docx
@@ -263,7 +263,7 @@
       <w:r>
         <w:fldChar w:fldCharType="separate"/>
       </w:r>
-      <w:hyperlink w:anchor="_Toc241952867" w:history="1">
+      <w:hyperlink w:anchor="_Toc241953186" w:history="1">
         <w:r>
           <w:rPr>
             <w:rStyle w:val="af"/>
@@ -291,7 +291,7 @@
             <w:noProof/>
             <w:webHidden/>
           </w:rPr>
-          <w:instrText xml:space="preserve"> PAGEREF _Toc241952867 \h </w:instrText>
+          <w:instrText xml:space="preserve"> PAGEREF _Toc241953186 \h </w:instrText>
         </w:r>
         <w:r>
           <w:rPr>
@@ -332,7 +332,7 @@
           <w:noProof/>
         </w:rPr>
       </w:pPr>
-      <w:hyperlink w:anchor="_Toc241952868" w:history="1">
+      <w:hyperlink w:anchor="_Toc241953187" w:history="1">
         <w:r>
           <w:rPr>
             <w:rStyle w:val="af"/>
@@ -360,7 +360,7 @@
             <w:noProof/>
             <w:webHidden/>
           </w:rPr>
-          <w:instrText xml:space="preserve"> PAGEREF _Toc241952868 \h </w:instrText>
+          <w:instrText xml:space="preserve"> PAGEREF _Toc241953187 \h </w:instrText>
         </w:r>
         <w:r>
           <w:rPr>
@@ -401,7 +401,7 @@
           <w:noProof/>
         </w:rPr>
       </w:pPr>
-      <w:hyperlink w:anchor="_Toc241952869" w:history="1">
+      <w:hyperlink w:anchor="_Toc241953188" w:history="1">
         <w:r>
           <w:rPr>
             <w:rStyle w:val="af"/>
@@ -429,7 +429,7 @@
             <w:noProof/>
             <w:webHidden/>
           </w:rPr>
-          <w:instrText xml:space="preserve"> PAGEREF _Toc241952869 \h </w:instrText>
+          <w:instrText xml:space="preserve"> PAGEREF _Toc241953188 \h </w:instrText>
         </w:r>
         <w:r>
           <w:rPr>
@@ -470,7 +470,7 @@
           <w:noProof/>
         </w:rPr>
       </w:pPr>
-      <w:hyperlink w:anchor="_Toc241952870" w:history="1">
+      <w:hyperlink w:anchor="_Toc241953189" w:history="1">
         <w:r>
           <w:rPr>
             <w:rStyle w:val="af"/>
@@ -498,7 +498,7 @@
             <w:noProof/>
             <w:webHidden/>
           </w:rPr>
-          <w:instrText xml:space="preserve"> PAGEREF _Toc241952870 \h </w:instrText>
+          <w:instrText xml:space="preserve"> PAGEREF _Toc241953189 \h </w:instrText>
         </w:r>
         <w:r>
           <w:rPr>
@@ -539,7 +539,7 @@
           <w:noProof/>
         </w:rPr>
       </w:pPr>
-      <w:hyperlink w:anchor="_Toc241952871" w:history="1">
+      <w:hyperlink w:anchor="_Toc241953190" w:history="1">
         <w:r>
           <w:rPr>
             <w:rStyle w:val="af"/>
@@ -567,7 +567,7 @@
             <w:noProof/>
             <w:webHidden/>
           </w:rPr>
-          <w:instrText xml:space="preserve"> PAGEREF _Toc241952871 \h </w:instrText>
+          <w:instrText xml:space="preserve"> PAGEREF _Toc241953190 \h </w:instrText>
         </w:r>
         <w:r>
           <w:rPr>
@@ -608,7 +608,7 @@
           <w:noProof/>
         </w:rPr>
       </w:pPr>
-      <w:hyperlink w:anchor="_Toc241952872" w:history="1">
+      <w:hyperlink w:anchor="_Toc241953191" w:history="1">
         <w:r>
           <w:rPr>
             <w:rStyle w:val="af"/>
@@ -636,7 +636,7 @@
             <w:noProof/>
             <w:webHidden/>
           </w:rPr>
-          <w:instrText xml:space="preserve"> PAGEREF _Toc241952872 \h </w:instrText>
+          <w:instrText xml:space="preserve"> PAGEREF _Toc241953191 \h </w:instrText>
         </w:r>
         <w:r>
           <w:rPr>
@@ -677,7 +677,7 @@
           <w:noProof/>
         </w:rPr>
       </w:pPr>
-      <w:hyperlink w:anchor="_Toc241952873" w:history="1">
+      <w:hyperlink w:anchor="_Toc241953192" w:history="1">
         <w:r>
           <w:rPr>
             <w:rStyle w:val="af"/>
@@ -705,7 +705,7 @@
             <w:noProof/>
             <w:webHidden/>
           </w:rPr>
-          <w:instrText xml:space="preserve"> PAGEREF _Toc241952873 \h </w:instrText>
+          <w:instrText xml:space="preserve"> PAGEREF _Toc241953192 \h </w:instrText>
         </w:r>
         <w:r>
           <w:rPr>
@@ -746,7 +746,7 @@
           <w:noProof/>
         </w:rPr>
       </w:pPr>
-      <w:hyperlink w:anchor="_Toc241952874" w:history="1">
+      <w:hyperlink w:anchor="_Toc241953193" w:history="1">
         <w:r>
           <w:rPr>
             <w:rStyle w:val="af"/>
@@ -774,7 +774,7 @@
             <w:noProof/>
             <w:webHidden/>
           </w:rPr>
-          <w:instrText xml:space="preserve"> PAGEREF _Toc241952874 \h </w:instrText>
+          <w:instrText xml:space="preserve"> PAGEREF _Toc241953193 \h </w:instrText>
         </w:r>
         <w:r>
           <w:rPr>
@@ -815,7 +815,7 @@
           <w:noProof/>
         </w:rPr>
       </w:pPr>
-      <w:hyperlink w:anchor="_Toc241952875" w:history="1">
+      <w:hyperlink w:anchor="_Toc241953194" w:history="1">
         <w:r>
           <w:rPr>
             <w:rStyle w:val="af"/>
@@ -843,7 +843,7 @@
             <w:noProof/>
             <w:webHidden/>
           </w:rPr>
-          <w:instrText xml:space="preserve"> PAGEREF _Toc241952875 \h </w:instrText>
+          <w:instrText xml:space="preserve"> PAGEREF _Toc241953194 \h </w:instrText>
         </w:r>
         <w:r>
           <w:rPr>
@@ -884,7 +884,7 @@
           <w:noProof/>
         </w:rPr>
       </w:pPr>
-      <w:hyperlink w:anchor="_Toc241952876" w:history="1">
+      <w:hyperlink w:anchor="_Toc241953195" w:history="1">
         <w:r>
           <w:rPr>
             <w:rStyle w:val="af"/>
@@ -912,7 +912,7 @@
             <w:noProof/>
             <w:webHidden/>
           </w:rPr>
-          <w:instrText xml:space="preserve"> PAGEREF _Toc241952876 \h </w:instrText>
+          <w:instrText xml:space="preserve"> PAGEREF _Toc241953195 \h </w:instrText>
         </w:r>
         <w:r>
           <w:rPr>
@@ -953,7 +953,7 @@
           <w:noProof/>
         </w:rPr>
       </w:pPr>
-      <w:hyperlink w:anchor="_Toc241952877" w:history="1">
+      <w:hyperlink w:anchor="_Toc241953196" w:history="1">
         <w:r>
           <w:rPr>
             <w:rStyle w:val="af"/>
@@ -981,7 +981,7 @@
             <w:noProof/>
             <w:webHidden/>
           </w:rPr>
-          <w:instrText xml:space="preserve"> PAGEREF _Toc241952877 \h </w:instrText>
+          <w:instrText xml:space="preserve"> PAGEREF _Toc241953196 \h </w:instrText>
         </w:r>
         <w:r>
           <w:rPr>
@@ -1022,7 +1022,7 @@
           <w:noProof/>
         </w:rPr>
       </w:pPr>
-      <w:hyperlink w:anchor="_Toc241952878" w:history="1">
+      <w:hyperlink w:anchor="_Toc241953197" w:history="1">
         <w:r>
           <w:rPr>
             <w:rStyle w:val="af"/>
@@ -1050,7 +1050,7 @@
             <w:noProof/>
             <w:webHidden/>
           </w:rPr>
-          <w:instrText xml:space="preserve"> PAGEREF _Toc241952878 \h </w:instrText>
+          <w:instrText xml:space="preserve"> PAGEREF _Toc241953197 \h </w:instrText>
         </w:r>
         <w:r>
           <w:rPr>
@@ -1091,7 +1091,7 @@
           <w:noProof/>
         </w:rPr>
       </w:pPr>
-      <w:hyperlink w:anchor="_Toc241952879" w:history="1">
+      <w:hyperlink w:anchor="_Toc241953198" w:history="1">
         <w:r>
           <w:rPr>
             <w:rStyle w:val="af"/>
@@ -1119,7 +1119,7 @@
             <w:noProof/>
             <w:webHidden/>
           </w:rPr>
-          <w:instrText xml:space="preserve"> PAGEREF _Toc241952879 \h </w:instrText>
+          <w:instrText xml:space="preserve"> PAGEREF _Toc241953198 \h </w:instrText>
         </w:r>
         <w:r>
           <w:rPr>
@@ -1160,7 +1160,7 @@
           <w:noProof/>
         </w:rPr>
       </w:pPr>
-      <w:hyperlink w:anchor="_Toc241952880" w:history="1">
+      <w:hyperlink w:anchor="_Toc241953199" w:history="1">
         <w:r>
           <w:rPr>
             <w:rStyle w:val="af"/>
@@ -1188,7 +1188,7 @@
             <w:noProof/>
             <w:webHidden/>
           </w:rPr>
-          <w:instrText xml:space="preserve"> PAGEREF _Toc241952880 \h </w:instrText>
+          <w:instrText xml:space="preserve"> PAGEREF _Toc241953199 \h </w:instrText>
         </w:r>
         <w:r>
           <w:rPr>
@@ -1229,7 +1229,7 @@
           <w:noProof/>
         </w:rPr>
       </w:pPr>
-      <w:hyperlink w:anchor="_Toc241952881" w:history="1">
+      <w:hyperlink w:anchor="_Toc241953200" w:history="1">
         <w:r>
           <w:rPr>
             <w:rStyle w:val="af"/>
@@ -1257,7 +1257,7 @@
             <w:noProof/>
             <w:webHidden/>
           </w:rPr>
-          <w:instrText xml:space="preserve"> PAGEREF _Toc241952881 \h </w:instrText>
+          <w:instrText xml:space="preserve"> PAGEREF _Toc241953200 \h </w:instrText>
         </w:r>
         <w:r>
           <w:rPr>
@@ -1298,7 +1298,7 @@
           <w:noProof/>
         </w:rPr>
       </w:pPr>
-      <w:hyperlink w:anchor="_Toc241952882" w:history="1">
+      <w:hyperlink w:anchor="_Toc241953201" w:history="1">
         <w:r>
           <w:rPr>
             <w:rStyle w:val="af"/>
@@ -1326,7 +1326,7 @@
             <w:noProof/>
             <w:webHidden/>
           </w:rPr>
-          <w:instrText xml:space="preserve"> PAGEREF _Toc241952882 \h </w:instrText>
+          <w:instrText xml:space="preserve"> PAGEREF _Toc241953201 \h </w:instrText>
         </w:r>
         <w:r>
           <w:rPr>
@@ -1367,7 +1367,7 @@
           <w:noProof/>
         </w:rPr>
       </w:pPr>
-      <w:hyperlink w:anchor="_Toc241952883" w:history="1">
+      <w:hyperlink w:anchor="_Toc241953202" w:history="1">
         <w:r>
           <w:rPr>
             <w:rStyle w:val="af"/>
@@ -1395,7 +1395,7 @@
             <w:noProof/>
             <w:webHidden/>
           </w:rPr>
-          <w:instrText xml:space="preserve"> PAGEREF _Toc241952883 \h </w:instrText>
+          <w:instrText xml:space="preserve"> PAGEREF _Toc241953202 \h </w:instrText>
         </w:r>
         <w:r>
           <w:rPr>
@@ -1436,7 +1436,7 @@
           <w:noProof/>
         </w:rPr>
       </w:pPr>
-      <w:hyperlink w:anchor="_Toc241952884" w:history="1">
+      <w:hyperlink w:anchor="_Toc241953203" w:history="1">
         <w:r>
           <w:rPr>
             <w:rStyle w:val="af"/>
@@ -1464,7 +1464,7 @@
             <w:noProof/>
             <w:webHidden/>
           </w:rPr>
-          <w:instrText xml:space="preserve"> PAGEREF _Toc241952884 \h </w:instrText>
+          <w:instrText xml:space="preserve"> PAGEREF _Toc241953203 \h </w:instrText>
         </w:r>
         <w:r>
           <w:rPr>
@@ -1505,7 +1505,7 @@
           <w:noProof/>
         </w:rPr>
       </w:pPr>
-      <w:hyperlink w:anchor="_Toc241952885" w:history="1">
+      <w:hyperlink w:anchor="_Toc241953204" w:history="1">
         <w:r>
           <w:rPr>
             <w:rStyle w:val="af"/>
@@ -1533,7 +1533,7 @@
             <w:noProof/>
             <w:webHidden/>
           </w:rPr>
-          <w:instrText xml:space="preserve"> PAGEREF _Toc241952885 \h </w:instrText>
+          <w:instrText xml:space="preserve"> PAGEREF _Toc241953204 \h </w:instrText>
         </w:r>
         <w:r>
           <w:rPr>
@@ -1579,7 +1579,7 @@
         <w:spacing w:before="0" w:after="360" w:line="360" w:lineRule="exact"/>
         <w:ind w:firstLine="709"/>
       </w:pPr>
-      <w:bookmarkStart w:id="1" w:name="_Toc241952867"/>
+      <w:bookmarkStart w:id="1" w:name="_Toc241953186"/>
       <w:r>
         <w:rPr>
           <w:b/>
@@ -1684,7 +1684,7 @@
         <w:ind w:firstLine="709"/>
       </w:pPr>
       <w:bookmarkStart w:id="2" w:name="_b608aa976fc82a0faaf3b83f58c735968afd03b"/>
-      <w:bookmarkStart w:id="3" w:name="_Toc241952868"/>
+      <w:bookmarkStart w:id="3" w:name="_Toc241953187"/>
       <w:bookmarkEnd w:id="0"/>
       <w:r>
         <w:rPr>
@@ -1750,7 +1750,7 @@
         <w:ind w:firstLine="709"/>
       </w:pPr>
       <w:bookmarkStart w:id="4" w:name="_ce8c8db2bd1f021f701413a98bce88b0dc0ff35"/>
-      <w:bookmarkStart w:id="5" w:name="_Toc241952869"/>
+      <w:bookmarkStart w:id="5" w:name="_Toc241953188"/>
       <w:r>
         <w:rPr>
           <w:b/>
@@ -3792,7 +3792,7 @@
         <w:ind w:firstLine="709"/>
       </w:pPr>
       <w:bookmarkStart w:id="6" w:name="_d6b1e0606ccffbfea524c7b8890d7424ae6ef8d"/>
-      <w:bookmarkStart w:id="7" w:name="_Toc241952870"/>
+      <w:bookmarkStart w:id="7" w:name="_Toc241953189"/>
       <w:bookmarkEnd w:id="4"/>
       <w:r>
         <w:rPr>
@@ -8504,7 +8504,7 @@
         <w:ind w:firstLine="709"/>
       </w:pPr>
       <w:bookmarkStart w:id="8" w:name="_7b60cb03201c02c98ad01f5cee41d479977e884"/>
-      <w:bookmarkStart w:id="9" w:name="_Toc241952871"/>
+      <w:bookmarkStart w:id="9" w:name="_Toc241953190"/>
       <w:bookmarkEnd w:id="6"/>
       <w:r>
         <w:rPr>
@@ -8575,7 +8575,7 @@
           <w:sz w:val="28"/>
         </w:rPr>
         <w:drawing>
-          <wp:inline distT="0" distB="0" distL="0" distR="0" wp14:anchorId="65B1C92C" wp14:editId="707F8BCD">
+          <wp:inline distT="0" distB="0" distL="0" distR="0" wp14:anchorId="1B0131D8" wp14:editId="17E1F6A0">
             <wp:extent cx="5334000" cy="3382536"/>
             <wp:effectExtent l="0" t="0" r="0" b="0"/>
             <wp:docPr id="13" name="Picture"/>
@@ -10890,7 +10890,7 @@
         <w:ind w:firstLine="709"/>
       </w:pPr>
       <w:bookmarkStart w:id="10" w:name="_519d46f9ff7923648cbfef21e26057944381813"/>
-      <w:bookmarkStart w:id="11" w:name="_Toc241952872"/>
+      <w:bookmarkStart w:id="11" w:name="_Toc241953191"/>
       <w:bookmarkEnd w:id="8"/>
       <w:r>
         <w:rPr>
@@ -15724,7 +15724,7 @@
           <w:sz w:val="28"/>
         </w:rPr>
         <w:drawing>
-          <wp:inline distT="0" distB="0" distL="0" distR="0" wp14:anchorId="68232A1C" wp14:editId="28137114">
+          <wp:inline distT="0" distB="0" distL="0" distR="0" wp14:anchorId="52BF12B8" wp14:editId="073DF856">
             <wp:extent cx="5334000" cy="3122341"/>
             <wp:effectExtent l="0" t="0" r="0" b="0"/>
             <wp:docPr id="17" name="Picture"/>
@@ -16703,7 +16703,7 @@
         <w:ind w:firstLine="709"/>
       </w:pPr>
       <w:bookmarkStart w:id="12" w:name="_ccc7c944b68a9100d34a943bc02da4feb181aee"/>
-      <w:bookmarkStart w:id="13" w:name="_Toc241952873"/>
+      <w:bookmarkStart w:id="13" w:name="_Toc241953192"/>
       <w:bookmarkEnd w:id="10"/>
       <w:r>
         <w:rPr>
@@ -19812,7 +19812,7 @@
         </w:rPr>
         <w:lastRenderedPageBreak/>
         <w:drawing>
-          <wp:inline distT="0" distB="0" distL="0" distR="0" wp14:anchorId="0CE5DE3E" wp14:editId="698B990F">
+          <wp:inline distT="0" distB="0" distL="0" distR="0" wp14:anchorId="6F6CA666" wp14:editId="363888DF">
             <wp:extent cx="5334000" cy="6114585"/>
             <wp:effectExtent l="0" t="0" r="0" b="0"/>
             <wp:docPr id="21" name="Picture"/>
@@ -20049,7 +20049,7 @@
         </w:rPr>
         <w:lastRenderedPageBreak/>
         <w:drawing>
-          <wp:inline distT="0" distB="0" distL="0" distR="0" wp14:anchorId="2B7BB88E" wp14:editId="4463ECD6">
+          <wp:inline distT="0" distB="0" distL="0" distR="0" wp14:anchorId="31E7A98E" wp14:editId="1F607E8F">
             <wp:extent cx="5334000" cy="9610810"/>
             <wp:effectExtent l="0" t="0" r="0" b="0"/>
             <wp:docPr id="24" name="Picture"/>
@@ -20289,7 +20289,7 @@
         </w:rPr>
         <w:lastRenderedPageBreak/>
         <w:drawing>
-          <wp:inline distT="0" distB="0" distL="0" distR="0" wp14:anchorId="4881B1FF" wp14:editId="32965ED3">
+          <wp:inline distT="0" distB="0" distL="0" distR="0" wp14:anchorId="53E402D9" wp14:editId="6D4E22EF">
             <wp:extent cx="5334000" cy="12458978"/>
             <wp:effectExtent l="0" t="0" r="0" b="0"/>
             <wp:docPr id="27" name="Picture"/>
@@ -20502,7 +20502,7 @@
           <w:sz w:val="28"/>
         </w:rPr>
         <w:drawing>
-          <wp:inline distT="0" distB="0" distL="0" distR="0" wp14:anchorId="4DC0A0AA" wp14:editId="71E075B1">
+          <wp:inline distT="0" distB="0" distL="0" distR="0" wp14:anchorId="699F1E70" wp14:editId="185F9305">
             <wp:extent cx="5334000" cy="5926666"/>
             <wp:effectExtent l="0" t="0" r="0" b="0"/>
             <wp:docPr id="30" name="Picture"/>
@@ -20761,7 +20761,7 @@
           <w:sz w:val="28"/>
         </w:rPr>
         <w:drawing>
-          <wp:inline distT="0" distB="0" distL="0" distR="0" wp14:anchorId="4B1002A2" wp14:editId="4041DA17">
+          <wp:inline distT="0" distB="0" distL="0" distR="0" wp14:anchorId="2597E29C" wp14:editId="4EDD5290">
             <wp:extent cx="5334000" cy="3343751"/>
             <wp:effectExtent l="0" t="0" r="0" b="0"/>
             <wp:docPr id="33" name="Picture"/>
@@ -22316,7 +22316,7 @@
         </w:rPr>
         <w:lastRenderedPageBreak/>
         <w:drawing>
-          <wp:inline distT="0" distB="0" distL="0" distR="0" wp14:anchorId="39588B02" wp14:editId="14D99FB9">
+          <wp:inline distT="0" distB="0" distL="0" distR="0" wp14:anchorId="1BB53AA0" wp14:editId="1296DD93">
             <wp:extent cx="5334000" cy="5785249"/>
             <wp:effectExtent l="0" t="0" r="0" b="0"/>
             <wp:docPr id="37" name="Picture"/>
@@ -22575,7 +22575,7 @@
         </w:rPr>
         <w:lastRenderedPageBreak/>
         <w:drawing>
-          <wp:inline distT="0" distB="0" distL="0" distR="0" wp14:anchorId="7BD1476F" wp14:editId="26AE5540">
+          <wp:inline distT="0" distB="0" distL="0" distR="0" wp14:anchorId="40BF14E3" wp14:editId="7D91230D">
             <wp:extent cx="5334000" cy="3040380"/>
             <wp:effectExtent l="0" t="0" r="0" b="0"/>
             <wp:docPr id="40" name="Picture"/>
@@ -22735,7 +22735,7 @@
           <w:sz w:val="28"/>
         </w:rPr>
         <w:drawing>
-          <wp:inline distT="0" distB="0" distL="0" distR="0" wp14:anchorId="09094FB2" wp14:editId="4543122A">
+          <wp:inline distT="0" distB="0" distL="0" distR="0" wp14:anchorId="43FA9AB7" wp14:editId="000E3507">
             <wp:extent cx="5334000" cy="3081866"/>
             <wp:effectExtent l="0" t="0" r="0" b="0"/>
             <wp:docPr id="43" name="Picture"/>
@@ -22890,7 +22890,7 @@
         </w:rPr>
         <w:lastRenderedPageBreak/>
         <w:drawing>
-          <wp:inline distT="0" distB="0" distL="0" distR="0" wp14:anchorId="391CBF6F" wp14:editId="1EE8C790">
+          <wp:inline distT="0" distB="0" distL="0" distR="0" wp14:anchorId="3C14F927" wp14:editId="0BA71C13">
             <wp:extent cx="5334000" cy="2592916"/>
             <wp:effectExtent l="0" t="0" r="0" b="0"/>
             <wp:docPr id="46" name="Picture"/>
@@ -23037,7 +23037,7 @@
           <w:sz w:val="28"/>
         </w:rPr>
         <w:drawing>
-          <wp:inline distT="0" distB="0" distL="0" distR="0" wp14:anchorId="633CA8AA" wp14:editId="291F7B4B">
+          <wp:inline distT="0" distB="0" distL="0" distR="0" wp14:anchorId="24ECA9EB" wp14:editId="263F6BDF">
             <wp:extent cx="5334000" cy="2332014"/>
             <wp:effectExtent l="0" t="0" r="0" b="0"/>
             <wp:docPr id="49" name="Picture"/>
@@ -23166,7 +23166,7 @@
         </w:rPr>
         <w:lastRenderedPageBreak/>
         <w:drawing>
-          <wp:inline distT="0" distB="0" distL="0" distR="0" wp14:anchorId="37C9B78D" wp14:editId="509364C1">
+          <wp:inline distT="0" distB="0" distL="0" distR="0" wp14:anchorId="6A1A1922" wp14:editId="0643265D">
             <wp:extent cx="5334000" cy="2691467"/>
             <wp:effectExtent l="0" t="0" r="0" b="0"/>
             <wp:docPr id="52" name="Picture"/>
@@ -23320,7 +23320,7 @@
           <w:sz w:val="28"/>
         </w:rPr>
         <w:drawing>
-          <wp:inline distT="0" distB="0" distL="0" distR="0" wp14:anchorId="418D135C" wp14:editId="5C2C82B1">
+          <wp:inline distT="0" distB="0" distL="0" distR="0" wp14:anchorId="59237EAC" wp14:editId="41BF71DD">
             <wp:extent cx="5334000" cy="2737379"/>
             <wp:effectExtent l="0" t="0" r="0" b="0"/>
             <wp:docPr id="55" name="Picture"/>
@@ -23488,8 +23488,8 @@
         </w:rPr>
         <w:lastRenderedPageBreak/>
         <w:drawing>
-          <wp:inline distT="0" distB="0" distL="0" distR="0" wp14:anchorId="329EAB13" wp14:editId="0C15CB87">
-            <wp:extent cx="5334000" cy="4152012"/>
+          <wp:inline distT="0" distB="0" distL="0" distR="0" wp14:anchorId="687FFBE8" wp14:editId="10EFDE35">
+            <wp:extent cx="5334000" cy="4149208"/>
             <wp:effectExtent l="0" t="0" r="0" b="0"/>
             <wp:docPr id="58" name="Picture"/>
             <wp:cNvGraphicFramePr/>
@@ -23511,7 +23511,7 @@
                   <pic:spPr bwMode="auto">
                     <a:xfrm>
                       <a:off x="0" y="0"/>
-                      <a:ext cx="5334000" cy="4152012"/>
+                      <a:ext cx="5334000" cy="4149208"/>
                     </a:xfrm>
                     <a:prstGeom prst="rect">
                       <a:avLst/>
@@ -23586,26 +23586,52 @@
         <w:rPr>
           <w:sz w:val="28"/>
         </w:rPr>
-        <w:t xml:space="preserve">, размещение в ЕС). Строка о корпоративных сертификатах на макете иллюстративна: по ПЗ1 </w:t>
+        <w:t xml:space="preserve">, размещение в ЕС, проверки </w:t>
       </w:r>
       <w:r>
         <w:rPr>
           <w:i/>
           <w:sz w:val="28"/>
         </w:rPr>
+        <w:t>OWASP</w:t>
+      </w:r>
+      <w:r>
+        <w:rPr>
+          <w:sz w:val="28"/>
+        </w:rPr>
+        <w:t xml:space="preserve"> </w:t>
+      </w:r>
+      <w:r>
+        <w:rPr>
+          <w:i/>
+          <w:sz w:val="28"/>
+        </w:rPr>
+        <w:t>Top</w:t>
+      </w:r>
+      <w:r>
+        <w:rPr>
+          <w:sz w:val="28"/>
+        </w:rPr>
+        <w:t xml:space="preserve"> 10) с пометкой, что корпоративные сертификаты вроде </w:t>
+      </w:r>
+      <w:r>
+        <w:rPr>
+          <w:i/>
+          <w:sz w:val="28"/>
+        </w:rPr>
         <w:t>SOC</w:t>
       </w:r>
       <w:r>
         <w:rPr>
           <w:sz w:val="28"/>
         </w:rPr>
-        <w:t xml:space="preserve"> 2 в проект не входит. Страница закрывает барьер доверия, выявл</w:t>
-      </w:r>
-      <w:r>
-        <w:rPr>
-          <w:sz w:val="28"/>
-        </w:rPr>
-        <w:t xml:space="preserve">енный в ЛР5 и риском </w:t>
+        <w:t xml:space="preserve"> 2 не входят в первые версии, как предусмотрено ПЗ1. Страница</w:t>
+      </w:r>
+      <w:r>
+        <w:rPr>
+          <w:sz w:val="28"/>
+        </w:rPr>
+        <w:t xml:space="preserve"> закрывает барьер доверия, выявленный в ЛР5 и риском </w:t>
       </w:r>
       <w:r>
         <w:rPr>
@@ -23628,7 +23654,7 @@
         <w:ind w:firstLine="709"/>
       </w:pPr>
       <w:bookmarkStart w:id="16" w:name="_fc51781abcc4857bf621eab6b8861ea54729fed"/>
-      <w:bookmarkStart w:id="17" w:name="_Toc241952874"/>
+      <w:bookmarkStart w:id="17" w:name="_Toc241953193"/>
       <w:bookmarkEnd w:id="15"/>
       <w:bookmarkEnd w:id="12"/>
       <w:r>
@@ -23651,13 +23677,13 @@
         <w:rPr>
           <w:sz w:val="28"/>
         </w:rPr>
-        <w:t xml:space="preserve">Методика [5] оценивает 24 единицы разработки по десяти показателям и относит их к первому релизу, следующим релизам или к гипотезам. Единица попадает в первый релиз, если она связана с </w:t>
-      </w:r>
-      <w:r>
-        <w:rPr>
-          <w:sz w:val="28"/>
-        </w:rPr>
-        <w:t>ценностным предложением, доходом, доказательна и ее потеря критична, либо если балл первого релиза не ниже 3,7.</w:t>
+        <w:t>Методика [5] оценивает 24 единицы разработки по десяти показателям и относит их к первому релизу, следующим релизам или к гипотезам. Единица попадает в п</w:t>
+      </w:r>
+      <w:r>
+        <w:rPr>
+          <w:sz w:val="28"/>
+        </w:rPr>
+        <w:t>ервый релиз, если она связана с ценностным предложением, доходом, доказательна и ее потеря критична, либо если балл первого релиза не ниже 3,7.</w:t>
       </w:r>
     </w:p>
     <w:p>
@@ -23684,7 +23710,13 @@
         <w:rPr>
           <w:sz w:val="28"/>
         </w:rPr>
-        <w:t>Таблица 18 – Состав релизов по единицам разработки</w:t>
+        <w:t>Таблица 18 – Состав релизов по единицам разраб</w:t>
+      </w:r>
+      <w:r>
+        <w:rPr>
+          <w:sz w:val="28"/>
+        </w:rPr>
+        <w:t>отки</w:t>
       </w:r>
     </w:p>
     <w:tbl>
@@ -23840,7 +23872,6 @@
                 <w:i/>
                 <w:sz w:val="24"/>
               </w:rPr>
-              <w:lastRenderedPageBreak/>
               <w:t>U-001</w:t>
             </w:r>
           </w:p>
@@ -23943,6 +23974,7 @@
                 <w:i/>
                 <w:sz w:val="24"/>
               </w:rPr>
+              <w:lastRenderedPageBreak/>
               <w:t>U-002</w:t>
             </w:r>
           </w:p>
@@ -26400,7 +26432,6 @@
           <w:i/>
           <w:sz w:val="28"/>
         </w:rPr>
-        <w:lastRenderedPageBreak/>
         <w:t>Team</w:t>
       </w:r>
       <w:r>
@@ -26447,6 +26478,7 @@
         <w:rPr>
           <w:sz w:val="28"/>
         </w:rPr>
+        <w:lastRenderedPageBreak/>
         <w:t>Таблица 19 – Дорожная карта релизов</w:t>
       </w:r>
     </w:p>
@@ -27028,7 +27060,7 @@
           <w:sz w:val="28"/>
         </w:rPr>
         <w:drawing>
-          <wp:inline distT="0" distB="0" distL="0" distR="0" wp14:anchorId="3B2DA26E" wp14:editId="60BD2C20">
+          <wp:inline distT="0" distB="0" distL="0" distR="0" wp14:anchorId="5D2C5272" wp14:editId="0863CC4A">
             <wp:extent cx="5334000" cy="2341756"/>
             <wp:effectExtent l="0" t="0" r="0" b="0"/>
             <wp:docPr id="63" name="Picture"/>
@@ -27712,7 +27744,6 @@
                 <w:i/>
                 <w:sz w:val="24"/>
               </w:rPr>
-              <w:lastRenderedPageBreak/>
               <w:t>R-006</w:t>
             </w:r>
           </w:p>
@@ -27883,6 +27914,7 @@
         <w:rPr>
           <w:sz w:val="28"/>
         </w:rPr>
+        <w:lastRenderedPageBreak/>
         <w:t xml:space="preserve">Наибольшие индексы у риска недостижения цели по платящим (16) и точности находок (15). Они требуют ранней проверки: измерения конверсий уже на </w:t>
       </w:r>
       <w:r>
@@ -27932,7 +27964,7 @@
         <w:ind w:firstLine="709"/>
       </w:pPr>
       <w:bookmarkStart w:id="18" w:name="_fb011a212b736610690ebb69f4e92f01bd3b3f9"/>
-      <w:bookmarkStart w:id="19" w:name="_Toc241952875"/>
+      <w:bookmarkStart w:id="19" w:name="_Toc241953194"/>
       <w:bookmarkEnd w:id="16"/>
       <w:r>
         <w:rPr>
@@ -28840,7 +28872,7 @@
         <w:ind w:firstLine="709"/>
       </w:pPr>
       <w:bookmarkStart w:id="20" w:name="_339ae803435bd6b9a653c2b18dadc62dc9ad8e7"/>
-      <w:bookmarkStart w:id="21" w:name="_Toc241952876"/>
+      <w:bookmarkStart w:id="21" w:name="_Toc241953195"/>
       <w:bookmarkEnd w:id="18"/>
       <w:r>
         <w:rPr>
@@ -28927,27 +28959,33 @@
         <w:rPr>
           <w:sz w:val="28"/>
         </w:rPr>
+        <w:t>Ограничения: оценки 1-5 и 1-4 в книгах выставлены аналитиком по страницам и результатам прежних работ (Д-26), опрос пользователей не проводился (используются</w:t>
+      </w:r>
+      <w:r>
+        <w:rPr>
+          <w:sz w:val="28"/>
+        </w:rPr>
+        <w:t xml:space="preserve"> модельные данные), прототип в </w:t>
+      </w:r>
+      <w:r>
+        <w:rPr>
+          <w:i/>
+          <w:sz w:val="28"/>
+        </w:rPr>
+        <w:t>Figma</w:t>
+      </w:r>
+      <w:r>
+        <w:rPr>
+          <w:sz w:val="28"/>
+        </w:rPr>
+        <w:t xml:space="preserve"> использует демонстрационные данные, бизнес-логика проверена на формальную </w:t>
+      </w:r>
+      <w:r>
+        <w:rPr>
+          <w:sz w:val="28"/>
+        </w:rPr>
         <w:lastRenderedPageBreak/>
-        <w:t>Ограничения: оценки 1-5 и 1-4 в книгах выставлены аналитиком по страницам и результатам прежних работ (Д-26), опрос пользователей не проводился (используются</w:t>
-      </w:r>
-      <w:r>
-        <w:rPr>
-          <w:sz w:val="28"/>
-        </w:rPr>
-        <w:t xml:space="preserve"> модельные данные), прототип в </w:t>
-      </w:r>
-      <w:r>
-        <w:rPr>
-          <w:i/>
-          <w:sz w:val="28"/>
-        </w:rPr>
-        <w:t>Figma</w:t>
-      </w:r>
-      <w:r>
-        <w:rPr>
-          <w:sz w:val="28"/>
-        </w:rPr>
-        <w:t xml:space="preserve"> использует демонстрационные данные, бизнес-логика проверена на формальную связность, но не на реальных пользователях. Эти пункты перечислены в приложении Б.</w:t>
+        <w:t>связность, но не на реальных пользователях. Эти пункты перечислены в приложении Б.</w:t>
       </w:r>
     </w:p>
     <w:p>
@@ -28958,7 +28996,7 @@
         <w:ind w:firstLine="709"/>
       </w:pPr>
       <w:bookmarkStart w:id="22" w:name="_1bfdad9d2d88ddb6ca16c31c1d4d4943679f32f"/>
-      <w:bookmarkStart w:id="23" w:name="_Toc241952877"/>
+      <w:bookmarkStart w:id="23" w:name="_Toc241953196"/>
       <w:bookmarkEnd w:id="20"/>
       <w:bookmarkEnd w:id="2"/>
       <w:r>
@@ -29188,7 +29226,7 @@
         <w:jc w:val="center"/>
       </w:pPr>
       <w:bookmarkStart w:id="24" w:name="_выводы"/>
-      <w:bookmarkStart w:id="25" w:name="_Toc241952878"/>
+      <w:bookmarkStart w:id="25" w:name="_Toc241953197"/>
       <w:bookmarkEnd w:id="22"/>
       <w:r>
         <w:rPr>
@@ -29385,7 +29423,7 @@
         <w:jc w:val="center"/>
       </w:pPr>
       <w:bookmarkStart w:id="26" w:name="_274f6a444530ef90b0479dabf3d210f01e97699"/>
-      <w:bookmarkStart w:id="27" w:name="_Toc241952879"/>
+      <w:bookmarkStart w:id="27" w:name="_Toc241953198"/>
       <w:bookmarkEnd w:id="24"/>
       <w:r>
         <w:rPr>
@@ -30428,7 +30466,7 @@
         <w:jc w:val="center"/>
       </w:pPr>
       <w:bookmarkStart w:id="28" w:name="_3d74faf1500c1b2a4a8bfa8e0e37c74206ce73d"/>
-      <w:bookmarkStart w:id="29" w:name="_Toc241952880"/>
+      <w:bookmarkStart w:id="29" w:name="_Toc241953199"/>
       <w:bookmarkEnd w:id="26"/>
       <w:r>
         <w:rPr>
@@ -31241,7 +31279,7 @@
         <w:jc w:val="center"/>
       </w:pPr>
       <w:bookmarkStart w:id="30" w:name="_25083b51e17d9d99817d1269b6af13d75b604a4"/>
-      <w:bookmarkStart w:id="31" w:name="_Toc241952881"/>
+      <w:bookmarkStart w:id="31" w:name="_Toc241953200"/>
       <w:bookmarkEnd w:id="28"/>
       <w:r>
         <w:rPr>
@@ -32092,7 +32130,7 @@
         <w:jc w:val="center"/>
       </w:pPr>
       <w:bookmarkStart w:id="32" w:name="_6574ce6d3bdcb7786930e8390195aee2be99a58"/>
-      <w:bookmarkStart w:id="33" w:name="_Toc241952882"/>
+      <w:bookmarkStart w:id="33" w:name="_Toc241953201"/>
       <w:bookmarkEnd w:id="30"/>
       <w:r>
         <w:rPr>
@@ -32504,7 +32542,7 @@
         <w:jc w:val="center"/>
       </w:pPr>
       <w:bookmarkStart w:id="34" w:name="_9415338eb7aade5a81d9d1583f95cf4a5b310ea"/>
-      <w:bookmarkStart w:id="35" w:name="_Toc241952883"/>
+      <w:bookmarkStart w:id="35" w:name="_Toc241953202"/>
       <w:bookmarkEnd w:id="32"/>
       <w:r>
         <w:rPr>
@@ -34415,7 +34453,7 @@
         <w:jc w:val="center"/>
       </w:pPr>
       <w:bookmarkStart w:id="36" w:name="_21cff5e6573cc685eba2e5d01fbe1912356e1d7"/>
-      <w:bookmarkStart w:id="37" w:name="_Toc241952884"/>
+      <w:bookmarkStart w:id="37" w:name="_Toc241953203"/>
       <w:bookmarkEnd w:id="34"/>
       <w:r>
         <w:rPr>
@@ -34532,7 +34570,7 @@
           <w:sz w:val="28"/>
         </w:rPr>
         <w:drawing>
-          <wp:inline distT="0" distB="0" distL="0" distR="0" wp14:anchorId="5452C37B" wp14:editId="06222931">
+          <wp:inline distT="0" distB="0" distL="0" distR="0" wp14:anchorId="77A0E36F" wp14:editId="72420E22">
             <wp:extent cx="5334000" cy="2375958"/>
             <wp:effectExtent l="0" t="0" r="0" b="0"/>
             <wp:docPr id="77" name="Picture"/>
@@ -34725,7 +34763,7 @@
           <w:sz w:val="28"/>
         </w:rPr>
         <w:drawing>
-          <wp:inline distT="0" distB="0" distL="0" distR="0" wp14:anchorId="6792F8AB" wp14:editId="0C5A96FC">
+          <wp:inline distT="0" distB="0" distL="0" distR="0" wp14:anchorId="6B253572" wp14:editId="0D804370">
             <wp:extent cx="5334000" cy="2375958"/>
             <wp:effectExtent l="0" t="0" r="0" b="0"/>
             <wp:docPr id="80" name="Picture"/>
@@ -34900,7 +34938,7 @@
         </w:rPr>
         <w:lastRenderedPageBreak/>
         <w:drawing>
-          <wp:inline distT="0" distB="0" distL="0" distR="0" wp14:anchorId="0A5EF361" wp14:editId="77AB7BB2">
+          <wp:inline distT="0" distB="0" distL="0" distR="0" wp14:anchorId="0CA7DE42" wp14:editId="1F0630CB">
             <wp:extent cx="5334000" cy="2375958"/>
             <wp:effectExtent l="0" t="0" r="0" b="0"/>
             <wp:docPr id="83" name="Picture"/>
@@ -35132,7 +35170,7 @@
           <w:sz w:val="28"/>
         </w:rPr>
         <w:drawing>
-          <wp:inline distT="0" distB="0" distL="0" distR="0" wp14:anchorId="08B542FE" wp14:editId="2CD7D055">
+          <wp:inline distT="0" distB="0" distL="0" distR="0" wp14:anchorId="4B8A92AB" wp14:editId="1E29896F">
             <wp:extent cx="5334000" cy="2375958"/>
             <wp:effectExtent l="0" t="0" r="0" b="0"/>
             <wp:docPr id="86" name="Picture"/>
@@ -35307,7 +35345,7 @@
         </w:rPr>
         <w:lastRenderedPageBreak/>
         <w:drawing>
-          <wp:inline distT="0" distB="0" distL="0" distR="0" wp14:anchorId="6E602059" wp14:editId="78C5DD81">
+          <wp:inline distT="0" distB="0" distL="0" distR="0" wp14:anchorId="3A8A1C99" wp14:editId="5F77F90A">
             <wp:extent cx="5334000" cy="2375958"/>
             <wp:effectExtent l="0" t="0" r="0" b="0"/>
             <wp:docPr id="89" name="Picture"/>
@@ -35500,7 +35538,7 @@
           <w:sz w:val="28"/>
         </w:rPr>
         <w:drawing>
-          <wp:inline distT="0" distB="0" distL="0" distR="0" wp14:anchorId="59CFA2B6" wp14:editId="0DA1FBE8">
+          <wp:inline distT="0" distB="0" distL="0" distR="0" wp14:anchorId="1899DE36" wp14:editId="61EE6E78">
             <wp:extent cx="5334000" cy="2375958"/>
             <wp:effectExtent l="0" t="0" r="0" b="0"/>
             <wp:docPr id="92" name="Picture"/>
@@ -35733,7 +35771,7 @@
         </w:rPr>
         <w:lastRenderedPageBreak/>
         <w:drawing>
-          <wp:inline distT="0" distB="0" distL="0" distR="0" wp14:anchorId="1A49BA51" wp14:editId="197D7066">
+          <wp:inline distT="0" distB="0" distL="0" distR="0" wp14:anchorId="1310DBEC" wp14:editId="08D1968C">
             <wp:extent cx="5334000" cy="2375958"/>
             <wp:effectExtent l="0" t="0" r="0" b="0"/>
             <wp:docPr id="95" name="Picture"/>
@@ -35906,7 +35944,7 @@
           <w:sz w:val="28"/>
         </w:rPr>
         <w:drawing>
-          <wp:inline distT="0" distB="0" distL="0" distR="0" wp14:anchorId="7C4DAAA7" wp14:editId="4A98D250">
+          <wp:inline distT="0" distB="0" distL="0" distR="0" wp14:anchorId="6B8939F8" wp14:editId="0A81D961">
             <wp:extent cx="5334000" cy="2375958"/>
             <wp:effectExtent l="0" t="0" r="0" b="0"/>
             <wp:docPr id="98" name="Picture"/>
@@ -36062,7 +36100,7 @@
         <w:jc w:val="center"/>
       </w:pPr>
       <w:bookmarkStart w:id="38" w:name="_e580caf5f2a0052cd60a87b42295a622f26cf83"/>
-      <w:bookmarkStart w:id="39" w:name="_Toc241952885"/>
+      <w:bookmarkStart w:id="39" w:name="_Toc241953204"/>
       <w:bookmarkEnd w:id="36"/>
       <w:r>
         <w:rPr>
@@ -37531,7 +37569,7 @@
   <w:abstractNum w:abstractNumId="0" w15:restartNumberingAfterBreak="0">
     <w:nsid w:val="0000A990"/>
     <w:multiLevelType w:val="multilevel"/>
-    <w:tmpl w:val="9F7AA7DA"/>
+    <w:tmpl w:val="97E49A9C"/>
     <w:lvl w:ilvl="0">
       <w:numFmt w:val="bullet"/>
       <w:lvlText w:val=" "/>
@@ -37608,7 +37646,7 @@
   <w:abstractNum w:abstractNumId="1" w15:restartNumberingAfterBreak="0">
     <w:nsid w:val="00A99411"/>
     <w:multiLevelType w:val="multilevel"/>
-    <w:tmpl w:val="D3EA4C40"/>
+    <w:tmpl w:val="D8A4C64E"/>
     <w:lvl w:ilvl="0">
       <w:start w:val="1"/>
       <w:numFmt w:val="decimal"/>
@@ -39086,7 +39124,7 @@
     <w:autoRedefine/>
     <w:uiPriority w:val="39"/>
     <w:unhideWhenUsed/>
-    <w:rsid w:val="00755F7E"/>
+    <w:rsid w:val="006D46F1"/>
     <w:pPr>
       <w:spacing w:after="100"/>
     </w:pPr>
@@ -39098,7 +39136,7 @@
     <w:autoRedefine/>
     <w:uiPriority w:val="39"/>
     <w:unhideWhenUsed/>
-    <w:rsid w:val="00755F7E"/>
+    <w:rsid w:val="006D46F1"/>
     <w:pPr>
       <w:spacing w:after="100"/>
       <w:ind w:left="240"/>

</xml_diff>

<commit_message>
reports: expand to 253 pages with real-data sections, registers, cards, journals; fix LR4 leaders wording; glossary and conclusion tables
</commit_message>
<xml_diff>
--- a/ЛР6_ЦП_Канвас_сценарии_релизы/ОТЧЕТ_ЛР6_TableMind.docx
+++ b/ЛР6_ЦП_Канвас_сценарии_релизы/ОТЧЕТ_ЛР6_TableMind.docx
@@ -263,7 +263,7 @@
       <w:r>
         <w:fldChar w:fldCharType="separate"/>
       </w:r>
-      <w:hyperlink w:anchor="_Toc241953186" w:history="1">
+      <w:hyperlink w:anchor="_Toc242012093" w:history="1">
         <w:r>
           <w:rPr>
             <w:rStyle w:val="af"/>
@@ -291,7 +291,7 @@
             <w:noProof/>
             <w:webHidden/>
           </w:rPr>
-          <w:instrText xml:space="preserve"> PAGEREF _Toc241953186 \h </w:instrText>
+          <w:instrText xml:space="preserve"> PAGEREF _Toc242012093 \h </w:instrText>
         </w:r>
         <w:r>
           <w:rPr>
@@ -332,7 +332,7 @@
           <w:noProof/>
         </w:rPr>
       </w:pPr>
-      <w:hyperlink w:anchor="_Toc241953187" w:history="1">
+      <w:hyperlink w:anchor="_Toc242012094" w:history="1">
         <w:r>
           <w:rPr>
             <w:rStyle w:val="af"/>
@@ -360,7 +360,7 @@
             <w:noProof/>
             <w:webHidden/>
           </w:rPr>
-          <w:instrText xml:space="preserve"> PAGEREF _Toc241953187 \h </w:instrText>
+          <w:instrText xml:space="preserve"> PAGEREF _Toc242012094 \h </w:instrText>
         </w:r>
         <w:r>
           <w:rPr>
@@ -401,7 +401,7 @@
           <w:noProof/>
         </w:rPr>
       </w:pPr>
-      <w:hyperlink w:anchor="_Toc241953188" w:history="1">
+      <w:hyperlink w:anchor="_Toc242012095" w:history="1">
         <w:r>
           <w:rPr>
             <w:rStyle w:val="af"/>
@@ -429,7 +429,7 @@
             <w:noProof/>
             <w:webHidden/>
           </w:rPr>
-          <w:instrText xml:space="preserve"> PAGEREF _Toc241953188 \h </w:instrText>
+          <w:instrText xml:space="preserve"> PAGEREF _Toc242012095 \h </w:instrText>
         </w:r>
         <w:r>
           <w:rPr>
@@ -470,7 +470,7 @@
           <w:noProof/>
         </w:rPr>
       </w:pPr>
-      <w:hyperlink w:anchor="_Toc241953189" w:history="1">
+      <w:hyperlink w:anchor="_Toc242012096" w:history="1">
         <w:r>
           <w:rPr>
             <w:rStyle w:val="af"/>
@@ -498,7 +498,7 @@
             <w:noProof/>
             <w:webHidden/>
           </w:rPr>
-          <w:instrText xml:space="preserve"> PAGEREF _Toc241953189 \h </w:instrText>
+          <w:instrText xml:space="preserve"> PAGEREF _Toc242012096 \h </w:instrText>
         </w:r>
         <w:r>
           <w:rPr>
@@ -539,7 +539,7 @@
           <w:noProof/>
         </w:rPr>
       </w:pPr>
-      <w:hyperlink w:anchor="_Toc241953190" w:history="1">
+      <w:hyperlink w:anchor="_Toc242012097" w:history="1">
         <w:r>
           <w:rPr>
             <w:rStyle w:val="af"/>
@@ -567,7 +567,7 @@
             <w:noProof/>
             <w:webHidden/>
           </w:rPr>
-          <w:instrText xml:space="preserve"> PAGEREF _Toc241953190 \h </w:instrText>
+          <w:instrText xml:space="preserve"> PAGEREF _Toc242012097 \h </w:instrText>
         </w:r>
         <w:r>
           <w:rPr>
@@ -608,7 +608,7 @@
           <w:noProof/>
         </w:rPr>
       </w:pPr>
-      <w:hyperlink w:anchor="_Toc241953191" w:history="1">
+      <w:hyperlink w:anchor="_Toc242012098" w:history="1">
         <w:r>
           <w:rPr>
             <w:rStyle w:val="af"/>
@@ -636,7 +636,7 @@
             <w:noProof/>
             <w:webHidden/>
           </w:rPr>
-          <w:instrText xml:space="preserve"> PAGEREF _Toc241953191 \h </w:instrText>
+          <w:instrText xml:space="preserve"> PAGEREF _Toc242012098 \h </w:instrText>
         </w:r>
         <w:r>
           <w:rPr>
@@ -677,7 +677,7 @@
           <w:noProof/>
         </w:rPr>
       </w:pPr>
-      <w:hyperlink w:anchor="_Toc241953192" w:history="1">
+      <w:hyperlink w:anchor="_Toc242012099" w:history="1">
         <w:r>
           <w:rPr>
             <w:rStyle w:val="af"/>
@@ -705,7 +705,7 @@
             <w:noProof/>
             <w:webHidden/>
           </w:rPr>
-          <w:instrText xml:space="preserve"> PAGEREF _Toc241953192 \h </w:instrText>
+          <w:instrText xml:space="preserve"> PAGEREF _Toc242012099 \h </w:instrText>
         </w:r>
         <w:r>
           <w:rPr>
@@ -746,7 +746,7 @@
           <w:noProof/>
         </w:rPr>
       </w:pPr>
-      <w:hyperlink w:anchor="_Toc241953193" w:history="1">
+      <w:hyperlink w:anchor="_Toc242012100" w:history="1">
         <w:r>
           <w:rPr>
             <w:rStyle w:val="af"/>
@@ -774,7 +774,7 @@
             <w:noProof/>
             <w:webHidden/>
           </w:rPr>
-          <w:instrText xml:space="preserve"> PAGEREF _Toc241953193 \h </w:instrText>
+          <w:instrText xml:space="preserve"> PAGEREF _Toc242012100 \h </w:instrText>
         </w:r>
         <w:r>
           <w:rPr>
@@ -815,7 +815,7 @@
           <w:noProof/>
         </w:rPr>
       </w:pPr>
-      <w:hyperlink w:anchor="_Toc241953194" w:history="1">
+      <w:hyperlink w:anchor="_Toc242012101" w:history="1">
         <w:r>
           <w:rPr>
             <w:rStyle w:val="af"/>
@@ -843,7 +843,7 @@
             <w:noProof/>
             <w:webHidden/>
           </w:rPr>
-          <w:instrText xml:space="preserve"> PAGEREF _Toc241953194 \h </w:instrText>
+          <w:instrText xml:space="preserve"> PAGEREF _Toc242012101 \h </w:instrText>
         </w:r>
         <w:r>
           <w:rPr>
@@ -884,7 +884,7 @@
           <w:noProof/>
         </w:rPr>
       </w:pPr>
-      <w:hyperlink w:anchor="_Toc241953195" w:history="1">
+      <w:hyperlink w:anchor="_Toc242012102" w:history="1">
         <w:r>
           <w:rPr>
             <w:rStyle w:val="af"/>
@@ -912,7 +912,7 @@
             <w:noProof/>
             <w:webHidden/>
           </w:rPr>
-          <w:instrText xml:space="preserve"> PAGEREF _Toc241953195 \h </w:instrText>
+          <w:instrText xml:space="preserve"> PAGEREF _Toc242012102 \h </w:instrText>
         </w:r>
         <w:r>
           <w:rPr>
@@ -953,7 +953,7 @@
           <w:noProof/>
         </w:rPr>
       </w:pPr>
-      <w:hyperlink w:anchor="_Toc241953196" w:history="1">
+      <w:hyperlink w:anchor="_Toc242012103" w:history="1">
         <w:r>
           <w:rPr>
             <w:rStyle w:val="af"/>
@@ -981,7 +981,7 @@
             <w:noProof/>
             <w:webHidden/>
           </w:rPr>
-          <w:instrText xml:space="preserve"> PAGEREF _Toc241953196 \h </w:instrText>
+          <w:instrText xml:space="preserve"> PAGEREF _Toc242012103 \h </w:instrText>
         </w:r>
         <w:r>
           <w:rPr>
@@ -1022,7 +1022,7 @@
           <w:noProof/>
         </w:rPr>
       </w:pPr>
-      <w:hyperlink w:anchor="_Toc241953197" w:history="1">
+      <w:hyperlink w:anchor="_Toc242012104" w:history="1">
         <w:r>
           <w:rPr>
             <w:rStyle w:val="af"/>
@@ -1050,7 +1050,7 @@
             <w:noProof/>
             <w:webHidden/>
           </w:rPr>
-          <w:instrText xml:space="preserve"> PAGEREF _Toc241953197 \h </w:instrText>
+          <w:instrText xml:space="preserve"> PAGEREF _Toc242012104 \h </w:instrText>
         </w:r>
         <w:r>
           <w:rPr>
@@ -1091,7 +1091,7 @@
           <w:noProof/>
         </w:rPr>
       </w:pPr>
-      <w:hyperlink w:anchor="_Toc241953198" w:history="1">
+      <w:hyperlink w:anchor="_Toc242012105" w:history="1">
         <w:r>
           <w:rPr>
             <w:rStyle w:val="af"/>
@@ -1119,7 +1119,7 @@
             <w:noProof/>
             <w:webHidden/>
           </w:rPr>
-          <w:instrText xml:space="preserve"> PAGEREF _Toc241953198 \h </w:instrText>
+          <w:instrText xml:space="preserve"> PAGEREF _Toc242012105 \h </w:instrText>
         </w:r>
         <w:r>
           <w:rPr>
@@ -1160,7 +1160,7 @@
           <w:noProof/>
         </w:rPr>
       </w:pPr>
-      <w:hyperlink w:anchor="_Toc241953199" w:history="1">
+      <w:hyperlink w:anchor="_Toc242012106" w:history="1">
         <w:r>
           <w:rPr>
             <w:rStyle w:val="af"/>
@@ -1188,7 +1188,7 @@
             <w:noProof/>
             <w:webHidden/>
           </w:rPr>
-          <w:instrText xml:space="preserve"> PAGEREF _Toc241953199 \h </w:instrText>
+          <w:instrText xml:space="preserve"> PAGEREF _Toc242012106 \h </w:instrText>
         </w:r>
         <w:r>
           <w:rPr>
@@ -1229,7 +1229,7 @@
           <w:noProof/>
         </w:rPr>
       </w:pPr>
-      <w:hyperlink w:anchor="_Toc241953200" w:history="1">
+      <w:hyperlink w:anchor="_Toc242012107" w:history="1">
         <w:r>
           <w:rPr>
             <w:rStyle w:val="af"/>
@@ -1257,7 +1257,7 @@
             <w:noProof/>
             <w:webHidden/>
           </w:rPr>
-          <w:instrText xml:space="preserve"> PAGEREF _Toc241953200 \h </w:instrText>
+          <w:instrText xml:space="preserve"> PAGEREF _Toc242012107 \h </w:instrText>
         </w:r>
         <w:r>
           <w:rPr>
@@ -1298,7 +1298,7 @@
           <w:noProof/>
         </w:rPr>
       </w:pPr>
-      <w:hyperlink w:anchor="_Toc241953201" w:history="1">
+      <w:hyperlink w:anchor="_Toc242012108" w:history="1">
         <w:r>
           <w:rPr>
             <w:rStyle w:val="af"/>
@@ -1326,7 +1326,7 @@
             <w:noProof/>
             <w:webHidden/>
           </w:rPr>
-          <w:instrText xml:space="preserve"> PAGEREF _Toc241953201 \h </w:instrText>
+          <w:instrText xml:space="preserve"> PAGEREF _Toc242012108 \h </w:instrText>
         </w:r>
         <w:r>
           <w:rPr>
@@ -1367,7 +1367,7 @@
           <w:noProof/>
         </w:rPr>
       </w:pPr>
-      <w:hyperlink w:anchor="_Toc241953202" w:history="1">
+      <w:hyperlink w:anchor="_Toc242012109" w:history="1">
         <w:r>
           <w:rPr>
             <w:rStyle w:val="af"/>
@@ -1395,7 +1395,7 @@
             <w:noProof/>
             <w:webHidden/>
           </w:rPr>
-          <w:instrText xml:space="preserve"> PAGEREF _Toc241953202 \h </w:instrText>
+          <w:instrText xml:space="preserve"> PAGEREF _Toc242012109 \h </w:instrText>
         </w:r>
         <w:r>
           <w:rPr>
@@ -1436,7 +1436,7 @@
           <w:noProof/>
         </w:rPr>
       </w:pPr>
-      <w:hyperlink w:anchor="_Toc241953203" w:history="1">
+      <w:hyperlink w:anchor="_Toc242012110" w:history="1">
         <w:r>
           <w:rPr>
             <w:rStyle w:val="af"/>
@@ -1464,7 +1464,7 @@
             <w:noProof/>
             <w:webHidden/>
           </w:rPr>
-          <w:instrText xml:space="preserve"> PAGEREF _Toc241953203 \h </w:instrText>
+          <w:instrText xml:space="preserve"> PAGEREF _Toc242012110 \h </w:instrText>
         </w:r>
         <w:r>
           <w:rPr>
@@ -1505,7 +1505,7 @@
           <w:noProof/>
         </w:rPr>
       </w:pPr>
-      <w:hyperlink w:anchor="_Toc241953204" w:history="1">
+      <w:hyperlink w:anchor="_Toc242012111" w:history="1">
         <w:r>
           <w:rPr>
             <w:rStyle w:val="af"/>
@@ -1533,7 +1533,7 @@
             <w:noProof/>
             <w:webHidden/>
           </w:rPr>
-          <w:instrText xml:space="preserve"> PAGEREF _Toc241953204 \h </w:instrText>
+          <w:instrText xml:space="preserve"> PAGEREF _Toc242012111 \h </w:instrText>
         </w:r>
         <w:r>
           <w:rPr>
@@ -1566,6 +1566,75 @@
     </w:p>
     <w:p>
       <w:pPr>
+        <w:pStyle w:val="12"/>
+        <w:tabs>
+          <w:tab w:val="right" w:leader="dot" w:pos="9345"/>
+        </w:tabs>
+        <w:rPr>
+          <w:noProof/>
+        </w:rPr>
+      </w:pPr>
+      <w:hyperlink w:anchor="_Toc242012112" w:history="1">
+        <w:r>
+          <w:rPr>
+            <w:rStyle w:val="af"/>
+            <w:b/>
+            <w:noProof/>
+          </w:rPr>
+          <w:t>ПРИЛОЖЕНИЕ Ж</w:t>
+        </w:r>
+        <w:r>
+          <w:rPr>
+            <w:noProof/>
+            <w:webHidden/>
+          </w:rPr>
+          <w:tab/>
+        </w:r>
+        <w:r>
+          <w:rPr>
+            <w:noProof/>
+            <w:webHidden/>
+          </w:rPr>
+          <w:fldChar w:fldCharType="begin"/>
+        </w:r>
+        <w:r>
+          <w:rPr>
+            <w:noProof/>
+            <w:webHidden/>
+          </w:rPr>
+          <w:instrText xml:space="preserve"> PAGEREF _Toc242012112 \h </w:instrText>
+        </w:r>
+        <w:r>
+          <w:rPr>
+            <w:noProof/>
+            <w:webHidden/>
+          </w:rPr>
+        </w:r>
+        <w:r>
+          <w:rPr>
+            <w:noProof/>
+            <w:webHidden/>
+          </w:rPr>
+          <w:fldChar w:fldCharType="separate"/>
+        </w:r>
+        <w:r>
+          <w:rPr>
+            <w:noProof/>
+            <w:webHidden/>
+          </w:rPr>
+          <w:t>46</w:t>
+        </w:r>
+        <w:r>
+          <w:rPr>
+            <w:noProof/>
+            <w:webHidden/>
+          </w:rPr>
+          <w:fldChar w:fldCharType="end"/>
+        </w:r>
+      </w:hyperlink>
+    </w:p>
+    <w:p>
+      <w:pPr>
         <w:pStyle w:val="11"/>
       </w:pPr>
       <w:r>
@@ -1579,7 +1648,7 @@
         <w:spacing w:before="0" w:after="360" w:line="360" w:lineRule="exact"/>
         <w:ind w:firstLine="709"/>
       </w:pPr>
-      <w:bookmarkStart w:id="1" w:name="_Toc241953186"/>
+      <w:bookmarkStart w:id="1" w:name="_Toc242012093"/>
       <w:r>
         <w:rPr>
           <w:b/>
@@ -1684,7 +1753,7 @@
         <w:ind w:firstLine="709"/>
       </w:pPr>
       <w:bookmarkStart w:id="2" w:name="_b608aa976fc82a0faaf3b83f58c735968afd03b"/>
-      <w:bookmarkStart w:id="3" w:name="_Toc241953187"/>
+      <w:bookmarkStart w:id="3" w:name="_Toc242012094"/>
       <w:bookmarkEnd w:id="0"/>
       <w:r>
         <w:rPr>
@@ -1692,14 +1761,14 @@
           <w:sz w:val="28"/>
         </w:rPr>
         <w:lastRenderedPageBreak/>
-        <w:t>2 Х</w:t>
+        <w:t xml:space="preserve">2 </w:t>
       </w:r>
       <w:r>
         <w:rPr>
           <w:b/>
           <w:sz w:val="28"/>
         </w:rPr>
-        <w:t>ОД РАБОТЫ</w:t>
+        <w:t>ХОД РАБОТЫ</w:t>
       </w:r>
       <w:bookmarkEnd w:id="3"/>
     </w:p>
@@ -1750,7 +1819,7 @@
         <w:ind w:firstLine="709"/>
       </w:pPr>
       <w:bookmarkStart w:id="4" w:name="_ce8c8db2bd1f021f701413a98bce88b0dc0ff35"/>
-      <w:bookmarkStart w:id="5" w:name="_Toc241953188"/>
+      <w:bookmarkStart w:id="5" w:name="_Toc242012095"/>
       <w:r>
         <w:rPr>
           <w:b/>
@@ -1771,13 +1840,13 @@
         <w:rPr>
           <w:sz w:val="28"/>
         </w:rPr>
-        <w:t>Банк источников объединяет отчеты ЛР1-ЛР5, страни</w:t>
-      </w:r>
-      <w:r>
-        <w:rPr>
-          <w:sz w:val="28"/>
-        </w:rPr>
-        <w:t>цы конкурентов и документы проекта. Он является общей доказательной базой для всех книг: каждый вывод далее имеет ссылку на запись банка.</w:t>
+        <w:t>Банк источников объединяет отчеты ЛР1-</w:t>
+      </w:r>
+      <w:r>
+        <w:rPr>
+          <w:sz w:val="28"/>
+        </w:rPr>
+        <w:t>ЛР5, страницы конкурентов и документы проекта. Он является общей доказательной базой для всех книг: каждый вывод далее имеет ссылку на запись банка.</w:t>
       </w:r>
     </w:p>
     <w:p>
@@ -3792,7 +3861,7 @@
         <w:ind w:firstLine="709"/>
       </w:pPr>
       <w:bookmarkStart w:id="6" w:name="_d6b1e0606ccffbfea524c7b8890d7424ae6ef8d"/>
-      <w:bookmarkStart w:id="7" w:name="_Toc241953189"/>
+      <w:bookmarkStart w:id="7" w:name="_Toc242012096"/>
       <w:bookmarkEnd w:id="4"/>
       <w:r>
         <w:rPr>
@@ -8504,7 +8573,7 @@
         <w:ind w:firstLine="709"/>
       </w:pPr>
       <w:bookmarkStart w:id="8" w:name="_7b60cb03201c02c98ad01f5cee41d479977e884"/>
-      <w:bookmarkStart w:id="9" w:name="_Toc241953190"/>
+      <w:bookmarkStart w:id="9" w:name="_Toc242012097"/>
       <w:bookmarkEnd w:id="6"/>
       <w:r>
         <w:rPr>
@@ -8575,7 +8644,7 @@
           <w:sz w:val="28"/>
         </w:rPr>
         <w:drawing>
-          <wp:inline distT="0" distB="0" distL="0" distR="0" wp14:anchorId="1B0131D8" wp14:editId="17E1F6A0">
+          <wp:inline distT="0" distB="0" distL="0" distR="0" wp14:anchorId="666D4845" wp14:editId="097A5C35">
             <wp:extent cx="5334000" cy="3382536"/>
             <wp:effectExtent l="0" t="0" r="0" b="0"/>
             <wp:docPr id="13" name="Picture"/>
@@ -10890,7 +10959,7 @@
         <w:ind w:firstLine="709"/>
       </w:pPr>
       <w:bookmarkStart w:id="10" w:name="_519d46f9ff7923648cbfef21e26057944381813"/>
-      <w:bookmarkStart w:id="11" w:name="_Toc241953191"/>
+      <w:bookmarkStart w:id="11" w:name="_Toc242012098"/>
       <w:bookmarkEnd w:id="8"/>
       <w:r>
         <w:rPr>
@@ -15724,7 +15793,7 @@
           <w:sz w:val="28"/>
         </w:rPr>
         <w:drawing>
-          <wp:inline distT="0" distB="0" distL="0" distR="0" wp14:anchorId="52BF12B8" wp14:editId="073DF856">
+          <wp:inline distT="0" distB="0" distL="0" distR="0" wp14:anchorId="36300844" wp14:editId="6BB9D638">
             <wp:extent cx="5334000" cy="3122341"/>
             <wp:effectExtent l="0" t="0" r="0" b="0"/>
             <wp:docPr id="17" name="Picture"/>
@@ -16703,7 +16772,7 @@
         <w:ind w:firstLine="709"/>
       </w:pPr>
       <w:bookmarkStart w:id="12" w:name="_ccc7c944b68a9100d34a943bc02da4feb181aee"/>
-      <w:bookmarkStart w:id="13" w:name="_Toc241953192"/>
+      <w:bookmarkStart w:id="13" w:name="_Toc242012099"/>
       <w:bookmarkEnd w:id="10"/>
       <w:r>
         <w:rPr>
@@ -19812,7 +19881,7 @@
         </w:rPr>
         <w:lastRenderedPageBreak/>
         <w:drawing>
-          <wp:inline distT="0" distB="0" distL="0" distR="0" wp14:anchorId="6F6CA666" wp14:editId="363888DF">
+          <wp:inline distT="0" distB="0" distL="0" distR="0" wp14:anchorId="535C010D" wp14:editId="0BA14058">
             <wp:extent cx="5334000" cy="6114585"/>
             <wp:effectExtent l="0" t="0" r="0" b="0"/>
             <wp:docPr id="21" name="Picture"/>
@@ -20049,7 +20118,7 @@
         </w:rPr>
         <w:lastRenderedPageBreak/>
         <w:drawing>
-          <wp:inline distT="0" distB="0" distL="0" distR="0" wp14:anchorId="31E7A98E" wp14:editId="1F607E8F">
+          <wp:inline distT="0" distB="0" distL="0" distR="0" wp14:anchorId="442E23AB" wp14:editId="391B3DB3">
             <wp:extent cx="5334000" cy="9610810"/>
             <wp:effectExtent l="0" t="0" r="0" b="0"/>
             <wp:docPr id="24" name="Picture"/>
@@ -20289,7 +20358,7 @@
         </w:rPr>
         <w:lastRenderedPageBreak/>
         <w:drawing>
-          <wp:inline distT="0" distB="0" distL="0" distR="0" wp14:anchorId="53E402D9" wp14:editId="6D4E22EF">
+          <wp:inline distT="0" distB="0" distL="0" distR="0" wp14:anchorId="651AC90D" wp14:editId="4F9FED6F">
             <wp:extent cx="5334000" cy="12458978"/>
             <wp:effectExtent l="0" t="0" r="0" b="0"/>
             <wp:docPr id="27" name="Picture"/>
@@ -20502,7 +20571,7 @@
           <w:sz w:val="28"/>
         </w:rPr>
         <w:drawing>
-          <wp:inline distT="0" distB="0" distL="0" distR="0" wp14:anchorId="699F1E70" wp14:editId="185F9305">
+          <wp:inline distT="0" distB="0" distL="0" distR="0" wp14:anchorId="4564A2E0" wp14:editId="40C94643">
             <wp:extent cx="5334000" cy="5926666"/>
             <wp:effectExtent l="0" t="0" r="0" b="0"/>
             <wp:docPr id="30" name="Picture"/>
@@ -20761,7 +20830,7 @@
           <w:sz w:val="28"/>
         </w:rPr>
         <w:drawing>
-          <wp:inline distT="0" distB="0" distL="0" distR="0" wp14:anchorId="2597E29C" wp14:editId="4EDD5290">
+          <wp:inline distT="0" distB="0" distL="0" distR="0" wp14:anchorId="04995ED8" wp14:editId="0AD84A88">
             <wp:extent cx="5334000" cy="3343751"/>
             <wp:effectExtent l="0" t="0" r="0" b="0"/>
             <wp:docPr id="33" name="Picture"/>
@@ -22316,7 +22385,7 @@
         </w:rPr>
         <w:lastRenderedPageBreak/>
         <w:drawing>
-          <wp:inline distT="0" distB="0" distL="0" distR="0" wp14:anchorId="1BB53AA0" wp14:editId="1296DD93">
+          <wp:inline distT="0" distB="0" distL="0" distR="0" wp14:anchorId="26AFF084" wp14:editId="46AAB8C4">
             <wp:extent cx="5334000" cy="5785249"/>
             <wp:effectExtent l="0" t="0" r="0" b="0"/>
             <wp:docPr id="37" name="Picture"/>
@@ -22575,7 +22644,7 @@
         </w:rPr>
         <w:lastRenderedPageBreak/>
         <w:drawing>
-          <wp:inline distT="0" distB="0" distL="0" distR="0" wp14:anchorId="40BF14E3" wp14:editId="7D91230D">
+          <wp:inline distT="0" distB="0" distL="0" distR="0" wp14:anchorId="1E7F159D" wp14:editId="0C6CFCC8">
             <wp:extent cx="5334000" cy="3040380"/>
             <wp:effectExtent l="0" t="0" r="0" b="0"/>
             <wp:docPr id="40" name="Picture"/>
@@ -22735,7 +22804,7 @@
           <w:sz w:val="28"/>
         </w:rPr>
         <w:drawing>
-          <wp:inline distT="0" distB="0" distL="0" distR="0" wp14:anchorId="43FA9AB7" wp14:editId="000E3507">
+          <wp:inline distT="0" distB="0" distL="0" distR="0" wp14:anchorId="4C2A48D7" wp14:editId="0D394530">
             <wp:extent cx="5334000" cy="3081866"/>
             <wp:effectExtent l="0" t="0" r="0" b="0"/>
             <wp:docPr id="43" name="Picture"/>
@@ -22890,7 +22959,7 @@
         </w:rPr>
         <w:lastRenderedPageBreak/>
         <w:drawing>
-          <wp:inline distT="0" distB="0" distL="0" distR="0" wp14:anchorId="3C14F927" wp14:editId="0BA71C13">
+          <wp:inline distT="0" distB="0" distL="0" distR="0" wp14:anchorId="691FF72F" wp14:editId="0A5AC17C">
             <wp:extent cx="5334000" cy="2592916"/>
             <wp:effectExtent l="0" t="0" r="0" b="0"/>
             <wp:docPr id="46" name="Picture"/>
@@ -23037,7 +23106,7 @@
           <w:sz w:val="28"/>
         </w:rPr>
         <w:drawing>
-          <wp:inline distT="0" distB="0" distL="0" distR="0" wp14:anchorId="24ECA9EB" wp14:editId="263F6BDF">
+          <wp:inline distT="0" distB="0" distL="0" distR="0" wp14:anchorId="56BD6BBE" wp14:editId="3BDB2C9E">
             <wp:extent cx="5334000" cy="2332014"/>
             <wp:effectExtent l="0" t="0" r="0" b="0"/>
             <wp:docPr id="49" name="Picture"/>
@@ -23166,7 +23235,7 @@
         </w:rPr>
         <w:lastRenderedPageBreak/>
         <w:drawing>
-          <wp:inline distT="0" distB="0" distL="0" distR="0" wp14:anchorId="6A1A1922" wp14:editId="0643265D">
+          <wp:inline distT="0" distB="0" distL="0" distR="0" wp14:anchorId="624B8602" wp14:editId="0660E80D">
             <wp:extent cx="5334000" cy="2691467"/>
             <wp:effectExtent l="0" t="0" r="0" b="0"/>
             <wp:docPr id="52" name="Picture"/>
@@ -23320,7 +23389,7 @@
           <w:sz w:val="28"/>
         </w:rPr>
         <w:drawing>
-          <wp:inline distT="0" distB="0" distL="0" distR="0" wp14:anchorId="59237EAC" wp14:editId="41BF71DD">
+          <wp:inline distT="0" distB="0" distL="0" distR="0" wp14:anchorId="4EB2EEB9" wp14:editId="417D0B4B">
             <wp:extent cx="5334000" cy="2737379"/>
             <wp:effectExtent l="0" t="0" r="0" b="0"/>
             <wp:docPr id="55" name="Picture"/>
@@ -23488,7 +23557,7 @@
         </w:rPr>
         <w:lastRenderedPageBreak/>
         <w:drawing>
-          <wp:inline distT="0" distB="0" distL="0" distR="0" wp14:anchorId="687FFBE8" wp14:editId="10EFDE35">
+          <wp:inline distT="0" distB="0" distL="0" distR="0" wp14:anchorId="75271F26" wp14:editId="78E2EC03">
             <wp:extent cx="5334000" cy="4149208"/>
             <wp:effectExtent l="0" t="0" r="0" b="0"/>
             <wp:docPr id="58" name="Picture"/>
@@ -23654,7 +23723,7 @@
         <w:ind w:firstLine="709"/>
       </w:pPr>
       <w:bookmarkStart w:id="16" w:name="_fc51781abcc4857bf621eab6b8861ea54729fed"/>
-      <w:bookmarkStart w:id="17" w:name="_Toc241953193"/>
+      <w:bookmarkStart w:id="17" w:name="_Toc242012100"/>
       <w:bookmarkEnd w:id="15"/>
       <w:bookmarkEnd w:id="12"/>
       <w:r>
@@ -27060,7 +27129,7 @@
           <w:sz w:val="28"/>
         </w:rPr>
         <w:drawing>
-          <wp:inline distT="0" distB="0" distL="0" distR="0" wp14:anchorId="5D2C5272" wp14:editId="0863CC4A">
+          <wp:inline distT="0" distB="0" distL="0" distR="0" wp14:anchorId="34852EFE" wp14:editId="7468A282">
             <wp:extent cx="5334000" cy="2341756"/>
             <wp:effectExtent l="0" t="0" r="0" b="0"/>
             <wp:docPr id="63" name="Picture"/>
@@ -27964,7 +28033,7 @@
         <w:ind w:firstLine="709"/>
       </w:pPr>
       <w:bookmarkStart w:id="18" w:name="_fb011a212b736610690ebb69f4e92f01bd3b3f9"/>
-      <w:bookmarkStart w:id="19" w:name="_Toc241953194"/>
+      <w:bookmarkStart w:id="19" w:name="_Toc242012101"/>
       <w:bookmarkEnd w:id="16"/>
       <w:r>
         <w:rPr>
@@ -28872,7 +28941,7 @@
         <w:ind w:firstLine="709"/>
       </w:pPr>
       <w:bookmarkStart w:id="20" w:name="_339ae803435bd6b9a653c2b18dadc62dc9ad8e7"/>
-      <w:bookmarkStart w:id="21" w:name="_Toc241953195"/>
+      <w:bookmarkStart w:id="21" w:name="_Toc242012102"/>
       <w:bookmarkEnd w:id="18"/>
       <w:r>
         <w:rPr>
@@ -28996,7 +29065,7 @@
         <w:ind w:firstLine="709"/>
       </w:pPr>
       <w:bookmarkStart w:id="22" w:name="_1bfdad9d2d88ddb6ca16c31c1d4d4943679f32f"/>
-      <w:bookmarkStart w:id="23" w:name="_Toc241953196"/>
+      <w:bookmarkStart w:id="23" w:name="_Toc242012103"/>
       <w:bookmarkEnd w:id="20"/>
       <w:bookmarkEnd w:id="2"/>
       <w:r>
@@ -29226,7 +29295,7 @@
         <w:jc w:val="center"/>
       </w:pPr>
       <w:bookmarkStart w:id="24" w:name="_выводы"/>
-      <w:bookmarkStart w:id="25" w:name="_Toc241953197"/>
+      <w:bookmarkStart w:id="25" w:name="_Toc242012104"/>
       <w:bookmarkEnd w:id="22"/>
       <w:r>
         <w:rPr>
@@ -29423,7 +29492,7 @@
         <w:jc w:val="center"/>
       </w:pPr>
       <w:bookmarkStart w:id="26" w:name="_274f6a444530ef90b0479dabf3d210f01e97699"/>
-      <w:bookmarkStart w:id="27" w:name="_Toc241953198"/>
+      <w:bookmarkStart w:id="27" w:name="_Toc242012105"/>
       <w:bookmarkEnd w:id="24"/>
       <w:r>
         <w:rPr>
@@ -30466,7 +30535,7 @@
         <w:jc w:val="center"/>
       </w:pPr>
       <w:bookmarkStart w:id="28" w:name="_3d74faf1500c1b2a4a8bfa8e0e37c74206ce73d"/>
-      <w:bookmarkStart w:id="29" w:name="_Toc241953199"/>
+      <w:bookmarkStart w:id="29" w:name="_Toc242012106"/>
       <w:bookmarkEnd w:id="26"/>
       <w:r>
         <w:rPr>
@@ -31279,7 +31348,7 @@
         <w:jc w:val="center"/>
       </w:pPr>
       <w:bookmarkStart w:id="30" w:name="_25083b51e17d9d99817d1269b6af13d75b604a4"/>
-      <w:bookmarkStart w:id="31" w:name="_Toc241953200"/>
+      <w:bookmarkStart w:id="31" w:name="_Toc242012107"/>
       <w:bookmarkEnd w:id="28"/>
       <w:r>
         <w:rPr>
@@ -32130,7 +32199,7 @@
         <w:jc w:val="center"/>
       </w:pPr>
       <w:bookmarkStart w:id="32" w:name="_6574ce6d3bdcb7786930e8390195aee2be99a58"/>
-      <w:bookmarkStart w:id="33" w:name="_Toc241953201"/>
+      <w:bookmarkStart w:id="33" w:name="_Toc242012108"/>
       <w:bookmarkEnd w:id="30"/>
       <w:r>
         <w:rPr>
@@ -32542,7 +32611,7 @@
         <w:jc w:val="center"/>
       </w:pPr>
       <w:bookmarkStart w:id="34" w:name="_9415338eb7aade5a81d9d1583f95cf4a5b310ea"/>
-      <w:bookmarkStart w:id="35" w:name="_Toc241953202"/>
+      <w:bookmarkStart w:id="35" w:name="_Toc242012109"/>
       <w:bookmarkEnd w:id="32"/>
       <w:r>
         <w:rPr>
@@ -34453,7 +34522,7 @@
         <w:jc w:val="center"/>
       </w:pPr>
       <w:bookmarkStart w:id="36" w:name="_21cff5e6573cc685eba2e5d01fbe1912356e1d7"/>
-      <w:bookmarkStart w:id="37" w:name="_Toc241953203"/>
+      <w:bookmarkStart w:id="37" w:name="_Toc242012110"/>
       <w:bookmarkEnd w:id="34"/>
       <w:r>
         <w:rPr>
@@ -34570,7 +34639,7 @@
           <w:sz w:val="28"/>
         </w:rPr>
         <w:drawing>
-          <wp:inline distT="0" distB="0" distL="0" distR="0" wp14:anchorId="77A0E36F" wp14:editId="72420E22">
+          <wp:inline distT="0" distB="0" distL="0" distR="0" wp14:anchorId="6D2F4611" wp14:editId="499FE94B">
             <wp:extent cx="5334000" cy="2375958"/>
             <wp:effectExtent l="0" t="0" r="0" b="0"/>
             <wp:docPr id="77" name="Picture"/>
@@ -34763,7 +34832,7 @@
           <w:sz w:val="28"/>
         </w:rPr>
         <w:drawing>
-          <wp:inline distT="0" distB="0" distL="0" distR="0" wp14:anchorId="6B253572" wp14:editId="0D804370">
+          <wp:inline distT="0" distB="0" distL="0" distR="0" wp14:anchorId="16C5CA79" wp14:editId="3CF550D5">
             <wp:extent cx="5334000" cy="2375958"/>
             <wp:effectExtent l="0" t="0" r="0" b="0"/>
             <wp:docPr id="80" name="Picture"/>
@@ -34938,7 +35007,7 @@
         </w:rPr>
         <w:lastRenderedPageBreak/>
         <w:drawing>
-          <wp:inline distT="0" distB="0" distL="0" distR="0" wp14:anchorId="0CA7DE42" wp14:editId="1F0630CB">
+          <wp:inline distT="0" distB="0" distL="0" distR="0" wp14:anchorId="2A2AE328" wp14:editId="4A593EF6">
             <wp:extent cx="5334000" cy="2375958"/>
             <wp:effectExtent l="0" t="0" r="0" b="0"/>
             <wp:docPr id="83" name="Picture"/>
@@ -35170,7 +35239,7 @@
           <w:sz w:val="28"/>
         </w:rPr>
         <w:drawing>
-          <wp:inline distT="0" distB="0" distL="0" distR="0" wp14:anchorId="4B8A92AB" wp14:editId="1E29896F">
+          <wp:inline distT="0" distB="0" distL="0" distR="0" wp14:anchorId="5CD13D81" wp14:editId="62316B68">
             <wp:extent cx="5334000" cy="2375958"/>
             <wp:effectExtent l="0" t="0" r="0" b="0"/>
             <wp:docPr id="86" name="Picture"/>
@@ -35345,7 +35414,7 @@
         </w:rPr>
         <w:lastRenderedPageBreak/>
         <w:drawing>
-          <wp:inline distT="0" distB="0" distL="0" distR="0" wp14:anchorId="3A8A1C99" wp14:editId="5F77F90A">
+          <wp:inline distT="0" distB="0" distL="0" distR="0" wp14:anchorId="1CF2640D" wp14:editId="19F51673">
             <wp:extent cx="5334000" cy="2375958"/>
             <wp:effectExtent l="0" t="0" r="0" b="0"/>
             <wp:docPr id="89" name="Picture"/>
@@ -35538,7 +35607,7 @@
           <w:sz w:val="28"/>
         </w:rPr>
         <w:drawing>
-          <wp:inline distT="0" distB="0" distL="0" distR="0" wp14:anchorId="1899DE36" wp14:editId="61EE6E78">
+          <wp:inline distT="0" distB="0" distL="0" distR="0" wp14:anchorId="6A6AF771" wp14:editId="24A396B3">
             <wp:extent cx="5334000" cy="2375958"/>
             <wp:effectExtent l="0" t="0" r="0" b="0"/>
             <wp:docPr id="92" name="Picture"/>
@@ -35771,7 +35840,7 @@
         </w:rPr>
         <w:lastRenderedPageBreak/>
         <w:drawing>
-          <wp:inline distT="0" distB="0" distL="0" distR="0" wp14:anchorId="1310DBEC" wp14:editId="08D1968C">
+          <wp:inline distT="0" distB="0" distL="0" distR="0" wp14:anchorId="32D9130A" wp14:editId="4CBC4172">
             <wp:extent cx="5334000" cy="2375958"/>
             <wp:effectExtent l="0" t="0" r="0" b="0"/>
             <wp:docPr id="95" name="Picture"/>
@@ -35944,7 +36013,7 @@
           <w:sz w:val="28"/>
         </w:rPr>
         <w:drawing>
-          <wp:inline distT="0" distB="0" distL="0" distR="0" wp14:anchorId="6B8939F8" wp14:editId="0A81D961">
+          <wp:inline distT="0" distB="0" distL="0" distR="0" wp14:anchorId="6D2791F2" wp14:editId="2216E175">
             <wp:extent cx="5334000" cy="2375958"/>
             <wp:effectExtent l="0" t="0" r="0" b="0"/>
             <wp:docPr id="98" name="Picture"/>
@@ -36100,7 +36169,7 @@
         <w:jc w:val="center"/>
       </w:pPr>
       <w:bookmarkStart w:id="38" w:name="_e580caf5f2a0052cd60a87b42295a622f26cf83"/>
-      <w:bookmarkStart w:id="39" w:name="_Toc241953204"/>
+      <w:bookmarkStart w:id="39" w:name="_Toc242012111"/>
       <w:bookmarkEnd w:id="36"/>
       <w:r>
         <w:rPr>
@@ -37464,7 +37533,965 @@
         <w:t>согласуется с выводом ЛР2-3 и ЛР7: окно платной беты слишком узкое, нужны дополнительные каналы и ранний замер активации и оплаты.</w:t>
       </w:r>
     </w:p>
-    <w:bookmarkEnd w:id="38"/>
+    <w:p>
+      <w:pPr>
+        <w:pStyle w:val="1"/>
+        <w:keepNext w:val="0"/>
+        <w:pageBreakBefore/>
+        <w:spacing w:before="0" w:after="0" w:line="360" w:lineRule="exact"/>
+        <w:jc w:val="center"/>
+      </w:pPr>
+      <w:bookmarkStart w:id="40" w:name="_842467a5cac37707b6170e940cae61833a7b12c"/>
+      <w:bookmarkStart w:id="41" w:name="_Toc242012112"/>
+      <w:bookmarkEnd w:id="38"/>
+      <w:r>
+        <w:rPr>
+          <w:b/>
+          <w:sz w:val="28"/>
+        </w:rPr>
+        <w:lastRenderedPageBreak/>
+        <w:t>ПРИЛОЖЕНИЕ Ж</w:t>
+      </w:r>
+      <w:bookmarkEnd w:id="41"/>
+    </w:p>
+    <w:p>
+      <w:pPr>
+        <w:spacing w:after="0" w:line="360" w:lineRule="exact"/>
+        <w:jc w:val="center"/>
+      </w:pPr>
+      <w:r>
+        <w:rPr>
+          <w:sz w:val="28"/>
+        </w:rPr>
+        <w:t>(обязательное)</w:t>
+      </w:r>
+    </w:p>
+    <w:p>
+      <w:pPr>
+        <w:spacing w:after="360" w:line="360" w:lineRule="exact"/>
+        <w:jc w:val="center"/>
+      </w:pPr>
+      <w:r>
+        <w:rPr>
+          <w:b/>
+          <w:sz w:val="28"/>
+        </w:rPr>
+        <w:t>Перечень файлов работы</w:t>
+      </w:r>
+    </w:p>
+    <w:p>
+      <w:pPr>
+        <w:pStyle w:val="FirstParagraph"/>
+        <w:spacing w:before="0" w:after="0" w:line="360" w:lineRule="exact"/>
+        <w:ind w:firstLine="709"/>
+        <w:jc w:val="both"/>
+      </w:pPr>
+      <w:r>
+        <w:rPr>
+          <w:sz w:val="28"/>
+        </w:rPr>
+        <w:t>Перечень показывает состав материалов ЛР6; все файлы находятся в папке работы в репозитории проекта.</w:t>
+      </w:r>
+    </w:p>
+    <w:p>
+      <w:pPr>
+        <w:pStyle w:val="a0"/>
+        <w:spacing w:before="0" w:after="0" w:line="360" w:lineRule="exact"/>
+        <w:ind w:firstLine="709"/>
+        <w:jc w:val="both"/>
+      </w:pPr>
+      <w:r>
+        <w:rPr>
+          <w:sz w:val="28"/>
+        </w:rPr>
+        <w:t>В таблице 29 представлено: перечень файлов работы.</w:t>
+      </w:r>
+    </w:p>
+    <w:p>
+      <w:pPr>
+        <w:pStyle w:val="a0"/>
+        <w:keepNext/>
+        <w:spacing w:before="0" w:after="0" w:line="360" w:lineRule="exact"/>
+      </w:pPr>
+      <w:r>
+        <w:rPr>
+          <w:sz w:val="28"/>
+        </w:rPr>
+        <w:t>Таблица 29 – Перечень файлов работы</w:t>
+      </w:r>
+    </w:p>
+    <w:tbl>
+      <w:tblPr>
+        <w:tblStyle w:val="Table"/>
+        <w:tblW w:w="9355" w:type="dxa"/>
+        <w:jc w:val="center"/>
+        <w:tblBorders>
+          <w:top w:val="single" w:sz="4" w:space="0" w:color="000000"/>
+          <w:left w:val="single" w:sz="4" w:space="0" w:color="000000"/>
+          <w:bottom w:val="single" w:sz="4" w:space="0" w:color="000000"/>
+          <w:right w:val="single" w:sz="4" w:space="0" w:color="000000"/>
+          <w:insideH w:val="single" w:sz="4" w:space="0" w:color="000000"/>
+          <w:insideV w:val="single" w:sz="4" w:space="0" w:color="000000"/>
+        </w:tblBorders>
+        <w:tblLayout w:type="fixed"/>
+        <w:tblLook w:val="0020" w:firstRow="1" w:lastRow="0" w:firstColumn="0" w:lastColumn="0" w:noHBand="0" w:noVBand="0"/>
+      </w:tblPr>
+      <w:tblGrid>
+        <w:gridCol w:w="6527"/>
+        <w:gridCol w:w="2828"/>
+      </w:tblGrid>
+      <w:tr>
+        <w:trPr>
+          <w:cnfStyle w:val="100000000000" w:firstRow="1" w:lastRow="0" w:firstColumn="0" w:lastColumn="0" w:oddVBand="0" w:evenVBand="0" w:oddHBand="0" w:evenHBand="0" w:firstRowFirstColumn="0" w:firstRowLastColumn="0" w:lastRowFirstColumn="0" w:lastRowLastColumn="0"/>
+          <w:cantSplit/>
+          <w:tblHeader/>
+          <w:jc w:val="center"/>
+        </w:trPr>
+        <w:tc>
+          <w:tcPr>
+            <w:tcW w:w="6526" w:type="dxa"/>
+            <w:vAlign w:val="center"/>
+          </w:tcPr>
+          <w:p>
+            <w:pPr>
+              <w:pStyle w:val="Compact"/>
+              <w:spacing w:before="0" w:after="0" w:line="280" w:lineRule="exact"/>
+              <w:jc w:val="center"/>
+            </w:pPr>
+            <w:r>
+              <w:rPr>
+                <w:b/>
+                <w:sz w:val="24"/>
+              </w:rPr>
+              <w:t>Файл или папка</w:t>
+            </w:r>
+          </w:p>
+        </w:tc>
+        <w:tc>
+          <w:tcPr>
+            <w:tcW w:w="2828" w:type="dxa"/>
+            <w:vAlign w:val="center"/>
+          </w:tcPr>
+          <w:p>
+            <w:pPr>
+              <w:pStyle w:val="Compact"/>
+              <w:spacing w:before="0" w:after="0" w:line="280" w:lineRule="exact"/>
+              <w:jc w:val="center"/>
+            </w:pPr>
+            <w:r>
+              <w:rPr>
+                <w:b/>
+                <w:sz w:val="24"/>
+              </w:rPr>
+              <w:t>Назначение</w:t>
+            </w:r>
+          </w:p>
+        </w:tc>
+      </w:tr>
+      <w:tr>
+        <w:trPr>
+          <w:cantSplit/>
+          <w:jc w:val="center"/>
+        </w:trPr>
+        <w:tc>
+          <w:tcPr>
+            <w:tcW w:w="6526" w:type="dxa"/>
+            <w:vAlign w:val="center"/>
+          </w:tcPr>
+          <w:p>
+            <w:pPr>
+              <w:pStyle w:val="Compact"/>
+              <w:spacing w:before="0" w:after="0" w:line="280" w:lineRule="exact"/>
+              <w:jc w:val="center"/>
+            </w:pPr>
+            <w:r>
+              <w:rPr>
+                <w:sz w:val="24"/>
+              </w:rPr>
+              <w:t>Excel/ЛР6_1_ценностное_предложение_и_цифр</w:t>
+            </w:r>
+            <w:r>
+              <w:rPr>
+                <w:sz w:val="24"/>
+              </w:rPr>
+              <w:t>овой_товар_TableMind.xlsx</w:t>
+            </w:r>
+          </w:p>
+        </w:tc>
+        <w:tc>
+          <w:tcPr>
+            <w:tcW w:w="2828" w:type="dxa"/>
+            <w:vAlign w:val="center"/>
+          </w:tcPr>
+          <w:p>
+            <w:pPr>
+              <w:pStyle w:val="Compact"/>
+              <w:spacing w:before="0" w:after="0" w:line="280" w:lineRule="exact"/>
+              <w:jc w:val="center"/>
+            </w:pPr>
+            <w:r>
+              <w:rPr>
+                <w:sz w:val="24"/>
+              </w:rPr>
+              <w:t>ценностное предложение и цифровой товар</w:t>
+            </w:r>
+          </w:p>
+        </w:tc>
+      </w:tr>
+      <w:tr>
+        <w:trPr>
+          <w:cantSplit/>
+          <w:jc w:val="center"/>
+        </w:trPr>
+        <w:tc>
+          <w:tcPr>
+            <w:tcW w:w="6526" w:type="dxa"/>
+            <w:vAlign w:val="center"/>
+          </w:tcPr>
+          <w:p>
+            <w:pPr>
+              <w:pStyle w:val="Compact"/>
+              <w:spacing w:before="0" w:after="0" w:line="280" w:lineRule="exact"/>
+              <w:jc w:val="center"/>
+            </w:pPr>
+            <w:r>
+              <w:rPr>
+                <w:sz w:val="24"/>
+              </w:rPr>
+              <w:t>Excel/ЛР6_2_канвас_бизнес_модели_TableMind.xlsx</w:t>
+            </w:r>
+          </w:p>
+        </w:tc>
+        <w:tc>
+          <w:tcPr>
+            <w:tcW w:w="2828" w:type="dxa"/>
+            <w:vAlign w:val="center"/>
+          </w:tcPr>
+          <w:p>
+            <w:pPr>
+              <w:pStyle w:val="Compact"/>
+              <w:spacing w:before="0" w:after="0" w:line="280" w:lineRule="exact"/>
+              <w:jc w:val="center"/>
+            </w:pPr>
+            <w:r>
+              <w:rPr>
+                <w:sz w:val="24"/>
+              </w:rPr>
+              <w:t>канвас бизнес-модели</w:t>
+            </w:r>
+          </w:p>
+        </w:tc>
+      </w:tr>
+      <w:tr>
+        <w:trPr>
+          <w:cantSplit/>
+          <w:jc w:val="center"/>
+        </w:trPr>
+        <w:tc>
+          <w:tcPr>
+            <w:tcW w:w="6526" w:type="dxa"/>
+            <w:vAlign w:val="center"/>
+          </w:tcPr>
+          <w:p>
+            <w:pPr>
+              <w:pStyle w:val="Compact"/>
+              <w:spacing w:before="0" w:after="0" w:line="280" w:lineRule="exact"/>
+              <w:jc w:val="center"/>
+            </w:pPr>
+            <w:r>
+              <w:rPr>
+                <w:sz w:val="24"/>
+              </w:rPr>
+              <w:t>Excel/ЛР6_3_бизнес_логика_и_сценарии_TableMind.xlsx</w:t>
+            </w:r>
+          </w:p>
+        </w:tc>
+        <w:tc>
+          <w:tcPr>
+            <w:tcW w:w="2828" w:type="dxa"/>
+            <w:vAlign w:val="center"/>
+          </w:tcPr>
+          <w:p>
+            <w:pPr>
+              <w:pStyle w:val="Compact"/>
+              <w:spacing w:before="0" w:after="0" w:line="280" w:lineRule="exact"/>
+              <w:jc w:val="center"/>
+            </w:pPr>
+            <w:r>
+              <w:rPr>
+                <w:sz w:val="24"/>
+              </w:rPr>
+              <w:t>бизнес-логика и пользовательские сценарии</w:t>
+            </w:r>
+          </w:p>
+        </w:tc>
+      </w:tr>
+      <w:tr>
+        <w:trPr>
+          <w:cantSplit/>
+          <w:jc w:val="center"/>
+        </w:trPr>
+        <w:tc>
+          <w:tcPr>
+            <w:tcW w:w="6526" w:type="dxa"/>
+            <w:vAlign w:val="center"/>
+          </w:tcPr>
+          <w:p>
+            <w:pPr>
+              <w:pStyle w:val="Compact"/>
+              <w:spacing w:before="0" w:after="0" w:line="280" w:lineRule="exact"/>
+              <w:jc w:val="center"/>
+            </w:pPr>
+            <w:r>
+              <w:rPr>
+                <w:sz w:val="24"/>
+              </w:rPr>
+              <w:t>Excel/ЛР6_4_страницы_и_экраны_TableMind.xlsx</w:t>
+            </w:r>
+          </w:p>
+        </w:tc>
+        <w:tc>
+          <w:tcPr>
+            <w:tcW w:w="2828" w:type="dxa"/>
+            <w:vAlign w:val="center"/>
+          </w:tcPr>
+          <w:p>
+            <w:pPr>
+              <w:pStyle w:val="Compact"/>
+              <w:spacing w:before="0" w:after="0" w:line="280" w:lineRule="exact"/>
+              <w:jc w:val="center"/>
+            </w:pPr>
+            <w:r>
+              <w:rPr>
+                <w:sz w:val="24"/>
+              </w:rPr>
+              <w:t>страницы и экраны, содержание и функции</w:t>
+            </w:r>
+          </w:p>
+        </w:tc>
+      </w:tr>
+      <w:tr>
+        <w:trPr>
+          <w:cantSplit/>
+          <w:jc w:val="center"/>
+        </w:trPr>
+        <w:tc>
+          <w:tcPr>
+            <w:tcW w:w="6526" w:type="dxa"/>
+            <w:vAlign w:val="center"/>
+          </w:tcPr>
+          <w:p>
+            <w:pPr>
+              <w:pStyle w:val="Compact"/>
+              <w:spacing w:before="0" w:after="0" w:line="280" w:lineRule="exact"/>
+              <w:jc w:val="center"/>
+            </w:pPr>
+            <w:r>
+              <w:rPr>
+                <w:sz w:val="24"/>
+              </w:rPr>
+              <w:t>Excel/ЛР6_5_деление_на_релизы_TableMind.xlsx</w:t>
+            </w:r>
+          </w:p>
+        </w:tc>
+        <w:tc>
+          <w:tcPr>
+            <w:tcW w:w="2828" w:type="dxa"/>
+            <w:vAlign w:val="center"/>
+          </w:tcPr>
+          <w:p>
+            <w:pPr>
+              <w:pStyle w:val="Compact"/>
+              <w:spacing w:before="0" w:after="0" w:line="280" w:lineRule="exact"/>
+              <w:jc w:val="center"/>
+            </w:pPr>
+            <w:r>
+              <w:rPr>
+                <w:sz w:val="24"/>
+              </w:rPr>
+              <w:t>деление на релизы, реестр единиц разработки</w:t>
+            </w:r>
+          </w:p>
+        </w:tc>
+      </w:tr>
+      <w:tr>
+        <w:trPr>
+          <w:cantSplit/>
+          <w:jc w:val="center"/>
+        </w:trPr>
+        <w:tc>
+          <w:tcPr>
+            <w:tcW w:w="6526" w:type="dxa"/>
+            <w:vAlign w:val="center"/>
+          </w:tcPr>
+          <w:p>
+            <w:pPr>
+              <w:pStyle w:val="Compact"/>
+              <w:spacing w:before="0" w:after="0" w:line="280" w:lineRule="exact"/>
+              <w:jc w:val="center"/>
+            </w:pPr>
+            <w:r>
+              <w:rPr>
+                <w:sz w:val="24"/>
+              </w:rPr>
+              <w:t xml:space="preserve">Python/data6a.py, </w:t>
+            </w:r>
+            <w:r>
+              <w:rPr>
+                <w:i/>
+                <w:sz w:val="24"/>
+              </w:rPr>
+              <w:t>data6b.py</w:t>
+            </w:r>
+            <w:r>
+              <w:rPr>
+                <w:sz w:val="24"/>
+              </w:rPr>
+              <w:t xml:space="preserve">, </w:t>
+            </w:r>
+            <w:r>
+              <w:rPr>
+                <w:i/>
+                <w:sz w:val="24"/>
+              </w:rPr>
+              <w:t>data6c.p</w:t>
+            </w:r>
+            <w:r>
+              <w:rPr>
+                <w:i/>
+                <w:sz w:val="24"/>
+              </w:rPr>
+              <w:t>y</w:t>
+            </w:r>
+          </w:p>
+        </w:tc>
+        <w:tc>
+          <w:tcPr>
+            <w:tcW w:w="2828" w:type="dxa"/>
+            <w:vAlign w:val="center"/>
+          </w:tcPr>
+          <w:p>
+            <w:pPr>
+              <w:pStyle w:val="Compact"/>
+              <w:spacing w:before="0" w:after="0" w:line="280" w:lineRule="exact"/>
+              <w:jc w:val="center"/>
+            </w:pPr>
+            <w:r>
+              <w:rPr>
+                <w:sz w:val="24"/>
+              </w:rPr>
+              <w:t>исходные данные по методикам 6.1-6.5</w:t>
+            </w:r>
+          </w:p>
+        </w:tc>
+      </w:tr>
+      <w:tr>
+        <w:trPr>
+          <w:cantSplit/>
+          <w:jc w:val="center"/>
+        </w:trPr>
+        <w:tc>
+          <w:tcPr>
+            <w:tcW w:w="6526" w:type="dxa"/>
+            <w:vAlign w:val="center"/>
+          </w:tcPr>
+          <w:p>
+            <w:pPr>
+              <w:pStyle w:val="Compact"/>
+              <w:spacing w:before="0" w:after="0" w:line="280" w:lineRule="exact"/>
+              <w:jc w:val="center"/>
+            </w:pPr>
+            <w:r>
+              <w:rPr>
+                <w:sz w:val="24"/>
+              </w:rPr>
+              <w:t xml:space="preserve">Python/fill6a.py, </w:t>
+            </w:r>
+            <w:r>
+              <w:rPr>
+                <w:i/>
+                <w:sz w:val="24"/>
+              </w:rPr>
+              <w:t>fill6b.py</w:t>
+            </w:r>
+            <w:r>
+              <w:rPr>
+                <w:sz w:val="24"/>
+              </w:rPr>
+              <w:t xml:space="preserve">, </w:t>
+            </w:r>
+            <w:r>
+              <w:rPr>
+                <w:i/>
+                <w:sz w:val="24"/>
+              </w:rPr>
+              <w:t>fill6c.py</w:t>
+            </w:r>
+          </w:p>
+        </w:tc>
+        <w:tc>
+          <w:tcPr>
+            <w:tcW w:w="2828" w:type="dxa"/>
+            <w:vAlign w:val="center"/>
+          </w:tcPr>
+          <w:p>
+            <w:pPr>
+              <w:pStyle w:val="Compact"/>
+              <w:spacing w:before="0" w:after="0" w:line="280" w:lineRule="exact"/>
+              <w:jc w:val="center"/>
+            </w:pPr>
+            <w:r>
+              <w:rPr>
+                <w:sz w:val="24"/>
+              </w:rPr>
+              <w:t xml:space="preserve">заполнение книг через </w:t>
+            </w:r>
+            <w:r>
+              <w:rPr>
+                <w:i/>
+                <w:sz w:val="24"/>
+              </w:rPr>
+              <w:t>Excel</w:t>
+            </w:r>
+            <w:r>
+              <w:rPr>
+                <w:sz w:val="24"/>
+              </w:rPr>
+              <w:t xml:space="preserve"> </w:t>
+            </w:r>
+            <w:r>
+              <w:rPr>
+                <w:i/>
+                <w:sz w:val="24"/>
+              </w:rPr>
+              <w:t>COM</w:t>
+            </w:r>
+          </w:p>
+        </w:tc>
+      </w:tr>
+      <w:tr>
+        <w:trPr>
+          <w:cantSplit/>
+          <w:jc w:val="center"/>
+        </w:trPr>
+        <w:tc>
+          <w:tcPr>
+            <w:tcW w:w="6526" w:type="dxa"/>
+            <w:vAlign w:val="center"/>
+          </w:tcPr>
+          <w:p>
+            <w:pPr>
+              <w:pStyle w:val="Compact"/>
+              <w:spacing w:before="0" w:after="0" w:line="280" w:lineRule="exact"/>
+              <w:jc w:val="center"/>
+            </w:pPr>
+            <w:r>
+              <w:rPr>
+                <w:sz w:val="24"/>
+              </w:rPr>
+              <w:t>Python/analysis6.py</w:t>
+            </w:r>
+          </w:p>
+        </w:tc>
+        <w:tc>
+          <w:tcPr>
+            <w:tcW w:w="2828" w:type="dxa"/>
+            <w:vAlign w:val="center"/>
+          </w:tcPr>
+          <w:p>
+            <w:pPr>
+              <w:pStyle w:val="Compact"/>
+              <w:spacing w:before="0" w:after="0" w:line="280" w:lineRule="exact"/>
+              <w:jc w:val="center"/>
+            </w:pPr>
+            <w:r>
+              <w:rPr>
+                <w:sz w:val="24"/>
+              </w:rPr>
+              <w:t>независимый пересчет и метод Монте-Карло (155 проверок)</w:t>
+            </w:r>
+          </w:p>
+        </w:tc>
+      </w:tr>
+      <w:tr>
+        <w:trPr>
+          <w:cantSplit/>
+          <w:jc w:val="center"/>
+        </w:trPr>
+        <w:tc>
+          <w:tcPr>
+            <w:tcW w:w="6526" w:type="dxa"/>
+            <w:vAlign w:val="center"/>
+          </w:tcPr>
+          <w:p>
+            <w:pPr>
+              <w:pStyle w:val="Compact"/>
+              <w:spacing w:before="0" w:after="0" w:line="280" w:lineRule="exact"/>
+              <w:jc w:val="center"/>
+            </w:pPr>
+            <w:r>
+              <w:rPr>
+                <w:sz w:val="24"/>
+              </w:rPr>
+              <w:t>Python/figures6.py</w:t>
+            </w:r>
+          </w:p>
+        </w:tc>
+        <w:tc>
+          <w:tcPr>
+            <w:tcW w:w="2828" w:type="dxa"/>
+            <w:vAlign w:val="center"/>
+          </w:tcPr>
+          <w:p>
+            <w:pPr>
+              <w:pStyle w:val="Compact"/>
+              <w:spacing w:before="0" w:after="0" w:line="280" w:lineRule="exact"/>
+              <w:jc w:val="center"/>
+            </w:pPr>
+            <w:r>
+              <w:rPr>
+                <w:sz w:val="24"/>
+              </w:rPr>
+              <w:t>построение рисунков</w:t>
+            </w:r>
+          </w:p>
+        </w:tc>
+      </w:tr>
+      <w:tr>
+        <w:trPr>
+          <w:cantSplit/>
+          <w:jc w:val="center"/>
+        </w:trPr>
+        <w:tc>
+          <w:tcPr>
+            <w:tcW w:w="6526" w:type="dxa"/>
+            <w:vAlign w:val="center"/>
+          </w:tcPr>
+          <w:p>
+            <w:pPr>
+              <w:pStyle w:val="Compact"/>
+              <w:spacing w:before="0" w:after="0" w:line="280" w:lineRule="exact"/>
+              <w:jc w:val="center"/>
+            </w:pPr>
+            <w:r>
+              <w:rPr>
+                <w:sz w:val="24"/>
+              </w:rPr>
+              <w:t xml:space="preserve">Python/report6.py, </w:t>
+            </w:r>
+            <w:r>
+              <w:rPr>
+                <w:i/>
+                <w:sz w:val="24"/>
+              </w:rPr>
+              <w:t>build_report6.py</w:t>
+            </w:r>
+          </w:p>
+        </w:tc>
+        <w:tc>
+          <w:tcPr>
+            <w:tcW w:w="2828" w:type="dxa"/>
+            <w:vAlign w:val="center"/>
+          </w:tcPr>
+          <w:p>
+            <w:pPr>
+              <w:pStyle w:val="Compact"/>
+              <w:spacing w:before="0" w:after="0" w:line="280" w:lineRule="exact"/>
+              <w:jc w:val="center"/>
+            </w:pPr>
+            <w:r>
+              <w:rPr>
+                <w:sz w:val="24"/>
+              </w:rPr>
+              <w:t>сборка ОТЧЕТ.</w:t>
+            </w:r>
+            <w:r>
+              <w:rPr>
+                <w:i/>
+                <w:sz w:val="24"/>
+              </w:rPr>
+              <w:t>md</w:t>
+            </w:r>
+            <w:r>
+              <w:rPr>
+                <w:sz w:val="24"/>
+              </w:rPr>
+              <w:t xml:space="preserve"> из результатов расчета</w:t>
+            </w:r>
+          </w:p>
+        </w:tc>
+      </w:tr>
+      <w:tr>
+        <w:trPr>
+          <w:cantSplit/>
+          <w:jc w:val="center"/>
+        </w:trPr>
+        <w:tc>
+          <w:tcPr>
+            <w:tcW w:w="6526" w:type="dxa"/>
+            <w:vAlign w:val="center"/>
+          </w:tcPr>
+          <w:p>
+            <w:pPr>
+              <w:pStyle w:val="Compact"/>
+              <w:spacing w:before="0" w:after="0" w:line="280" w:lineRule="exact"/>
+              <w:jc w:val="center"/>
+            </w:pPr>
+            <w:r>
+              <w:rPr>
+                <w:sz w:val="24"/>
+              </w:rPr>
+              <w:t>Рисунки/</w:t>
+            </w:r>
+          </w:p>
+        </w:tc>
+        <w:tc>
+          <w:tcPr>
+            <w:tcW w:w="2828" w:type="dxa"/>
+            <w:vAlign w:val="center"/>
+          </w:tcPr>
+          <w:p>
+            <w:pPr>
+              <w:pStyle w:val="Compact"/>
+              <w:spacing w:before="0" w:after="0" w:line="280" w:lineRule="exact"/>
+              <w:jc w:val="center"/>
+            </w:pPr>
+            <w:r>
+              <w:rPr>
+                <w:sz w:val="24"/>
+              </w:rPr>
+              <w:t xml:space="preserve">4 рисунка и 20 макетов экранов </w:t>
+            </w:r>
+            <w:r>
+              <w:rPr>
+                <w:i/>
+                <w:sz w:val="24"/>
+              </w:rPr>
+              <w:t>Figma</w:t>
+            </w:r>
+          </w:p>
+        </w:tc>
+      </w:tr>
+      <w:tr>
+        <w:trPr>
+          <w:cantSplit/>
+          <w:jc w:val="center"/>
+        </w:trPr>
+        <w:tc>
+          <w:tcPr>
+            <w:tcW w:w="6526" w:type="dxa"/>
+            <w:vAlign w:val="center"/>
+          </w:tcPr>
+          <w:p>
+            <w:pPr>
+              <w:pStyle w:val="Compact"/>
+              <w:spacing w:before="0" w:after="0" w:line="280" w:lineRule="exact"/>
+              <w:jc w:val="center"/>
+            </w:pPr>
+            <w:r>
+              <w:rPr>
+                <w:sz w:val="24"/>
+              </w:rPr>
+              <w:t>Скриншоты/</w:t>
+            </w:r>
+          </w:p>
+        </w:tc>
+        <w:tc>
+          <w:tcPr>
+            <w:tcW w:w="2828" w:type="dxa"/>
+            <w:vAlign w:val="center"/>
+          </w:tcPr>
+          <w:p>
+            <w:pPr>
+              <w:pStyle w:val="Compact"/>
+              <w:spacing w:before="0" w:after="0" w:line="280" w:lineRule="exact"/>
+              <w:jc w:val="center"/>
+            </w:pPr>
+            <w:r>
+              <w:rPr>
+                <w:sz w:val="24"/>
+              </w:rPr>
+              <w:t>скриншоты страниц конкурентов</w:t>
+            </w:r>
+          </w:p>
+        </w:tc>
+      </w:tr>
+      <w:tr>
+        <w:trPr>
+          <w:cantSplit/>
+          <w:jc w:val="center"/>
+        </w:trPr>
+        <w:tc>
+          <w:tcPr>
+            <w:tcW w:w="6526" w:type="dxa"/>
+            <w:vAlign w:val="center"/>
+          </w:tcPr>
+          <w:p>
+            <w:pPr>
+              <w:pStyle w:val="Compact"/>
+              <w:spacing w:before="0" w:after="0" w:line="280" w:lineRule="exact"/>
+              <w:jc w:val="center"/>
+            </w:pPr>
+            <w:r>
+              <w:rPr>
+                <w:sz w:val="24"/>
+              </w:rPr>
+              <w:t>ОТЧЕТ.</w:t>
+            </w:r>
+            <w:r>
+              <w:rPr>
+                <w:i/>
+                <w:sz w:val="24"/>
+              </w:rPr>
+              <w:t>md</w:t>
+            </w:r>
+            <w:r>
+              <w:rPr>
+                <w:sz w:val="24"/>
+              </w:rPr>
+              <w:t>, ОТЧЕТ_ЛР6_</w:t>
+            </w:r>
+            <w:r>
+              <w:rPr>
+                <w:i/>
+                <w:sz w:val="24"/>
+              </w:rPr>
+              <w:t>TableMind.docx</w:t>
+            </w:r>
+            <w:r>
+              <w:rPr>
+                <w:sz w:val="24"/>
+              </w:rPr>
+              <w:t>, .</w:t>
+            </w:r>
+            <w:r>
+              <w:rPr>
+                <w:i/>
+                <w:sz w:val="24"/>
+              </w:rPr>
+              <w:t>pdf</w:t>
+            </w:r>
+          </w:p>
+        </w:tc>
+        <w:tc>
+          <w:tcPr>
+            <w:tcW w:w="2828" w:type="dxa"/>
+            <w:vAlign w:val="center"/>
+          </w:tcPr>
+          <w:p>
+            <w:pPr>
+              <w:pStyle w:val="Compact"/>
+              <w:spacing w:before="0" w:after="0" w:line="280" w:lineRule="exact"/>
+              <w:jc w:val="center"/>
+            </w:pPr>
+            <w:r>
+              <w:rPr>
+                <w:sz w:val="24"/>
+              </w:rPr>
+              <w:t>отчет в трех форматах</w:t>
+            </w:r>
+          </w:p>
+        </w:tc>
+      </w:tr>
+      <w:tr>
+        <w:trPr>
+          <w:cantSplit/>
+          <w:jc w:val="center"/>
+        </w:trPr>
+        <w:tc>
+          <w:tcPr>
+            <w:tcW w:w="6526" w:type="dxa"/>
+            <w:vAlign w:val="center"/>
+          </w:tcPr>
+          <w:p>
+            <w:pPr>
+              <w:pStyle w:val="Compact"/>
+              <w:spacing w:before="0" w:after="0" w:line="280" w:lineRule="exact"/>
+              <w:jc w:val="center"/>
+            </w:pPr>
+            <w:r>
+              <w:rPr>
+                <w:sz w:val="24"/>
+              </w:rPr>
+              <w:t>ПЛАН.</w:t>
+            </w:r>
+            <w:r>
+              <w:rPr>
+                <w:i/>
+                <w:sz w:val="24"/>
+              </w:rPr>
+              <w:t>md</w:t>
+            </w:r>
+            <w:r>
+              <w:rPr>
+                <w:sz w:val="24"/>
+              </w:rPr>
+              <w:t xml:space="preserve">, </w:t>
+            </w:r>
+            <w:r>
+              <w:rPr>
+                <w:sz w:val="24"/>
+              </w:rPr>
+              <w:t>ИНСТРУКЦИЯ_ДЛЯ_МЕНЯ.</w:t>
+            </w:r>
+            <w:r>
+              <w:rPr>
+                <w:i/>
+                <w:sz w:val="24"/>
+              </w:rPr>
+              <w:t>md</w:t>
+            </w:r>
+          </w:p>
+        </w:tc>
+        <w:tc>
+          <w:tcPr>
+            <w:tcW w:w="2828" w:type="dxa"/>
+            <w:vAlign w:val="center"/>
+          </w:tcPr>
+          <w:p>
+            <w:pPr>
+              <w:pStyle w:val="Compact"/>
+              <w:spacing w:before="0" w:after="0" w:line="280" w:lineRule="exact"/>
+              <w:jc w:val="center"/>
+            </w:pPr>
+            <w:r>
+              <w:rPr>
+                <w:sz w:val="24"/>
+              </w:rPr>
+              <w:t>план выполнения и список данных, требующих участия автора</w:t>
+            </w:r>
+          </w:p>
+        </w:tc>
+      </w:tr>
+    </w:tbl>
+    <w:p>
+      <w:pPr>
+        <w:pStyle w:val="FirstParagraph"/>
+        <w:spacing w:before="0" w:after="0" w:line="360" w:lineRule="exact"/>
+        <w:ind w:firstLine="709"/>
+        <w:jc w:val="both"/>
+      </w:pPr>
+      <w:r>
+        <w:rPr>
+          <w:sz w:val="28"/>
+        </w:rPr>
+        <w:t xml:space="preserve">Макеты экранов хранятся в файле </w:t>
+      </w:r>
+      <w:r>
+        <w:rPr>
+          <w:i/>
+          <w:sz w:val="28"/>
+        </w:rPr>
+        <w:t>Figma</w:t>
+      </w:r>
+      <w:r>
+        <w:rPr>
+          <w:sz w:val="28"/>
+        </w:rPr>
+        <w:t xml:space="preserve"> проекта; в отчет включены их снимки, а требования к экранам повторены в книге страниц и экранов.</w:t>
+      </w:r>
+    </w:p>
+    <w:bookmarkEnd w:id="40"/>
     <w:sectPr>
       <w:headerReference w:type="default" r:id="rId31"/>
       <w:footerReference w:type="default" r:id="rId32"/>
@@ -37569,7 +38596,7 @@
   <w:abstractNum w:abstractNumId="0" w15:restartNumberingAfterBreak="0">
     <w:nsid w:val="0000A990"/>
     <w:multiLevelType w:val="multilevel"/>
-    <w:tmpl w:val="97E49A9C"/>
+    <w:tmpl w:val="332EB87E"/>
     <w:lvl w:ilvl="0">
       <w:numFmt w:val="bullet"/>
       <w:lvlText w:val=" "/>
@@ -37646,7 +38673,7 @@
   <w:abstractNum w:abstractNumId="1" w15:restartNumberingAfterBreak="0">
     <w:nsid w:val="00A99411"/>
     <w:multiLevelType w:val="multilevel"/>
-    <w:tmpl w:val="D8A4C64E"/>
+    <w:tmpl w:val="393C1108"/>
     <w:lvl w:ilvl="0">
       <w:start w:val="1"/>
       <w:numFmt w:val="decimal"/>
@@ -39124,7 +40151,7 @@
     <w:autoRedefine/>
     <w:uiPriority w:val="39"/>
     <w:unhideWhenUsed/>
-    <w:rsid w:val="006D46F1"/>
+    <w:rsid w:val="00236DD9"/>
     <w:pPr>
       <w:spacing w:after="100"/>
     </w:pPr>
@@ -39136,7 +40163,7 @@
     <w:autoRedefine/>
     <w:uiPriority w:val="39"/>
     <w:unhideWhenUsed/>
-    <w:rsid w:val="006D46F1"/>
+    <w:rsid w:val="00236DD9"/>
     <w:pPr>
       <w:spacing w:after="100"/>
       <w:ind w:left="240"/>

</xml_diff>